<commit_message>
punto 5. Punto 7
</commit_message>
<xml_diff>
--- a/Documentación_final.docx
+++ b/Documentación_final.docx
@@ -68,7 +68,21 @@
         <w:rPr>
           <w:rStyle w:val="Ttulodellibro"/>
         </w:rPr>
-        <w:t xml:space="preserve">Proyecto Intermodular Hito </w:t>
+        <w:t xml:space="preserve">Proyecto </w:t>
+      </w:r>
+      <w:proofErr w:type="spellStart"/>
+      <w:r>
+        <w:rPr>
+          <w:rStyle w:val="Ttulodellibro"/>
+        </w:rPr>
+        <w:t>Intermodular</w:t>
+      </w:r>
+      <w:proofErr w:type="spellEnd"/>
+      <w:r>
+        <w:rPr>
+          <w:rStyle w:val="Ttulodellibro"/>
+        </w:rPr>
+        <w:t xml:space="preserve"> Hito </w:t>
       </w:r>
       <w:r>
         <w:rPr>
@@ -147,6 +161,7 @@
           <w:u w:val="single"/>
         </w:rPr>
       </w:pPr>
+      <w:proofErr w:type="spellStart"/>
       <w:r>
         <w:rPr>
           <w:sz w:val="40"/>
@@ -156,61 +171,1353 @@
         <w:lastRenderedPageBreak/>
         <w:t>Abstract</w:t>
       </w:r>
-    </w:p>
-    <w:p>
-      <w:r>
-        <w:t>For this project,</w:t>
-      </w:r>
-      <w:r>
-        <w:t xml:space="preserve"> the website “Ro</w:t>
+      <w:proofErr w:type="spellEnd"/>
+    </w:p>
+    <w:p>
+      <w:r>
+        <w:t xml:space="preserve">For </w:t>
+      </w:r>
+      <w:proofErr w:type="spellStart"/>
+      <w:r>
+        <w:t>this</w:t>
+      </w:r>
+      <w:proofErr w:type="spellEnd"/>
+      <w:r>
+        <w:t xml:space="preserve"> </w:t>
+      </w:r>
+      <w:proofErr w:type="spellStart"/>
+      <w:r>
+        <w:t>project</w:t>
+      </w:r>
+      <w:proofErr w:type="spellEnd"/>
+      <w:r>
+        <w:t>,</w:t>
+      </w:r>
+      <w:r>
+        <w:t xml:space="preserve"> </w:t>
+      </w:r>
+      <w:proofErr w:type="spellStart"/>
+      <w:r>
+        <w:t>the</w:t>
+      </w:r>
+      <w:proofErr w:type="spellEnd"/>
+      <w:r>
+        <w:t xml:space="preserve"> </w:t>
+      </w:r>
+      <w:proofErr w:type="spellStart"/>
+      <w:r>
+        <w:t>website</w:t>
+      </w:r>
+      <w:proofErr w:type="spellEnd"/>
+      <w:r>
+        <w:t xml:space="preserve"> “</w:t>
+      </w:r>
+      <w:proofErr w:type="spellStart"/>
+      <w:r>
+        <w:t>Ro</w:t>
       </w:r>
       <w:r>
         <w:t>o</w:t>
       </w:r>
       <w:r>
-        <w:t>mie” has been designed,</w:t>
-      </w:r>
-      <w:r>
-        <w:t xml:space="preserve"> that will help students find rooms to rent near the universities they study at</w:t>
-      </w:r>
-      <w:r>
-        <w:t xml:space="preserve">, being the task to find appartments to rent very challenging for young students. </w:t>
+        <w:t>mie</w:t>
+      </w:r>
+      <w:proofErr w:type="spellEnd"/>
+      <w:r>
+        <w:t xml:space="preserve">” has </w:t>
+      </w:r>
+      <w:proofErr w:type="spellStart"/>
+      <w:r>
+        <w:t>been</w:t>
+      </w:r>
+      <w:proofErr w:type="spellEnd"/>
+      <w:r>
+        <w:t xml:space="preserve"> </w:t>
+      </w:r>
+      <w:proofErr w:type="spellStart"/>
+      <w:r>
+        <w:t>designed</w:t>
+      </w:r>
+      <w:proofErr w:type="spellEnd"/>
+      <w:r>
+        <w:t>,</w:t>
+      </w:r>
+      <w:r>
+        <w:t xml:space="preserve"> </w:t>
+      </w:r>
+      <w:proofErr w:type="spellStart"/>
+      <w:r>
+        <w:t>that</w:t>
+      </w:r>
+      <w:proofErr w:type="spellEnd"/>
+      <w:r>
+        <w:t xml:space="preserve"> </w:t>
+      </w:r>
+      <w:proofErr w:type="spellStart"/>
+      <w:r>
+        <w:t>will</w:t>
+      </w:r>
+      <w:proofErr w:type="spellEnd"/>
+      <w:r>
+        <w:t xml:space="preserve"> </w:t>
+      </w:r>
+      <w:proofErr w:type="spellStart"/>
+      <w:r>
+        <w:t>help</w:t>
+      </w:r>
+      <w:proofErr w:type="spellEnd"/>
+      <w:r>
+        <w:t xml:space="preserve"> </w:t>
+      </w:r>
+      <w:proofErr w:type="spellStart"/>
+      <w:r>
+        <w:t>students</w:t>
+      </w:r>
+      <w:proofErr w:type="spellEnd"/>
+      <w:r>
+        <w:t xml:space="preserve"> </w:t>
+      </w:r>
+      <w:proofErr w:type="spellStart"/>
+      <w:r>
+        <w:t>find</w:t>
+      </w:r>
+      <w:proofErr w:type="spellEnd"/>
+      <w:r>
+        <w:t xml:space="preserve"> </w:t>
+      </w:r>
+      <w:proofErr w:type="spellStart"/>
+      <w:r>
+        <w:t>rooms</w:t>
+      </w:r>
+      <w:proofErr w:type="spellEnd"/>
+      <w:r>
+        <w:t xml:space="preserve"> </w:t>
+      </w:r>
+      <w:proofErr w:type="spellStart"/>
+      <w:r>
+        <w:t>to</w:t>
+      </w:r>
+      <w:proofErr w:type="spellEnd"/>
+      <w:r>
+        <w:t xml:space="preserve"> </w:t>
+      </w:r>
+      <w:proofErr w:type="spellStart"/>
+      <w:r>
+        <w:t>rent</w:t>
+      </w:r>
+      <w:proofErr w:type="spellEnd"/>
+      <w:r>
+        <w:t xml:space="preserve"> </w:t>
+      </w:r>
+      <w:proofErr w:type="spellStart"/>
+      <w:r>
+        <w:t>near</w:t>
+      </w:r>
+      <w:proofErr w:type="spellEnd"/>
+      <w:r>
+        <w:t xml:space="preserve"> </w:t>
+      </w:r>
+      <w:proofErr w:type="spellStart"/>
+      <w:r>
+        <w:t>the</w:t>
+      </w:r>
+      <w:proofErr w:type="spellEnd"/>
+      <w:r>
+        <w:t xml:space="preserve"> </w:t>
+      </w:r>
+      <w:proofErr w:type="spellStart"/>
+      <w:r>
+        <w:t>universities</w:t>
+      </w:r>
+      <w:proofErr w:type="spellEnd"/>
+      <w:r>
+        <w:t xml:space="preserve"> </w:t>
+      </w:r>
+      <w:proofErr w:type="spellStart"/>
+      <w:r>
+        <w:t>they</w:t>
+      </w:r>
+      <w:proofErr w:type="spellEnd"/>
+      <w:r>
+        <w:t xml:space="preserve"> </w:t>
+      </w:r>
+      <w:proofErr w:type="spellStart"/>
+      <w:r>
+        <w:t>study</w:t>
+      </w:r>
+      <w:proofErr w:type="spellEnd"/>
+      <w:r>
+        <w:t xml:space="preserve"> at</w:t>
+      </w:r>
+      <w:r>
+        <w:t xml:space="preserve">, </w:t>
+      </w:r>
+      <w:proofErr w:type="spellStart"/>
+      <w:r>
+        <w:t>being</w:t>
+      </w:r>
+      <w:proofErr w:type="spellEnd"/>
+      <w:r>
+        <w:t xml:space="preserve"> </w:t>
+      </w:r>
+      <w:proofErr w:type="spellStart"/>
+      <w:r>
+        <w:t>the</w:t>
+      </w:r>
+      <w:proofErr w:type="spellEnd"/>
+      <w:r>
+        <w:t xml:space="preserve"> </w:t>
+      </w:r>
+      <w:proofErr w:type="spellStart"/>
+      <w:r>
+        <w:t>task</w:t>
+      </w:r>
+      <w:proofErr w:type="spellEnd"/>
+      <w:r>
+        <w:t xml:space="preserve"> </w:t>
+      </w:r>
+      <w:proofErr w:type="spellStart"/>
+      <w:r>
+        <w:t>to</w:t>
+      </w:r>
+      <w:proofErr w:type="spellEnd"/>
+      <w:r>
+        <w:t xml:space="preserve"> </w:t>
+      </w:r>
+      <w:proofErr w:type="spellStart"/>
+      <w:r>
+        <w:t>find</w:t>
+      </w:r>
+      <w:proofErr w:type="spellEnd"/>
+      <w:r>
+        <w:t xml:space="preserve"> </w:t>
+      </w:r>
+      <w:proofErr w:type="spellStart"/>
+      <w:r>
+        <w:t>appartments</w:t>
+      </w:r>
+      <w:proofErr w:type="spellEnd"/>
+      <w:r>
+        <w:t xml:space="preserve"> </w:t>
+      </w:r>
+      <w:proofErr w:type="spellStart"/>
+      <w:r>
+        <w:t>to</w:t>
+      </w:r>
+      <w:proofErr w:type="spellEnd"/>
+      <w:r>
+        <w:t xml:space="preserve"> </w:t>
+      </w:r>
+      <w:proofErr w:type="spellStart"/>
+      <w:r>
+        <w:t>rent</w:t>
+      </w:r>
+      <w:proofErr w:type="spellEnd"/>
+      <w:r>
+        <w:t xml:space="preserve"> </w:t>
+      </w:r>
+      <w:proofErr w:type="spellStart"/>
+      <w:r>
+        <w:t>very</w:t>
+      </w:r>
+      <w:proofErr w:type="spellEnd"/>
+      <w:r>
+        <w:t xml:space="preserve"> </w:t>
+      </w:r>
+      <w:proofErr w:type="spellStart"/>
+      <w:r>
+        <w:t>challenging</w:t>
+      </w:r>
+      <w:proofErr w:type="spellEnd"/>
+      <w:r>
+        <w:t xml:space="preserve"> </w:t>
+      </w:r>
+      <w:proofErr w:type="spellStart"/>
+      <w:r>
+        <w:t>for</w:t>
+      </w:r>
+      <w:proofErr w:type="spellEnd"/>
+      <w:r>
+        <w:t xml:space="preserve"> </w:t>
+      </w:r>
+      <w:proofErr w:type="spellStart"/>
+      <w:r>
+        <w:t>young</w:t>
+      </w:r>
+      <w:proofErr w:type="spellEnd"/>
+      <w:r>
+        <w:t xml:space="preserve"> </w:t>
+      </w:r>
+      <w:proofErr w:type="spellStart"/>
+      <w:r>
+        <w:t>students</w:t>
+      </w:r>
+      <w:proofErr w:type="spellEnd"/>
+      <w:r>
+        <w:t xml:space="preserve">. </w:t>
       </w:r>
       <w:r>
         <w:br/>
-        <w:t xml:space="preserve">The website will let the home owners publish their property as a whole, and the students will choose a room to rent from the house. </w:t>
+        <w:t xml:space="preserve">The </w:t>
+      </w:r>
+      <w:proofErr w:type="spellStart"/>
+      <w:r>
+        <w:t>website</w:t>
+      </w:r>
+      <w:proofErr w:type="spellEnd"/>
+      <w:r>
+        <w:t xml:space="preserve"> </w:t>
+      </w:r>
+      <w:proofErr w:type="spellStart"/>
+      <w:r>
+        <w:t>will</w:t>
+      </w:r>
+      <w:proofErr w:type="spellEnd"/>
+      <w:r>
+        <w:t xml:space="preserve"> </w:t>
+      </w:r>
+      <w:proofErr w:type="spellStart"/>
+      <w:r>
+        <w:t>let</w:t>
+      </w:r>
+      <w:proofErr w:type="spellEnd"/>
+      <w:r>
+        <w:t xml:space="preserve"> </w:t>
+      </w:r>
+      <w:proofErr w:type="spellStart"/>
+      <w:r>
+        <w:t>the</w:t>
+      </w:r>
+      <w:proofErr w:type="spellEnd"/>
+      <w:r>
+        <w:t xml:space="preserve"> home </w:t>
+      </w:r>
+      <w:proofErr w:type="spellStart"/>
+      <w:r>
+        <w:t>owners</w:t>
+      </w:r>
+      <w:proofErr w:type="spellEnd"/>
+      <w:r>
+        <w:t xml:space="preserve"> </w:t>
+      </w:r>
+      <w:proofErr w:type="spellStart"/>
+      <w:r>
+        <w:t>publish</w:t>
+      </w:r>
+      <w:proofErr w:type="spellEnd"/>
+      <w:r>
+        <w:t xml:space="preserve"> </w:t>
+      </w:r>
+      <w:proofErr w:type="spellStart"/>
+      <w:r>
+        <w:t>their</w:t>
+      </w:r>
+      <w:proofErr w:type="spellEnd"/>
+      <w:r>
+        <w:t xml:space="preserve"> </w:t>
+      </w:r>
+      <w:proofErr w:type="spellStart"/>
+      <w:r>
+        <w:t>property</w:t>
+      </w:r>
+      <w:proofErr w:type="spellEnd"/>
+      <w:r>
+        <w:t xml:space="preserve"> as a </w:t>
+      </w:r>
+      <w:proofErr w:type="spellStart"/>
+      <w:r>
+        <w:t>whole</w:t>
+      </w:r>
+      <w:proofErr w:type="spellEnd"/>
+      <w:r>
+        <w:t xml:space="preserve">, and </w:t>
+      </w:r>
+      <w:proofErr w:type="spellStart"/>
+      <w:r>
+        <w:t>the</w:t>
+      </w:r>
+      <w:proofErr w:type="spellEnd"/>
+      <w:r>
+        <w:t xml:space="preserve"> </w:t>
+      </w:r>
+      <w:proofErr w:type="spellStart"/>
+      <w:r>
+        <w:t>students</w:t>
+      </w:r>
+      <w:proofErr w:type="spellEnd"/>
+      <w:r>
+        <w:t xml:space="preserve"> </w:t>
+      </w:r>
+      <w:proofErr w:type="spellStart"/>
+      <w:r>
+        <w:t>will</w:t>
+      </w:r>
+      <w:proofErr w:type="spellEnd"/>
+      <w:r>
+        <w:t xml:space="preserve"> </w:t>
+      </w:r>
+      <w:proofErr w:type="spellStart"/>
+      <w:r>
+        <w:t>choose</w:t>
+      </w:r>
+      <w:proofErr w:type="spellEnd"/>
+      <w:r>
+        <w:t xml:space="preserve"> a </w:t>
+      </w:r>
+      <w:proofErr w:type="spellStart"/>
+      <w:r>
+        <w:t>room</w:t>
+      </w:r>
+      <w:proofErr w:type="spellEnd"/>
+      <w:r>
+        <w:t xml:space="preserve"> </w:t>
+      </w:r>
+      <w:proofErr w:type="spellStart"/>
+      <w:r>
+        <w:t>to</w:t>
+      </w:r>
+      <w:proofErr w:type="spellEnd"/>
+      <w:r>
+        <w:t xml:space="preserve"> </w:t>
+      </w:r>
+      <w:proofErr w:type="spellStart"/>
+      <w:r>
+        <w:t>rent</w:t>
+      </w:r>
+      <w:proofErr w:type="spellEnd"/>
+      <w:r>
+        <w:t xml:space="preserve"> </w:t>
+      </w:r>
+      <w:proofErr w:type="spellStart"/>
+      <w:r>
+        <w:t>from</w:t>
+      </w:r>
+      <w:proofErr w:type="spellEnd"/>
+      <w:r>
+        <w:t xml:space="preserve"> </w:t>
+      </w:r>
+      <w:proofErr w:type="spellStart"/>
+      <w:r>
+        <w:t>the</w:t>
+      </w:r>
+      <w:proofErr w:type="spellEnd"/>
+      <w:r>
+        <w:t xml:space="preserve"> </w:t>
+      </w:r>
+      <w:proofErr w:type="spellStart"/>
+      <w:r>
+        <w:t>house</w:t>
+      </w:r>
+      <w:proofErr w:type="spellEnd"/>
+      <w:r>
+        <w:t xml:space="preserve">. </w:t>
       </w:r>
       <w:r>
         <w:br/>
-        <w:t xml:space="preserve">The price of the room won’t change depending on the amount of renters in the house and the duration of the contract will always be 9 months. </w:t>
+        <w:t xml:space="preserve">The </w:t>
+      </w:r>
+      <w:proofErr w:type="spellStart"/>
+      <w:r>
+        <w:t>price</w:t>
+      </w:r>
+      <w:proofErr w:type="spellEnd"/>
+      <w:r>
+        <w:t xml:space="preserve"> </w:t>
+      </w:r>
+      <w:proofErr w:type="spellStart"/>
+      <w:r>
+        <w:t>of</w:t>
+      </w:r>
+      <w:proofErr w:type="spellEnd"/>
+      <w:r>
+        <w:t xml:space="preserve"> </w:t>
+      </w:r>
+      <w:proofErr w:type="spellStart"/>
+      <w:r>
+        <w:t>the</w:t>
+      </w:r>
+      <w:proofErr w:type="spellEnd"/>
+      <w:r>
+        <w:t xml:space="preserve"> </w:t>
+      </w:r>
+      <w:proofErr w:type="spellStart"/>
+      <w:r>
+        <w:t>room</w:t>
+      </w:r>
+      <w:proofErr w:type="spellEnd"/>
+      <w:r>
+        <w:t xml:space="preserve"> </w:t>
+      </w:r>
+      <w:proofErr w:type="spellStart"/>
+      <w:r>
+        <w:t>won’t</w:t>
+      </w:r>
+      <w:proofErr w:type="spellEnd"/>
+      <w:r>
+        <w:t xml:space="preserve"> </w:t>
+      </w:r>
+      <w:proofErr w:type="spellStart"/>
+      <w:r>
+        <w:t>change</w:t>
+      </w:r>
+      <w:proofErr w:type="spellEnd"/>
+      <w:r>
+        <w:t xml:space="preserve"> </w:t>
+      </w:r>
+      <w:proofErr w:type="spellStart"/>
+      <w:r>
+        <w:t>depending</w:t>
+      </w:r>
+      <w:proofErr w:type="spellEnd"/>
+      <w:r>
+        <w:t xml:space="preserve"> </w:t>
+      </w:r>
+      <w:proofErr w:type="spellStart"/>
+      <w:r>
+        <w:t>on</w:t>
+      </w:r>
+      <w:proofErr w:type="spellEnd"/>
+      <w:r>
+        <w:t xml:space="preserve"> </w:t>
+      </w:r>
+      <w:proofErr w:type="spellStart"/>
+      <w:r>
+        <w:t>the</w:t>
+      </w:r>
+      <w:proofErr w:type="spellEnd"/>
+      <w:r>
+        <w:t xml:space="preserve"> </w:t>
+      </w:r>
+      <w:proofErr w:type="spellStart"/>
+      <w:r>
+        <w:t>amount</w:t>
+      </w:r>
+      <w:proofErr w:type="spellEnd"/>
+      <w:r>
+        <w:t xml:space="preserve"> </w:t>
+      </w:r>
+      <w:proofErr w:type="spellStart"/>
+      <w:r>
+        <w:t>of</w:t>
+      </w:r>
+      <w:proofErr w:type="spellEnd"/>
+      <w:r>
+        <w:t xml:space="preserve"> </w:t>
+      </w:r>
+      <w:proofErr w:type="spellStart"/>
+      <w:r>
+        <w:t>renters</w:t>
+      </w:r>
+      <w:proofErr w:type="spellEnd"/>
+      <w:r>
+        <w:t xml:space="preserve"> in </w:t>
+      </w:r>
+      <w:proofErr w:type="spellStart"/>
+      <w:r>
+        <w:t>the</w:t>
+      </w:r>
+      <w:proofErr w:type="spellEnd"/>
+      <w:r>
+        <w:t xml:space="preserve"> </w:t>
+      </w:r>
+      <w:proofErr w:type="spellStart"/>
+      <w:r>
+        <w:t>house</w:t>
+      </w:r>
+      <w:proofErr w:type="spellEnd"/>
+      <w:r>
+        <w:t xml:space="preserve"> and </w:t>
+      </w:r>
+      <w:proofErr w:type="spellStart"/>
+      <w:r>
+        <w:t>the</w:t>
+      </w:r>
+      <w:proofErr w:type="spellEnd"/>
+      <w:r>
+        <w:t xml:space="preserve"> </w:t>
+      </w:r>
+      <w:proofErr w:type="spellStart"/>
+      <w:r>
+        <w:t>duration</w:t>
+      </w:r>
+      <w:proofErr w:type="spellEnd"/>
+      <w:r>
+        <w:t xml:space="preserve"> </w:t>
+      </w:r>
+      <w:proofErr w:type="spellStart"/>
+      <w:r>
+        <w:t>of</w:t>
+      </w:r>
+      <w:proofErr w:type="spellEnd"/>
+      <w:r>
+        <w:t xml:space="preserve"> </w:t>
+      </w:r>
+      <w:proofErr w:type="spellStart"/>
+      <w:r>
+        <w:t>the</w:t>
+      </w:r>
+      <w:proofErr w:type="spellEnd"/>
+      <w:r>
+        <w:t xml:space="preserve"> </w:t>
+      </w:r>
+      <w:proofErr w:type="spellStart"/>
+      <w:r>
+        <w:t>contract</w:t>
+      </w:r>
+      <w:proofErr w:type="spellEnd"/>
+      <w:r>
+        <w:t xml:space="preserve"> </w:t>
+      </w:r>
+      <w:proofErr w:type="spellStart"/>
+      <w:r>
+        <w:t>will</w:t>
+      </w:r>
+      <w:proofErr w:type="spellEnd"/>
+      <w:r>
+        <w:t xml:space="preserve"> </w:t>
+      </w:r>
+      <w:proofErr w:type="spellStart"/>
+      <w:r>
+        <w:t>always</w:t>
+      </w:r>
+      <w:proofErr w:type="spellEnd"/>
+      <w:r>
+        <w:t xml:space="preserve"> be 9 </w:t>
+      </w:r>
+      <w:proofErr w:type="spellStart"/>
+      <w:r>
+        <w:t>months</w:t>
+      </w:r>
+      <w:proofErr w:type="spellEnd"/>
+      <w:r>
+        <w:t xml:space="preserve">. </w:t>
       </w:r>
       <w:r>
         <w:br/>
-        <w:t xml:space="preserve">The deposit will be handled by a third party, and will only be given back with the tenant’s and renter’s signature. </w:t>
+        <w:t xml:space="preserve">The </w:t>
+      </w:r>
+      <w:proofErr w:type="spellStart"/>
+      <w:r>
+        <w:t>deposit</w:t>
+      </w:r>
+      <w:proofErr w:type="spellEnd"/>
+      <w:r>
+        <w:t xml:space="preserve"> </w:t>
+      </w:r>
+      <w:proofErr w:type="spellStart"/>
+      <w:r>
+        <w:t>will</w:t>
+      </w:r>
+      <w:proofErr w:type="spellEnd"/>
+      <w:r>
+        <w:t xml:space="preserve"> be </w:t>
+      </w:r>
+      <w:proofErr w:type="spellStart"/>
+      <w:r>
+        <w:t>handled</w:t>
+      </w:r>
+      <w:proofErr w:type="spellEnd"/>
+      <w:r>
+        <w:t xml:space="preserve"> </w:t>
+      </w:r>
+      <w:proofErr w:type="spellStart"/>
+      <w:r>
+        <w:t>by</w:t>
+      </w:r>
+      <w:proofErr w:type="spellEnd"/>
+      <w:r>
+        <w:t xml:space="preserve"> a </w:t>
+      </w:r>
+      <w:proofErr w:type="spellStart"/>
+      <w:r>
+        <w:t>third</w:t>
+      </w:r>
+      <w:proofErr w:type="spellEnd"/>
+      <w:r>
+        <w:t xml:space="preserve"> </w:t>
+      </w:r>
+      <w:proofErr w:type="spellStart"/>
+      <w:r>
+        <w:t>party</w:t>
+      </w:r>
+      <w:proofErr w:type="spellEnd"/>
+      <w:r>
+        <w:t xml:space="preserve">, and </w:t>
+      </w:r>
+      <w:proofErr w:type="spellStart"/>
+      <w:r>
+        <w:t>will</w:t>
+      </w:r>
+      <w:proofErr w:type="spellEnd"/>
+      <w:r>
+        <w:t xml:space="preserve"> </w:t>
+      </w:r>
+      <w:proofErr w:type="spellStart"/>
+      <w:r>
+        <w:t>only</w:t>
+      </w:r>
+      <w:proofErr w:type="spellEnd"/>
+      <w:r>
+        <w:t xml:space="preserve"> be </w:t>
+      </w:r>
+      <w:proofErr w:type="spellStart"/>
+      <w:r>
+        <w:t>given</w:t>
+      </w:r>
+      <w:proofErr w:type="spellEnd"/>
+      <w:r>
+        <w:t xml:space="preserve"> back </w:t>
+      </w:r>
+      <w:proofErr w:type="spellStart"/>
+      <w:r>
+        <w:t>with</w:t>
+      </w:r>
+      <w:proofErr w:type="spellEnd"/>
+      <w:r>
+        <w:t xml:space="preserve"> </w:t>
+      </w:r>
+      <w:proofErr w:type="spellStart"/>
+      <w:r>
+        <w:t>the</w:t>
+      </w:r>
+      <w:proofErr w:type="spellEnd"/>
+      <w:r>
+        <w:t xml:space="preserve"> </w:t>
+      </w:r>
+      <w:proofErr w:type="spellStart"/>
+      <w:r>
+        <w:t>tenant’s</w:t>
+      </w:r>
+      <w:proofErr w:type="spellEnd"/>
+      <w:r>
+        <w:t xml:space="preserve"> and </w:t>
+      </w:r>
+      <w:proofErr w:type="spellStart"/>
+      <w:r>
+        <w:t>renter’s</w:t>
+      </w:r>
+      <w:proofErr w:type="spellEnd"/>
+      <w:r>
+        <w:t xml:space="preserve"> </w:t>
+      </w:r>
+      <w:proofErr w:type="spellStart"/>
+      <w:r>
+        <w:t>signature</w:t>
+      </w:r>
+      <w:proofErr w:type="spellEnd"/>
+      <w:r>
+        <w:t xml:space="preserve">. </w:t>
       </w:r>
       <w:r>
         <w:br/>
-        <w:t xml:space="preserve">We have used an iterative software methodology to develop the website in different iterations separated by a couple months each. The tasks have been divided using a Trello table and following the KanBan agile methodology, for easier communication and organization. </w:t>
+      </w:r>
+      <w:proofErr w:type="spellStart"/>
+      <w:r>
+        <w:t>We</w:t>
+      </w:r>
+      <w:proofErr w:type="spellEnd"/>
+      <w:r>
+        <w:t xml:space="preserve"> </w:t>
+      </w:r>
+      <w:proofErr w:type="spellStart"/>
+      <w:r>
+        <w:t>have</w:t>
+      </w:r>
+      <w:proofErr w:type="spellEnd"/>
+      <w:r>
+        <w:t xml:space="preserve"> </w:t>
+      </w:r>
+      <w:proofErr w:type="spellStart"/>
+      <w:r>
+        <w:t>used</w:t>
+      </w:r>
+      <w:proofErr w:type="spellEnd"/>
+      <w:r>
+        <w:t xml:space="preserve"> </w:t>
+      </w:r>
+      <w:proofErr w:type="spellStart"/>
+      <w:r>
+        <w:t>an</w:t>
+      </w:r>
+      <w:proofErr w:type="spellEnd"/>
+      <w:r>
+        <w:t xml:space="preserve"> iterative software </w:t>
+      </w:r>
+      <w:proofErr w:type="spellStart"/>
+      <w:r>
+        <w:t>methodology</w:t>
+      </w:r>
+      <w:proofErr w:type="spellEnd"/>
+      <w:r>
+        <w:t xml:space="preserve"> </w:t>
+      </w:r>
+      <w:proofErr w:type="spellStart"/>
+      <w:r>
+        <w:t>to</w:t>
+      </w:r>
+      <w:proofErr w:type="spellEnd"/>
+      <w:r>
+        <w:t xml:space="preserve"> </w:t>
+      </w:r>
+      <w:proofErr w:type="spellStart"/>
+      <w:r>
+        <w:t>develop</w:t>
+      </w:r>
+      <w:proofErr w:type="spellEnd"/>
+      <w:r>
+        <w:t xml:space="preserve"> </w:t>
+      </w:r>
+      <w:proofErr w:type="spellStart"/>
+      <w:r>
+        <w:t>the</w:t>
+      </w:r>
+      <w:proofErr w:type="spellEnd"/>
+      <w:r>
+        <w:t xml:space="preserve"> </w:t>
+      </w:r>
+      <w:proofErr w:type="spellStart"/>
+      <w:r>
+        <w:t>website</w:t>
+      </w:r>
+      <w:proofErr w:type="spellEnd"/>
+      <w:r>
+        <w:t xml:space="preserve"> in </w:t>
+      </w:r>
+      <w:proofErr w:type="spellStart"/>
+      <w:r>
+        <w:t>different</w:t>
+      </w:r>
+      <w:proofErr w:type="spellEnd"/>
+      <w:r>
+        <w:t xml:space="preserve"> </w:t>
+      </w:r>
+      <w:proofErr w:type="spellStart"/>
+      <w:r>
+        <w:t>iterations</w:t>
+      </w:r>
+      <w:proofErr w:type="spellEnd"/>
+      <w:r>
+        <w:t xml:space="preserve"> </w:t>
+      </w:r>
+      <w:proofErr w:type="spellStart"/>
+      <w:r>
+        <w:t>separated</w:t>
+      </w:r>
+      <w:proofErr w:type="spellEnd"/>
+      <w:r>
+        <w:t xml:space="preserve"> </w:t>
+      </w:r>
+      <w:proofErr w:type="spellStart"/>
+      <w:r>
+        <w:t>by</w:t>
+      </w:r>
+      <w:proofErr w:type="spellEnd"/>
+      <w:r>
+        <w:t xml:space="preserve"> a </w:t>
+      </w:r>
+      <w:proofErr w:type="spellStart"/>
+      <w:r>
+        <w:t>couple</w:t>
+      </w:r>
+      <w:proofErr w:type="spellEnd"/>
+      <w:r>
+        <w:t xml:space="preserve"> </w:t>
+      </w:r>
+      <w:proofErr w:type="spellStart"/>
+      <w:r>
+        <w:t>months</w:t>
+      </w:r>
+      <w:proofErr w:type="spellEnd"/>
+      <w:r>
+        <w:t xml:space="preserve"> </w:t>
+      </w:r>
+      <w:proofErr w:type="spellStart"/>
+      <w:r>
+        <w:t>each</w:t>
+      </w:r>
+      <w:proofErr w:type="spellEnd"/>
+      <w:r>
+        <w:t xml:space="preserve">. The </w:t>
+      </w:r>
+      <w:proofErr w:type="spellStart"/>
+      <w:r>
+        <w:t>tasks</w:t>
+      </w:r>
+      <w:proofErr w:type="spellEnd"/>
+      <w:r>
+        <w:t xml:space="preserve"> </w:t>
+      </w:r>
+      <w:proofErr w:type="spellStart"/>
+      <w:r>
+        <w:t>have</w:t>
+      </w:r>
+      <w:proofErr w:type="spellEnd"/>
+      <w:r>
+        <w:t xml:space="preserve"> </w:t>
+      </w:r>
+      <w:proofErr w:type="spellStart"/>
+      <w:r>
+        <w:t>been</w:t>
+      </w:r>
+      <w:proofErr w:type="spellEnd"/>
+      <w:r>
+        <w:t xml:space="preserve"> </w:t>
+      </w:r>
+      <w:proofErr w:type="spellStart"/>
+      <w:r>
+        <w:t>divided</w:t>
+      </w:r>
+      <w:proofErr w:type="spellEnd"/>
+      <w:r>
+        <w:t xml:space="preserve"> </w:t>
+      </w:r>
+      <w:proofErr w:type="spellStart"/>
+      <w:r>
+        <w:t>using</w:t>
+      </w:r>
+      <w:proofErr w:type="spellEnd"/>
+      <w:r>
+        <w:t xml:space="preserve"> a Trello table and </w:t>
+      </w:r>
+      <w:proofErr w:type="spellStart"/>
+      <w:r>
+        <w:t>following</w:t>
+      </w:r>
+      <w:proofErr w:type="spellEnd"/>
+      <w:r>
+        <w:t xml:space="preserve"> </w:t>
+      </w:r>
+      <w:proofErr w:type="spellStart"/>
+      <w:r>
+        <w:t>the</w:t>
+      </w:r>
+      <w:proofErr w:type="spellEnd"/>
+      <w:r>
+        <w:t xml:space="preserve"> </w:t>
+      </w:r>
+      <w:proofErr w:type="spellStart"/>
+      <w:r>
+        <w:t>KanBan</w:t>
+      </w:r>
+      <w:proofErr w:type="spellEnd"/>
+      <w:r>
+        <w:t xml:space="preserve"> agile </w:t>
+      </w:r>
+      <w:proofErr w:type="spellStart"/>
+      <w:r>
+        <w:t>methodology</w:t>
+      </w:r>
+      <w:proofErr w:type="spellEnd"/>
+      <w:r>
+        <w:t xml:space="preserve">, </w:t>
+      </w:r>
+      <w:proofErr w:type="spellStart"/>
+      <w:r>
+        <w:t>for</w:t>
+      </w:r>
+      <w:proofErr w:type="spellEnd"/>
+      <w:r>
+        <w:t xml:space="preserve"> </w:t>
+      </w:r>
+      <w:proofErr w:type="spellStart"/>
+      <w:r>
+        <w:t>easier</w:t>
+      </w:r>
+      <w:proofErr w:type="spellEnd"/>
+      <w:r>
+        <w:t xml:space="preserve"> </w:t>
+      </w:r>
+      <w:proofErr w:type="spellStart"/>
+      <w:r>
+        <w:t>communication</w:t>
+      </w:r>
+      <w:proofErr w:type="spellEnd"/>
+      <w:r>
+        <w:t xml:space="preserve"> and </w:t>
+      </w:r>
+      <w:proofErr w:type="spellStart"/>
+      <w:r>
+        <w:t>organization</w:t>
+      </w:r>
+      <w:proofErr w:type="spellEnd"/>
+      <w:r>
+        <w:t xml:space="preserve">. </w:t>
       </w:r>
       <w:r>
         <w:br/>
       </w:r>
-      <w:r>
-        <w:t xml:space="preserve">It’s </w:t>
-      </w:r>
-      <w:r>
-        <w:t xml:space="preserve">used HTML, CSS and JavaScript to create the frontend of the website, SQL server management studio to create the databases and IntelliJ IDEA as an IDE to program the backend using Java. </w:t>
-      </w:r>
-    </w:p>
-    <w:p>
-      <w:r>
-        <w:t>In the end,</w:t>
-      </w:r>
-      <w:r>
-        <w:t xml:space="preserve"> it’s</w:t>
-      </w:r>
-      <w:r>
-        <w:t xml:space="preserve"> a friendly website that will protect the young students from scams and abusive practices; and will make the process of renting outside your hometown a more pleasant experience.</w:t>
+      <w:proofErr w:type="spellStart"/>
+      <w:r>
+        <w:t>It’s</w:t>
+      </w:r>
+      <w:proofErr w:type="spellEnd"/>
+      <w:r>
+        <w:t xml:space="preserve"> </w:t>
+      </w:r>
+      <w:proofErr w:type="spellStart"/>
+      <w:r>
+        <w:t>used</w:t>
+      </w:r>
+      <w:proofErr w:type="spellEnd"/>
+      <w:r>
+        <w:t xml:space="preserve"> HTML, CSS and JavaScript </w:t>
+      </w:r>
+      <w:proofErr w:type="spellStart"/>
+      <w:r>
+        <w:t>to</w:t>
+      </w:r>
+      <w:proofErr w:type="spellEnd"/>
+      <w:r>
+        <w:t xml:space="preserve"> </w:t>
+      </w:r>
+      <w:proofErr w:type="spellStart"/>
+      <w:r>
+        <w:t>create</w:t>
+      </w:r>
+      <w:proofErr w:type="spellEnd"/>
+      <w:r>
+        <w:t xml:space="preserve"> </w:t>
+      </w:r>
+      <w:proofErr w:type="spellStart"/>
+      <w:r>
+        <w:t>the</w:t>
+      </w:r>
+      <w:proofErr w:type="spellEnd"/>
+      <w:r>
+        <w:t xml:space="preserve"> </w:t>
+      </w:r>
+      <w:proofErr w:type="spellStart"/>
+      <w:r>
+        <w:t>frontend</w:t>
+      </w:r>
+      <w:proofErr w:type="spellEnd"/>
+      <w:r>
+        <w:t xml:space="preserve"> </w:t>
+      </w:r>
+      <w:proofErr w:type="spellStart"/>
+      <w:r>
+        <w:t>of</w:t>
+      </w:r>
+      <w:proofErr w:type="spellEnd"/>
+      <w:r>
+        <w:t xml:space="preserve"> </w:t>
+      </w:r>
+      <w:proofErr w:type="spellStart"/>
+      <w:r>
+        <w:t>the</w:t>
+      </w:r>
+      <w:proofErr w:type="spellEnd"/>
+      <w:r>
+        <w:t xml:space="preserve"> </w:t>
+      </w:r>
+      <w:proofErr w:type="spellStart"/>
+      <w:r>
+        <w:t>website</w:t>
+      </w:r>
+      <w:proofErr w:type="spellEnd"/>
+      <w:r>
+        <w:t xml:space="preserve">, SQL server </w:t>
+      </w:r>
+      <w:proofErr w:type="spellStart"/>
+      <w:r>
+        <w:t>management</w:t>
+      </w:r>
+      <w:proofErr w:type="spellEnd"/>
+      <w:r>
+        <w:t xml:space="preserve"> </w:t>
+      </w:r>
+      <w:proofErr w:type="spellStart"/>
+      <w:r>
+        <w:t>studio</w:t>
+      </w:r>
+      <w:proofErr w:type="spellEnd"/>
+      <w:r>
+        <w:t xml:space="preserve"> </w:t>
+      </w:r>
+      <w:proofErr w:type="spellStart"/>
+      <w:r>
+        <w:t>to</w:t>
+      </w:r>
+      <w:proofErr w:type="spellEnd"/>
+      <w:r>
+        <w:t xml:space="preserve"> </w:t>
+      </w:r>
+      <w:proofErr w:type="spellStart"/>
+      <w:r>
+        <w:t>create</w:t>
+      </w:r>
+      <w:proofErr w:type="spellEnd"/>
+      <w:r>
+        <w:t xml:space="preserve"> </w:t>
+      </w:r>
+      <w:proofErr w:type="spellStart"/>
+      <w:r>
+        <w:t>the</w:t>
+      </w:r>
+      <w:proofErr w:type="spellEnd"/>
+      <w:r>
+        <w:t xml:space="preserve"> </w:t>
+      </w:r>
+      <w:proofErr w:type="spellStart"/>
+      <w:r>
+        <w:t>databases</w:t>
+      </w:r>
+      <w:proofErr w:type="spellEnd"/>
+      <w:r>
+        <w:t xml:space="preserve"> and IntelliJ IDEA as </w:t>
+      </w:r>
+      <w:proofErr w:type="spellStart"/>
+      <w:proofErr w:type="gramStart"/>
+      <w:r>
+        <w:t>an</w:t>
+      </w:r>
+      <w:proofErr w:type="spellEnd"/>
+      <w:r>
+        <w:t xml:space="preserve"> IDE</w:t>
+      </w:r>
+      <w:proofErr w:type="gramEnd"/>
+      <w:r>
+        <w:t xml:space="preserve"> </w:t>
+      </w:r>
+      <w:proofErr w:type="spellStart"/>
+      <w:r>
+        <w:t>to</w:t>
+      </w:r>
+      <w:proofErr w:type="spellEnd"/>
+      <w:r>
+        <w:t xml:space="preserve"> </w:t>
+      </w:r>
+      <w:proofErr w:type="spellStart"/>
+      <w:r>
+        <w:t>program</w:t>
+      </w:r>
+      <w:proofErr w:type="spellEnd"/>
+      <w:r>
+        <w:t xml:space="preserve"> </w:t>
+      </w:r>
+      <w:proofErr w:type="spellStart"/>
+      <w:r>
+        <w:t>the</w:t>
+      </w:r>
+      <w:proofErr w:type="spellEnd"/>
+      <w:r>
+        <w:t xml:space="preserve"> </w:t>
+      </w:r>
+      <w:proofErr w:type="spellStart"/>
+      <w:r>
+        <w:t>backend</w:t>
+      </w:r>
+      <w:proofErr w:type="spellEnd"/>
+      <w:r>
+        <w:t xml:space="preserve"> </w:t>
+      </w:r>
+      <w:proofErr w:type="spellStart"/>
+      <w:r>
+        <w:t>using</w:t>
+      </w:r>
+      <w:proofErr w:type="spellEnd"/>
+      <w:r>
+        <w:t xml:space="preserve"> Java. </w:t>
+      </w:r>
+    </w:p>
+    <w:p>
+      <w:r>
+        <w:t xml:space="preserve">In </w:t>
+      </w:r>
+      <w:proofErr w:type="spellStart"/>
+      <w:r>
+        <w:t>the</w:t>
+      </w:r>
+      <w:proofErr w:type="spellEnd"/>
+      <w:r>
+        <w:t xml:space="preserve"> </w:t>
+      </w:r>
+      <w:proofErr w:type="spellStart"/>
+      <w:r>
+        <w:t>end</w:t>
+      </w:r>
+      <w:proofErr w:type="spellEnd"/>
+      <w:r>
+        <w:t>,</w:t>
+      </w:r>
+      <w:r>
+        <w:t xml:space="preserve"> </w:t>
+      </w:r>
+      <w:proofErr w:type="spellStart"/>
+      <w:r>
+        <w:t>it’s</w:t>
+      </w:r>
+      <w:proofErr w:type="spellEnd"/>
+      <w:r>
+        <w:t xml:space="preserve"> a </w:t>
+      </w:r>
+      <w:proofErr w:type="spellStart"/>
+      <w:r>
+        <w:t>friendly</w:t>
+      </w:r>
+      <w:proofErr w:type="spellEnd"/>
+      <w:r>
+        <w:t xml:space="preserve"> </w:t>
+      </w:r>
+      <w:proofErr w:type="spellStart"/>
+      <w:r>
+        <w:t>website</w:t>
+      </w:r>
+      <w:proofErr w:type="spellEnd"/>
+      <w:r>
+        <w:t xml:space="preserve"> </w:t>
+      </w:r>
+      <w:proofErr w:type="spellStart"/>
+      <w:r>
+        <w:t>that</w:t>
+      </w:r>
+      <w:proofErr w:type="spellEnd"/>
+      <w:r>
+        <w:t xml:space="preserve"> </w:t>
+      </w:r>
+      <w:proofErr w:type="spellStart"/>
+      <w:r>
+        <w:t>will</w:t>
+      </w:r>
+      <w:proofErr w:type="spellEnd"/>
+      <w:r>
+        <w:t xml:space="preserve"> </w:t>
+      </w:r>
+      <w:proofErr w:type="spellStart"/>
+      <w:r>
+        <w:t>protect</w:t>
+      </w:r>
+      <w:proofErr w:type="spellEnd"/>
+      <w:r>
+        <w:t xml:space="preserve"> </w:t>
+      </w:r>
+      <w:proofErr w:type="spellStart"/>
+      <w:r>
+        <w:t>the</w:t>
+      </w:r>
+      <w:proofErr w:type="spellEnd"/>
+      <w:r>
+        <w:t xml:space="preserve"> </w:t>
+      </w:r>
+      <w:proofErr w:type="spellStart"/>
+      <w:r>
+        <w:t>young</w:t>
+      </w:r>
+      <w:proofErr w:type="spellEnd"/>
+      <w:r>
+        <w:t xml:space="preserve"> </w:t>
+      </w:r>
+      <w:proofErr w:type="spellStart"/>
+      <w:r>
+        <w:t>students</w:t>
+      </w:r>
+      <w:proofErr w:type="spellEnd"/>
+      <w:r>
+        <w:t xml:space="preserve"> </w:t>
+      </w:r>
+      <w:proofErr w:type="spellStart"/>
+      <w:r>
+        <w:t>from</w:t>
+      </w:r>
+      <w:proofErr w:type="spellEnd"/>
+      <w:r>
+        <w:t xml:space="preserve"> </w:t>
+      </w:r>
+      <w:proofErr w:type="spellStart"/>
+      <w:r>
+        <w:t>scams</w:t>
+      </w:r>
+      <w:proofErr w:type="spellEnd"/>
+      <w:r>
+        <w:t xml:space="preserve"> and abusive </w:t>
+      </w:r>
+      <w:proofErr w:type="spellStart"/>
+      <w:r>
+        <w:t>practices</w:t>
+      </w:r>
+      <w:proofErr w:type="spellEnd"/>
+      <w:r>
+        <w:t xml:space="preserve">; and </w:t>
+      </w:r>
+      <w:proofErr w:type="spellStart"/>
+      <w:r>
+        <w:t>will</w:t>
+      </w:r>
+      <w:proofErr w:type="spellEnd"/>
+      <w:r>
+        <w:t xml:space="preserve"> </w:t>
+      </w:r>
+      <w:proofErr w:type="spellStart"/>
+      <w:r>
+        <w:t>make</w:t>
+      </w:r>
+      <w:proofErr w:type="spellEnd"/>
+      <w:r>
+        <w:t xml:space="preserve"> </w:t>
+      </w:r>
+      <w:proofErr w:type="spellStart"/>
+      <w:r>
+        <w:t>the</w:t>
+      </w:r>
+      <w:proofErr w:type="spellEnd"/>
+      <w:r>
+        <w:t xml:space="preserve"> </w:t>
+      </w:r>
+      <w:proofErr w:type="spellStart"/>
+      <w:r>
+        <w:t>process</w:t>
+      </w:r>
+      <w:proofErr w:type="spellEnd"/>
+      <w:r>
+        <w:t xml:space="preserve"> </w:t>
+      </w:r>
+      <w:proofErr w:type="spellStart"/>
+      <w:r>
+        <w:t>of</w:t>
+      </w:r>
+      <w:proofErr w:type="spellEnd"/>
+      <w:r>
+        <w:t xml:space="preserve"> renting </w:t>
+      </w:r>
+      <w:proofErr w:type="spellStart"/>
+      <w:r>
+        <w:t>outside</w:t>
+      </w:r>
+      <w:proofErr w:type="spellEnd"/>
+      <w:r>
+        <w:t xml:space="preserve"> </w:t>
+      </w:r>
+      <w:proofErr w:type="spellStart"/>
+      <w:r>
+        <w:t>your</w:t>
+      </w:r>
+      <w:proofErr w:type="spellEnd"/>
+      <w:r>
+        <w:t xml:space="preserve"> </w:t>
+      </w:r>
+      <w:proofErr w:type="spellStart"/>
+      <w:r>
+        <w:t>hometown</w:t>
+      </w:r>
+      <w:proofErr w:type="spellEnd"/>
+      <w:r>
+        <w:t xml:space="preserve"> a more </w:t>
+      </w:r>
+      <w:proofErr w:type="spellStart"/>
+      <w:r>
+        <w:t>pleasant</w:t>
+      </w:r>
+      <w:proofErr w:type="spellEnd"/>
+      <w:r>
+        <w:t xml:space="preserve"> </w:t>
+      </w:r>
+      <w:proofErr w:type="spellStart"/>
+      <w:r>
+        <w:t>experience</w:t>
+      </w:r>
+      <w:proofErr w:type="spellEnd"/>
+      <w:r>
+        <w:t>.</w:t>
       </w:r>
     </w:p>
     <w:p>
@@ -2035,6 +3342,7 @@
         </w:rPr>
         <w:t>'</w:t>
       </w:r>
+      <w:proofErr w:type="spellStart"/>
       <w:r>
         <w:rPr>
           <w:rFonts w:ascii="Aptos" w:eastAsia="Aptos" w:hAnsi="Aptos" w:cs="Aptos"/>
@@ -2043,6 +3351,7 @@
         </w:rPr>
         <w:t>Roomie</w:t>
       </w:r>
+      <w:proofErr w:type="spellEnd"/>
       <w:r>
         <w:rPr>
           <w:rFonts w:ascii="Aptos" w:eastAsia="Aptos" w:hAnsi="Aptos" w:cs="Aptos"/>
@@ -2078,6 +3387,7 @@
         <w:spacing w:before="240" w:after="142" w:line="276" w:lineRule="auto"/>
         <w:jc w:val="both"/>
       </w:pPr>
+      <w:proofErr w:type="spellStart"/>
       <w:r>
         <w:rPr>
           <w:rFonts w:ascii="Aptos" w:eastAsia="Aptos" w:hAnsi="Aptos" w:cs="Aptos"/>
@@ -2086,11 +3396,54 @@
         </w:rPr>
         <w:t>Roomie</w:t>
       </w:r>
-      <w:r>
-        <w:rPr>
-          <w:rFonts w:ascii="Aptos" w:eastAsia="Aptos" w:hAnsi="Aptos" w:cs="Aptos"/>
-        </w:rPr>
-        <w:t xml:space="preserve"> toma como premisa la dificultad que presenta para un joven recién alcanzada la mayoría de edad, encontrar una residencia temporal mientras se cursa el año académico. El resto de páginas web ofrecen todo tipo de productos inmobiliarios, desde alquiler y compra de pisos para residencia indefinida hasta de naves industriales y oficinas. Alquiler de estudios y habitaciones también está comprendido pero la oferta, aunque sea elevada, se diluye entre el resto de anuncios. Como resultado, el cliente puede abrumarse y sentirse frustrado con el proceso, sobre todo al tratarse de alguien joven.</w:t>
+      <w:proofErr w:type="spellEnd"/>
+      <w:r>
+        <w:rPr>
+          <w:rFonts w:ascii="Aptos" w:eastAsia="Aptos" w:hAnsi="Aptos" w:cs="Aptos"/>
+        </w:rPr>
+        <w:t xml:space="preserve"> toma como premisa la dificultad que presenta para </w:t>
+      </w:r>
+      <w:proofErr w:type="gramStart"/>
+      <w:r>
+        <w:rPr>
+          <w:rFonts w:ascii="Aptos" w:eastAsia="Aptos" w:hAnsi="Aptos" w:cs="Aptos"/>
+        </w:rPr>
+        <w:t>un joven recién alcanzada</w:t>
+      </w:r>
+      <w:proofErr w:type="gramEnd"/>
+      <w:r>
+        <w:rPr>
+          <w:rFonts w:ascii="Aptos" w:eastAsia="Aptos" w:hAnsi="Aptos" w:cs="Aptos"/>
+        </w:rPr>
+        <w:t xml:space="preserve"> la mayoría de edad, encontrar una residencia temporal mientras se cursa el año académico. El resto de </w:t>
+      </w:r>
+      <w:proofErr w:type="gramStart"/>
+      <w:r>
+        <w:rPr>
+          <w:rFonts w:ascii="Aptos" w:eastAsia="Aptos" w:hAnsi="Aptos" w:cs="Aptos"/>
+        </w:rPr>
+        <w:t>páginas</w:t>
+      </w:r>
+      <w:proofErr w:type="gramEnd"/>
+      <w:r>
+        <w:rPr>
+          <w:rFonts w:ascii="Aptos" w:eastAsia="Aptos" w:hAnsi="Aptos" w:cs="Aptos"/>
+        </w:rPr>
+        <w:t xml:space="preserve"> web ofrecen todo tipo de productos inmobiliarios, desde alquiler y compra de pisos para residencia indefinida hasta de naves industriales y oficinas. Alquiler de estudios y habitaciones también está comprendido pero la oferta, aunque sea elevada, se diluye entre el resto de </w:t>
+      </w:r>
+      <w:proofErr w:type="gramStart"/>
+      <w:r>
+        <w:rPr>
+          <w:rFonts w:ascii="Aptos" w:eastAsia="Aptos" w:hAnsi="Aptos" w:cs="Aptos"/>
+        </w:rPr>
+        <w:t>anuncios</w:t>
+      </w:r>
+      <w:proofErr w:type="gramEnd"/>
+      <w:r>
+        <w:rPr>
+          <w:rFonts w:ascii="Aptos" w:eastAsia="Aptos" w:hAnsi="Aptos" w:cs="Aptos"/>
+        </w:rPr>
+        <w:t>. Como resultado, el cliente puede abrumarse y sentirse frustrado con el proceso, sobre todo al tratarse de alguien joven.</w:t>
       </w:r>
     </w:p>
     <w:p>
@@ -2318,7 +3671,23 @@
           <w:b/>
           <w:bCs/>
         </w:rPr>
-        <w:t xml:space="preserve">-01 (M) Registro y login: </w:t>
+        <w:t xml:space="preserve">-01 (M) Registro y </w:t>
+      </w:r>
+      <w:proofErr w:type="spellStart"/>
+      <w:r>
+        <w:rPr>
+          <w:b/>
+          <w:bCs/>
+        </w:rPr>
+        <w:t>login</w:t>
+      </w:r>
+      <w:proofErr w:type="spellEnd"/>
+      <w:r>
+        <w:rPr>
+          <w:b/>
+          <w:bCs/>
+        </w:rPr>
+        <w:t xml:space="preserve">: </w:t>
       </w:r>
       <w:r>
         <w:t>El sistema permitirá al inquilino crear una cuenta con la que acceder a la página web.</w:t>
@@ -2905,7 +4274,23 @@
           <w:b/>
           <w:bCs/>
         </w:rPr>
-        <w:t xml:space="preserve">RFA-01 (M) Registro y login: </w:t>
+        <w:t xml:space="preserve">RFA-01 (M) Registro y </w:t>
+      </w:r>
+      <w:proofErr w:type="spellStart"/>
+      <w:r>
+        <w:rPr>
+          <w:b/>
+          <w:bCs/>
+        </w:rPr>
+        <w:t>login</w:t>
+      </w:r>
+      <w:proofErr w:type="spellEnd"/>
+      <w:r>
+        <w:rPr>
+          <w:b/>
+          <w:bCs/>
+        </w:rPr>
+        <w:t xml:space="preserve">: </w:t>
       </w:r>
       <w:r>
         <w:t>El sistema permitirá al arrendador crear una cuenta con la que acceder a la página web.</w:t>
@@ -3598,7 +4983,23 @@
           <w:b/>
           <w:bCs/>
         </w:rPr>
-        <w:t>RFAD-01(M) Registro y login:</w:t>
+        <w:t xml:space="preserve">RFAD-01(M) Registro y </w:t>
+      </w:r>
+      <w:proofErr w:type="spellStart"/>
+      <w:r>
+        <w:rPr>
+          <w:b/>
+          <w:bCs/>
+        </w:rPr>
+        <w:t>login</w:t>
+      </w:r>
+      <w:proofErr w:type="spellEnd"/>
+      <w:r>
+        <w:rPr>
+          <w:b/>
+          <w:bCs/>
+        </w:rPr>
+        <w:t>:</w:t>
       </w:r>
       <w:r>
         <w:t xml:space="preserve"> El sistema deberá permitir al administrador crear una cuenta con la que acceder a la página web.</w:t>
@@ -3802,27 +5203,14 @@
       <w:pPr>
         <w:pStyle w:val="Descripcin"/>
       </w:pPr>
-      <w:r>
-        <w:fldChar w:fldCharType="begin"/>
-      </w:r>
-      <w:r>
-        <w:instrText xml:space="preserve"> SEQ Ilustración \* ARABIC </w:instrText>
-      </w:r>
-      <w:r>
-        <w:fldChar w:fldCharType="separate"/>
-      </w:r>
-      <w:r>
-        <w:rPr>
-          <w:noProof/>
-        </w:rPr>
-        <w:t>1</w:t>
-      </w:r>
-      <w:r>
-        <w:rPr>
-          <w:noProof/>
-        </w:rPr>
-        <w:fldChar w:fldCharType="end"/>
-      </w:r>
+      <w:fldSimple w:instr=" SEQ Ilustración \* ARABIC ">
+        <w:r>
+          <w:rPr>
+            <w:noProof/>
+          </w:rPr>
+          <w:t>1</w:t>
+        </w:r>
+      </w:fldSimple>
       <w:r>
         <w:t xml:space="preserve"> Diagrama arquitectura</w:t>
       </w:r>
@@ -3926,28 +5314,15 @@
       <w:pPr>
         <w:pStyle w:val="Descripcin"/>
       </w:pPr>
-      <w:r>
-        <w:fldChar w:fldCharType="begin"/>
-      </w:r>
-      <w:r>
-        <w:instrText xml:space="preserve"> SEQ Ilustración \* ARABIC </w:instrText>
-      </w:r>
-      <w:r>
-        <w:fldChar w:fldCharType="separate"/>
-      </w:r>
-      <w:bookmarkStart w:id="8" w:name="_Toc223618249"/>
-      <w:r>
-        <w:rPr>
-          <w:noProof/>
-        </w:rPr>
-        <w:t>2</w:t>
-      </w:r>
-      <w:r>
-        <w:rPr>
-          <w:noProof/>
-        </w:rPr>
-        <w:fldChar w:fldCharType="end"/>
-      </w:r>
+      <w:fldSimple w:instr=" SEQ Ilustración \* ARABIC ">
+        <w:bookmarkStart w:id="8" w:name="_Toc223618249"/>
+        <w:r>
+          <w:rPr>
+            <w:noProof/>
+          </w:rPr>
+          <w:t>2</w:t>
+        </w:r>
+      </w:fldSimple>
       <w:r>
         <w:t>-</w:t>
       </w:r>
@@ -3961,7 +5336,15 @@
         <w:jc w:val="both"/>
       </w:pPr>
       <w:r>
-        <w:t xml:space="preserve">En la web “Roomie” habrá 3 posibles usuarios diferentes. Inquilino, arrendador y administrador. En le diagrama de casos de uso se puede observar las posibles acciones únicas y compartidas que tienen los diferentes usuarios. </w:t>
+        <w:t>En la web “</w:t>
+      </w:r>
+      <w:proofErr w:type="spellStart"/>
+      <w:r>
+        <w:t>Roomie</w:t>
+      </w:r>
+      <w:proofErr w:type="spellEnd"/>
+      <w:r>
+        <w:t xml:space="preserve">” habrá 3 posibles usuarios diferentes. Inquilino, arrendador y administrador. En le diagrama de casos de uso se puede observar las posibles acciones únicas y compartidas que tienen los diferentes usuarios. </w:t>
       </w:r>
       <w:r>
         <w:br w:type="page"/>
@@ -4034,28 +5417,15 @@
       <w:pPr>
         <w:pStyle w:val="Descripcin"/>
       </w:pPr>
-      <w:r>
-        <w:fldChar w:fldCharType="begin"/>
-      </w:r>
-      <w:r>
-        <w:instrText xml:space="preserve"> SEQ Ilustración \* ARABIC </w:instrText>
-      </w:r>
-      <w:r>
-        <w:fldChar w:fldCharType="separate"/>
-      </w:r>
-      <w:bookmarkStart w:id="10" w:name="_Toc223618250"/>
-      <w:r>
-        <w:rPr>
-          <w:noProof/>
-        </w:rPr>
-        <w:t>3</w:t>
-      </w:r>
-      <w:r>
-        <w:rPr>
-          <w:noProof/>
-        </w:rPr>
-        <w:fldChar w:fldCharType="end"/>
-      </w:r>
+      <w:fldSimple w:instr=" SEQ Ilustración \* ARABIC ">
+        <w:bookmarkStart w:id="10" w:name="_Toc223618250"/>
+        <w:r>
+          <w:rPr>
+            <w:noProof/>
+          </w:rPr>
+          <w:t>3</w:t>
+        </w:r>
+      </w:fldSimple>
       <w:r>
         <w:t>- Diagrama de clases</w:t>
       </w:r>
@@ -4126,27 +5496,14 @@
       <w:pPr>
         <w:pStyle w:val="Descripcin"/>
       </w:pPr>
-      <w:r>
-        <w:fldChar w:fldCharType="begin"/>
-      </w:r>
-      <w:r>
-        <w:instrText xml:space="preserve"> SEQ Ilustración \* ARABIC </w:instrText>
-      </w:r>
-      <w:r>
-        <w:fldChar w:fldCharType="separate"/>
-      </w:r>
-      <w:r>
-        <w:rPr>
-          <w:noProof/>
-        </w:rPr>
-        <w:t>4</w:t>
-      </w:r>
-      <w:r>
-        <w:rPr>
-          <w:noProof/>
-        </w:rPr>
-        <w:fldChar w:fldCharType="end"/>
-      </w:r>
+      <w:fldSimple w:instr=" SEQ Ilustración \* ARABIC ">
+        <w:r>
+          <w:rPr>
+            <w:noProof/>
+          </w:rPr>
+          <w:t>4</w:t>
+        </w:r>
+      </w:fldSimple>
       <w:r>
         <w:t xml:space="preserve"> Diagrama entidad-relación</w:t>
       </w:r>
@@ -4156,7 +5513,23 @@
         <w:jc w:val="both"/>
       </w:pPr>
       <w:r>
-        <w:t xml:space="preserve">Tanto en el diagrama de clases (Ilustración 3), como en el diagrama entidad relación (Ilustración 4); se pueden observar las entidades que van a componer la web “Roomie”. Los usuarios registrados, los pisos añadidos, los contratos pendientes y las habitaciones con sus muebles, son los datos que se guardarán en la base de datos y que manipularemos a través de programación orientada a objetos. </w:t>
+        <w:t>Tanto en el diagrama de clases (Ilustración 3), como en el diagrama entidad relación (Ilustración 4); se pueden observar las entidades que van a componer la web “</w:t>
+      </w:r>
+      <w:proofErr w:type="spellStart"/>
+      <w:r>
+        <w:t>Roomie</w:t>
+      </w:r>
+      <w:proofErr w:type="spellEnd"/>
+      <w:r>
+        <w:t xml:space="preserve">”. Los usuarios registrados, los pisos añadidos, los contratos pendientes y las habitaciones con sus </w:t>
+      </w:r>
+      <w:proofErr w:type="gramStart"/>
+      <w:r>
+        <w:t>muebles,</w:t>
+      </w:r>
+      <w:proofErr w:type="gramEnd"/>
+      <w:r>
+        <w:t xml:space="preserve"> son los datos que se guardarán en la base de datos y que manipularemos a través de programación orientada a objetos. </w:t>
       </w:r>
     </w:p>
     <w:p>
@@ -4174,6 +5547,7 @@
           <w:numId w:val="18"/>
         </w:numPr>
       </w:pPr>
+      <w:proofErr w:type="gramStart"/>
       <w:r>
         <w:rPr>
           <w:b/>
@@ -4184,14 +5558,67 @@
       <w:r>
         <w:t>(</w:t>
       </w:r>
+      <w:proofErr w:type="spellStart"/>
+      <w:proofErr w:type="gramEnd"/>
       <w:r>
         <w:rPr>
           <w:u w:val="single"/>
         </w:rPr>
         <w:t>dni</w:t>
       </w:r>
-      <w:r>
-        <w:t>, name, surnames, username, password, phone, email, birthdate)</w:t>
+      <w:proofErr w:type="spellEnd"/>
+      <w:r>
+        <w:t xml:space="preserve">, </w:t>
+      </w:r>
+      <w:proofErr w:type="spellStart"/>
+      <w:r>
+        <w:t>name</w:t>
+      </w:r>
+      <w:proofErr w:type="spellEnd"/>
+      <w:r>
+        <w:t xml:space="preserve">, </w:t>
+      </w:r>
+      <w:proofErr w:type="spellStart"/>
+      <w:r>
+        <w:t>surnames</w:t>
+      </w:r>
+      <w:proofErr w:type="spellEnd"/>
+      <w:r>
+        <w:t xml:space="preserve">, </w:t>
+      </w:r>
+      <w:proofErr w:type="spellStart"/>
+      <w:r>
+        <w:t>username</w:t>
+      </w:r>
+      <w:proofErr w:type="spellEnd"/>
+      <w:r>
+        <w:t xml:space="preserve">, </w:t>
+      </w:r>
+      <w:proofErr w:type="spellStart"/>
+      <w:proofErr w:type="gramStart"/>
+      <w:r>
+        <w:t>password</w:t>
+      </w:r>
+      <w:proofErr w:type="spellEnd"/>
+      <w:proofErr w:type="gramEnd"/>
+      <w:r>
+        <w:t xml:space="preserve">, </w:t>
+      </w:r>
+      <w:proofErr w:type="spellStart"/>
+      <w:r>
+        <w:t>phone</w:t>
+      </w:r>
+      <w:proofErr w:type="spellEnd"/>
+      <w:r>
+        <w:t xml:space="preserve">, email, </w:t>
+      </w:r>
+      <w:proofErr w:type="spellStart"/>
+      <w:r>
+        <w:t>birthdate</w:t>
+      </w:r>
+      <w:proofErr w:type="spellEnd"/>
+      <w:r>
+        <w:t>)</w:t>
       </w:r>
     </w:p>
     <w:p>
@@ -4201,6 +5628,7 @@
           <w:numId w:val="18"/>
         </w:numPr>
       </w:pPr>
+      <w:proofErr w:type="gramStart"/>
       <w:r>
         <w:rPr>
           <w:b/>
@@ -4211,6 +5639,8 @@
       <w:r>
         <w:t>(</w:t>
       </w:r>
+      <w:proofErr w:type="spellStart"/>
+      <w:proofErr w:type="gramEnd"/>
       <w:r>
         <w:rPr>
           <w:color w:val="EE0000"/>
@@ -4218,6 +5648,7 @@
         </w:rPr>
         <w:t>dni</w:t>
       </w:r>
+      <w:proofErr w:type="spellEnd"/>
       <w:r>
         <w:rPr>
           <w:color w:val="EE0000"/>
@@ -4225,7 +5656,15 @@
         <w:t xml:space="preserve"> </w:t>
       </w:r>
       <w:r>
-        <w:t>-&gt; USER, studentLicense)</w:t>
+        <w:t xml:space="preserve">-&gt; USER, </w:t>
+      </w:r>
+      <w:proofErr w:type="spellStart"/>
+      <w:r>
+        <w:t>studentLicense</w:t>
+      </w:r>
+      <w:proofErr w:type="spellEnd"/>
+      <w:r>
+        <w:t>)</w:t>
       </w:r>
     </w:p>
     <w:p>
@@ -4235,6 +5674,7 @@
           <w:numId w:val="18"/>
         </w:numPr>
       </w:pPr>
+      <w:proofErr w:type="gramStart"/>
       <w:r>
         <w:rPr>
           <w:b/>
@@ -4245,6 +5685,8 @@
       <w:r>
         <w:t>(</w:t>
       </w:r>
+      <w:proofErr w:type="spellStart"/>
+      <w:proofErr w:type="gramEnd"/>
       <w:r>
         <w:rPr>
           <w:color w:val="EE0000"/>
@@ -4252,6 +5694,7 @@
         </w:rPr>
         <w:t>dni</w:t>
       </w:r>
+      <w:proofErr w:type="spellEnd"/>
       <w:r>
         <w:t xml:space="preserve"> -&gt; USER)</w:t>
       </w:r>
@@ -4263,6 +5706,7 @@
           <w:numId w:val="18"/>
         </w:numPr>
       </w:pPr>
+      <w:proofErr w:type="gramStart"/>
       <w:r>
         <w:rPr>
           <w:b/>
@@ -4273,12 +5717,15 @@
       <w:r>
         <w:t>(</w:t>
       </w:r>
+      <w:proofErr w:type="spellStart"/>
+      <w:proofErr w:type="gramEnd"/>
       <w:r>
         <w:rPr>
           <w:u w:val="single"/>
         </w:rPr>
         <w:t>signatureDate</w:t>
       </w:r>
+      <w:proofErr w:type="spellEnd"/>
       <w:r>
         <w:t xml:space="preserve">, </w:t>
       </w:r>
@@ -4288,23 +5735,59 @@
         </w:rPr>
         <w:t>(</w:t>
       </w:r>
+      <w:proofErr w:type="spellStart"/>
       <w:r>
         <w:rPr>
           <w:color w:val="EE0000"/>
           <w:u w:val="single"/>
         </w:rPr>
-        <w:t>num, type, address</w:t>
-      </w:r>
-      <w:r>
-        <w:t xml:space="preserve">) -&gt; ROOM, </w:t>
-      </w:r>
+        <w:t>num</w:t>
+      </w:r>
+      <w:proofErr w:type="spellEnd"/>
       <w:r>
         <w:rPr>
           <w:color w:val="EE0000"/>
           <w:u w:val="single"/>
         </w:rPr>
+        <w:t xml:space="preserve">, </w:t>
+      </w:r>
+      <w:proofErr w:type="spellStart"/>
+      <w:r>
+        <w:rPr>
+          <w:color w:val="EE0000"/>
+          <w:u w:val="single"/>
+        </w:rPr>
+        <w:t>type</w:t>
+      </w:r>
+      <w:proofErr w:type="spellEnd"/>
+      <w:r>
+        <w:rPr>
+          <w:color w:val="EE0000"/>
+          <w:u w:val="single"/>
+        </w:rPr>
+        <w:t xml:space="preserve">, </w:t>
+      </w:r>
+      <w:proofErr w:type="spellStart"/>
+      <w:r>
+        <w:rPr>
+          <w:color w:val="EE0000"/>
+          <w:u w:val="single"/>
+        </w:rPr>
+        <w:t>address</w:t>
+      </w:r>
+      <w:proofErr w:type="spellEnd"/>
+      <w:r>
+        <w:t xml:space="preserve">) -&gt; ROOM, </w:t>
+      </w:r>
+      <w:proofErr w:type="spellStart"/>
+      <w:r>
+        <w:rPr>
+          <w:color w:val="EE0000"/>
+          <w:u w:val="single"/>
+        </w:rPr>
         <w:t>dni</w:t>
       </w:r>
+      <w:proofErr w:type="spellEnd"/>
       <w:r>
         <w:rPr>
           <w:u w:val="single"/>
@@ -4312,7 +5795,39 @@
         <w:t xml:space="preserve"> </w:t>
       </w:r>
       <w:r>
-        <w:t>-&gt; TENANT, status, pricePerMonth, startingDate, endingDate)</w:t>
+        <w:t xml:space="preserve">-&gt; TENANT, </w:t>
+      </w:r>
+      <w:proofErr w:type="gramStart"/>
+      <w:r>
+        <w:t>status</w:t>
+      </w:r>
+      <w:proofErr w:type="gramEnd"/>
+      <w:r>
+        <w:t xml:space="preserve">, </w:t>
+      </w:r>
+      <w:proofErr w:type="spellStart"/>
+      <w:r>
+        <w:t>pricePerMonth</w:t>
+      </w:r>
+      <w:proofErr w:type="spellEnd"/>
+      <w:r>
+        <w:t xml:space="preserve">, </w:t>
+      </w:r>
+      <w:proofErr w:type="spellStart"/>
+      <w:r>
+        <w:t>startingDate</w:t>
+      </w:r>
+      <w:proofErr w:type="spellEnd"/>
+      <w:r>
+        <w:t xml:space="preserve">, </w:t>
+      </w:r>
+      <w:proofErr w:type="spellStart"/>
+      <w:r>
+        <w:t>endingDate</w:t>
+      </w:r>
+      <w:proofErr w:type="spellEnd"/>
+      <w:r>
+        <w:t>)</w:t>
       </w:r>
     </w:p>
     <w:p>
@@ -4322,6 +5837,7 @@
           <w:numId w:val="18"/>
         </w:numPr>
       </w:pPr>
+      <w:proofErr w:type="gramStart"/>
       <w:r>
         <w:rPr>
           <w:b/>
@@ -4333,20 +5849,47 @@
       <w:r>
         <w:t>(</w:t>
       </w:r>
+      <w:proofErr w:type="spellStart"/>
+      <w:proofErr w:type="gramEnd"/>
       <w:r>
         <w:rPr>
           <w:u w:val="single"/>
         </w:rPr>
         <w:t>address</w:t>
       </w:r>
-      <w:r>
-        <w:t xml:space="preserve">, surface, status, </w:t>
-      </w:r>
+      <w:proofErr w:type="spellEnd"/>
+      <w:r>
+        <w:t xml:space="preserve">, </w:t>
+      </w:r>
+      <w:proofErr w:type="spellStart"/>
+      <w:r>
+        <w:t>surface</w:t>
+      </w:r>
+      <w:proofErr w:type="spellEnd"/>
+      <w:r>
+        <w:t xml:space="preserve">, </w:t>
+      </w:r>
+      <w:proofErr w:type="gramStart"/>
+      <w:r>
+        <w:t>status</w:t>
+      </w:r>
+      <w:proofErr w:type="gramEnd"/>
+      <w:r>
+        <w:t xml:space="preserve">, </w:t>
+      </w:r>
+      <w:proofErr w:type="spellStart"/>
       <w:r>
         <w:rPr>
           <w:color w:val="EE0000"/>
         </w:rPr>
-        <w:t xml:space="preserve">dni </w:t>
+        <w:t>dni</w:t>
+      </w:r>
+      <w:proofErr w:type="spellEnd"/>
+      <w:r>
+        <w:rPr>
+          <w:color w:val="EE0000"/>
+        </w:rPr>
+        <w:t xml:space="preserve"> </w:t>
       </w:r>
       <w:r>
         <w:t>-&gt; OWNER)</w:t>
@@ -4359,6 +5902,7 @@
           <w:numId w:val="18"/>
         </w:numPr>
       </w:pPr>
+      <w:proofErr w:type="gramStart"/>
       <w:r>
         <w:rPr>
           <w:b/>
@@ -4369,12 +5913,29 @@
       <w:r>
         <w:t>(</w:t>
       </w:r>
+      <w:proofErr w:type="spellStart"/>
+      <w:proofErr w:type="gramEnd"/>
       <w:r>
         <w:rPr>
           <w:u w:val="single"/>
         </w:rPr>
-        <w:t>num, type</w:t>
-      </w:r>
+        <w:t>num</w:t>
+      </w:r>
+      <w:proofErr w:type="spellEnd"/>
+      <w:r>
+        <w:rPr>
+          <w:u w:val="single"/>
+        </w:rPr>
+        <w:t xml:space="preserve">, </w:t>
+      </w:r>
+      <w:proofErr w:type="spellStart"/>
+      <w:r>
+        <w:rPr>
+          <w:u w:val="single"/>
+        </w:rPr>
+        <w:t>type</w:t>
+      </w:r>
+      <w:proofErr w:type="spellEnd"/>
       <w:r>
         <w:t>,</w:t>
       </w:r>
@@ -4384,6 +5945,7 @@
         </w:rPr>
         <w:t xml:space="preserve"> </w:t>
       </w:r>
+      <w:proofErr w:type="spellStart"/>
       <w:r>
         <w:rPr>
           <w:color w:val="EE0000"/>
@@ -4391,8 +5953,33 @@
         </w:rPr>
         <w:t>address</w:t>
       </w:r>
-      <w:r>
-        <w:t xml:space="preserve"> -&gt; PROPERTY, surface, status, pricePerMonth)</w:t>
+      <w:proofErr w:type="spellEnd"/>
+      <w:r>
+        <w:t xml:space="preserve"> -&gt; PROPERTY, </w:t>
+      </w:r>
+      <w:proofErr w:type="spellStart"/>
+      <w:r>
+        <w:t>surface</w:t>
+      </w:r>
+      <w:proofErr w:type="spellEnd"/>
+      <w:r>
+        <w:t xml:space="preserve">, </w:t>
+      </w:r>
+      <w:proofErr w:type="gramStart"/>
+      <w:r>
+        <w:t>status</w:t>
+      </w:r>
+      <w:proofErr w:type="gramEnd"/>
+      <w:r>
+        <w:t xml:space="preserve">, </w:t>
+      </w:r>
+      <w:proofErr w:type="spellStart"/>
+      <w:r>
+        <w:t>pricePerMonth</w:t>
+      </w:r>
+      <w:proofErr w:type="spellEnd"/>
+      <w:r>
+        <w:t>)</w:t>
       </w:r>
     </w:p>
     <w:p>
@@ -4402,6 +5989,7 @@
           <w:numId w:val="18"/>
         </w:numPr>
       </w:pPr>
+      <w:proofErr w:type="gramStart"/>
       <w:r>
         <w:rPr>
           <w:b/>
@@ -4412,12 +6000,15 @@
       <w:r>
         <w:t>(</w:t>
       </w:r>
+      <w:proofErr w:type="spellStart"/>
       <w:r>
         <w:rPr>
           <w:u w:val="single"/>
         </w:rPr>
         <w:t>num,type</w:t>
       </w:r>
+      <w:proofErr w:type="spellEnd"/>
+      <w:proofErr w:type="gramEnd"/>
       <w:r>
         <w:t xml:space="preserve">, </w:t>
       </w:r>
@@ -4427,15 +6018,57 @@
         </w:rPr>
         <w:t>(</w:t>
       </w:r>
+      <w:proofErr w:type="spellStart"/>
       <w:r>
         <w:rPr>
           <w:color w:val="EE0000"/>
           <w:u w:val="single"/>
         </w:rPr>
-        <w:t>num, type, address</w:t>
-      </w:r>
-      <w:r>
-        <w:t>) -&gt; ROOM, qty)</w:t>
+        <w:t>num</w:t>
+      </w:r>
+      <w:proofErr w:type="spellEnd"/>
+      <w:r>
+        <w:rPr>
+          <w:color w:val="EE0000"/>
+          <w:u w:val="single"/>
+        </w:rPr>
+        <w:t xml:space="preserve">, </w:t>
+      </w:r>
+      <w:proofErr w:type="spellStart"/>
+      <w:r>
+        <w:rPr>
+          <w:color w:val="EE0000"/>
+          <w:u w:val="single"/>
+        </w:rPr>
+        <w:t>type</w:t>
+      </w:r>
+      <w:proofErr w:type="spellEnd"/>
+      <w:r>
+        <w:rPr>
+          <w:color w:val="EE0000"/>
+          <w:u w:val="single"/>
+        </w:rPr>
+        <w:t xml:space="preserve">, </w:t>
+      </w:r>
+      <w:proofErr w:type="spellStart"/>
+      <w:r>
+        <w:rPr>
+          <w:color w:val="EE0000"/>
+          <w:u w:val="single"/>
+        </w:rPr>
+        <w:t>address</w:t>
+      </w:r>
+      <w:proofErr w:type="spellEnd"/>
+      <w:r>
+        <w:t xml:space="preserve">) -&gt; ROOM, </w:t>
+      </w:r>
+      <w:proofErr w:type="spellStart"/>
+      <w:r>
+        <w:t>qty</w:t>
+      </w:r>
+      <w:proofErr w:type="spellEnd"/>
+      <w:r>
+        <w:t>)</w:t>
       </w:r>
     </w:p>
     <w:p>
@@ -4446,6 +6079,7 @@
           <w:numId w:val="18"/>
         </w:numPr>
       </w:pPr>
+      <w:proofErr w:type="gramStart"/>
       <w:r>
         <w:rPr>
           <w:b/>
@@ -4456,23 +6090,32 @@
       <w:r>
         <w:t>(</w:t>
       </w:r>
+      <w:proofErr w:type="spellStart"/>
+      <w:proofErr w:type="gramEnd"/>
       <w:r>
         <w:rPr>
           <w:u w:val="single"/>
         </w:rPr>
         <w:t>reportDate</w:t>
       </w:r>
+      <w:proofErr w:type="spellEnd"/>
       <w:r>
         <w:t xml:space="preserve">, </w:t>
       </w:r>
+      <w:proofErr w:type="spellStart"/>
       <w:r>
         <w:rPr>
           <w:u w:val="single"/>
         </w:rPr>
         <w:t>dni</w:t>
       </w:r>
-      <w:r>
-        <w:t xml:space="preserve"> -&gt; USER,  </w:t>
+      <w:proofErr w:type="spellEnd"/>
+      <w:r>
+        <w:t xml:space="preserve"> -&gt; </w:t>
+      </w:r>
+      <w:proofErr w:type="gramStart"/>
+      <w:r>
+        <w:t xml:space="preserve">USER,  </w:t>
       </w:r>
       <w:r>
         <w:rPr>
@@ -4480,15 +6123,74 @@
         </w:rPr>
         <w:t>(</w:t>
       </w:r>
+      <w:proofErr w:type="spellStart"/>
+      <w:proofErr w:type="gramEnd"/>
       <w:r>
         <w:rPr>
           <w:color w:val="EE0000"/>
           <w:u w:val="single"/>
         </w:rPr>
-        <w:t>num, type, address</w:t>
-      </w:r>
-      <w:r>
-        <w:t>) -&gt; ROOM, issue, details, status)</w:t>
+        <w:t>num</w:t>
+      </w:r>
+      <w:proofErr w:type="spellEnd"/>
+      <w:r>
+        <w:rPr>
+          <w:color w:val="EE0000"/>
+          <w:u w:val="single"/>
+        </w:rPr>
+        <w:t xml:space="preserve">, </w:t>
+      </w:r>
+      <w:proofErr w:type="spellStart"/>
+      <w:r>
+        <w:rPr>
+          <w:color w:val="EE0000"/>
+          <w:u w:val="single"/>
+        </w:rPr>
+        <w:t>type</w:t>
+      </w:r>
+      <w:proofErr w:type="spellEnd"/>
+      <w:r>
+        <w:rPr>
+          <w:color w:val="EE0000"/>
+          <w:u w:val="single"/>
+        </w:rPr>
+        <w:t xml:space="preserve">, </w:t>
+      </w:r>
+      <w:proofErr w:type="spellStart"/>
+      <w:r>
+        <w:rPr>
+          <w:color w:val="EE0000"/>
+          <w:u w:val="single"/>
+        </w:rPr>
+        <w:t>address</w:t>
+      </w:r>
+      <w:proofErr w:type="spellEnd"/>
+      <w:r>
+        <w:t xml:space="preserve">) -&gt; ROOM, </w:t>
+      </w:r>
+      <w:proofErr w:type="spellStart"/>
+      <w:r>
+        <w:t>issue</w:t>
+      </w:r>
+      <w:proofErr w:type="spellEnd"/>
+      <w:r>
+        <w:t xml:space="preserve">, </w:t>
+      </w:r>
+      <w:proofErr w:type="spellStart"/>
+      <w:r>
+        <w:t>details</w:t>
+      </w:r>
+      <w:proofErr w:type="spellEnd"/>
+      <w:r>
+        <w:t xml:space="preserve">, </w:t>
+      </w:r>
+      <w:proofErr w:type="gramStart"/>
+      <w:r>
+        <w:t>status</w:t>
+      </w:r>
+      <w:proofErr w:type="gramEnd"/>
+      <w:r>
+        <w:t>)</w:t>
       </w:r>
     </w:p>
     <w:p>
@@ -4792,7 +6494,21 @@
         <w:rPr>
           <w:rFonts w:ascii="Aptos" w:eastAsia="Aptos" w:hAnsi="Aptos" w:cs="Aptos"/>
         </w:rPr>
-        <w:t>Todo proyecto se rige por un modelo de ciclo de vida. Se tratan de esquemas que organizan las diferentes fases del desarrollo, facilitando la gestión del mismo.</w:t>
+        <w:t xml:space="preserve">Todo proyecto se rige por un modelo de ciclo de vida. Se tratan de esquemas que organizan las diferentes fases del desarrollo, facilitando la gestión </w:t>
+      </w:r>
+      <w:proofErr w:type="gramStart"/>
+      <w:r>
+        <w:rPr>
+          <w:rFonts w:ascii="Aptos" w:eastAsia="Aptos" w:hAnsi="Aptos" w:cs="Aptos"/>
+        </w:rPr>
+        <w:t>del mismo</w:t>
+      </w:r>
+      <w:proofErr w:type="gramEnd"/>
+      <w:r>
+        <w:rPr>
+          <w:rFonts w:ascii="Aptos" w:eastAsia="Aptos" w:hAnsi="Aptos" w:cs="Aptos"/>
+        </w:rPr>
+        <w:t>.</w:t>
       </w:r>
     </w:p>
     <w:p>
@@ -4803,17 +6519,39 @@
           <w:rFonts w:ascii="Aptos" w:eastAsia="Aptos" w:hAnsi="Aptos" w:cs="Aptos"/>
         </w:rPr>
       </w:pPr>
-      <w:r>
-        <w:rPr>
-          <w:rFonts w:ascii="Aptos" w:eastAsia="Aptos" w:hAnsi="Aptos" w:cs="Aptos"/>
-        </w:rPr>
-        <w:t>Roomie pretende ofrecer un servicio mantenido y con actualizaciones constantes a largo plazo. Ade</w:t>
-      </w:r>
-      <w:r>
-        <w:rPr>
-          <w:rFonts w:ascii="Aptos" w:eastAsia="Aptos" w:hAnsi="Aptos" w:cs="Aptos"/>
-        </w:rPr>
-        <w:t xml:space="preserve">más, se exige entregar prototipos funcionales repartidos en hitos, por tanto un </w:t>
+      <w:proofErr w:type="spellStart"/>
+      <w:r>
+        <w:rPr>
+          <w:rFonts w:ascii="Aptos" w:eastAsia="Aptos" w:hAnsi="Aptos" w:cs="Aptos"/>
+        </w:rPr>
+        <w:t>Roomie</w:t>
+      </w:r>
+      <w:proofErr w:type="spellEnd"/>
+      <w:r>
+        <w:rPr>
+          <w:rFonts w:ascii="Aptos" w:eastAsia="Aptos" w:hAnsi="Aptos" w:cs="Aptos"/>
+        </w:rPr>
+        <w:t xml:space="preserve"> pretende ofrecer un servicio mantenido y con actualizaciones constantes a largo plazo. Ade</w:t>
+      </w:r>
+      <w:r>
+        <w:rPr>
+          <w:rFonts w:ascii="Aptos" w:eastAsia="Aptos" w:hAnsi="Aptos" w:cs="Aptos"/>
+        </w:rPr>
+        <w:t xml:space="preserve">más, se exige entregar prototipos funcionales repartidos en hitos, por </w:t>
+      </w:r>
+      <w:proofErr w:type="gramStart"/>
+      <w:r>
+        <w:rPr>
+          <w:rFonts w:ascii="Aptos" w:eastAsia="Aptos" w:hAnsi="Aptos" w:cs="Aptos"/>
+        </w:rPr>
+        <w:t>tanto</w:t>
+      </w:r>
+      <w:proofErr w:type="gramEnd"/>
+      <w:r>
+        <w:rPr>
+          <w:rFonts w:ascii="Aptos" w:eastAsia="Aptos" w:hAnsi="Aptos" w:cs="Aptos"/>
+        </w:rPr>
+        <w:t xml:space="preserve"> un </w:t>
       </w:r>
       <w:r>
         <w:rPr>
@@ -5158,7 +6896,15 @@
       </w:pPr>
       <w:bookmarkStart w:id="14" w:name="_Toc223718673"/>
       <w:r>
-        <w:t xml:space="preserve">Nuestro Tablero KanBan </w:t>
+        <w:t xml:space="preserve">Nuestro Tablero </w:t>
+      </w:r>
+      <w:proofErr w:type="spellStart"/>
+      <w:r>
+        <w:t>KanBan</w:t>
+      </w:r>
+      <w:proofErr w:type="spellEnd"/>
+      <w:r>
+        <w:t xml:space="preserve"> </w:t>
       </w:r>
       <w:bookmarkEnd w:id="14"/>
     </w:p>
@@ -5230,28 +6976,15 @@
       <w:pPr>
         <w:pStyle w:val="Descripcin"/>
       </w:pPr>
-      <w:r>
-        <w:fldChar w:fldCharType="begin"/>
-      </w:r>
-      <w:r>
-        <w:instrText xml:space="preserve"> SEQ Ilustración \* ARABIC </w:instrText>
-      </w:r>
-      <w:r>
-        <w:fldChar w:fldCharType="separate"/>
-      </w:r>
-      <w:bookmarkStart w:id="15" w:name="_Toc223618251"/>
-      <w:r>
-        <w:rPr>
-          <w:noProof/>
-        </w:rPr>
-        <w:t>5</w:t>
-      </w:r>
-      <w:r>
-        <w:rPr>
-          <w:noProof/>
-        </w:rPr>
-        <w:fldChar w:fldCharType="end"/>
-      </w:r>
+      <w:fldSimple w:instr=" SEQ Ilustración \* ARABIC ">
+        <w:bookmarkStart w:id="15" w:name="_Toc223618251"/>
+        <w:r>
+          <w:rPr>
+            <w:noProof/>
+          </w:rPr>
+          <w:t>5</w:t>
+        </w:r>
+      </w:fldSimple>
       <w:r>
         <w:t>- Tablero Trello Hito 2 1/2</w:t>
       </w:r>
@@ -5314,28 +7047,15 @@
       <w:pPr>
         <w:pStyle w:val="Descripcin"/>
       </w:pPr>
-      <w:r>
-        <w:fldChar w:fldCharType="begin"/>
-      </w:r>
-      <w:r>
-        <w:instrText xml:space="preserve"> SEQ Ilustración \* ARABIC </w:instrText>
-      </w:r>
-      <w:r>
-        <w:fldChar w:fldCharType="separate"/>
-      </w:r>
-      <w:bookmarkStart w:id="16" w:name="_Toc223618252"/>
-      <w:r>
-        <w:rPr>
-          <w:noProof/>
-        </w:rPr>
-        <w:t>6</w:t>
-      </w:r>
-      <w:r>
-        <w:rPr>
-          <w:noProof/>
-        </w:rPr>
-        <w:fldChar w:fldCharType="end"/>
-      </w:r>
+      <w:fldSimple w:instr=" SEQ Ilustración \* ARABIC ">
+        <w:bookmarkStart w:id="16" w:name="_Toc223618252"/>
+        <w:r>
+          <w:rPr>
+            <w:noProof/>
+          </w:rPr>
+          <w:t>6</w:t>
+        </w:r>
+      </w:fldSimple>
       <w:r>
         <w:t>- Tablero Trello Hito 2 2/2</w:t>
       </w:r>
@@ -5369,7 +7089,21 @@
         <w:rPr>
           <w:rFonts w:ascii="Aptos" w:eastAsia="Aptos" w:hAnsi="Aptos" w:cs="Aptos"/>
         </w:rPr>
-        <w:t>En las primeras iteraciones del proyecto la mayoría de roles y tareas son compartidas, ya que todos estamos participando conjuntamente en todo tipo de tareas y no necesitamos aún a nadie que haga el rol de jefe de proyecto. En iteraciones más avanzadas tendremos roles y tareas más diferenciadas.</w:t>
+        <w:t xml:space="preserve">En las primeras iteraciones del proyecto la mayoría de </w:t>
+      </w:r>
+      <w:proofErr w:type="gramStart"/>
+      <w:r>
+        <w:rPr>
+          <w:rFonts w:ascii="Aptos" w:eastAsia="Aptos" w:hAnsi="Aptos" w:cs="Aptos"/>
+        </w:rPr>
+        <w:t>roles</w:t>
+      </w:r>
+      <w:proofErr w:type="gramEnd"/>
+      <w:r>
+        <w:rPr>
+          <w:rFonts w:ascii="Aptos" w:eastAsia="Aptos" w:hAnsi="Aptos" w:cs="Aptos"/>
+        </w:rPr>
+        <w:t xml:space="preserve"> y tareas son compartidas, ya que todos estamos participando conjuntamente en todo tipo de tareas y no necesitamos aún a nadie que haga el rol de jefe de proyecto. En iteraciones más avanzadas tendremos roles y tareas más diferenciadas.</w:t>
       </w:r>
     </w:p>
     <w:p>
@@ -5385,11 +7119,11 @@
         <w:tblLook w:val="06A0" w:firstRow="1" w:lastRow="0" w:firstColumn="1" w:lastColumn="0" w:noHBand="1" w:noVBand="1"/>
       </w:tblPr>
       <w:tblGrid>
-        <w:gridCol w:w="1995"/>
-        <w:gridCol w:w="1611"/>
-        <w:gridCol w:w="1803"/>
-        <w:gridCol w:w="1803"/>
-        <w:gridCol w:w="1803"/>
+        <w:gridCol w:w="1976"/>
+        <w:gridCol w:w="1794"/>
+        <w:gridCol w:w="1668"/>
+        <w:gridCol w:w="1688"/>
+        <w:gridCol w:w="1890"/>
       </w:tblGrid>
       <w:tr>
         <w:trPr>
@@ -5533,7 +7267,21 @@
               <w:rPr>
                 <w:rFonts w:eastAsia="Arial" w:cs="Arial"/>
               </w:rPr>
-              <w:t>Creación de github, escribir introducción, descripción de ciclo de vida y plan de negocios</w:t>
+              <w:t xml:space="preserve">Creación de </w:t>
+            </w:r>
+            <w:proofErr w:type="spellStart"/>
+            <w:r>
+              <w:rPr>
+                <w:rFonts w:eastAsia="Arial" w:cs="Arial"/>
+              </w:rPr>
+              <w:t>github</w:t>
+            </w:r>
+            <w:proofErr w:type="spellEnd"/>
+            <w:r>
+              <w:rPr>
+                <w:rFonts w:eastAsia="Arial" w:cs="Arial"/>
+              </w:rPr>
+              <w:t>, escribir introducción, descripción de ciclo de vida y plan de negocios</w:t>
             </w:r>
           </w:p>
           <w:p/>
@@ -5689,37 +7437,152 @@
           </w:p>
         </w:tc>
       </w:tr>
+      <w:tr>
+        <w:trPr>
+          <w:trHeight w:val="300"/>
+        </w:trPr>
+        <w:tc>
+          <w:tcPr>
+            <w:tcW w:w="1995" w:type="dxa"/>
+            <w:vAlign w:val="center"/>
+          </w:tcPr>
+          <w:p>
+            <w:pPr>
+              <w:jc w:val="center"/>
+            </w:pPr>
+            <w:r>
+              <w:t>HITO FINAL</w:t>
+            </w:r>
+          </w:p>
+        </w:tc>
+        <w:tc>
+          <w:tcPr>
+            <w:tcW w:w="1611" w:type="dxa"/>
+          </w:tcPr>
+          <w:p>
+            <w:pPr>
+              <w:spacing w:after="159" w:line="276" w:lineRule="auto"/>
+              <w:rPr>
+                <w:rFonts w:eastAsia="Arial" w:cs="Arial"/>
+              </w:rPr>
+            </w:pPr>
+            <w:r>
+              <w:rPr>
+                <w:rFonts w:eastAsia="Arial" w:cs="Arial"/>
+              </w:rPr>
+              <w:t xml:space="preserve">Administración de base de datos y de proyecto </w:t>
+            </w:r>
+            <w:proofErr w:type="spellStart"/>
+            <w:r>
+              <w:rPr>
+                <w:rFonts w:eastAsia="Arial" w:cs="Arial"/>
+              </w:rPr>
+              <w:t>JavaFX</w:t>
+            </w:r>
+            <w:proofErr w:type="spellEnd"/>
+            <w:r>
+              <w:rPr>
+                <w:rFonts w:eastAsia="Arial" w:cs="Arial"/>
+              </w:rPr>
+              <w:t xml:space="preserve">. </w:t>
+            </w:r>
+          </w:p>
+        </w:tc>
+        <w:tc>
+          <w:tcPr>
+            <w:tcW w:w="1803" w:type="dxa"/>
+          </w:tcPr>
+          <w:p>
+            <w:pPr>
+              <w:spacing w:after="159" w:line="276" w:lineRule="auto"/>
+              <w:rPr>
+                <w:rFonts w:eastAsia="Arial" w:cs="Arial"/>
+              </w:rPr>
+            </w:pPr>
+            <w:r>
+              <w:rPr>
+                <w:rFonts w:eastAsia="Arial" w:cs="Arial"/>
+              </w:rPr>
+              <w:t>Desarrollo de las páginas restantes de la página web.</w:t>
+            </w:r>
+          </w:p>
+        </w:tc>
+        <w:tc>
+          <w:tcPr>
+            <w:tcW w:w="1803" w:type="dxa"/>
+          </w:tcPr>
+          <w:p>
+            <w:pPr>
+              <w:spacing w:after="159" w:line="276" w:lineRule="auto"/>
+              <w:rPr>
+                <w:rFonts w:eastAsia="Arial" w:cs="Arial"/>
+              </w:rPr>
+            </w:pPr>
+            <w:r>
+              <w:rPr>
+                <w:rFonts w:eastAsia="Arial" w:cs="Arial"/>
+              </w:rPr>
+              <w:t>Desarrollo de las páginas restantes de la página web.</w:t>
+            </w:r>
+          </w:p>
+        </w:tc>
+        <w:tc>
+          <w:tcPr>
+            <w:tcW w:w="1803" w:type="dxa"/>
+          </w:tcPr>
+          <w:p>
+            <w:pPr>
+              <w:spacing w:after="159" w:line="276" w:lineRule="auto"/>
+              <w:rPr>
+                <w:rFonts w:eastAsia="Arial" w:cs="Arial"/>
+              </w:rPr>
+            </w:pPr>
+            <w:r>
+              <w:rPr>
+                <w:rFonts w:eastAsia="Arial" w:cs="Arial"/>
+              </w:rPr>
+              <w:t>Documentación de los últimos puntos del proyecto y coordinación.</w:t>
+            </w:r>
+          </w:p>
+        </w:tc>
+      </w:tr>
     </w:tbl>
     <w:p>
       <w:pPr>
         <w:pStyle w:val="Descripcin"/>
       </w:pPr>
-      <w:r>
-        <w:fldChar w:fldCharType="begin"/>
-      </w:r>
-      <w:r>
-        <w:instrText xml:space="preserve"> SEQ Ilustración \* ARABIC </w:instrText>
-      </w:r>
-      <w:r>
-        <w:fldChar w:fldCharType="separate"/>
-      </w:r>
-      <w:bookmarkStart w:id="18" w:name="_Toc223618253"/>
-      <w:r>
-        <w:rPr>
-          <w:noProof/>
-        </w:rPr>
-        <w:t>7</w:t>
-      </w:r>
-      <w:r>
-        <w:rPr>
-          <w:noProof/>
-        </w:rPr>
-        <w:fldChar w:fldCharType="end"/>
-      </w:r>
+      <w:fldSimple w:instr=" SEQ Ilustración \* ARABIC ">
+        <w:bookmarkStart w:id="18" w:name="_Toc223618253"/>
+        <w:r>
+          <w:rPr>
+            <w:noProof/>
+          </w:rPr>
+          <w:t>7</w:t>
+        </w:r>
+      </w:fldSimple>
       <w:r>
         <w:t>- Planificación de Tareas</w:t>
       </w:r>
       <w:bookmarkEnd w:id="18"/>
+    </w:p>
+    <w:p>
+      <w:pPr>
+        <w:rPr>
+          <w:i/>
+          <w:iCs/>
+          <w:color w:val="0E2841" w:themeColor="text2"/>
+          <w:sz w:val="18"/>
+          <w:szCs w:val="18"/>
+        </w:rPr>
+      </w:pPr>
+      <w:r>
+        <w:br w:type="page"/>
+      </w:r>
+    </w:p>
+    <w:p>
+      <w:pPr>
+        <w:pStyle w:val="Descripcin"/>
+      </w:pPr>
     </w:p>
     <w:tbl>
       <w:tblPr>
@@ -5957,33 +7820,114 @@
           </w:p>
         </w:tc>
       </w:tr>
+      <w:tr>
+        <w:trPr>
+          <w:trHeight w:val="960"/>
+        </w:trPr>
+        <w:tc>
+          <w:tcPr>
+            <w:tcW w:w="1803" w:type="dxa"/>
+            <w:vAlign w:val="center"/>
+          </w:tcPr>
+          <w:p>
+            <w:pPr>
+              <w:jc w:val="center"/>
+            </w:pPr>
+            <w:r>
+              <w:t>HITO FINAL</w:t>
+            </w:r>
+          </w:p>
+        </w:tc>
+        <w:tc>
+          <w:tcPr>
+            <w:tcW w:w="1803" w:type="dxa"/>
+            <w:vAlign w:val="center"/>
+          </w:tcPr>
+          <w:p>
+            <w:pPr>
+              <w:keepNext/>
+              <w:jc w:val="center"/>
+            </w:pPr>
+            <w:r>
+              <w:t xml:space="preserve">Desarrollador </w:t>
+            </w:r>
+            <w:proofErr w:type="spellStart"/>
+            <w:r>
+              <w:t>backend</w:t>
+            </w:r>
+            <w:proofErr w:type="spellEnd"/>
+          </w:p>
+        </w:tc>
+        <w:tc>
+          <w:tcPr>
+            <w:tcW w:w="1803" w:type="dxa"/>
+            <w:vAlign w:val="center"/>
+          </w:tcPr>
+          <w:p>
+            <w:pPr>
+              <w:keepNext/>
+              <w:jc w:val="center"/>
+            </w:pPr>
+            <w:r>
+              <w:t xml:space="preserve">Desarrollador </w:t>
+            </w:r>
+            <w:proofErr w:type="spellStart"/>
+            <w:r>
+              <w:t>frontend</w:t>
+            </w:r>
+            <w:proofErr w:type="spellEnd"/>
+          </w:p>
+        </w:tc>
+        <w:tc>
+          <w:tcPr>
+            <w:tcW w:w="1803" w:type="dxa"/>
+            <w:vAlign w:val="center"/>
+          </w:tcPr>
+          <w:p>
+            <w:pPr>
+              <w:keepNext/>
+              <w:jc w:val="center"/>
+            </w:pPr>
+            <w:r>
+              <w:t xml:space="preserve">Desarrollador </w:t>
+            </w:r>
+            <w:proofErr w:type="spellStart"/>
+            <w:r>
+              <w:t>frontend</w:t>
+            </w:r>
+            <w:proofErr w:type="spellEnd"/>
+          </w:p>
+        </w:tc>
+        <w:tc>
+          <w:tcPr>
+            <w:tcW w:w="1803" w:type="dxa"/>
+            <w:vAlign w:val="center"/>
+          </w:tcPr>
+          <w:p>
+            <w:pPr>
+              <w:keepNext/>
+              <w:jc w:val="center"/>
+            </w:pPr>
+            <w:r>
+              <w:t>Documentador y coordinador de proyecto</w:t>
+            </w:r>
+          </w:p>
+        </w:tc>
+      </w:tr>
     </w:tbl>
     <w:p>
       <w:pPr>
         <w:pStyle w:val="Descripcin"/>
       </w:pPr>
-      <w:r>
-        <w:fldChar w:fldCharType="begin"/>
-      </w:r>
-      <w:r>
-        <w:instrText xml:space="preserve"> SEQ Ilustración \* ARABIC </w:instrText>
-      </w:r>
-      <w:r>
-        <w:fldChar w:fldCharType="separate"/>
-      </w:r>
-      <w:bookmarkStart w:id="19" w:name="_Toc223618254"/>
-      <w:r>
-        <w:rPr>
-          <w:noProof/>
-        </w:rPr>
-        <w:t>8</w:t>
-      </w:r>
-      <w:r>
-        <w:rPr>
-          <w:noProof/>
-        </w:rPr>
-        <w:fldChar w:fldCharType="end"/>
-      </w:r>
+      <w:fldSimple w:instr=" SEQ Ilustración \* ARABIC ">
+        <w:bookmarkStart w:id="19" w:name="_Toc223618254"/>
+        <w:r>
+          <w:rPr>
+            <w:noProof/>
+          </w:rPr>
+          <w:t>8</w:t>
+        </w:r>
+      </w:fldSimple>
       <w:r>
         <w:t>- Roles de equipo</w:t>
       </w:r>
@@ -6054,7 +7998,23 @@
         <w:t>desarrollo del código</w:t>
       </w:r>
       <w:r>
-        <w:t xml:space="preserve"> fuente, se ha empleado el IDE IntelliJ IDEA en la implementación del proyecto CRUD (Create, Read, Update, Delete)</w:t>
+        <w:t xml:space="preserve"> fuente, se ha empleado el IDE IntelliJ IDEA en la implementación del proyecto CRUD (</w:t>
+      </w:r>
+      <w:proofErr w:type="spellStart"/>
+      <w:r>
+        <w:t>Create</w:t>
+      </w:r>
+      <w:proofErr w:type="spellEnd"/>
+      <w:r>
+        <w:t xml:space="preserve">, Read, </w:t>
+      </w:r>
+      <w:proofErr w:type="spellStart"/>
+      <w:r>
+        <w:t>Update</w:t>
+      </w:r>
+      <w:proofErr w:type="spellEnd"/>
+      <w:r>
+        <w:t>, Delete)</w:t>
       </w:r>
       <w:r>
         <w:t xml:space="preserve"> para</w:t>
@@ -6070,7 +8030,15 @@
         <w:t xml:space="preserve"> </w:t>
       </w:r>
       <w:r>
-        <w:t>Code como editor principal para el diseño y estructuración del front-end mediante HTML, CSS y JavaScript.</w:t>
+        <w:t xml:space="preserve">Code como editor principal para el diseño y estructuración del </w:t>
+      </w:r>
+      <w:proofErr w:type="spellStart"/>
+      <w:r>
+        <w:t>front-end</w:t>
+      </w:r>
+      <w:proofErr w:type="spellEnd"/>
+      <w:r>
+        <w:t xml:space="preserve"> mediante HTML, CSS y JavaScript.</w:t>
       </w:r>
     </w:p>
     <w:p>
@@ -6088,7 +8056,15 @@
         <w:t>control de versiones</w:t>
       </w:r>
       <w:r>
-        <w:t xml:space="preserve"> del proyecto, se ha utilizado GitHub como plataforma en la que alojar el proyecto y Sourcetree para gestionar el repositorio conjunto. </w:t>
+        <w:t xml:space="preserve"> del proyecto, se ha utilizado GitHub como plataforma en la que alojar el proyecto y </w:t>
+      </w:r>
+      <w:proofErr w:type="spellStart"/>
+      <w:r>
+        <w:t>Sourcetree</w:t>
+      </w:r>
+      <w:proofErr w:type="spellEnd"/>
+      <w:r>
+        <w:t xml:space="preserve"> para gestionar el repositorio conjunto. </w:t>
       </w:r>
     </w:p>
     <w:p>
@@ -6116,6 +8092,7 @@
       <w:r>
         <w:t xml:space="preserve">Se ha usado </w:t>
       </w:r>
+      <w:proofErr w:type="spellStart"/>
       <w:r>
         <w:rPr>
           <w:b/>
@@ -6123,14 +8100,9 @@
         </w:rPr>
         <w:t>Cdmon</w:t>
       </w:r>
-      <w:r>
-        <w:t xml:space="preserve"> para el alojamiento </w:t>
-      </w:r>
-      <w:r>
-        <w:t>de la página web creada</w:t>
-      </w:r>
-      <w:r>
-        <w:t xml:space="preserve"> en servidores en línea.</w:t>
+      <w:proofErr w:type="spellEnd"/>
+      <w:r>
+        <w:t xml:space="preserve"> para el alojamiento de la página web creada en servidores en línea.</w:t>
       </w:r>
     </w:p>
     <w:p>
@@ -6171,7 +8143,15 @@
         <w:t>JavaScript</w:t>
       </w:r>
       <w:r>
-        <w:t xml:space="preserve"> para añadir interactividad a nuestra página web y guardar datos básicos en el ordenador usando el LocalStorage. </w:t>
+        <w:t xml:space="preserve"> para añadir interactividad a nuestra página web y guardar datos básicos en el ordenador usando el </w:t>
+      </w:r>
+      <w:proofErr w:type="spellStart"/>
+      <w:r>
+        <w:t>LocalStorage</w:t>
+      </w:r>
+      <w:proofErr w:type="spellEnd"/>
+      <w:r>
+        <w:t xml:space="preserve">. </w:t>
       </w:r>
       <w:r>
         <w:rPr>
@@ -6209,8 +8189,17 @@
           <w:b/>
           <w:bCs/>
         </w:rPr>
-        <w:t>tecnologías frontend</w:t>
-      </w:r>
+        <w:t xml:space="preserve">tecnologías </w:t>
+      </w:r>
+      <w:proofErr w:type="spellStart"/>
+      <w:r>
+        <w:rPr>
+          <w:b/>
+          <w:bCs/>
+        </w:rPr>
+        <w:t>frontend</w:t>
+      </w:r>
+      <w:proofErr w:type="spellEnd"/>
       <w:r>
         <w:t xml:space="preserve"> que hemos empleado para el diseño de</w:t>
       </w:r>
@@ -6254,13 +8243,31 @@
       <w:r>
         <w:t xml:space="preserve">Se ha utilizado el </w:t>
       </w:r>
-      <w:r>
-        <w:rPr>
-          <w:b/>
-          <w:bCs/>
-        </w:rPr>
-        <w:t>framework JavaFX</w:t>
-      </w:r>
+      <w:proofErr w:type="spellStart"/>
+      <w:r>
+        <w:rPr>
+          <w:b/>
+          <w:bCs/>
+        </w:rPr>
+        <w:t>framework</w:t>
+      </w:r>
+      <w:proofErr w:type="spellEnd"/>
+      <w:r>
+        <w:rPr>
+          <w:b/>
+          <w:bCs/>
+        </w:rPr>
+        <w:t xml:space="preserve"> </w:t>
+      </w:r>
+      <w:proofErr w:type="spellStart"/>
+      <w:r>
+        <w:rPr>
+          <w:b/>
+          <w:bCs/>
+        </w:rPr>
+        <w:t>JavaFX</w:t>
+      </w:r>
+      <w:proofErr w:type="spellEnd"/>
       <w:r>
         <w:t xml:space="preserve">, </w:t>
       </w:r>
@@ -6282,42 +8289,96 @@
         <w:rPr>
           <w:b/>
           <w:bCs/>
-        </w:rPr>
-      </w:pPr>
-      <w:r>
-        <w:rPr>
-          <w:b/>
-          <w:bCs/>
-        </w:rPr>
-        <w:t>Simulación de conexión frontend-backend</w:t>
-      </w:r>
+          <w:u w:val="single"/>
+        </w:rPr>
+      </w:pPr>
+      <w:r>
+        <w:rPr>
+          <w:b/>
+          <w:bCs/>
+          <w:u w:val="single"/>
+        </w:rPr>
+        <w:t xml:space="preserve">Simulación de conexión </w:t>
+      </w:r>
+      <w:proofErr w:type="spellStart"/>
+      <w:r>
+        <w:rPr>
+          <w:b/>
+          <w:bCs/>
+          <w:u w:val="single"/>
+        </w:rPr>
+        <w:t>frontend-backend</w:t>
+      </w:r>
+      <w:proofErr w:type="spellEnd"/>
     </w:p>
     <w:p>
       <w:r>
         <w:t>E</w:t>
       </w:r>
       <w:r>
-        <w:t>n este proyecto no existe una conexión real entre el backend y el frontend</w:t>
-      </w:r>
-      <w:r>
-        <w:t xml:space="preserve">, por lo que los datos introducidos en los formularios de la página web no se están transfiriendo a la base de datos. Se ha implementado una simulación en el frontend que imita está conexión. </w:t>
+        <w:t xml:space="preserve">n este proyecto no existe una conexión real entre el </w:t>
+      </w:r>
+      <w:proofErr w:type="spellStart"/>
+      <w:r>
+        <w:t>backend</w:t>
+      </w:r>
+      <w:proofErr w:type="spellEnd"/>
+      <w:r>
+        <w:t xml:space="preserve"> y el </w:t>
+      </w:r>
+      <w:proofErr w:type="spellStart"/>
+      <w:r>
+        <w:t>frontend</w:t>
+      </w:r>
+      <w:proofErr w:type="spellEnd"/>
+      <w:r>
+        <w:t xml:space="preserve">, por lo que los datos introducidos en los formularios de la página web no se están transfiriendo a la base de datos. Se ha implementado una simulación en el </w:t>
+      </w:r>
+      <w:proofErr w:type="spellStart"/>
+      <w:r>
+        <w:t>frontend</w:t>
+      </w:r>
+      <w:proofErr w:type="spellEnd"/>
+      <w:r>
+        <w:t xml:space="preserve"> que imita está conexión. </w:t>
       </w:r>
       <w:r>
         <w:br/>
-        <w:t xml:space="preserve">La forma en que se ha realizado esta simulación es usando el LocalStorage. Al rellenar </w:t>
+        <w:t xml:space="preserve">La forma en que se ha realizado esta simulación es usando el </w:t>
+      </w:r>
+      <w:proofErr w:type="spellStart"/>
+      <w:r>
+        <w:t>LocalStorage</w:t>
+      </w:r>
+      <w:proofErr w:type="spellEnd"/>
+      <w:r>
+        <w:t xml:space="preserve">. Al rellenar </w:t>
       </w:r>
       <w:r>
         <w:lastRenderedPageBreak/>
         <w:t xml:space="preserve">el formulario de registro de la página web, se recogen los datos insertados y se crea un objeto usuario que se almacena en una lista alojada en el </w:t>
       </w:r>
+      <w:proofErr w:type="spellStart"/>
       <w:r>
         <w:t>L</w:t>
       </w:r>
       <w:r>
-        <w:t xml:space="preserve">ocalStorage. </w:t>
-      </w:r>
-      <w:r>
-        <w:t xml:space="preserve">A la hora de hacer el inicio de sesión, se saca la lista del LocalStorage, se comprueba que las credenciales insertadas en el inicio de sesión se encuentran en esta lista y se concede o deniega el acceso. </w:t>
+        <w:t>ocalStorage</w:t>
+      </w:r>
+      <w:proofErr w:type="spellEnd"/>
+      <w:r>
+        <w:t xml:space="preserve">. </w:t>
+      </w:r>
+      <w:r>
+        <w:t xml:space="preserve">A la hora de hacer el inicio de sesión, se saca la lista del </w:t>
+      </w:r>
+      <w:proofErr w:type="spellStart"/>
+      <w:r>
+        <w:t>LocalStorage</w:t>
+      </w:r>
+      <w:proofErr w:type="spellEnd"/>
+      <w:r>
+        <w:t xml:space="preserve">, se comprueba que las credenciales insertadas en el inicio de sesión se encuentran en esta lista y se concede o deniega el acceso. </w:t>
       </w:r>
       <w:r>
         <w:t xml:space="preserve">En las siguientes imágenes se enseña los pasos principales para la creación de usuarios y su manipulación para el control de acceso a la web. </w:t>
@@ -6339,7 +8400,13 @@
       </w:r>
     </w:p>
     <w:p>
-      <w:r>
+      <w:pPr>
+        <w:keepNext/>
+      </w:pPr>
+      <w:r>
+        <w:rPr>
+          <w:noProof/>
+        </w:rPr>
         <w:drawing>
           <wp:inline distT="0" distB="0" distL="0" distR="0" wp14:anchorId="6F00EEF0" wp14:editId="11DB508C">
             <wp:extent cx="5696745" cy="1657581"/>
@@ -6378,7 +8445,29 @@
       </w:r>
     </w:p>
     <w:p>
-      <w:r>
+      <w:pPr>
+        <w:pStyle w:val="Descripcin"/>
+      </w:pPr>
+      <w:fldSimple w:instr=" SEQ Ilustración \* ARABIC ">
+        <w:r>
+          <w:rPr>
+            <w:noProof/>
+          </w:rPr>
+          <w:t>9</w:t>
+        </w:r>
+      </w:fldSimple>
+      <w:r>
+        <w:t xml:space="preserve"> Creación usuario 1/3</w:t>
+      </w:r>
+    </w:p>
+    <w:p>
+      <w:pPr>
+        <w:keepNext/>
+      </w:pPr>
+      <w:r>
+        <w:rPr>
+          <w:noProof/>
+        </w:rPr>
         <w:drawing>
           <wp:inline distT="0" distB="0" distL="0" distR="0" wp14:anchorId="4072A468" wp14:editId="0919FEC1">
             <wp:extent cx="2657846" cy="1676634"/>
@@ -6417,7 +8506,29 @@
       </w:r>
     </w:p>
     <w:p>
-      <w:r>
+      <w:pPr>
+        <w:pStyle w:val="Descripcin"/>
+      </w:pPr>
+      <w:fldSimple w:instr=" SEQ Ilustración \* ARABIC ">
+        <w:r>
+          <w:rPr>
+            <w:noProof/>
+          </w:rPr>
+          <w:t>10</w:t>
+        </w:r>
+      </w:fldSimple>
+      <w:r>
+        <w:t xml:space="preserve"> Creación usuario 2/3</w:t>
+      </w:r>
+    </w:p>
+    <w:p>
+      <w:pPr>
+        <w:keepNext/>
+      </w:pPr>
+      <w:r>
+        <w:rPr>
+          <w:noProof/>
+        </w:rPr>
         <w:drawing>
           <wp:inline distT="0" distB="0" distL="0" distR="0" wp14:anchorId="2F84BCC8" wp14:editId="09A759D9">
             <wp:extent cx="5731510" cy="1660525"/>
@@ -6457,6 +8568,22 @@
     </w:p>
     <w:p>
       <w:pPr>
+        <w:pStyle w:val="Descripcin"/>
+      </w:pPr>
+      <w:fldSimple w:instr=" SEQ Ilustración \* ARABIC ">
+        <w:r>
+          <w:rPr>
+            <w:noProof/>
+          </w:rPr>
+          <w:t>11</w:t>
+        </w:r>
+      </w:fldSimple>
+      <w:r>
+        <w:t xml:space="preserve"> Creación usuario 3/3</w:t>
+      </w:r>
+    </w:p>
+    <w:p>
+      <w:pPr>
         <w:rPr>
           <w:b/>
           <w:bCs/>
@@ -6488,15 +8615,13 @@
     </w:p>
     <w:p>
       <w:pPr>
-        <w:rPr>
-          <w:b/>
-          <w:bCs/>
-        </w:rPr>
-      </w:pPr>
-      <w:r>
-        <w:rPr>
-          <w:b/>
-          <w:bCs/>
+        <w:keepNext/>
+      </w:pPr>
+      <w:r>
+        <w:rPr>
+          <w:b/>
+          <w:bCs/>
+          <w:noProof/>
         </w:rPr>
         <w:drawing>
           <wp:inline distT="0" distB="0" distL="0" distR="0" wp14:anchorId="0E576428" wp14:editId="078EA3DB">
@@ -6537,6 +8662,182 @@
     </w:p>
     <w:p>
       <w:pPr>
+        <w:pStyle w:val="Descripcin"/>
+      </w:pPr>
+      <w:r>
+        <w:rPr>
+          <w:b/>
+          <w:bCs/>
+        </w:rPr>
+        <w:fldChar w:fldCharType="begin"/>
+      </w:r>
+      <w:r>
+        <w:rPr>
+          <w:b/>
+          <w:bCs/>
+        </w:rPr>
+        <w:instrText xml:space="preserve"> SEQ Ilustración \* ARABIC </w:instrText>
+      </w:r>
+      <w:r>
+        <w:rPr>
+          <w:b/>
+          <w:bCs/>
+        </w:rPr>
+        <w:fldChar w:fldCharType="separate"/>
+      </w:r>
+      <w:r>
+        <w:rPr>
+          <w:b/>
+          <w:bCs/>
+          <w:noProof/>
+        </w:rPr>
+        <w:t>12</w:t>
+      </w:r>
+      <w:r>
+        <w:rPr>
+          <w:b/>
+          <w:bCs/>
+        </w:rPr>
+        <w:fldChar w:fldCharType="end"/>
+      </w:r>
+      <w:r>
+        <w:t xml:space="preserve"> Control acceso plataforma</w:t>
+      </w:r>
+    </w:p>
+    <w:p/>
+    <w:p>
+      <w:pPr>
+        <w:rPr>
+          <w:b/>
+          <w:bCs/>
+          <w:u w:val="single"/>
+        </w:rPr>
+      </w:pPr>
+      <w:r>
+        <w:rPr>
+          <w:b/>
+          <w:bCs/>
+          <w:u w:val="single"/>
+        </w:rPr>
+        <w:t xml:space="preserve">Conexión </w:t>
+      </w:r>
+      <w:proofErr w:type="spellStart"/>
+      <w:r>
+        <w:rPr>
+          <w:b/>
+          <w:bCs/>
+          <w:u w:val="single"/>
+        </w:rPr>
+        <w:t>JavaFX</w:t>
+      </w:r>
+      <w:proofErr w:type="spellEnd"/>
+      <w:r>
+        <w:rPr>
+          <w:b/>
+          <w:bCs/>
+          <w:u w:val="single"/>
+        </w:rPr>
+        <w:t xml:space="preserve"> con SQL Server Management Studio</w:t>
+      </w:r>
+    </w:p>
+    <w:p>
+      <w:r>
+        <w:t xml:space="preserve">A la hora de implementar el sistema CRUD, debemos hacer una conexión entre la base de datos, creada en SSMS, y el proyecto </w:t>
+      </w:r>
+      <w:proofErr w:type="spellStart"/>
+      <w:r>
+        <w:t>JavaFX</w:t>
+      </w:r>
+      <w:proofErr w:type="spellEnd"/>
+      <w:r>
+        <w:t xml:space="preserve">. Para ello tuvimos que crear un método personalizado con el que hacer esta conexión, ya que es diferente a conectarlo con </w:t>
+      </w:r>
+      <w:proofErr w:type="spellStart"/>
+      <w:r>
+        <w:t>HeidiSQL</w:t>
+      </w:r>
+      <w:proofErr w:type="spellEnd"/>
+      <w:r>
+        <w:t xml:space="preserve">. </w:t>
+      </w:r>
+      <w:r>
+        <w:br/>
+        <w:t>Por un lado, SSMS utiliza su propio puerto, el 1433. Por otro lado, la conexión se realiza a través de un usuario</w:t>
+      </w:r>
+      <w:r>
+        <w:t xml:space="preserve"> y se requiere una contraseña. Una vez habilitado el usuario “</w:t>
+      </w:r>
+      <w:proofErr w:type="spellStart"/>
+      <w:r>
+        <w:t>sa</w:t>
+      </w:r>
+      <w:proofErr w:type="spellEnd"/>
+      <w:r>
+        <w:t xml:space="preserve">” y configurado una contraseña para este, se puede hacer la conexión a la base de datos con el siguiente método. </w:t>
+      </w:r>
+    </w:p>
+    <w:p>
+      <w:pPr>
+        <w:keepNext/>
+      </w:pPr>
+      <w:r>
+        <w:lastRenderedPageBreak/>
+        <w:drawing>
+          <wp:inline distT="0" distB="0" distL="0" distR="0" wp14:anchorId="4E9E85F0" wp14:editId="3BD3495F">
+            <wp:extent cx="5731510" cy="3602355"/>
+            <wp:effectExtent l="0" t="0" r="2540" b="0"/>
+            <wp:docPr id="122850871" name="Imagen 1"/>
+            <wp:cNvGraphicFramePr>
+              <a:graphicFrameLocks xmlns:a="http://schemas.openxmlformats.org/drawingml/2006/main" noChangeAspect="1"/>
+            </wp:cNvGraphicFramePr>
+            <a:graphic xmlns:a="http://schemas.openxmlformats.org/drawingml/2006/main">
+              <a:graphicData uri="http://schemas.openxmlformats.org/drawingml/2006/picture">
+                <pic:pic xmlns:pic="http://schemas.openxmlformats.org/drawingml/2006/picture">
+                  <pic:nvPicPr>
+                    <pic:cNvPr id="122850871" name=""/>
+                    <pic:cNvPicPr/>
+                  </pic:nvPicPr>
+                  <pic:blipFill>
+                    <a:blip r:embed="rId29"/>
+                    <a:stretch>
+                      <a:fillRect/>
+                    </a:stretch>
+                  </pic:blipFill>
+                  <pic:spPr>
+                    <a:xfrm>
+                      <a:off x="0" y="0"/>
+                      <a:ext cx="5731510" cy="3602355"/>
+                    </a:xfrm>
+                    <a:prstGeom prst="rect">
+                      <a:avLst/>
+                    </a:prstGeom>
+                  </pic:spPr>
+                </pic:pic>
+              </a:graphicData>
+            </a:graphic>
+          </wp:inline>
+        </w:drawing>
+      </w:r>
+    </w:p>
+    <w:p>
+      <w:pPr>
+        <w:pStyle w:val="Descripcin"/>
+      </w:pPr>
+      <w:fldSimple w:instr=" SEQ Ilustración \* ARABIC ">
+        <w:r>
+          <w:rPr>
+            <w:noProof/>
+          </w:rPr>
+          <w:t>13</w:t>
+        </w:r>
+      </w:fldSimple>
+      <w:r>
+        <w:t xml:space="preserve"> Método conexión a BD</w:t>
+      </w:r>
+    </w:p>
+    <w:p/>
+    <w:p>
+      <w:pPr>
         <w:pStyle w:val="Ttulo"/>
         <w:numPr>
           <w:ilvl w:val="0"/>
@@ -6544,6 +8845,20 @@
         </w:numPr>
       </w:pPr>
       <w:r>
+        <w:t>Manual de usuario</w:t>
+      </w:r>
+    </w:p>
+    <w:p/>
+    <w:p/>
+    <w:p>
+      <w:pPr>
+        <w:pStyle w:val="Ttulo"/>
+        <w:numPr>
+          <w:ilvl w:val="0"/>
+          <w:numId w:val="15"/>
+        </w:numPr>
+      </w:pPr>
+      <w:r>
         <w:t>Plan de negocio</w:t>
       </w:r>
     </w:p>
@@ -6599,7 +8914,21 @@
         <w:rPr>
           <w:rFonts w:ascii="Aptos" w:eastAsia="Aptos" w:hAnsi="Aptos" w:cs="Aptos"/>
         </w:rPr>
-        <w:t>Trabajamos para ayudar a los estudiantes a encontrar pisos durante su año lectivo. El resto de buscadores abarcan todo el mercado inmobiliario, no filtrando correctamente las posibles conexiones con centros de interés.</w:t>
+        <w:t xml:space="preserve">Trabajamos para ayudar a los estudiantes a encontrar pisos durante su año lectivo. El resto de </w:t>
+      </w:r>
+      <w:proofErr w:type="gramStart"/>
+      <w:r>
+        <w:rPr>
+          <w:rFonts w:ascii="Aptos" w:eastAsia="Aptos" w:hAnsi="Aptos" w:cs="Aptos"/>
+        </w:rPr>
+        <w:t>buscadores</w:t>
+      </w:r>
+      <w:proofErr w:type="gramEnd"/>
+      <w:r>
+        <w:rPr>
+          <w:rFonts w:ascii="Aptos" w:eastAsia="Aptos" w:hAnsi="Aptos" w:cs="Aptos"/>
+        </w:rPr>
+        <w:t xml:space="preserve"> abarcan todo el mercado inmobiliario, no filtrando correctamente las posibles conexiones con centros de interés.</w:t>
       </w:r>
     </w:p>
     <w:p>
@@ -6611,6 +8940,7 @@
         <w:rPr>
           <w:rFonts w:ascii="Aptos" w:eastAsia="Aptos" w:hAnsi="Aptos" w:cs="Aptos"/>
         </w:rPr>
+        <w:lastRenderedPageBreak/>
         <w:t>Planteamos una plataforma simple de navegar y que garantiza cercanía al centro de estudio. Además, nosotros garantizamos seguridad para el joven, luchando en contra de posibles fraudes que traten de capitalizar en su falta de experiencia.</w:t>
       </w:r>
     </w:p>
@@ -6661,7 +8991,7 @@
         </w:rPr>
         <w:t xml:space="preserve">Alquiler de oficinas </w:t>
       </w:r>
-      <w:hyperlink r:id="rId29">
+      <w:hyperlink r:id="rId30">
         <w:r>
           <w:rPr>
             <w:rStyle w:val="Hipervnculo"/>
@@ -6795,7 +9125,21 @@
         <w:rPr>
           <w:rFonts w:ascii="Aptos" w:eastAsia="Aptos" w:hAnsi="Aptos" w:cs="Aptos"/>
         </w:rPr>
-        <w:t>Plan de Hostinger Cloud Startup 12 meses: 119,88€</w:t>
+        <w:t xml:space="preserve">Plan de Hostinger Cloud </w:t>
+      </w:r>
+      <w:proofErr w:type="gramStart"/>
+      <w:r>
+        <w:rPr>
+          <w:rFonts w:ascii="Aptos" w:eastAsia="Aptos" w:hAnsi="Aptos" w:cs="Aptos"/>
+        </w:rPr>
+        <w:t>Startup</w:t>
+      </w:r>
+      <w:proofErr w:type="gramEnd"/>
+      <w:r>
+        <w:rPr>
+          <w:rFonts w:ascii="Aptos" w:eastAsia="Aptos" w:hAnsi="Aptos" w:cs="Aptos"/>
+        </w:rPr>
+        <w:t xml:space="preserve"> 12 meses: 119,88€</w:t>
       </w:r>
     </w:p>
     <w:p>
@@ -6865,7 +9209,74 @@
         <w:rPr>
           <w:rFonts w:ascii="Aptos" w:eastAsia="Aptos" w:hAnsi="Aptos" w:cs="Aptos"/>
         </w:rPr>
-        <w:t>Podemos solicitar subvenciones por ayudar a jóvenes durante sus estudios.</w:t>
+        <w:t xml:space="preserve">Solicitud de </w:t>
+      </w:r>
+      <w:r>
+        <w:rPr>
+          <w:rFonts w:ascii="Aptos" w:eastAsia="Aptos" w:hAnsi="Aptos" w:cs="Aptos"/>
+        </w:rPr>
+        <w:t>subvenciones</w:t>
+      </w:r>
+      <w:r>
+        <w:rPr>
+          <w:rFonts w:ascii="Aptos" w:eastAsia="Aptos" w:hAnsi="Aptos" w:cs="Aptos"/>
+        </w:rPr>
+        <w:t xml:space="preserve"> por ayudar a jóvenes durante sus estudios.</w:t>
+      </w:r>
+      <w:r>
+        <w:rPr>
+          <w:rFonts w:ascii="Aptos" w:eastAsia="Aptos" w:hAnsi="Aptos" w:cs="Aptos"/>
+        </w:rPr>
+        <w:t xml:space="preserve"> </w:t>
+      </w:r>
+      <w:r>
+        <w:rPr>
+          <w:rFonts w:ascii="Aptos" w:eastAsia="Aptos" w:hAnsi="Aptos" w:cs="Aptos"/>
+        </w:rPr>
+        <w:br/>
+      </w:r>
+    </w:p>
+    <w:p>
+      <w:pPr>
+        <w:pStyle w:val="Prrafodelista"/>
+        <w:numPr>
+          <w:ilvl w:val="0"/>
+          <w:numId w:val="4"/>
+        </w:numPr>
+        <w:spacing w:before="240" w:after="240" w:line="276" w:lineRule="auto"/>
+        <w:rPr>
+          <w:rFonts w:ascii="Aptos" w:eastAsia="Aptos" w:hAnsi="Aptos" w:cs="Aptos"/>
+        </w:rPr>
+      </w:pPr>
+      <w:r>
+        <w:t>Ofrecer un CRM para la administración de los inmuebles desde un portal/</w:t>
+      </w:r>
+      <w:proofErr w:type="gramStart"/>
+      <w:r>
+        <w:t>app</w:t>
+      </w:r>
+      <w:proofErr w:type="gramEnd"/>
+      <w:r>
+        <w:t xml:space="preserve">. </w:t>
+      </w:r>
+      <w:r>
+        <w:br/>
+      </w:r>
+    </w:p>
+    <w:p>
+      <w:pPr>
+        <w:pStyle w:val="Prrafodelista"/>
+        <w:numPr>
+          <w:ilvl w:val="0"/>
+          <w:numId w:val="4"/>
+        </w:numPr>
+        <w:spacing w:before="240" w:after="240" w:line="276" w:lineRule="auto"/>
+        <w:rPr>
+          <w:rFonts w:ascii="Aptos" w:eastAsia="Aptos" w:hAnsi="Aptos" w:cs="Aptos"/>
+        </w:rPr>
+      </w:pPr>
+      <w:r>
+        <w:t xml:space="preserve">Posibilidad de ofrecer un espacio publicitario en la web. </w:t>
       </w:r>
       <w:r>
         <w:br w:type="page"/>
@@ -7549,7 +9960,35 @@
         <w:rPr>
           <w:rFonts w:ascii="Aptos" w:eastAsia="Aptos" w:hAnsi="Aptos" w:cs="Aptos"/>
         </w:rPr>
-        <w:t xml:space="preserve">Caldas Blanco, M. E., Hidalgo Ortega, M. L. y Laraño DIaz, J. (2024). </w:t>
+        <w:t xml:space="preserve">Caldas Blanco, M. E., Hidalgo Ortega, M. L. y </w:t>
+      </w:r>
+      <w:proofErr w:type="spellStart"/>
+      <w:r>
+        <w:rPr>
+          <w:rFonts w:ascii="Aptos" w:eastAsia="Aptos" w:hAnsi="Aptos" w:cs="Aptos"/>
+        </w:rPr>
+        <w:t>Laraño</w:t>
+      </w:r>
+      <w:proofErr w:type="spellEnd"/>
+      <w:r>
+        <w:rPr>
+          <w:rFonts w:ascii="Aptos" w:eastAsia="Aptos" w:hAnsi="Aptos" w:cs="Aptos"/>
+        </w:rPr>
+        <w:t xml:space="preserve"> </w:t>
+      </w:r>
+      <w:proofErr w:type="spellStart"/>
+      <w:r>
+        <w:rPr>
+          <w:rFonts w:ascii="Aptos" w:eastAsia="Aptos" w:hAnsi="Aptos" w:cs="Aptos"/>
+        </w:rPr>
+        <w:t>DIaz</w:t>
+      </w:r>
+      <w:proofErr w:type="spellEnd"/>
+      <w:r>
+        <w:rPr>
+          <w:rFonts w:ascii="Aptos" w:eastAsia="Aptos" w:hAnsi="Aptos" w:cs="Aptos"/>
+        </w:rPr>
+        <w:t xml:space="preserve">, J. (2024). </w:t>
       </w:r>
       <w:r>
         <w:rPr>
@@ -7563,18 +10002,40 @@
         <w:rPr>
           <w:rFonts w:ascii="Aptos" w:eastAsia="Aptos" w:hAnsi="Aptos" w:cs="Aptos"/>
         </w:rPr>
-        <w:t>(Capítulo 4). Editex.</w:t>
+        <w:t xml:space="preserve">(Capítulo 4). </w:t>
+      </w:r>
+      <w:proofErr w:type="spellStart"/>
+      <w:r>
+        <w:rPr>
+          <w:rFonts w:ascii="Aptos" w:eastAsia="Aptos" w:hAnsi="Aptos" w:cs="Aptos"/>
+        </w:rPr>
+        <w:t>Editex</w:t>
+      </w:r>
+      <w:proofErr w:type="spellEnd"/>
+      <w:r>
+        <w:rPr>
+          <w:rFonts w:ascii="Aptos" w:eastAsia="Aptos" w:hAnsi="Aptos" w:cs="Aptos"/>
+        </w:rPr>
+        <w:t>.</w:t>
       </w:r>
     </w:p>
     <w:p>
       <w:pPr>
         <w:spacing w:line="276" w:lineRule="auto"/>
       </w:pPr>
-      <w:r>
-        <w:rPr>
-          <w:rFonts w:ascii="Aptos" w:eastAsia="Aptos" w:hAnsi="Aptos" w:cs="Aptos"/>
-        </w:rPr>
-        <w:t xml:space="preserve">elEconomista. (15 de septiembre de 2023). </w:t>
+      <w:proofErr w:type="spellStart"/>
+      <w:r>
+        <w:rPr>
+          <w:rFonts w:ascii="Aptos" w:eastAsia="Aptos" w:hAnsi="Aptos" w:cs="Aptos"/>
+        </w:rPr>
+        <w:t>elEconomista</w:t>
+      </w:r>
+      <w:proofErr w:type="spellEnd"/>
+      <w:r>
+        <w:rPr>
+          <w:rFonts w:ascii="Aptos" w:eastAsia="Aptos" w:hAnsi="Aptos" w:cs="Aptos"/>
+        </w:rPr>
+        <w:t xml:space="preserve">. (15 de septiembre de 2023). </w:t>
       </w:r>
       <w:r>
         <w:rPr>
@@ -7582,7 +10043,25 @@
           <w:i/>
           <w:iCs/>
         </w:rPr>
-        <w:t>Crece el número de estudiantes que decicen alquilar habitaciones en pisos compartidos.</w:t>
+        <w:t xml:space="preserve">Crece el número de estudiantes que </w:t>
+      </w:r>
+      <w:proofErr w:type="spellStart"/>
+      <w:r>
+        <w:rPr>
+          <w:rFonts w:ascii="Aptos" w:eastAsia="Aptos" w:hAnsi="Aptos" w:cs="Aptos"/>
+          <w:i/>
+          <w:iCs/>
+        </w:rPr>
+        <w:t>decicen</w:t>
+      </w:r>
+      <w:proofErr w:type="spellEnd"/>
+      <w:r>
+        <w:rPr>
+          <w:rFonts w:ascii="Aptos" w:eastAsia="Aptos" w:hAnsi="Aptos" w:cs="Aptos"/>
+          <w:i/>
+          <w:iCs/>
+        </w:rPr>
+        <w:t xml:space="preserve"> alquilar habitaciones en pisos compartidos.</w:t>
       </w:r>
       <w:r>
         <w:rPr>
@@ -7590,7 +10069,7 @@
         </w:rPr>
         <w:t xml:space="preserve"> </w:t>
       </w:r>
-      <w:hyperlink r:id="rId30">
+      <w:hyperlink r:id="rId31">
         <w:r>
           <w:rPr>
             <w:rStyle w:val="Hipervnculo"/>
@@ -7604,11 +10083,19 @@
       <w:pPr>
         <w:spacing w:line="276" w:lineRule="auto"/>
       </w:pPr>
-      <w:r>
-        <w:rPr>
-          <w:rFonts w:ascii="Aptos" w:eastAsia="Aptos" w:hAnsi="Aptos" w:cs="Aptos"/>
-        </w:rPr>
-        <w:t xml:space="preserve">Diánez Juan, S. (2025). </w:t>
+      <w:proofErr w:type="spellStart"/>
+      <w:r>
+        <w:rPr>
+          <w:rFonts w:ascii="Aptos" w:eastAsia="Aptos" w:hAnsi="Aptos" w:cs="Aptos"/>
+        </w:rPr>
+        <w:t>Diánez</w:t>
+      </w:r>
+      <w:proofErr w:type="spellEnd"/>
+      <w:r>
+        <w:rPr>
+          <w:rFonts w:ascii="Aptos" w:eastAsia="Aptos" w:hAnsi="Aptos" w:cs="Aptos"/>
+        </w:rPr>
+        <w:t xml:space="preserve"> Juan, S. (2025). </w:t>
       </w:r>
       <w:r>
         <w:rPr>
@@ -7624,7 +10111,7 @@
         </w:rPr>
         <w:t xml:space="preserve">IES Mutxamel. </w:t>
       </w:r>
-      <w:hyperlink r:id="rId31">
+      <w:hyperlink r:id="rId32">
         <w:r>
           <w:rPr>
             <w:rStyle w:val="Hipervnculo"/>
@@ -7638,11 +10125,19 @@
       <w:pPr>
         <w:spacing w:line="276" w:lineRule="auto"/>
       </w:pPr>
-      <w:r>
-        <w:rPr>
-          <w:rFonts w:ascii="Aptos" w:eastAsia="Aptos" w:hAnsi="Aptos" w:cs="Aptos"/>
-        </w:rPr>
-        <w:t xml:space="preserve">Diánez Juan, S. (2025). </w:t>
+      <w:proofErr w:type="spellStart"/>
+      <w:r>
+        <w:rPr>
+          <w:rFonts w:ascii="Aptos" w:eastAsia="Aptos" w:hAnsi="Aptos" w:cs="Aptos"/>
+        </w:rPr>
+        <w:t>Diánez</w:t>
+      </w:r>
+      <w:proofErr w:type="spellEnd"/>
+      <w:r>
+        <w:rPr>
+          <w:rFonts w:ascii="Aptos" w:eastAsia="Aptos" w:hAnsi="Aptos" w:cs="Aptos"/>
+        </w:rPr>
+        <w:t xml:space="preserve"> Juan, S. (2025). </w:t>
       </w:r>
       <w:r>
         <w:rPr>
@@ -7658,7 +10153,7 @@
         </w:rPr>
         <w:t xml:space="preserve">IES Mutxamel. </w:t>
       </w:r>
-      <w:hyperlink r:id="rId32">
+      <w:hyperlink r:id="rId33">
         <w:r>
           <w:rPr>
             <w:rStyle w:val="Hipervnculo"/>
@@ -7692,7 +10187,7 @@
         </w:rPr>
         <w:t xml:space="preserve">. </w:t>
       </w:r>
-      <w:hyperlink r:id="rId33">
+      <w:hyperlink r:id="rId34">
         <w:r>
           <w:rPr>
             <w:rStyle w:val="Hipervnculo"/>
@@ -7704,8 +10199,8 @@
     </w:p>
     <w:p/>
     <w:sectPr>
-      <w:headerReference w:type="default" r:id="rId34"/>
-      <w:footerReference w:type="default" r:id="rId35"/>
+      <w:headerReference w:type="default" r:id="rId35"/>
+      <w:footerReference w:type="default" r:id="rId36"/>
       <w:pgSz w:w="11906" w:h="16838"/>
       <w:pgMar w:top="1440" w:right="1440" w:bottom="1440" w:left="1440" w:header="283" w:footer="720" w:gutter="0"/>
       <w:cols w:space="720"/>
@@ -8689,7 +11184,7 @@
   <w:abstractNum w:abstractNumId="6" w15:restartNumberingAfterBreak="0">
     <w:nsid w:val="2D1F8272"/>
     <w:multiLevelType w:val="hybridMultilevel"/>
-    <w:tmpl w:val="0ABE61A4"/>
+    <w:tmpl w:val="63AC281C"/>
     <w:lvl w:ilvl="0" w:tplc="38D6B184">
       <w:start w:val="1"/>
       <w:numFmt w:val="bullet"/>
@@ -10613,6 +13108,7 @@
   <w:style w:type="character" w:default="1" w:styleId="Fuentedeprrafopredeter">
     <w:name w:val="Default Paragraph Font"/>
     <w:uiPriority w:val="1"/>
+    <w:semiHidden/>
     <w:unhideWhenUsed/>
   </w:style>
   <w:style w:type="table" w:default="1" w:styleId="Tablanormal">
@@ -11138,12 +13634,7 @@
 </file>
 
 <file path=customXml/item3.xml><?xml version="1.0" encoding="utf-8"?>
-<?mso-contentType ?>
-<FormTemplates xmlns="http://schemas.microsoft.com/sharepoint/v3/contenttype/forms">
-  <Display>DocumentLibraryForm</Display>
-  <Edit>DocumentLibraryForm</Edit>
-  <New>DocumentLibraryForm</New>
-</FormTemplates>
+<b:Sources xmlns:b="http://schemas.openxmlformats.org/officeDocument/2006/bibliography" xmlns="http://schemas.openxmlformats.org/officeDocument/2006/bibliography" SelectedStyle="\APASixthEditionOfficeOnline.xsl" StyleName="APA" Version="6"/>
 </file>
 
 <file path=customXml/item4.xml><?xml version="1.0" encoding="utf-8"?>
@@ -11297,7 +13788,12 @@
 </file>
 
 <file path=customXml/item5.xml><?xml version="1.0" encoding="utf-8"?>
-<b:Sources xmlns:b="http://schemas.openxmlformats.org/officeDocument/2006/bibliography" xmlns="http://schemas.openxmlformats.org/officeDocument/2006/bibliography" SelectedStyle="\APASixthEditionOfficeOnline.xsl" StyleName="APA" Version="6"/>
+<?mso-contentType ?>
+<FormTemplates xmlns="http://schemas.microsoft.com/sharepoint/v3/contenttype/forms">
+  <Display>DocumentLibraryForm</Display>
+  <Edit>DocumentLibraryForm</Edit>
+  <New>DocumentLibraryForm</New>
+</FormTemplates>
 </file>
 
 <file path=customXml/itemProps1.xml><?xml version="1.0" encoding="utf-8"?>
@@ -11319,9 +13815,9 @@
 </file>
 
 <file path=customXml/itemProps3.xml><?xml version="1.0" encoding="utf-8"?>
-<ds:datastoreItem xmlns:ds="http://schemas.openxmlformats.org/officeDocument/2006/customXml" ds:itemID="{9C62D19F-2C4B-4163-B98D-18BF5B309744}">
+<ds:datastoreItem xmlns:ds="http://schemas.openxmlformats.org/officeDocument/2006/customXml" ds:itemID="{84CA4A16-CE6B-4C64-8CA7-CF5CBE9EE313}">
   <ds:schemaRefs>
-    <ds:schemaRef ds:uri="http://schemas.microsoft.com/sharepoint/v3/contenttype/forms"/>
+    <ds:schemaRef ds:uri="http://schemas.openxmlformats.org/officeDocument/2006/bibliography"/>
   </ds:schemaRefs>
 </ds:datastoreItem>
 </file>
@@ -11345,9 +13841,9 @@
 </file>
 
 <file path=customXml/itemProps5.xml><?xml version="1.0" encoding="utf-8"?>
-<ds:datastoreItem xmlns:ds="http://schemas.openxmlformats.org/officeDocument/2006/customXml" ds:itemID="{84CA4A16-CE6B-4C64-8CA7-CF5CBE9EE313}">
+<ds:datastoreItem xmlns:ds="http://schemas.openxmlformats.org/officeDocument/2006/customXml" ds:itemID="{9C62D19F-2C4B-4163-B98D-18BF5B309744}">
   <ds:schemaRefs>
-    <ds:schemaRef ds:uri="http://schemas.openxmlformats.org/officeDocument/2006/bibliography"/>
+    <ds:schemaRef ds:uri="http://schemas.microsoft.com/sharepoint/v3/contenttype/forms"/>
   </ds:schemaRefs>
 </ds:datastoreItem>
 </file>
</xml_diff>

<commit_message>
Diagrama de arquitectura actualizado
</commit_message>
<xml_diff>
--- a/Documentación_final.docx
+++ b/Documentación_final.docx
@@ -68,21 +68,7 @@
         <w:rPr>
           <w:rStyle w:val="Ttulodellibro"/>
         </w:rPr>
-        <w:t xml:space="preserve">Proyecto </w:t>
-      </w:r>
-      <w:proofErr w:type="spellStart"/>
-      <w:r>
-        <w:rPr>
-          <w:rStyle w:val="Ttulodellibro"/>
-        </w:rPr>
-        <w:t>Intermodular</w:t>
-      </w:r>
-      <w:proofErr w:type="spellEnd"/>
-      <w:r>
-        <w:rPr>
-          <w:rStyle w:val="Ttulodellibro"/>
-        </w:rPr>
-        <w:t xml:space="preserve"> Hito </w:t>
+        <w:t xml:space="preserve">Proyecto Intermodular Hito </w:t>
       </w:r>
       <w:r>
         <w:rPr>
@@ -161,7 +147,6 @@
           <w:u w:val="single"/>
         </w:rPr>
       </w:pPr>
-      <w:proofErr w:type="spellStart"/>
       <w:r>
         <w:rPr>
           <w:sz w:val="40"/>
@@ -171,1348 +156,61 @@
         <w:lastRenderedPageBreak/>
         <w:t>Abstract</w:t>
       </w:r>
-      <w:proofErr w:type="spellEnd"/>
-    </w:p>
-    <w:p>
-      <w:r>
-        <w:t xml:space="preserve">For </w:t>
-      </w:r>
-      <w:proofErr w:type="spellStart"/>
-      <w:r>
-        <w:t>this</w:t>
-      </w:r>
-      <w:proofErr w:type="spellEnd"/>
-      <w:r>
-        <w:t xml:space="preserve"> </w:t>
-      </w:r>
-      <w:proofErr w:type="spellStart"/>
-      <w:r>
-        <w:t>project</w:t>
-      </w:r>
-      <w:proofErr w:type="spellEnd"/>
-      <w:r>
-        <w:t>,</w:t>
-      </w:r>
-      <w:r>
-        <w:t xml:space="preserve"> </w:t>
-      </w:r>
-      <w:proofErr w:type="spellStart"/>
-      <w:r>
-        <w:t>the</w:t>
-      </w:r>
-      <w:proofErr w:type="spellEnd"/>
-      <w:r>
-        <w:t xml:space="preserve"> </w:t>
-      </w:r>
-      <w:proofErr w:type="spellStart"/>
-      <w:r>
-        <w:t>website</w:t>
-      </w:r>
-      <w:proofErr w:type="spellEnd"/>
-      <w:r>
-        <w:t xml:space="preserve"> “</w:t>
-      </w:r>
-      <w:proofErr w:type="spellStart"/>
-      <w:r>
-        <w:t>Ro</w:t>
+    </w:p>
+    <w:p>
+      <w:r>
+        <w:t>For this project,</w:t>
+      </w:r>
+      <w:r>
+        <w:t xml:space="preserve"> the website “Ro</w:t>
       </w:r>
       <w:r>
         <w:t>o</w:t>
       </w:r>
       <w:r>
-        <w:t>mie</w:t>
-      </w:r>
-      <w:proofErr w:type="spellEnd"/>
-      <w:r>
-        <w:t xml:space="preserve">” has </w:t>
-      </w:r>
-      <w:proofErr w:type="spellStart"/>
-      <w:r>
-        <w:t>been</w:t>
-      </w:r>
-      <w:proofErr w:type="spellEnd"/>
-      <w:r>
-        <w:t xml:space="preserve"> </w:t>
-      </w:r>
-      <w:proofErr w:type="spellStart"/>
-      <w:r>
-        <w:t>designed</w:t>
-      </w:r>
-      <w:proofErr w:type="spellEnd"/>
-      <w:r>
-        <w:t>,</w:t>
-      </w:r>
-      <w:r>
-        <w:t xml:space="preserve"> </w:t>
-      </w:r>
-      <w:proofErr w:type="spellStart"/>
-      <w:r>
-        <w:t>that</w:t>
-      </w:r>
-      <w:proofErr w:type="spellEnd"/>
-      <w:r>
-        <w:t xml:space="preserve"> </w:t>
-      </w:r>
-      <w:proofErr w:type="spellStart"/>
-      <w:r>
-        <w:t>will</w:t>
-      </w:r>
-      <w:proofErr w:type="spellEnd"/>
-      <w:r>
-        <w:t xml:space="preserve"> </w:t>
-      </w:r>
-      <w:proofErr w:type="spellStart"/>
-      <w:r>
-        <w:t>help</w:t>
-      </w:r>
-      <w:proofErr w:type="spellEnd"/>
-      <w:r>
-        <w:t xml:space="preserve"> </w:t>
-      </w:r>
-      <w:proofErr w:type="spellStart"/>
-      <w:r>
-        <w:t>students</w:t>
-      </w:r>
-      <w:proofErr w:type="spellEnd"/>
-      <w:r>
-        <w:t xml:space="preserve"> </w:t>
-      </w:r>
-      <w:proofErr w:type="spellStart"/>
-      <w:r>
-        <w:t>find</w:t>
-      </w:r>
-      <w:proofErr w:type="spellEnd"/>
-      <w:r>
-        <w:t xml:space="preserve"> </w:t>
-      </w:r>
-      <w:proofErr w:type="spellStart"/>
-      <w:r>
-        <w:t>rooms</w:t>
-      </w:r>
-      <w:proofErr w:type="spellEnd"/>
-      <w:r>
-        <w:t xml:space="preserve"> </w:t>
-      </w:r>
-      <w:proofErr w:type="spellStart"/>
-      <w:r>
-        <w:t>to</w:t>
-      </w:r>
-      <w:proofErr w:type="spellEnd"/>
-      <w:r>
-        <w:t xml:space="preserve"> </w:t>
-      </w:r>
-      <w:proofErr w:type="spellStart"/>
-      <w:r>
-        <w:t>rent</w:t>
-      </w:r>
-      <w:proofErr w:type="spellEnd"/>
-      <w:r>
-        <w:t xml:space="preserve"> </w:t>
-      </w:r>
-      <w:proofErr w:type="spellStart"/>
-      <w:r>
-        <w:t>near</w:t>
-      </w:r>
-      <w:proofErr w:type="spellEnd"/>
-      <w:r>
-        <w:t xml:space="preserve"> </w:t>
-      </w:r>
-      <w:proofErr w:type="spellStart"/>
-      <w:r>
-        <w:t>the</w:t>
-      </w:r>
-      <w:proofErr w:type="spellEnd"/>
-      <w:r>
-        <w:t xml:space="preserve"> </w:t>
-      </w:r>
-      <w:proofErr w:type="spellStart"/>
-      <w:r>
-        <w:t>universities</w:t>
-      </w:r>
-      <w:proofErr w:type="spellEnd"/>
-      <w:r>
-        <w:t xml:space="preserve"> </w:t>
-      </w:r>
-      <w:proofErr w:type="spellStart"/>
-      <w:r>
-        <w:t>they</w:t>
-      </w:r>
-      <w:proofErr w:type="spellEnd"/>
-      <w:r>
-        <w:t xml:space="preserve"> </w:t>
-      </w:r>
-      <w:proofErr w:type="spellStart"/>
-      <w:r>
-        <w:t>study</w:t>
-      </w:r>
-      <w:proofErr w:type="spellEnd"/>
-      <w:r>
-        <w:t xml:space="preserve"> at</w:t>
-      </w:r>
-      <w:r>
-        <w:t xml:space="preserve">, </w:t>
-      </w:r>
-      <w:proofErr w:type="spellStart"/>
-      <w:r>
-        <w:t>being</w:t>
-      </w:r>
-      <w:proofErr w:type="spellEnd"/>
-      <w:r>
-        <w:t xml:space="preserve"> </w:t>
-      </w:r>
-      <w:proofErr w:type="spellStart"/>
-      <w:r>
-        <w:t>the</w:t>
-      </w:r>
-      <w:proofErr w:type="spellEnd"/>
-      <w:r>
-        <w:t xml:space="preserve"> </w:t>
-      </w:r>
-      <w:proofErr w:type="spellStart"/>
-      <w:r>
-        <w:t>task</w:t>
-      </w:r>
-      <w:proofErr w:type="spellEnd"/>
-      <w:r>
-        <w:t xml:space="preserve"> </w:t>
-      </w:r>
-      <w:proofErr w:type="spellStart"/>
-      <w:r>
-        <w:t>to</w:t>
-      </w:r>
-      <w:proofErr w:type="spellEnd"/>
-      <w:r>
-        <w:t xml:space="preserve"> </w:t>
-      </w:r>
-      <w:proofErr w:type="spellStart"/>
-      <w:r>
-        <w:t>find</w:t>
-      </w:r>
-      <w:proofErr w:type="spellEnd"/>
-      <w:r>
-        <w:t xml:space="preserve"> </w:t>
-      </w:r>
-      <w:proofErr w:type="spellStart"/>
-      <w:r>
-        <w:t>appartments</w:t>
-      </w:r>
-      <w:proofErr w:type="spellEnd"/>
-      <w:r>
-        <w:t xml:space="preserve"> </w:t>
-      </w:r>
-      <w:proofErr w:type="spellStart"/>
-      <w:r>
-        <w:t>to</w:t>
-      </w:r>
-      <w:proofErr w:type="spellEnd"/>
-      <w:r>
-        <w:t xml:space="preserve"> </w:t>
-      </w:r>
-      <w:proofErr w:type="spellStart"/>
-      <w:r>
-        <w:t>rent</w:t>
-      </w:r>
-      <w:proofErr w:type="spellEnd"/>
-      <w:r>
-        <w:t xml:space="preserve"> </w:t>
-      </w:r>
-      <w:proofErr w:type="spellStart"/>
-      <w:r>
-        <w:t>very</w:t>
-      </w:r>
-      <w:proofErr w:type="spellEnd"/>
-      <w:r>
-        <w:t xml:space="preserve"> </w:t>
-      </w:r>
-      <w:proofErr w:type="spellStart"/>
-      <w:r>
-        <w:t>challenging</w:t>
-      </w:r>
-      <w:proofErr w:type="spellEnd"/>
-      <w:r>
-        <w:t xml:space="preserve"> </w:t>
-      </w:r>
-      <w:proofErr w:type="spellStart"/>
-      <w:r>
-        <w:t>for</w:t>
-      </w:r>
-      <w:proofErr w:type="spellEnd"/>
-      <w:r>
-        <w:t xml:space="preserve"> </w:t>
-      </w:r>
-      <w:proofErr w:type="spellStart"/>
-      <w:r>
-        <w:t>young</w:t>
-      </w:r>
-      <w:proofErr w:type="spellEnd"/>
-      <w:r>
-        <w:t xml:space="preserve"> </w:t>
-      </w:r>
-      <w:proofErr w:type="spellStart"/>
-      <w:r>
-        <w:t>students</w:t>
-      </w:r>
-      <w:proofErr w:type="spellEnd"/>
-      <w:r>
-        <w:t xml:space="preserve">. </w:t>
+        <w:t>mie” has been designed,</w:t>
+      </w:r>
+      <w:r>
+        <w:t xml:space="preserve"> that will help students find rooms to rent near the universities they study at</w:t>
+      </w:r>
+      <w:r>
+        <w:t xml:space="preserve">, being the task to find appartments to rent very challenging for young students. </w:t>
       </w:r>
       <w:r>
         <w:br/>
-        <w:t xml:space="preserve">The </w:t>
-      </w:r>
-      <w:proofErr w:type="spellStart"/>
-      <w:r>
-        <w:t>website</w:t>
-      </w:r>
-      <w:proofErr w:type="spellEnd"/>
-      <w:r>
-        <w:t xml:space="preserve"> </w:t>
-      </w:r>
-      <w:proofErr w:type="spellStart"/>
-      <w:r>
-        <w:t>will</w:t>
-      </w:r>
-      <w:proofErr w:type="spellEnd"/>
-      <w:r>
-        <w:t xml:space="preserve"> </w:t>
-      </w:r>
-      <w:proofErr w:type="spellStart"/>
-      <w:r>
-        <w:t>let</w:t>
-      </w:r>
-      <w:proofErr w:type="spellEnd"/>
-      <w:r>
-        <w:t xml:space="preserve"> </w:t>
-      </w:r>
-      <w:proofErr w:type="spellStart"/>
-      <w:r>
-        <w:t>the</w:t>
-      </w:r>
-      <w:proofErr w:type="spellEnd"/>
-      <w:r>
-        <w:t xml:space="preserve"> home </w:t>
-      </w:r>
-      <w:proofErr w:type="spellStart"/>
-      <w:r>
-        <w:t>owners</w:t>
-      </w:r>
-      <w:proofErr w:type="spellEnd"/>
-      <w:r>
-        <w:t xml:space="preserve"> </w:t>
-      </w:r>
-      <w:proofErr w:type="spellStart"/>
-      <w:r>
-        <w:t>publish</w:t>
-      </w:r>
-      <w:proofErr w:type="spellEnd"/>
-      <w:r>
-        <w:t xml:space="preserve"> </w:t>
-      </w:r>
-      <w:proofErr w:type="spellStart"/>
-      <w:r>
-        <w:t>their</w:t>
-      </w:r>
-      <w:proofErr w:type="spellEnd"/>
-      <w:r>
-        <w:t xml:space="preserve"> </w:t>
-      </w:r>
-      <w:proofErr w:type="spellStart"/>
-      <w:r>
-        <w:t>property</w:t>
-      </w:r>
-      <w:proofErr w:type="spellEnd"/>
-      <w:r>
-        <w:t xml:space="preserve"> as a </w:t>
-      </w:r>
-      <w:proofErr w:type="spellStart"/>
-      <w:r>
-        <w:t>whole</w:t>
-      </w:r>
-      <w:proofErr w:type="spellEnd"/>
-      <w:r>
-        <w:t xml:space="preserve">, and </w:t>
-      </w:r>
-      <w:proofErr w:type="spellStart"/>
-      <w:r>
-        <w:t>the</w:t>
-      </w:r>
-      <w:proofErr w:type="spellEnd"/>
-      <w:r>
-        <w:t xml:space="preserve"> </w:t>
-      </w:r>
-      <w:proofErr w:type="spellStart"/>
-      <w:r>
-        <w:t>students</w:t>
-      </w:r>
-      <w:proofErr w:type="spellEnd"/>
-      <w:r>
-        <w:t xml:space="preserve"> </w:t>
-      </w:r>
-      <w:proofErr w:type="spellStart"/>
-      <w:r>
-        <w:t>will</w:t>
-      </w:r>
-      <w:proofErr w:type="spellEnd"/>
-      <w:r>
-        <w:t xml:space="preserve"> </w:t>
-      </w:r>
-      <w:proofErr w:type="spellStart"/>
-      <w:r>
-        <w:t>choose</w:t>
-      </w:r>
-      <w:proofErr w:type="spellEnd"/>
-      <w:r>
-        <w:t xml:space="preserve"> a </w:t>
-      </w:r>
-      <w:proofErr w:type="spellStart"/>
-      <w:r>
-        <w:t>room</w:t>
-      </w:r>
-      <w:proofErr w:type="spellEnd"/>
-      <w:r>
-        <w:t xml:space="preserve"> </w:t>
-      </w:r>
-      <w:proofErr w:type="spellStart"/>
-      <w:r>
-        <w:t>to</w:t>
-      </w:r>
-      <w:proofErr w:type="spellEnd"/>
-      <w:r>
-        <w:t xml:space="preserve"> </w:t>
-      </w:r>
-      <w:proofErr w:type="spellStart"/>
-      <w:r>
-        <w:t>rent</w:t>
-      </w:r>
-      <w:proofErr w:type="spellEnd"/>
-      <w:r>
-        <w:t xml:space="preserve"> </w:t>
-      </w:r>
-      <w:proofErr w:type="spellStart"/>
-      <w:r>
-        <w:t>from</w:t>
-      </w:r>
-      <w:proofErr w:type="spellEnd"/>
-      <w:r>
-        <w:t xml:space="preserve"> </w:t>
-      </w:r>
-      <w:proofErr w:type="spellStart"/>
-      <w:r>
-        <w:t>the</w:t>
-      </w:r>
-      <w:proofErr w:type="spellEnd"/>
-      <w:r>
-        <w:t xml:space="preserve"> </w:t>
-      </w:r>
-      <w:proofErr w:type="spellStart"/>
-      <w:r>
-        <w:t>house</w:t>
-      </w:r>
-      <w:proofErr w:type="spellEnd"/>
-      <w:r>
-        <w:t xml:space="preserve">. </w:t>
+        <w:t xml:space="preserve">The website will let the home owners publish their property as a whole, and the students will choose a room to rent from the house. </w:t>
       </w:r>
       <w:r>
         <w:br/>
-        <w:t xml:space="preserve">The </w:t>
-      </w:r>
-      <w:proofErr w:type="spellStart"/>
-      <w:r>
-        <w:t>price</w:t>
-      </w:r>
-      <w:proofErr w:type="spellEnd"/>
-      <w:r>
-        <w:t xml:space="preserve"> </w:t>
-      </w:r>
-      <w:proofErr w:type="spellStart"/>
-      <w:r>
-        <w:t>of</w:t>
-      </w:r>
-      <w:proofErr w:type="spellEnd"/>
-      <w:r>
-        <w:t xml:space="preserve"> </w:t>
-      </w:r>
-      <w:proofErr w:type="spellStart"/>
-      <w:r>
-        <w:t>the</w:t>
-      </w:r>
-      <w:proofErr w:type="spellEnd"/>
-      <w:r>
-        <w:t xml:space="preserve"> </w:t>
-      </w:r>
-      <w:proofErr w:type="spellStart"/>
-      <w:r>
-        <w:t>room</w:t>
-      </w:r>
-      <w:proofErr w:type="spellEnd"/>
-      <w:r>
-        <w:t xml:space="preserve"> </w:t>
-      </w:r>
-      <w:proofErr w:type="spellStart"/>
-      <w:r>
-        <w:t>won’t</w:t>
-      </w:r>
-      <w:proofErr w:type="spellEnd"/>
-      <w:r>
-        <w:t xml:space="preserve"> </w:t>
-      </w:r>
-      <w:proofErr w:type="spellStart"/>
-      <w:r>
-        <w:t>change</w:t>
-      </w:r>
-      <w:proofErr w:type="spellEnd"/>
-      <w:r>
-        <w:t xml:space="preserve"> </w:t>
-      </w:r>
-      <w:proofErr w:type="spellStart"/>
-      <w:r>
-        <w:t>depending</w:t>
-      </w:r>
-      <w:proofErr w:type="spellEnd"/>
-      <w:r>
-        <w:t xml:space="preserve"> </w:t>
-      </w:r>
-      <w:proofErr w:type="spellStart"/>
-      <w:r>
-        <w:t>on</w:t>
-      </w:r>
-      <w:proofErr w:type="spellEnd"/>
-      <w:r>
-        <w:t xml:space="preserve"> </w:t>
-      </w:r>
-      <w:proofErr w:type="spellStart"/>
-      <w:r>
-        <w:t>the</w:t>
-      </w:r>
-      <w:proofErr w:type="spellEnd"/>
-      <w:r>
-        <w:t xml:space="preserve"> </w:t>
-      </w:r>
-      <w:proofErr w:type="spellStart"/>
-      <w:r>
-        <w:t>amount</w:t>
-      </w:r>
-      <w:proofErr w:type="spellEnd"/>
-      <w:r>
-        <w:t xml:space="preserve"> </w:t>
-      </w:r>
-      <w:proofErr w:type="spellStart"/>
-      <w:r>
-        <w:t>of</w:t>
-      </w:r>
-      <w:proofErr w:type="spellEnd"/>
-      <w:r>
-        <w:t xml:space="preserve"> </w:t>
-      </w:r>
-      <w:proofErr w:type="spellStart"/>
-      <w:r>
-        <w:t>renters</w:t>
-      </w:r>
-      <w:proofErr w:type="spellEnd"/>
-      <w:r>
-        <w:t xml:space="preserve"> in </w:t>
-      </w:r>
-      <w:proofErr w:type="spellStart"/>
-      <w:r>
-        <w:t>the</w:t>
-      </w:r>
-      <w:proofErr w:type="spellEnd"/>
-      <w:r>
-        <w:t xml:space="preserve"> </w:t>
-      </w:r>
-      <w:proofErr w:type="spellStart"/>
-      <w:r>
-        <w:t>house</w:t>
-      </w:r>
-      <w:proofErr w:type="spellEnd"/>
-      <w:r>
-        <w:t xml:space="preserve"> and </w:t>
-      </w:r>
-      <w:proofErr w:type="spellStart"/>
-      <w:r>
-        <w:t>the</w:t>
-      </w:r>
-      <w:proofErr w:type="spellEnd"/>
-      <w:r>
-        <w:t xml:space="preserve"> </w:t>
-      </w:r>
-      <w:proofErr w:type="spellStart"/>
-      <w:r>
-        <w:t>duration</w:t>
-      </w:r>
-      <w:proofErr w:type="spellEnd"/>
-      <w:r>
-        <w:t xml:space="preserve"> </w:t>
-      </w:r>
-      <w:proofErr w:type="spellStart"/>
-      <w:r>
-        <w:t>of</w:t>
-      </w:r>
-      <w:proofErr w:type="spellEnd"/>
-      <w:r>
-        <w:t xml:space="preserve"> </w:t>
-      </w:r>
-      <w:proofErr w:type="spellStart"/>
-      <w:r>
-        <w:t>the</w:t>
-      </w:r>
-      <w:proofErr w:type="spellEnd"/>
-      <w:r>
-        <w:t xml:space="preserve"> </w:t>
-      </w:r>
-      <w:proofErr w:type="spellStart"/>
-      <w:r>
-        <w:t>contract</w:t>
-      </w:r>
-      <w:proofErr w:type="spellEnd"/>
-      <w:r>
-        <w:t xml:space="preserve"> </w:t>
-      </w:r>
-      <w:proofErr w:type="spellStart"/>
-      <w:r>
-        <w:t>will</w:t>
-      </w:r>
-      <w:proofErr w:type="spellEnd"/>
-      <w:r>
-        <w:t xml:space="preserve"> </w:t>
-      </w:r>
-      <w:proofErr w:type="spellStart"/>
-      <w:r>
-        <w:t>always</w:t>
-      </w:r>
-      <w:proofErr w:type="spellEnd"/>
-      <w:r>
-        <w:t xml:space="preserve"> be 9 </w:t>
-      </w:r>
-      <w:proofErr w:type="spellStart"/>
-      <w:r>
-        <w:t>months</w:t>
-      </w:r>
-      <w:proofErr w:type="spellEnd"/>
-      <w:r>
-        <w:t xml:space="preserve">. </w:t>
+        <w:t xml:space="preserve">The price of the room won’t change depending on the amount of renters in the house and the duration of the contract will always be 9 months. </w:t>
       </w:r>
       <w:r>
         <w:br/>
-        <w:t xml:space="preserve">The </w:t>
-      </w:r>
-      <w:proofErr w:type="spellStart"/>
-      <w:r>
-        <w:t>deposit</w:t>
-      </w:r>
-      <w:proofErr w:type="spellEnd"/>
-      <w:r>
-        <w:t xml:space="preserve"> </w:t>
-      </w:r>
-      <w:proofErr w:type="spellStart"/>
-      <w:r>
-        <w:t>will</w:t>
-      </w:r>
-      <w:proofErr w:type="spellEnd"/>
-      <w:r>
-        <w:t xml:space="preserve"> be </w:t>
-      </w:r>
-      <w:proofErr w:type="spellStart"/>
-      <w:r>
-        <w:t>handled</w:t>
-      </w:r>
-      <w:proofErr w:type="spellEnd"/>
-      <w:r>
-        <w:t xml:space="preserve"> </w:t>
-      </w:r>
-      <w:proofErr w:type="spellStart"/>
-      <w:r>
-        <w:t>by</w:t>
-      </w:r>
-      <w:proofErr w:type="spellEnd"/>
-      <w:r>
-        <w:t xml:space="preserve"> a </w:t>
-      </w:r>
-      <w:proofErr w:type="spellStart"/>
-      <w:r>
-        <w:t>third</w:t>
-      </w:r>
-      <w:proofErr w:type="spellEnd"/>
-      <w:r>
-        <w:t xml:space="preserve"> </w:t>
-      </w:r>
-      <w:proofErr w:type="spellStart"/>
-      <w:r>
-        <w:t>party</w:t>
-      </w:r>
-      <w:proofErr w:type="spellEnd"/>
-      <w:r>
-        <w:t xml:space="preserve">, and </w:t>
-      </w:r>
-      <w:proofErr w:type="spellStart"/>
-      <w:r>
-        <w:t>will</w:t>
-      </w:r>
-      <w:proofErr w:type="spellEnd"/>
-      <w:r>
-        <w:t xml:space="preserve"> </w:t>
-      </w:r>
-      <w:proofErr w:type="spellStart"/>
-      <w:r>
-        <w:t>only</w:t>
-      </w:r>
-      <w:proofErr w:type="spellEnd"/>
-      <w:r>
-        <w:t xml:space="preserve"> be </w:t>
-      </w:r>
-      <w:proofErr w:type="spellStart"/>
-      <w:r>
-        <w:t>given</w:t>
-      </w:r>
-      <w:proofErr w:type="spellEnd"/>
-      <w:r>
-        <w:t xml:space="preserve"> back </w:t>
-      </w:r>
-      <w:proofErr w:type="spellStart"/>
-      <w:r>
-        <w:t>with</w:t>
-      </w:r>
-      <w:proofErr w:type="spellEnd"/>
-      <w:r>
-        <w:t xml:space="preserve"> </w:t>
-      </w:r>
-      <w:proofErr w:type="spellStart"/>
-      <w:r>
-        <w:t>the</w:t>
-      </w:r>
-      <w:proofErr w:type="spellEnd"/>
-      <w:r>
-        <w:t xml:space="preserve"> </w:t>
-      </w:r>
-      <w:proofErr w:type="spellStart"/>
-      <w:r>
-        <w:t>tenant’s</w:t>
-      </w:r>
-      <w:proofErr w:type="spellEnd"/>
-      <w:r>
-        <w:t xml:space="preserve"> and </w:t>
-      </w:r>
-      <w:proofErr w:type="spellStart"/>
-      <w:r>
-        <w:t>renter’s</w:t>
-      </w:r>
-      <w:proofErr w:type="spellEnd"/>
-      <w:r>
-        <w:t xml:space="preserve"> </w:t>
-      </w:r>
-      <w:proofErr w:type="spellStart"/>
-      <w:r>
-        <w:t>signature</w:t>
-      </w:r>
-      <w:proofErr w:type="spellEnd"/>
-      <w:r>
-        <w:t xml:space="preserve">. </w:t>
+        <w:t xml:space="preserve">The deposit will be handled by a third party, and will only be given back with the tenant’s and renter’s signature. </w:t>
       </w:r>
       <w:r>
         <w:br/>
-      </w:r>
-      <w:proofErr w:type="spellStart"/>
-      <w:r>
-        <w:t>We</w:t>
-      </w:r>
-      <w:proofErr w:type="spellEnd"/>
-      <w:r>
-        <w:t xml:space="preserve"> </w:t>
-      </w:r>
-      <w:proofErr w:type="spellStart"/>
-      <w:r>
-        <w:t>have</w:t>
-      </w:r>
-      <w:proofErr w:type="spellEnd"/>
-      <w:r>
-        <w:t xml:space="preserve"> </w:t>
-      </w:r>
-      <w:proofErr w:type="spellStart"/>
-      <w:r>
-        <w:t>used</w:t>
-      </w:r>
-      <w:proofErr w:type="spellEnd"/>
-      <w:r>
-        <w:t xml:space="preserve"> </w:t>
-      </w:r>
-      <w:proofErr w:type="spellStart"/>
-      <w:r>
-        <w:t>an</w:t>
-      </w:r>
-      <w:proofErr w:type="spellEnd"/>
-      <w:r>
-        <w:t xml:space="preserve"> iterative software </w:t>
-      </w:r>
-      <w:proofErr w:type="spellStart"/>
-      <w:r>
-        <w:t>methodology</w:t>
-      </w:r>
-      <w:proofErr w:type="spellEnd"/>
-      <w:r>
-        <w:t xml:space="preserve"> </w:t>
-      </w:r>
-      <w:proofErr w:type="spellStart"/>
-      <w:r>
-        <w:t>to</w:t>
-      </w:r>
-      <w:proofErr w:type="spellEnd"/>
-      <w:r>
-        <w:t xml:space="preserve"> </w:t>
-      </w:r>
-      <w:proofErr w:type="spellStart"/>
-      <w:r>
-        <w:t>develop</w:t>
-      </w:r>
-      <w:proofErr w:type="spellEnd"/>
-      <w:r>
-        <w:t xml:space="preserve"> </w:t>
-      </w:r>
-      <w:proofErr w:type="spellStart"/>
-      <w:r>
-        <w:t>the</w:t>
-      </w:r>
-      <w:proofErr w:type="spellEnd"/>
-      <w:r>
-        <w:t xml:space="preserve"> </w:t>
-      </w:r>
-      <w:proofErr w:type="spellStart"/>
-      <w:r>
-        <w:t>website</w:t>
-      </w:r>
-      <w:proofErr w:type="spellEnd"/>
-      <w:r>
-        <w:t xml:space="preserve"> in </w:t>
-      </w:r>
-      <w:proofErr w:type="spellStart"/>
-      <w:r>
-        <w:t>different</w:t>
-      </w:r>
-      <w:proofErr w:type="spellEnd"/>
-      <w:r>
-        <w:t xml:space="preserve"> </w:t>
-      </w:r>
-      <w:proofErr w:type="spellStart"/>
-      <w:r>
-        <w:t>iterations</w:t>
-      </w:r>
-      <w:proofErr w:type="spellEnd"/>
-      <w:r>
-        <w:t xml:space="preserve"> </w:t>
-      </w:r>
-      <w:proofErr w:type="spellStart"/>
-      <w:r>
-        <w:t>separated</w:t>
-      </w:r>
-      <w:proofErr w:type="spellEnd"/>
-      <w:r>
-        <w:t xml:space="preserve"> </w:t>
-      </w:r>
-      <w:proofErr w:type="spellStart"/>
-      <w:r>
-        <w:t>by</w:t>
-      </w:r>
-      <w:proofErr w:type="spellEnd"/>
-      <w:r>
-        <w:t xml:space="preserve"> a </w:t>
-      </w:r>
-      <w:proofErr w:type="spellStart"/>
-      <w:r>
-        <w:t>couple</w:t>
-      </w:r>
-      <w:proofErr w:type="spellEnd"/>
-      <w:r>
-        <w:t xml:space="preserve"> </w:t>
-      </w:r>
-      <w:proofErr w:type="spellStart"/>
-      <w:r>
-        <w:t>months</w:t>
-      </w:r>
-      <w:proofErr w:type="spellEnd"/>
-      <w:r>
-        <w:t xml:space="preserve"> </w:t>
-      </w:r>
-      <w:proofErr w:type="spellStart"/>
-      <w:r>
-        <w:t>each</w:t>
-      </w:r>
-      <w:proofErr w:type="spellEnd"/>
-      <w:r>
-        <w:t xml:space="preserve">. The </w:t>
-      </w:r>
-      <w:proofErr w:type="spellStart"/>
-      <w:r>
-        <w:t>tasks</w:t>
-      </w:r>
-      <w:proofErr w:type="spellEnd"/>
-      <w:r>
-        <w:t xml:space="preserve"> </w:t>
-      </w:r>
-      <w:proofErr w:type="spellStart"/>
-      <w:r>
-        <w:t>have</w:t>
-      </w:r>
-      <w:proofErr w:type="spellEnd"/>
-      <w:r>
-        <w:t xml:space="preserve"> </w:t>
-      </w:r>
-      <w:proofErr w:type="spellStart"/>
-      <w:r>
-        <w:t>been</w:t>
-      </w:r>
-      <w:proofErr w:type="spellEnd"/>
-      <w:r>
-        <w:t xml:space="preserve"> </w:t>
-      </w:r>
-      <w:proofErr w:type="spellStart"/>
-      <w:r>
-        <w:t>divided</w:t>
-      </w:r>
-      <w:proofErr w:type="spellEnd"/>
-      <w:r>
-        <w:t xml:space="preserve"> </w:t>
-      </w:r>
-      <w:proofErr w:type="spellStart"/>
-      <w:r>
-        <w:t>using</w:t>
-      </w:r>
-      <w:proofErr w:type="spellEnd"/>
-      <w:r>
-        <w:t xml:space="preserve"> a Trello table and </w:t>
-      </w:r>
-      <w:proofErr w:type="spellStart"/>
-      <w:r>
-        <w:t>following</w:t>
-      </w:r>
-      <w:proofErr w:type="spellEnd"/>
-      <w:r>
-        <w:t xml:space="preserve"> </w:t>
-      </w:r>
-      <w:proofErr w:type="spellStart"/>
-      <w:r>
-        <w:t>the</w:t>
-      </w:r>
-      <w:proofErr w:type="spellEnd"/>
-      <w:r>
-        <w:t xml:space="preserve"> </w:t>
-      </w:r>
-      <w:proofErr w:type="spellStart"/>
-      <w:r>
-        <w:t>KanBan</w:t>
-      </w:r>
-      <w:proofErr w:type="spellEnd"/>
-      <w:r>
-        <w:t xml:space="preserve"> agile </w:t>
-      </w:r>
-      <w:proofErr w:type="spellStart"/>
-      <w:r>
-        <w:t>methodology</w:t>
-      </w:r>
-      <w:proofErr w:type="spellEnd"/>
-      <w:r>
-        <w:t xml:space="preserve">, </w:t>
-      </w:r>
-      <w:proofErr w:type="spellStart"/>
-      <w:r>
-        <w:t>for</w:t>
-      </w:r>
-      <w:proofErr w:type="spellEnd"/>
-      <w:r>
-        <w:t xml:space="preserve"> </w:t>
-      </w:r>
-      <w:proofErr w:type="spellStart"/>
-      <w:r>
-        <w:t>easier</w:t>
-      </w:r>
-      <w:proofErr w:type="spellEnd"/>
-      <w:r>
-        <w:t xml:space="preserve"> </w:t>
-      </w:r>
-      <w:proofErr w:type="spellStart"/>
-      <w:r>
-        <w:t>communication</w:t>
-      </w:r>
-      <w:proofErr w:type="spellEnd"/>
-      <w:r>
-        <w:t xml:space="preserve"> and </w:t>
-      </w:r>
-      <w:proofErr w:type="spellStart"/>
-      <w:r>
-        <w:t>organization</w:t>
-      </w:r>
-      <w:proofErr w:type="spellEnd"/>
-      <w:r>
-        <w:t xml:space="preserve">. </w:t>
+        <w:t xml:space="preserve">We have used an iterative software methodology to develop the website in different iterations separated by a couple months each. The tasks have been divided using a Trello table and following the KanBan agile methodology, for easier communication and organization. </w:t>
       </w:r>
       <w:r>
         <w:br/>
       </w:r>
-      <w:proofErr w:type="spellStart"/>
-      <w:r>
-        <w:t>It’s</w:t>
-      </w:r>
-      <w:proofErr w:type="spellEnd"/>
-      <w:r>
-        <w:t xml:space="preserve"> </w:t>
-      </w:r>
-      <w:proofErr w:type="spellStart"/>
-      <w:r>
-        <w:t>used</w:t>
-      </w:r>
-      <w:proofErr w:type="spellEnd"/>
-      <w:r>
-        <w:t xml:space="preserve"> HTML, CSS and JavaScript </w:t>
-      </w:r>
-      <w:proofErr w:type="spellStart"/>
-      <w:r>
-        <w:t>to</w:t>
-      </w:r>
-      <w:proofErr w:type="spellEnd"/>
-      <w:r>
-        <w:t xml:space="preserve"> </w:t>
-      </w:r>
-      <w:proofErr w:type="spellStart"/>
-      <w:r>
-        <w:t>create</w:t>
-      </w:r>
-      <w:proofErr w:type="spellEnd"/>
-      <w:r>
-        <w:t xml:space="preserve"> </w:t>
-      </w:r>
-      <w:proofErr w:type="spellStart"/>
-      <w:r>
-        <w:t>the</w:t>
-      </w:r>
-      <w:proofErr w:type="spellEnd"/>
-      <w:r>
-        <w:t xml:space="preserve"> </w:t>
-      </w:r>
-      <w:proofErr w:type="spellStart"/>
-      <w:r>
-        <w:t>frontend</w:t>
-      </w:r>
-      <w:proofErr w:type="spellEnd"/>
-      <w:r>
-        <w:t xml:space="preserve"> </w:t>
-      </w:r>
-      <w:proofErr w:type="spellStart"/>
-      <w:r>
-        <w:t>of</w:t>
-      </w:r>
-      <w:proofErr w:type="spellEnd"/>
-      <w:r>
-        <w:t xml:space="preserve"> </w:t>
-      </w:r>
-      <w:proofErr w:type="spellStart"/>
-      <w:r>
-        <w:t>the</w:t>
-      </w:r>
-      <w:proofErr w:type="spellEnd"/>
-      <w:r>
-        <w:t xml:space="preserve"> </w:t>
-      </w:r>
-      <w:proofErr w:type="spellStart"/>
-      <w:r>
-        <w:t>website</w:t>
-      </w:r>
-      <w:proofErr w:type="spellEnd"/>
-      <w:r>
-        <w:t xml:space="preserve">, SQL server </w:t>
-      </w:r>
-      <w:proofErr w:type="spellStart"/>
-      <w:r>
-        <w:t>management</w:t>
-      </w:r>
-      <w:proofErr w:type="spellEnd"/>
-      <w:r>
-        <w:t xml:space="preserve"> </w:t>
-      </w:r>
-      <w:proofErr w:type="spellStart"/>
-      <w:r>
-        <w:t>studio</w:t>
-      </w:r>
-      <w:proofErr w:type="spellEnd"/>
-      <w:r>
-        <w:t xml:space="preserve"> </w:t>
-      </w:r>
-      <w:proofErr w:type="spellStart"/>
-      <w:r>
-        <w:t>to</w:t>
-      </w:r>
-      <w:proofErr w:type="spellEnd"/>
-      <w:r>
-        <w:t xml:space="preserve"> </w:t>
-      </w:r>
-      <w:proofErr w:type="spellStart"/>
-      <w:r>
-        <w:t>create</w:t>
-      </w:r>
-      <w:proofErr w:type="spellEnd"/>
-      <w:r>
-        <w:t xml:space="preserve"> </w:t>
-      </w:r>
-      <w:proofErr w:type="spellStart"/>
-      <w:r>
-        <w:t>the</w:t>
-      </w:r>
-      <w:proofErr w:type="spellEnd"/>
-      <w:r>
-        <w:t xml:space="preserve"> </w:t>
-      </w:r>
-      <w:proofErr w:type="spellStart"/>
-      <w:r>
-        <w:t>databases</w:t>
-      </w:r>
-      <w:proofErr w:type="spellEnd"/>
-      <w:r>
-        <w:t xml:space="preserve"> and IntelliJ IDEA as </w:t>
-      </w:r>
-      <w:proofErr w:type="spellStart"/>
-      <w:r>
-        <w:t>an</w:t>
-      </w:r>
-      <w:proofErr w:type="spellEnd"/>
-      <w:r>
-        <w:t xml:space="preserve"> IDE </w:t>
-      </w:r>
-      <w:proofErr w:type="spellStart"/>
-      <w:r>
-        <w:t>to</w:t>
-      </w:r>
-      <w:proofErr w:type="spellEnd"/>
-      <w:r>
-        <w:t xml:space="preserve"> </w:t>
-      </w:r>
-      <w:proofErr w:type="spellStart"/>
-      <w:r>
-        <w:t>program</w:t>
-      </w:r>
-      <w:proofErr w:type="spellEnd"/>
-      <w:r>
-        <w:t xml:space="preserve"> </w:t>
-      </w:r>
-      <w:proofErr w:type="spellStart"/>
-      <w:r>
-        <w:t>the</w:t>
-      </w:r>
-      <w:proofErr w:type="spellEnd"/>
-      <w:r>
-        <w:t xml:space="preserve"> </w:t>
-      </w:r>
-      <w:proofErr w:type="spellStart"/>
-      <w:r>
-        <w:t>backend</w:t>
-      </w:r>
-      <w:proofErr w:type="spellEnd"/>
-      <w:r>
-        <w:t xml:space="preserve"> </w:t>
-      </w:r>
-      <w:proofErr w:type="spellStart"/>
-      <w:r>
-        <w:t>using</w:t>
-      </w:r>
-      <w:proofErr w:type="spellEnd"/>
-      <w:r>
-        <w:t xml:space="preserve"> Java. </w:t>
-      </w:r>
-    </w:p>
-    <w:p>
-      <w:r>
-        <w:t xml:space="preserve">In </w:t>
-      </w:r>
-      <w:proofErr w:type="spellStart"/>
-      <w:r>
-        <w:t>the</w:t>
-      </w:r>
-      <w:proofErr w:type="spellEnd"/>
-      <w:r>
-        <w:t xml:space="preserve"> </w:t>
-      </w:r>
-      <w:proofErr w:type="spellStart"/>
-      <w:r>
-        <w:t>end</w:t>
-      </w:r>
-      <w:proofErr w:type="spellEnd"/>
-      <w:r>
-        <w:t>,</w:t>
-      </w:r>
-      <w:r>
-        <w:t xml:space="preserve"> </w:t>
-      </w:r>
-      <w:proofErr w:type="spellStart"/>
-      <w:r>
-        <w:t>it’s</w:t>
-      </w:r>
-      <w:proofErr w:type="spellEnd"/>
-      <w:r>
-        <w:t xml:space="preserve"> a </w:t>
-      </w:r>
-      <w:proofErr w:type="spellStart"/>
-      <w:r>
-        <w:t>friendly</w:t>
-      </w:r>
-      <w:proofErr w:type="spellEnd"/>
-      <w:r>
-        <w:t xml:space="preserve"> </w:t>
-      </w:r>
-      <w:proofErr w:type="spellStart"/>
-      <w:r>
-        <w:t>website</w:t>
-      </w:r>
-      <w:proofErr w:type="spellEnd"/>
-      <w:r>
-        <w:t xml:space="preserve"> </w:t>
-      </w:r>
-      <w:proofErr w:type="spellStart"/>
-      <w:r>
-        <w:t>that</w:t>
-      </w:r>
-      <w:proofErr w:type="spellEnd"/>
-      <w:r>
-        <w:t xml:space="preserve"> </w:t>
-      </w:r>
-      <w:proofErr w:type="spellStart"/>
-      <w:r>
-        <w:t>will</w:t>
-      </w:r>
-      <w:proofErr w:type="spellEnd"/>
-      <w:r>
-        <w:t xml:space="preserve"> </w:t>
-      </w:r>
-      <w:proofErr w:type="spellStart"/>
-      <w:r>
-        <w:t>protect</w:t>
-      </w:r>
-      <w:proofErr w:type="spellEnd"/>
-      <w:r>
-        <w:t xml:space="preserve"> </w:t>
-      </w:r>
-      <w:proofErr w:type="spellStart"/>
-      <w:r>
-        <w:t>the</w:t>
-      </w:r>
-      <w:proofErr w:type="spellEnd"/>
-      <w:r>
-        <w:t xml:space="preserve"> </w:t>
-      </w:r>
-      <w:proofErr w:type="spellStart"/>
-      <w:r>
-        <w:t>young</w:t>
-      </w:r>
-      <w:proofErr w:type="spellEnd"/>
-      <w:r>
-        <w:t xml:space="preserve"> </w:t>
-      </w:r>
-      <w:proofErr w:type="spellStart"/>
-      <w:r>
-        <w:t>students</w:t>
-      </w:r>
-      <w:proofErr w:type="spellEnd"/>
-      <w:r>
-        <w:t xml:space="preserve"> </w:t>
-      </w:r>
-      <w:proofErr w:type="spellStart"/>
-      <w:r>
-        <w:t>from</w:t>
-      </w:r>
-      <w:proofErr w:type="spellEnd"/>
-      <w:r>
-        <w:t xml:space="preserve"> </w:t>
-      </w:r>
-      <w:proofErr w:type="spellStart"/>
-      <w:r>
-        <w:t>scams</w:t>
-      </w:r>
-      <w:proofErr w:type="spellEnd"/>
-      <w:r>
-        <w:t xml:space="preserve"> and abusive </w:t>
-      </w:r>
-      <w:proofErr w:type="spellStart"/>
-      <w:r>
-        <w:t>practices</w:t>
-      </w:r>
-      <w:proofErr w:type="spellEnd"/>
-      <w:r>
-        <w:t xml:space="preserve">; and </w:t>
-      </w:r>
-      <w:proofErr w:type="spellStart"/>
-      <w:r>
-        <w:t>will</w:t>
-      </w:r>
-      <w:proofErr w:type="spellEnd"/>
-      <w:r>
-        <w:t xml:space="preserve"> </w:t>
-      </w:r>
-      <w:proofErr w:type="spellStart"/>
-      <w:r>
-        <w:t>make</w:t>
-      </w:r>
-      <w:proofErr w:type="spellEnd"/>
-      <w:r>
-        <w:t xml:space="preserve"> </w:t>
-      </w:r>
-      <w:proofErr w:type="spellStart"/>
-      <w:r>
-        <w:t>the</w:t>
-      </w:r>
-      <w:proofErr w:type="spellEnd"/>
-      <w:r>
-        <w:t xml:space="preserve"> </w:t>
-      </w:r>
-      <w:proofErr w:type="spellStart"/>
-      <w:r>
-        <w:t>process</w:t>
-      </w:r>
-      <w:proofErr w:type="spellEnd"/>
-      <w:r>
-        <w:t xml:space="preserve"> </w:t>
-      </w:r>
-      <w:proofErr w:type="spellStart"/>
-      <w:r>
-        <w:t>of</w:t>
-      </w:r>
-      <w:proofErr w:type="spellEnd"/>
-      <w:r>
-        <w:t xml:space="preserve"> renting </w:t>
-      </w:r>
-      <w:proofErr w:type="spellStart"/>
-      <w:r>
-        <w:t>outside</w:t>
-      </w:r>
-      <w:proofErr w:type="spellEnd"/>
-      <w:r>
-        <w:t xml:space="preserve"> </w:t>
-      </w:r>
-      <w:proofErr w:type="spellStart"/>
-      <w:r>
-        <w:t>your</w:t>
-      </w:r>
-      <w:proofErr w:type="spellEnd"/>
-      <w:r>
-        <w:t xml:space="preserve"> </w:t>
-      </w:r>
-      <w:proofErr w:type="spellStart"/>
-      <w:r>
-        <w:t>hometown</w:t>
-      </w:r>
-      <w:proofErr w:type="spellEnd"/>
-      <w:r>
-        <w:t xml:space="preserve"> a more </w:t>
-      </w:r>
-      <w:proofErr w:type="spellStart"/>
-      <w:r>
-        <w:t>pleasant</w:t>
-      </w:r>
-      <w:proofErr w:type="spellEnd"/>
-      <w:r>
-        <w:t xml:space="preserve"> </w:t>
-      </w:r>
-      <w:proofErr w:type="spellStart"/>
-      <w:r>
-        <w:t>experience</w:t>
-      </w:r>
-      <w:proofErr w:type="spellEnd"/>
-      <w:r>
-        <w:t>.</w:t>
+      <w:r>
+        <w:t xml:space="preserve">It’s </w:t>
+      </w:r>
+      <w:r>
+        <w:t xml:space="preserve">used HTML, CSS and JavaScript to create the frontend of the website, SQL server management studio to create the databases and IntelliJ IDEA as an IDE to program the backend using Java. </w:t>
+      </w:r>
+    </w:p>
+    <w:p>
+      <w:r>
+        <w:t>In the end,</w:t>
+      </w:r>
+      <w:r>
+        <w:t xml:space="preserve"> it’s</w:t>
+      </w:r>
+      <w:r>
+        <w:t xml:space="preserve"> a friendly website that will protect the young students from scams and abusive practices; and will make the process of renting outside your hometown a more pleasant experience.</w:t>
       </w:r>
     </w:p>
     <w:p>
@@ -5882,7 +4580,6 @@
         </w:rPr>
         <w:t>'</w:t>
       </w:r>
-      <w:proofErr w:type="spellStart"/>
       <w:r>
         <w:rPr>
           <w:rFonts w:ascii="Aptos" w:eastAsia="Aptos" w:hAnsi="Aptos" w:cs="Aptos"/>
@@ -5891,7 +4588,6 @@
         </w:rPr>
         <w:t>Roomie</w:t>
       </w:r>
-      <w:proofErr w:type="spellEnd"/>
       <w:r>
         <w:rPr>
           <w:rFonts w:ascii="Aptos" w:eastAsia="Aptos" w:hAnsi="Aptos" w:cs="Aptos"/>
@@ -5927,7 +4623,6 @@
         <w:spacing w:before="240" w:after="142" w:line="276" w:lineRule="auto"/>
         <w:jc w:val="both"/>
       </w:pPr>
-      <w:proofErr w:type="spellStart"/>
       <w:r>
         <w:rPr>
           <w:rFonts w:ascii="Aptos" w:eastAsia="Aptos" w:hAnsi="Aptos" w:cs="Aptos"/>
@@ -5936,7 +4631,6 @@
         </w:rPr>
         <w:t>Roomie</w:t>
       </w:r>
-      <w:proofErr w:type="spellEnd"/>
       <w:r>
         <w:rPr>
           <w:rFonts w:ascii="Aptos" w:eastAsia="Aptos" w:hAnsi="Aptos" w:cs="Aptos"/>
@@ -6167,23 +4861,7 @@
           <w:b/>
           <w:bCs/>
         </w:rPr>
-        <w:t xml:space="preserve">-01 (M) Registro y </w:t>
-      </w:r>
-      <w:proofErr w:type="spellStart"/>
-      <w:r>
-        <w:rPr>
-          <w:b/>
-          <w:bCs/>
-        </w:rPr>
-        <w:t>login</w:t>
-      </w:r>
-      <w:proofErr w:type="spellEnd"/>
-      <w:r>
-        <w:rPr>
-          <w:b/>
-          <w:bCs/>
-        </w:rPr>
-        <w:t xml:space="preserve">: </w:t>
+        <w:t xml:space="preserve">-01 (M) Registro y login: </w:t>
       </w:r>
       <w:r>
         <w:t>El sistema permitirá al inquilino crear una cuenta con la que acceder a la página web.</w:t>
@@ -6770,23 +5448,7 @@
           <w:b/>
           <w:bCs/>
         </w:rPr>
-        <w:t xml:space="preserve">RFA-01 (M) Registro y </w:t>
-      </w:r>
-      <w:proofErr w:type="spellStart"/>
-      <w:r>
-        <w:rPr>
-          <w:b/>
-          <w:bCs/>
-        </w:rPr>
-        <w:t>login</w:t>
-      </w:r>
-      <w:proofErr w:type="spellEnd"/>
-      <w:r>
-        <w:rPr>
-          <w:b/>
-          <w:bCs/>
-        </w:rPr>
-        <w:t xml:space="preserve">: </w:t>
+        <w:t xml:space="preserve">RFA-01 (M) Registro y login: </w:t>
       </w:r>
       <w:r>
         <w:t>El sistema permitirá al arrendador crear una cuenta con la que acceder a la página web.</w:t>
@@ -7479,23 +6141,7 @@
           <w:b/>
           <w:bCs/>
         </w:rPr>
-        <w:t xml:space="preserve">RFAD-01(M) Registro y </w:t>
-      </w:r>
-      <w:proofErr w:type="spellStart"/>
-      <w:r>
-        <w:rPr>
-          <w:b/>
-          <w:bCs/>
-        </w:rPr>
-        <w:t>login</w:t>
-      </w:r>
-      <w:proofErr w:type="spellEnd"/>
-      <w:r>
-        <w:rPr>
-          <w:b/>
-          <w:bCs/>
-        </w:rPr>
-        <w:t>:</w:t>
+        <w:t>RFAD-01(M) Registro y login:</w:t>
       </w:r>
       <w:r>
         <w:t xml:space="preserve"> El sistema deberá permitir al administrador crear una cuenta con la que acceder a la página web.</w:t>
@@ -7644,10 +6290,10 @@
           <w:noProof/>
         </w:rPr>
         <w:drawing>
-          <wp:inline distT="0" distB="0" distL="0" distR="0" wp14:anchorId="243E0CC1" wp14:editId="7B7C057A">
-            <wp:extent cx="5263116" cy="3482043"/>
-            <wp:effectExtent l="0" t="0" r="0" b="4445"/>
-            <wp:docPr id="2095435174" name="Imagen 1"/>
+          <wp:inline distT="0" distB="0" distL="0" distR="0" wp14:anchorId="72C4AF21" wp14:editId="34222FFA">
+            <wp:extent cx="5731510" cy="3634740"/>
+            <wp:effectExtent l="0" t="0" r="2540" b="3810"/>
+            <wp:docPr id="961951826" name="Imagen 1"/>
             <wp:cNvGraphicFramePr>
               <a:graphicFrameLocks xmlns:a="http://schemas.openxmlformats.org/drawingml/2006/main" noChangeAspect="1"/>
             </wp:cNvGraphicFramePr>
@@ -7655,10 +6301,10 @@
               <a:graphicData uri="http://schemas.openxmlformats.org/drawingml/2006/picture">
                 <pic:pic xmlns:pic="http://schemas.openxmlformats.org/drawingml/2006/picture">
                   <pic:nvPicPr>
-                    <pic:cNvPr id="2095435174" name="Imagen 2095435174"/>
+                    <pic:cNvPr id="961951826" name="Imagen 961951826"/>
                     <pic:cNvPicPr/>
                   </pic:nvPicPr>
-                  <pic:blipFill rotWithShape="1">
+                  <pic:blipFill>
                     <a:blip r:embed="rId13">
                       <a:extLst>
                         <a:ext uri="{28A0092B-C50C-407E-A947-70E740481C1C}">
@@ -7666,27 +6312,18 @@
                         </a:ext>
                       </a:extLst>
                     </a:blip>
-                    <a:srcRect l="5380" t="8134" r="2777"/>
                     <a:stretch>
                       <a:fillRect/>
                     </a:stretch>
                   </pic:blipFill>
-                  <pic:spPr bwMode="auto">
+                  <pic:spPr>
                     <a:xfrm>
                       <a:off x="0" y="0"/>
-                      <a:ext cx="5263967" cy="3482606"/>
+                      <a:ext cx="5731510" cy="3634740"/>
                     </a:xfrm>
                     <a:prstGeom prst="rect">
                       <a:avLst/>
                     </a:prstGeom>
-                    <a:ln>
-                      <a:noFill/>
-                    </a:ln>
-                    <a:extLst>
-                      <a:ext uri="{53640926-AAD7-44D8-BBD7-CCE9431645EC}">
-                        <a14:shadowObscured xmlns:a14="http://schemas.microsoft.com/office/drawing/2010/main"/>
-                      </a:ext>
-                    </a:extLst>
                   </pic:spPr>
                 </pic:pic>
               </a:graphicData>
@@ -7715,15 +6352,26 @@
     </w:p>
     <w:p>
       <w:pPr>
-        <w:rPr>
-          <w:color w:val="EE0000"/>
-        </w:rPr>
-      </w:pPr>
-      <w:r>
-        <w:rPr>
-          <w:color w:val="EE0000"/>
-        </w:rPr>
-        <w:t>AÑADIR DESCRIPCIÓN DE DIAGRAMA DE ARQUITECTURA</w:t>
+        <w:jc w:val="both"/>
+      </w:pPr>
+      <w:r>
+        <w:t xml:space="preserve">El usuario estándar tendrá acceso únicamente a la página web. </w:t>
+      </w:r>
+    </w:p>
+    <w:p>
+      <w:pPr>
+        <w:jc w:val="both"/>
+      </w:pPr>
+      <w:r>
+        <w:t xml:space="preserve">Esta página web (frontend), no está conectada con la base de datos (backend). Usa una simulación de base de datos con Local Storage. </w:t>
+      </w:r>
+    </w:p>
+    <w:p>
+      <w:pPr>
+        <w:jc w:val="both"/>
+      </w:pPr>
+      <w:r>
+        <w:t>El administrador tendrá acceso a la base de datos a través del sistema CRUD (Create, Read, Update, Delete) creado en JavaFX.</w:t>
       </w:r>
     </w:p>
     <w:p>
@@ -7834,15 +6482,7 @@
         <w:jc w:val="both"/>
       </w:pPr>
       <w:r>
-        <w:t>En la web “</w:t>
-      </w:r>
-      <w:proofErr w:type="spellStart"/>
-      <w:r>
-        <w:t>Roomie</w:t>
-      </w:r>
-      <w:proofErr w:type="spellEnd"/>
-      <w:r>
-        <w:t xml:space="preserve">” habrá 3 posibles usuarios diferentes. Inquilino, arrendador y administrador. En le diagrama de casos de uso se puede observar las posibles acciones únicas y compartidas que tienen los diferentes usuarios. </w:t>
+        <w:t xml:space="preserve">En la web “Roomie” habrá 3 posibles usuarios diferentes. Inquilino, arrendador y administrador. En le diagrama de casos de uso se puede observar las posibles acciones únicas y compartidas que tienen los diferentes usuarios. </w:t>
       </w:r>
       <w:r>
         <w:br w:type="page"/>
@@ -8015,15 +6655,7 @@
         <w:jc w:val="both"/>
       </w:pPr>
       <w:r>
-        <w:t>Tanto en el diagrama de clases (Ilustración 3), como en el diagrama entidad relación (Ilustración 4); se pueden observar las entidades que van a componer la web “</w:t>
-      </w:r>
-      <w:proofErr w:type="spellStart"/>
-      <w:r>
-        <w:t>Roomie</w:t>
-      </w:r>
-      <w:proofErr w:type="spellEnd"/>
-      <w:r>
-        <w:t xml:space="preserve">”. Los usuarios registrados, los pisos añadidos, los contratos pendientes y las habitaciones con sus muebles, son los datos que se guardarán en la base de datos y que manipularemos a través de programación orientada a objetos. </w:t>
+        <w:t xml:space="preserve">Tanto en el diagrama de clases (Ilustración 3), como en el diagrama entidad relación (Ilustración 4); se pueden observar las entidades que van a componer la web “Roomie”. Los usuarios registrados, los pisos añadidos, los contratos pendientes y las habitaciones con sus muebles, son los datos que se guardarán en la base de datos y que manipularemos a través de programación orientada a objetos. </w:t>
       </w:r>
     </w:p>
     <w:p>
@@ -8053,64 +6685,14 @@
       <w:r>
         <w:t>(</w:t>
       </w:r>
-      <w:proofErr w:type="spellStart"/>
       <w:r>
         <w:rPr>
           <w:u w:val="single"/>
         </w:rPr>
         <w:t>dni</w:t>
       </w:r>
-      <w:proofErr w:type="spellEnd"/>
-      <w:r>
-        <w:t xml:space="preserve">, </w:t>
-      </w:r>
-      <w:proofErr w:type="spellStart"/>
-      <w:r>
-        <w:t>name</w:t>
-      </w:r>
-      <w:proofErr w:type="spellEnd"/>
-      <w:r>
-        <w:t xml:space="preserve">, </w:t>
-      </w:r>
-      <w:proofErr w:type="spellStart"/>
-      <w:r>
-        <w:t>surnames</w:t>
-      </w:r>
-      <w:proofErr w:type="spellEnd"/>
-      <w:r>
-        <w:t xml:space="preserve">, </w:t>
-      </w:r>
-      <w:proofErr w:type="spellStart"/>
-      <w:r>
-        <w:t>username</w:t>
-      </w:r>
-      <w:proofErr w:type="spellEnd"/>
-      <w:r>
-        <w:t xml:space="preserve">, </w:t>
-      </w:r>
-      <w:proofErr w:type="spellStart"/>
-      <w:r>
-        <w:t>password</w:t>
-      </w:r>
-      <w:proofErr w:type="spellEnd"/>
-      <w:r>
-        <w:t xml:space="preserve">, </w:t>
-      </w:r>
-      <w:proofErr w:type="spellStart"/>
-      <w:r>
-        <w:t>phone</w:t>
-      </w:r>
-      <w:proofErr w:type="spellEnd"/>
-      <w:r>
-        <w:t xml:space="preserve">, email, </w:t>
-      </w:r>
-      <w:proofErr w:type="spellStart"/>
-      <w:r>
-        <w:t>birthdate</w:t>
-      </w:r>
-      <w:proofErr w:type="spellEnd"/>
-      <w:r>
-        <w:t>)</w:t>
+      <w:r>
+        <w:t>, name, surnames, username, password, phone, email, birthdate)</w:t>
       </w:r>
     </w:p>
     <w:p>
@@ -8130,7 +6712,6 @@
       <w:r>
         <w:t>(</w:t>
       </w:r>
-      <w:proofErr w:type="spellStart"/>
       <w:r>
         <w:rPr>
           <w:color w:val="EE0000"/>
@@ -8138,7 +6719,6 @@
         </w:rPr>
         <w:t>dni</w:t>
       </w:r>
-      <w:proofErr w:type="spellEnd"/>
       <w:r>
         <w:rPr>
           <w:color w:val="EE0000"/>
@@ -8146,15 +6726,7 @@
         <w:t xml:space="preserve"> </w:t>
       </w:r>
       <w:r>
-        <w:t xml:space="preserve">-&gt; USER, </w:t>
-      </w:r>
-      <w:proofErr w:type="spellStart"/>
-      <w:r>
-        <w:t>studentLicense</w:t>
-      </w:r>
-      <w:proofErr w:type="spellEnd"/>
-      <w:r>
-        <w:t>)</w:t>
+        <w:t>-&gt; USER, studentLicense)</w:t>
       </w:r>
     </w:p>
     <w:p>
@@ -8174,7 +6746,6 @@
       <w:r>
         <w:t>(</w:t>
       </w:r>
-      <w:proofErr w:type="spellStart"/>
       <w:r>
         <w:rPr>
           <w:color w:val="EE0000"/>
@@ -8182,7 +6753,6 @@
         </w:rPr>
         <w:t>dni</w:t>
       </w:r>
-      <w:proofErr w:type="spellEnd"/>
       <w:r>
         <w:t xml:space="preserve"> -&gt; USER)</w:t>
       </w:r>
@@ -8204,14 +6774,12 @@
       <w:r>
         <w:t>(</w:t>
       </w:r>
-      <w:proofErr w:type="spellStart"/>
       <w:r>
         <w:rPr>
           <w:u w:val="single"/>
         </w:rPr>
         <w:t>signatureDate</w:t>
       </w:r>
-      <w:proofErr w:type="spellEnd"/>
       <w:r>
         <w:t xml:space="preserve">, </w:t>
       </w:r>
@@ -8221,91 +6789,31 @@
         </w:rPr>
         <w:t>(</w:t>
       </w:r>
-      <w:proofErr w:type="spellStart"/>
       <w:r>
         <w:rPr>
           <w:color w:val="EE0000"/>
           <w:u w:val="single"/>
         </w:rPr>
-        <w:t>num</w:t>
-      </w:r>
-      <w:proofErr w:type="spellEnd"/>
+        <w:t>num, type, address</w:t>
+      </w:r>
+      <w:r>
+        <w:t xml:space="preserve">) -&gt; ROOM, </w:t>
+      </w:r>
       <w:r>
         <w:rPr>
           <w:color w:val="EE0000"/>
           <w:u w:val="single"/>
         </w:rPr>
-        <w:t xml:space="preserve">, </w:t>
-      </w:r>
-      <w:proofErr w:type="spellStart"/>
-      <w:r>
-        <w:rPr>
-          <w:color w:val="EE0000"/>
+        <w:t>dni</w:t>
+      </w:r>
+      <w:r>
+        <w:rPr>
           <w:u w:val="single"/>
         </w:rPr>
-        <w:t>type</w:t>
-      </w:r>
-      <w:proofErr w:type="spellEnd"/>
-      <w:r>
-        <w:rPr>
-          <w:color w:val="EE0000"/>
-          <w:u w:val="single"/>
-        </w:rPr>
-        <w:t xml:space="preserve">, </w:t>
-      </w:r>
-      <w:proofErr w:type="spellStart"/>
-      <w:r>
-        <w:rPr>
-          <w:color w:val="EE0000"/>
-          <w:u w:val="single"/>
-        </w:rPr>
-        <w:t>address</w:t>
-      </w:r>
-      <w:proofErr w:type="spellEnd"/>
-      <w:r>
-        <w:t xml:space="preserve">) -&gt; ROOM, </w:t>
-      </w:r>
-      <w:proofErr w:type="spellStart"/>
-      <w:r>
-        <w:rPr>
-          <w:color w:val="EE0000"/>
-          <w:u w:val="single"/>
-        </w:rPr>
-        <w:t>dni</w:t>
-      </w:r>
-      <w:proofErr w:type="spellEnd"/>
-      <w:r>
-        <w:rPr>
-          <w:u w:val="single"/>
-        </w:rPr>
         <w:t xml:space="preserve"> </w:t>
       </w:r>
       <w:r>
-        <w:t xml:space="preserve">-&gt; TENANT, status, </w:t>
-      </w:r>
-      <w:proofErr w:type="spellStart"/>
-      <w:r>
-        <w:t>pricePerMonth</w:t>
-      </w:r>
-      <w:proofErr w:type="spellEnd"/>
-      <w:r>
-        <w:t xml:space="preserve">, </w:t>
-      </w:r>
-      <w:proofErr w:type="spellStart"/>
-      <w:r>
-        <w:t>startingDate</w:t>
-      </w:r>
-      <w:proofErr w:type="spellEnd"/>
-      <w:r>
-        <w:t xml:space="preserve">, </w:t>
-      </w:r>
-      <w:proofErr w:type="spellStart"/>
-      <w:r>
-        <w:t>endingDate</w:t>
-      </w:r>
-      <w:proofErr w:type="spellEnd"/>
-      <w:r>
-        <w:t>)</w:t>
+        <w:t>-&gt; TENANT, status, pricePerMonth, startingDate, endingDate)</w:t>
       </w:r>
     </w:p>
     <w:p>
@@ -8326,38 +6834,20 @@
       <w:r>
         <w:t>(</w:t>
       </w:r>
-      <w:proofErr w:type="spellStart"/>
       <w:r>
         <w:rPr>
           <w:u w:val="single"/>
         </w:rPr>
         <w:t>address</w:t>
       </w:r>
-      <w:proofErr w:type="spellEnd"/>
-      <w:r>
-        <w:t xml:space="preserve">, </w:t>
-      </w:r>
-      <w:proofErr w:type="spellStart"/>
-      <w:r>
-        <w:t>surface</w:t>
-      </w:r>
-      <w:proofErr w:type="spellEnd"/>
-      <w:r>
-        <w:t xml:space="preserve">, status, </w:t>
-      </w:r>
-      <w:proofErr w:type="spellStart"/>
+      <w:r>
+        <w:t xml:space="preserve">, surface, status, </w:t>
+      </w:r>
       <w:r>
         <w:rPr>
           <w:color w:val="EE0000"/>
         </w:rPr>
-        <w:t>dni</w:t>
-      </w:r>
-      <w:proofErr w:type="spellEnd"/>
-      <w:r>
-        <w:rPr>
-          <w:color w:val="EE0000"/>
-        </w:rPr>
-        <w:t xml:space="preserve"> </w:t>
+        <w:t xml:space="preserve">dni </w:t>
       </w:r>
       <w:r>
         <w:t>-&gt; OWNER)</w:t>
@@ -8380,38 +6870,21 @@
       <w:r>
         <w:t>(</w:t>
       </w:r>
-      <w:proofErr w:type="spellStart"/>
       <w:r>
         <w:rPr>
           <w:u w:val="single"/>
         </w:rPr>
-        <w:t>num</w:t>
-      </w:r>
-      <w:proofErr w:type="spellEnd"/>
+        <w:t>num, type</w:t>
+      </w:r>
+      <w:r>
+        <w:t>,</w:t>
+      </w:r>
       <w:r>
         <w:rPr>
           <w:u w:val="single"/>
         </w:rPr>
-        <w:t xml:space="preserve">, </w:t>
-      </w:r>
-      <w:proofErr w:type="spellStart"/>
-      <w:r>
-        <w:rPr>
-          <w:u w:val="single"/>
-        </w:rPr>
-        <w:t>type</w:t>
-      </w:r>
-      <w:proofErr w:type="spellEnd"/>
-      <w:r>
-        <w:t>,</w:t>
-      </w:r>
-      <w:r>
-        <w:rPr>
-          <w:u w:val="single"/>
-        </w:rPr>
         <w:t xml:space="preserve"> </w:t>
       </w:r>
-      <w:proofErr w:type="spellStart"/>
       <w:r>
         <w:rPr>
           <w:color w:val="EE0000"/>
@@ -8419,25 +6892,8 @@
         </w:rPr>
         <w:t>address</w:t>
       </w:r>
-      <w:proofErr w:type="spellEnd"/>
-      <w:r>
-        <w:t xml:space="preserve"> -&gt; PROPERTY, </w:t>
-      </w:r>
-      <w:proofErr w:type="spellStart"/>
-      <w:r>
-        <w:t>surface</w:t>
-      </w:r>
-      <w:proofErr w:type="spellEnd"/>
-      <w:r>
-        <w:t xml:space="preserve">, status, </w:t>
-      </w:r>
-      <w:proofErr w:type="spellStart"/>
-      <w:r>
-        <w:t>pricePerMonth</w:t>
-      </w:r>
-      <w:proofErr w:type="spellEnd"/>
-      <w:r>
-        <w:t>)</w:t>
+      <w:r>
+        <w:t xml:space="preserve"> -&gt; PROPERTY, surface, status, pricePerMonth)</w:t>
       </w:r>
     </w:p>
     <w:p>
@@ -8457,14 +6913,12 @@
       <w:r>
         <w:t>(</w:t>
       </w:r>
-      <w:proofErr w:type="spellStart"/>
       <w:r>
         <w:rPr>
           <w:u w:val="single"/>
         </w:rPr>
         <w:t>num,type</w:t>
       </w:r>
-      <w:proofErr w:type="spellEnd"/>
       <w:r>
         <w:t xml:space="preserve">, </w:t>
       </w:r>
@@ -8474,57 +6928,15 @@
         </w:rPr>
         <w:t>(</w:t>
       </w:r>
-      <w:proofErr w:type="spellStart"/>
       <w:r>
         <w:rPr>
           <w:color w:val="EE0000"/>
           <w:u w:val="single"/>
         </w:rPr>
-        <w:t>num</w:t>
-      </w:r>
-      <w:proofErr w:type="spellEnd"/>
-      <w:r>
-        <w:rPr>
-          <w:color w:val="EE0000"/>
-          <w:u w:val="single"/>
-        </w:rPr>
-        <w:t xml:space="preserve">, </w:t>
-      </w:r>
-      <w:proofErr w:type="spellStart"/>
-      <w:r>
-        <w:rPr>
-          <w:color w:val="EE0000"/>
-          <w:u w:val="single"/>
-        </w:rPr>
-        <w:t>type</w:t>
-      </w:r>
-      <w:proofErr w:type="spellEnd"/>
-      <w:r>
-        <w:rPr>
-          <w:color w:val="EE0000"/>
-          <w:u w:val="single"/>
-        </w:rPr>
-        <w:t xml:space="preserve">, </w:t>
-      </w:r>
-      <w:proofErr w:type="spellStart"/>
-      <w:r>
-        <w:rPr>
-          <w:color w:val="EE0000"/>
-          <w:u w:val="single"/>
-        </w:rPr>
-        <w:t>address</w:t>
-      </w:r>
-      <w:proofErr w:type="spellEnd"/>
-      <w:r>
-        <w:t xml:space="preserve">) -&gt; ROOM, </w:t>
-      </w:r>
-      <w:proofErr w:type="spellStart"/>
-      <w:r>
-        <w:t>qty</w:t>
-      </w:r>
-      <w:proofErr w:type="spellEnd"/>
-      <w:r>
-        <w:t>)</w:t>
+        <w:t>num, type, address</w:t>
+      </w:r>
+      <w:r>
+        <w:t>) -&gt; ROOM, qty)</w:t>
       </w:r>
     </w:p>
     <w:p>
@@ -8545,25 +6957,21 @@
       <w:r>
         <w:t>(</w:t>
       </w:r>
-      <w:proofErr w:type="spellStart"/>
       <w:r>
         <w:rPr>
           <w:u w:val="single"/>
         </w:rPr>
         <w:t>reportDate</w:t>
       </w:r>
-      <w:proofErr w:type="spellEnd"/>
       <w:r>
         <w:t xml:space="preserve">, </w:t>
       </w:r>
-      <w:proofErr w:type="spellStart"/>
       <w:r>
         <w:rPr>
           <w:u w:val="single"/>
         </w:rPr>
         <w:t>dni</w:t>
       </w:r>
-      <w:proofErr w:type="spellEnd"/>
       <w:r>
         <w:t xml:space="preserve"> -&gt; USER,  </w:t>
       </w:r>
@@ -8573,65 +6981,15 @@
         </w:rPr>
         <w:t>(</w:t>
       </w:r>
-      <w:proofErr w:type="spellStart"/>
       <w:r>
         <w:rPr>
           <w:color w:val="EE0000"/>
           <w:u w:val="single"/>
         </w:rPr>
-        <w:t>num</w:t>
-      </w:r>
-      <w:proofErr w:type="spellEnd"/>
-      <w:r>
-        <w:rPr>
-          <w:color w:val="EE0000"/>
-          <w:u w:val="single"/>
-        </w:rPr>
-        <w:t xml:space="preserve">, </w:t>
-      </w:r>
-      <w:proofErr w:type="spellStart"/>
-      <w:r>
-        <w:rPr>
-          <w:color w:val="EE0000"/>
-          <w:u w:val="single"/>
-        </w:rPr>
-        <w:t>type</w:t>
-      </w:r>
-      <w:proofErr w:type="spellEnd"/>
-      <w:r>
-        <w:rPr>
-          <w:color w:val="EE0000"/>
-          <w:u w:val="single"/>
-        </w:rPr>
-        <w:t xml:space="preserve">, </w:t>
-      </w:r>
-      <w:proofErr w:type="spellStart"/>
-      <w:r>
-        <w:rPr>
-          <w:color w:val="EE0000"/>
-          <w:u w:val="single"/>
-        </w:rPr>
-        <w:t>address</w:t>
-      </w:r>
-      <w:proofErr w:type="spellEnd"/>
-      <w:r>
-        <w:t xml:space="preserve">) -&gt; ROOM, </w:t>
-      </w:r>
-      <w:proofErr w:type="spellStart"/>
-      <w:r>
-        <w:t>issue</w:t>
-      </w:r>
-      <w:proofErr w:type="spellEnd"/>
-      <w:r>
-        <w:t xml:space="preserve">, </w:t>
-      </w:r>
-      <w:proofErr w:type="spellStart"/>
-      <w:r>
-        <w:t>details</w:t>
-      </w:r>
-      <w:proofErr w:type="spellEnd"/>
-      <w:r>
-        <w:t>, status)</w:t>
+        <w:t>num, type, address</w:t>
+      </w:r>
+      <w:r>
+        <w:t>) -&gt; ROOM, issue, details, status)</w:t>
       </w:r>
     </w:p>
     <w:p>
@@ -8946,19 +7304,11 @@
           <w:rFonts w:ascii="Aptos" w:eastAsia="Aptos" w:hAnsi="Aptos" w:cs="Aptos"/>
         </w:rPr>
       </w:pPr>
-      <w:proofErr w:type="spellStart"/>
-      <w:r>
-        <w:rPr>
-          <w:rFonts w:ascii="Aptos" w:eastAsia="Aptos" w:hAnsi="Aptos" w:cs="Aptos"/>
-        </w:rPr>
-        <w:t>Roomie</w:t>
-      </w:r>
-      <w:proofErr w:type="spellEnd"/>
-      <w:r>
-        <w:rPr>
-          <w:rFonts w:ascii="Aptos" w:eastAsia="Aptos" w:hAnsi="Aptos" w:cs="Aptos"/>
-        </w:rPr>
-        <w:t xml:space="preserve"> pretende ofrecer un servicio mantenido y con actualizaciones constantes a largo plazo. Ade</w:t>
+      <w:r>
+        <w:rPr>
+          <w:rFonts w:ascii="Aptos" w:eastAsia="Aptos" w:hAnsi="Aptos" w:cs="Aptos"/>
+        </w:rPr>
+        <w:t>Roomie pretende ofrecer un servicio mantenido y con actualizaciones constantes a largo plazo. Ade</w:t>
       </w:r>
       <w:r>
         <w:rPr>
@@ -9309,14 +7659,9 @@
       </w:pPr>
       <w:bookmarkStart w:id="24" w:name="_Toc228986030"/>
       <w:r>
-        <w:t xml:space="preserve">Nuestro Tablero </w:t>
-      </w:r>
-      <w:proofErr w:type="spellStart"/>
-      <w:r>
-        <w:t>KanBan</w:t>
+        <w:t>Nuestro Tablero KanBan</w:t>
       </w:r>
       <w:bookmarkEnd w:id="24"/>
-      <w:proofErr w:type="spellEnd"/>
       <w:r>
         <w:t xml:space="preserve"> </w:t>
       </w:r>
@@ -9666,21 +8011,7 @@
               <w:rPr>
                 <w:rFonts w:eastAsia="Arial" w:cs="Arial"/>
               </w:rPr>
-              <w:t xml:space="preserve">Creación de </w:t>
-            </w:r>
-            <w:proofErr w:type="spellStart"/>
-            <w:r>
-              <w:rPr>
-                <w:rFonts w:eastAsia="Arial" w:cs="Arial"/>
-              </w:rPr>
-              <w:t>github</w:t>
-            </w:r>
-            <w:proofErr w:type="spellEnd"/>
-            <w:r>
-              <w:rPr>
-                <w:rFonts w:eastAsia="Arial" w:cs="Arial"/>
-              </w:rPr>
-              <w:t>, escribir introducción, descripción de ciclo de vida y plan de negocios</w:t>
+              <w:t>Creación de github, escribir introducción, descripción de ciclo de vida y plan de negocios</w:t>
             </w:r>
           </w:p>
           <w:p/>
@@ -9869,21 +8200,7 @@
               <w:rPr>
                 <w:rFonts w:eastAsia="Arial" w:cs="Arial"/>
               </w:rPr>
-              <w:t xml:space="preserve">Administración de base de datos y de proyecto </w:t>
-            </w:r>
-            <w:proofErr w:type="spellStart"/>
-            <w:r>
-              <w:rPr>
-                <w:rFonts w:eastAsia="Arial" w:cs="Arial"/>
-              </w:rPr>
-              <w:t>JavaFX</w:t>
-            </w:r>
-            <w:proofErr w:type="spellEnd"/>
-            <w:r>
-              <w:rPr>
-                <w:rFonts w:eastAsia="Arial" w:cs="Arial"/>
-              </w:rPr>
-              <w:t xml:space="preserve">. </w:t>
+              <w:t xml:space="preserve">Administración de base de datos y de proyecto JavaFX. </w:t>
             </w:r>
           </w:p>
         </w:tc>
@@ -10248,13 +8565,8 @@
               <w:jc w:val="center"/>
             </w:pPr>
             <w:r>
-              <w:t xml:space="preserve">Desarrollador </w:t>
-            </w:r>
-            <w:proofErr w:type="spellStart"/>
-            <w:r>
-              <w:t>backend</w:t>
-            </w:r>
-            <w:proofErr w:type="spellEnd"/>
+              <w:t>Desarrollador backend</w:t>
+            </w:r>
           </w:p>
         </w:tc>
         <w:tc>
@@ -10268,13 +8580,8 @@
               <w:jc w:val="center"/>
             </w:pPr>
             <w:r>
-              <w:t xml:space="preserve">Desarrollador </w:t>
-            </w:r>
-            <w:proofErr w:type="spellStart"/>
-            <w:r>
-              <w:t>frontend</w:t>
-            </w:r>
-            <w:proofErr w:type="spellEnd"/>
+              <w:t>Desarrollador frontend</w:t>
+            </w:r>
           </w:p>
         </w:tc>
         <w:tc>
@@ -10288,13 +8595,8 @@
               <w:jc w:val="center"/>
             </w:pPr>
             <w:r>
-              <w:t xml:space="preserve">Desarrollador </w:t>
-            </w:r>
-            <w:proofErr w:type="spellStart"/>
-            <w:r>
-              <w:t>frontend</w:t>
-            </w:r>
-            <w:proofErr w:type="spellEnd"/>
+              <w:t>Desarrollador frontend</w:t>
+            </w:r>
           </w:p>
         </w:tc>
         <w:tc>
@@ -10397,23 +8699,7 @@
         <w:t>desarrollo del código</w:t>
       </w:r>
       <w:r>
-        <w:t xml:space="preserve"> fuente, se ha empleado el IDE IntelliJ IDEA en la implementación del proyecto CRUD (</w:t>
-      </w:r>
-      <w:proofErr w:type="spellStart"/>
-      <w:r>
-        <w:t>Create</w:t>
-      </w:r>
-      <w:proofErr w:type="spellEnd"/>
-      <w:r>
-        <w:t xml:space="preserve">, Read, </w:t>
-      </w:r>
-      <w:proofErr w:type="spellStart"/>
-      <w:r>
-        <w:t>Update</w:t>
-      </w:r>
-      <w:proofErr w:type="spellEnd"/>
-      <w:r>
-        <w:t>, Delete)</w:t>
+        <w:t xml:space="preserve"> fuente, se ha empleado el IDE IntelliJ IDEA en la implementación del proyecto CRUD (Create, Read, Update, Delete)</w:t>
       </w:r>
       <w:r>
         <w:t xml:space="preserve"> para</w:t>
@@ -10429,15 +8715,7 @@
         <w:t xml:space="preserve"> </w:t>
       </w:r>
       <w:r>
-        <w:t xml:space="preserve">Code como editor principal para el diseño y estructuración del </w:t>
-      </w:r>
-      <w:proofErr w:type="spellStart"/>
-      <w:r>
-        <w:t>front-end</w:t>
-      </w:r>
-      <w:proofErr w:type="spellEnd"/>
-      <w:r>
-        <w:t xml:space="preserve"> mediante HTML, CSS y JavaScript.</w:t>
+        <w:t>Code como editor principal para el diseño y estructuración del front-end mediante HTML, CSS y JavaScript.</w:t>
       </w:r>
     </w:p>
     <w:p>
@@ -10455,15 +8733,7 @@
         <w:t>control de versiones</w:t>
       </w:r>
       <w:r>
-        <w:t xml:space="preserve"> del proyecto, se ha utilizado GitHub como plataforma en la que alojar el proyecto y </w:t>
-      </w:r>
-      <w:proofErr w:type="spellStart"/>
-      <w:r>
-        <w:t>Sourcetree</w:t>
-      </w:r>
-      <w:proofErr w:type="spellEnd"/>
-      <w:r>
-        <w:t xml:space="preserve"> para gestionar el repositorio conjunto. </w:t>
+        <w:t xml:space="preserve"> del proyecto, se ha utilizado GitHub como plataforma en la que alojar el proyecto y Sourcetree para gestionar el repositorio conjunto. </w:t>
       </w:r>
     </w:p>
     <w:p>
@@ -10491,7 +8761,6 @@
       <w:r>
         <w:t xml:space="preserve">Se ha usado </w:t>
       </w:r>
-      <w:proofErr w:type="spellStart"/>
       <w:r>
         <w:rPr>
           <w:b/>
@@ -10499,7 +8768,6 @@
         </w:rPr>
         <w:t>Cdmon</w:t>
       </w:r>
-      <w:proofErr w:type="spellEnd"/>
       <w:r>
         <w:t xml:space="preserve"> para el alojamiento de la página web creada en servidores en línea.</w:t>
       </w:r>
@@ -10512,6 +8780,7 @@
     <w:p>
       <w:pPr>
         <w:pStyle w:val="Ttulo2"/>
+        <w:jc w:val="both"/>
       </w:pPr>
       <w:bookmarkStart w:id="32" w:name="_Toc228986034"/>
       <w:r>
@@ -10544,15 +8813,7 @@
         <w:t>JavaScript</w:t>
       </w:r>
       <w:r>
-        <w:t xml:space="preserve"> para añadir interactividad a nuestra página web y guardar datos básicos en el ordenador usando el </w:t>
-      </w:r>
-      <w:proofErr w:type="spellStart"/>
-      <w:r>
-        <w:t>LocalStorage</w:t>
-      </w:r>
-      <w:proofErr w:type="spellEnd"/>
-      <w:r>
-        <w:t xml:space="preserve">. </w:t>
+        <w:t xml:space="preserve"> para añadir interactividad a nuestra página web y guardar datos básicos en el ordenador usando el LocalStorage. </w:t>
       </w:r>
       <w:r>
         <w:rPr>
@@ -10590,85 +8851,58 @@
           <w:b/>
           <w:bCs/>
         </w:rPr>
-        <w:t xml:space="preserve">tecnologías </w:t>
-      </w:r>
-      <w:proofErr w:type="spellStart"/>
+        <w:t>tecnologías frontend</w:t>
+      </w:r>
+      <w:r>
+        <w:t xml:space="preserve"> que hemos empleado para el diseño de</w:t>
+      </w:r>
+      <w:r>
+        <w:t xml:space="preserve">l </w:t>
+      </w:r>
+      <w:r>
+        <w:t xml:space="preserve">proyecto son </w:t>
+      </w:r>
       <w:r>
         <w:rPr>
           <w:b/>
           <w:bCs/>
         </w:rPr>
-        <w:t>frontend</w:t>
-      </w:r>
-      <w:proofErr w:type="spellEnd"/>
-      <w:r>
-        <w:t xml:space="preserve"> que hemos empleado para el diseño de</w:t>
-      </w:r>
-      <w:r>
-        <w:t xml:space="preserve">l </w:t>
-      </w:r>
-      <w:r>
-        <w:t xml:space="preserve">proyecto son </w:t>
+        <w:t>HTML</w:t>
+      </w:r>
+      <w:r>
+        <w:t xml:space="preserve">, para la estructura de la web, y </w:t>
+      </w:r>
+      <w:r>
+        <w:t xml:space="preserve">un </w:t>
       </w:r>
       <w:r>
         <w:rPr>
           <w:b/>
           <w:bCs/>
         </w:rPr>
-        <w:t>HTML</w:t>
-      </w:r>
-      <w:r>
-        <w:t xml:space="preserve">, para la estructura de la web, y </w:t>
-      </w:r>
-      <w:r>
-        <w:t xml:space="preserve">un </w:t>
+        <w:t>CSS</w:t>
+      </w:r>
+      <w:r>
+        <w:t xml:space="preserve"> propio para la personalización del proyecto.</w:t>
+      </w:r>
+      <w:r>
+        <w:t xml:space="preserve"> </w:t>
+      </w:r>
+    </w:p>
+    <w:p>
+      <w:pPr>
+        <w:jc w:val="both"/>
+      </w:pPr>
+      <w:r>
+        <w:t xml:space="preserve">Se ha utilizado el </w:t>
       </w:r>
       <w:r>
         <w:rPr>
           <w:b/>
           <w:bCs/>
         </w:rPr>
-        <w:t>CSS</w:t>
-      </w:r>
-      <w:r>
-        <w:t xml:space="preserve"> propio para la personalización del proyecto.</w:t>
-      </w:r>
-      <w:r>
-        <w:t xml:space="preserve"> </w:t>
-      </w:r>
-    </w:p>
-    <w:p>
-      <w:pPr>
-        <w:jc w:val="both"/>
-      </w:pPr>
-      <w:r>
-        <w:t xml:space="preserve">Se ha utilizado el </w:t>
-      </w:r>
-      <w:proofErr w:type="spellStart"/>
-      <w:r>
-        <w:rPr>
-          <w:b/>
-          <w:bCs/>
-        </w:rPr>
-        <w:t>framework</w:t>
-      </w:r>
-      <w:proofErr w:type="spellEnd"/>
-      <w:r>
-        <w:rPr>
-          <w:b/>
-          <w:bCs/>
-        </w:rPr>
-        <w:t xml:space="preserve"> </w:t>
-      </w:r>
-      <w:proofErr w:type="spellStart"/>
-      <w:r>
-        <w:rPr>
-          <w:b/>
-          <w:bCs/>
-        </w:rPr>
-        <w:t>JavaFX</w:t>
-      </w:r>
-      <w:proofErr w:type="spellEnd"/>
+        <w:t>framework JavaFX</w:t>
+      </w:r>
       <w:r>
         <w:t xml:space="preserve">, </w:t>
       </w:r>
@@ -10701,87 +8935,38 @@
           <w:bCs/>
           <w:u w:val="single"/>
         </w:rPr>
-        <w:t xml:space="preserve">Simulación de conexión </w:t>
-      </w:r>
-      <w:proofErr w:type="spellStart"/>
-      <w:r>
-        <w:rPr>
-          <w:b/>
-          <w:bCs/>
-          <w:u w:val="single"/>
-        </w:rPr>
-        <w:t>frontend-backend</w:t>
-      </w:r>
-      <w:proofErr w:type="spellEnd"/>
-    </w:p>
-    <w:p>
+        <w:t>Simulación de conexión frontend-backend</w:t>
+      </w:r>
+    </w:p>
+    <w:p>
+      <w:pPr>
+        <w:jc w:val="both"/>
+      </w:pPr>
       <w:r>
         <w:t>E</w:t>
       </w:r>
       <w:r>
-        <w:t xml:space="preserve">n este proyecto no existe una conexión real entre el </w:t>
-      </w:r>
-      <w:proofErr w:type="spellStart"/>
-      <w:r>
-        <w:t>backend</w:t>
-      </w:r>
-      <w:proofErr w:type="spellEnd"/>
-      <w:r>
-        <w:t xml:space="preserve"> y el </w:t>
-      </w:r>
-      <w:proofErr w:type="spellStart"/>
-      <w:r>
-        <w:t>frontend</w:t>
-      </w:r>
-      <w:proofErr w:type="spellEnd"/>
-      <w:r>
-        <w:t xml:space="preserve">, por lo que los datos introducidos en los formularios de la página web no se están transfiriendo a la base de datos. Se ha implementado una simulación en el </w:t>
-      </w:r>
-      <w:proofErr w:type="spellStart"/>
-      <w:r>
-        <w:t>frontend</w:t>
-      </w:r>
-      <w:proofErr w:type="spellEnd"/>
-      <w:r>
-        <w:t xml:space="preserve"> que imita está conexión. </w:t>
+        <w:t>n este proyecto no existe una conexión real entre el backend y el frontend</w:t>
+      </w:r>
+      <w:r>
+        <w:t xml:space="preserve">, por lo que los datos introducidos en los formularios de la página web no se están transfiriendo a la base de datos. Se ha implementado una simulación en el frontend que imita está conexión. </w:t>
       </w:r>
       <w:r>
         <w:br/>
-        <w:t xml:space="preserve">La forma en que se ha realizado esta simulación es usando el </w:t>
-      </w:r>
-      <w:proofErr w:type="spellStart"/>
-      <w:r>
-        <w:t>LocalStorage</w:t>
-      </w:r>
-      <w:proofErr w:type="spellEnd"/>
-      <w:r>
-        <w:t xml:space="preserve">. Al rellenar </w:t>
+        <w:t xml:space="preserve">La forma en que se ha realizado esta simulación es usando el LocalStorage. Al rellenar </w:t>
       </w:r>
       <w:r>
         <w:lastRenderedPageBreak/>
         <w:t xml:space="preserve">el formulario de registro de la página web, se recogen los datos insertados y se crea un objeto usuario que se almacena en una lista alojada en el </w:t>
       </w:r>
-      <w:proofErr w:type="spellStart"/>
       <w:r>
         <w:t>L</w:t>
       </w:r>
       <w:r>
-        <w:t>ocalStorage</w:t>
-      </w:r>
-      <w:proofErr w:type="spellEnd"/>
-      <w:r>
-        <w:t xml:space="preserve">. </w:t>
-      </w:r>
-      <w:r>
-        <w:t xml:space="preserve">A la hora de hacer el inicio de sesión, se saca la lista del </w:t>
-      </w:r>
-      <w:proofErr w:type="spellStart"/>
-      <w:r>
-        <w:t>LocalStorage</w:t>
-      </w:r>
-      <w:proofErr w:type="spellEnd"/>
-      <w:r>
-        <w:t xml:space="preserve">, se comprueba que las credenciales insertadas en el inicio de sesión se encuentran en esta lista y se concede o deniega el acceso. </w:t>
+        <w:t xml:space="preserve">ocalStorage. </w:t>
+      </w:r>
+      <w:r>
+        <w:t xml:space="preserve">A la hora de hacer el inicio de sesión, se saca la lista del LocalStorage, se comprueba que las credenciales insertadas en el inicio de sesión se encuentran en esta lista y se concede o deniega el acceso. </w:t>
       </w:r>
       <w:r>
         <w:t xml:space="preserve">En las siguientes imágenes se enseña los pasos principales para la creación de usuarios y su manipulación para el control de acceso a la web. </w:t>
@@ -11130,61 +9315,22 @@
           <w:bCs/>
           <w:u w:val="single"/>
         </w:rPr>
-        <w:t xml:space="preserve">Conexión </w:t>
-      </w:r>
-      <w:proofErr w:type="spellStart"/>
-      <w:r>
-        <w:rPr>
-          <w:b/>
-          <w:bCs/>
-          <w:u w:val="single"/>
-        </w:rPr>
-        <w:t>JavaFX</w:t>
-      </w:r>
-      <w:proofErr w:type="spellEnd"/>
-      <w:r>
-        <w:rPr>
-          <w:b/>
-          <w:bCs/>
-          <w:u w:val="single"/>
-        </w:rPr>
-        <w:t xml:space="preserve"> con SQL Server Management Studio</w:t>
-      </w:r>
-    </w:p>
-    <w:p>
-      <w:r>
-        <w:t xml:space="preserve">A la hora de implementar el sistema CRUD, debemos hacer una conexión entre la base de datos, creada en SSMS, y el proyecto </w:t>
-      </w:r>
-      <w:proofErr w:type="spellStart"/>
-      <w:r>
-        <w:t>JavaFX</w:t>
-      </w:r>
-      <w:proofErr w:type="spellEnd"/>
-      <w:r>
-        <w:t xml:space="preserve">. Para ello tuvimos que crear un método personalizado con el que hacer esta conexión, ya que es diferente a conectarlo con </w:t>
-      </w:r>
-      <w:proofErr w:type="spellStart"/>
-      <w:r>
-        <w:t>HeidiSQL</w:t>
-      </w:r>
-      <w:proofErr w:type="spellEnd"/>
-      <w:r>
-        <w:t xml:space="preserve">. </w:t>
+        <w:t>Conexión JavaFX con SQL Server Management Studio</w:t>
+      </w:r>
+    </w:p>
+    <w:p>
+      <w:pPr>
+        <w:jc w:val="both"/>
+      </w:pPr>
+      <w:r>
+        <w:t xml:space="preserve">A la hora de implementar el sistema CRUD, debemos hacer una conexión entre la base de datos, creada en SSMS, y el proyecto JavaFX. Para ello tuvimos que crear un método personalizado con el que hacer esta conexión, ya que es diferente a conectarlo con HeidiSQL. </w:t>
       </w:r>
       <w:r>
         <w:br/>
         <w:t>Por un lado, SSMS utiliza su propio puerto, el 1433. Por otro lado, la conexión se realiza a través de un usuario</w:t>
       </w:r>
       <w:r>
-        <w:t xml:space="preserve"> y se requiere una contraseña. Una vez habilitado el usuario “</w:t>
-      </w:r>
-      <w:proofErr w:type="spellStart"/>
-      <w:r>
-        <w:t>sa</w:t>
-      </w:r>
-      <w:proofErr w:type="spellEnd"/>
-      <w:r>
-        <w:t xml:space="preserve">” y configurado una contraseña para este, se puede hacer la conexión a la base de datos con el siguiente método. </w:t>
+        <w:t xml:space="preserve"> y se requiere una contraseña. Una vez habilitado el usuario “sa” y configurado una contraseña para este, se puede hacer la conexión a la base de datos con el siguiente método. </w:t>
       </w:r>
     </w:p>
     <w:p>
@@ -11284,31 +9430,11 @@
           <w:rPr>
             <w:rStyle w:val="Hipervnculo"/>
           </w:rPr>
-          <w:t>www.proyecto-r</w:t>
-        </w:r>
-        <w:r>
-          <w:rPr>
-            <w:rStyle w:val="Hipervnculo"/>
-          </w:rPr>
-          <w:t>o</w:t>
-        </w:r>
-        <w:r>
-          <w:rPr>
-            <w:rStyle w:val="Hipervnculo"/>
-          </w:rPr>
-          <w:t>omie.com</w:t>
+          <w:t>www.proyecto-roomie.com</w:t>
         </w:r>
       </w:hyperlink>
       <w:r>
-        <w:t>. En el caso de abrirlo desde una carpeta local, se podrá igualmente abrir cualquier archivo con formato .</w:t>
-      </w:r>
-      <w:proofErr w:type="spellStart"/>
-      <w:r>
-        <w:t>html</w:t>
-      </w:r>
-      <w:proofErr w:type="spellEnd"/>
-      <w:r>
-        <w:t xml:space="preserve"> usando cualquier navegador.  </w:t>
+        <w:t xml:space="preserve">. En el caso de abrirlo desde una carpeta local, se podrá igualmente abrir cualquier archivo con formato .html usando cualquier navegador.  </w:t>
       </w:r>
     </w:p>
     <w:p>
@@ -11336,6 +9462,9 @@
       <w:bookmarkEnd w:id="41"/>
     </w:p>
     <w:p>
+      <w:pPr>
+        <w:jc w:val="both"/>
+      </w:pPr>
       <w:r>
         <w:t>En la página de registro podrás crear tu cuenta simulada de usuario</w:t>
       </w:r>
@@ -11351,6 +9480,9 @@
         <w:keepNext/>
       </w:pPr>
       <w:r>
+        <w:rPr>
+          <w:noProof/>
+        </w:rPr>
         <w:drawing>
           <wp:inline distT="0" distB="0" distL="0" distR="0" wp14:anchorId="65AB6F30" wp14:editId="634884E8">
             <wp:extent cx="4802529" cy="7296150"/>
@@ -11413,6 +9545,9 @@
       </w:r>
     </w:p>
     <w:p>
+      <w:pPr>
+        <w:jc w:val="both"/>
+      </w:pPr>
       <w:r>
         <w:t xml:space="preserve">Usando tu correo y contraseña, a partir de ahora, podrás acceder a tu perfil desde la pantalla de inicio de sesión. Desde tu perfil podrás publicar las habitaciones que ofreces, si eres arrendador, o ver tu habitación alquilada, si eres inquilino. </w:t>
       </w:r>
@@ -11422,6 +9557,9 @@
         <w:keepNext/>
       </w:pPr>
       <w:r>
+        <w:rPr>
+          <w:noProof/>
+        </w:rPr>
         <w:drawing>
           <wp:inline distT="0" distB="0" distL="0" distR="0" wp14:anchorId="374C5F60" wp14:editId="4C477F54">
             <wp:extent cx="5731510" cy="5079365"/>
@@ -11478,11 +9616,17 @@
       <w:bookmarkEnd w:id="43"/>
     </w:p>
     <w:p>
+      <w:pPr>
+        <w:jc w:val="both"/>
+      </w:pPr>
       <w:r>
         <w:t xml:space="preserve">En la pestaña de Buscar, podrás explorar los diferentes anuncios de habitaciones disponibles. Podrás filtrar los resultados que buscas desde el buscador. </w:t>
       </w:r>
     </w:p>
     <w:p>
+      <w:pPr>
+        <w:jc w:val="both"/>
+      </w:pPr>
       <w:r>
         <w:t xml:space="preserve">En la pantalla de inicio encontrarás un resumen del proyecto y sus objetivos. </w:t>
       </w:r>
@@ -11505,11 +9649,17 @@
       <w:bookmarkEnd w:id="44"/>
     </w:p>
     <w:p>
+      <w:pPr>
+        <w:jc w:val="both"/>
+      </w:pPr>
       <w:r>
         <w:t xml:space="preserve">En el caso de que el usuario en algún momento tenga que manipular la base de datos, ya sea para crear, eliminar o actualizar usuarios de la página o editar viviendas; lo hará a través de una sencilla app. </w:t>
       </w:r>
     </w:p>
     <w:p>
+      <w:pPr>
+        <w:jc w:val="both"/>
+      </w:pPr>
       <w:r>
         <w:t xml:space="preserve">En esta app buscarás la pantalla para manipular los datos que necesitas editar. Una vez encontrada, puedes:  </w:t>
       </w:r>
@@ -11521,6 +9671,7 @@
           <w:ilvl w:val="0"/>
           <w:numId w:val="21"/>
         </w:numPr>
+        <w:jc w:val="both"/>
       </w:pPr>
       <w:r>
         <w:t xml:space="preserve">Añadir nuevos datos. Escribes en los espacios en blanco. Una vez rellenos todos los datos, pulsar insertar. </w:t>
@@ -11533,6 +9684,7 @@
           <w:ilvl w:val="0"/>
           <w:numId w:val="21"/>
         </w:numPr>
+        <w:jc w:val="both"/>
       </w:pPr>
       <w:r>
         <w:t>Editar datos ya existentes. Seleccionas en la tabla los datos a editar, pulsar editar. Rellenas con los nuevos datos y pulsas guardar.</w:t>
@@ -11545,6 +9697,7 @@
           <w:ilvl w:val="0"/>
           <w:numId w:val="21"/>
         </w:numPr>
+        <w:jc w:val="both"/>
       </w:pPr>
       <w:r>
         <w:t xml:space="preserve">Eliminar datos. Seleccionas en la tabla los datos a eliminar. Pulsas eliminar. </w:t>
@@ -11591,11 +9744,17 @@
       <w:bookmarkEnd w:id="46"/>
     </w:p>
     <w:p>
+      <w:pPr>
+        <w:jc w:val="both"/>
+      </w:pPr>
       <w:r>
         <w:t xml:space="preserve">Para acceder a la página web del proyecto no hay unos requisitos mínimos, simplemente se necesita cualquier dispositivo con acceso a internet y que pueda abrir un navegador web. </w:t>
       </w:r>
     </w:p>
     <w:p>
+      <w:pPr>
+        <w:jc w:val="both"/>
+      </w:pPr>
       <w:r>
         <w:t xml:space="preserve">Por otro </w:t>
       </w:r>
@@ -11613,6 +9772,7 @@
           <w:ilvl w:val="0"/>
           <w:numId w:val="21"/>
         </w:numPr>
+        <w:jc w:val="both"/>
       </w:pPr>
       <w:r>
         <w:t>Tener Java instalado en el PC.</w:t>
@@ -11625,17 +9785,10 @@
           <w:ilvl w:val="0"/>
           <w:numId w:val="21"/>
         </w:numPr>
-      </w:pPr>
-      <w:r>
-        <w:t xml:space="preserve">Un entorno de desarrollo moderno desde el que ejecutar un proyecto </w:t>
-      </w:r>
-      <w:proofErr w:type="spellStart"/>
-      <w:r>
-        <w:t>JavaFX</w:t>
-      </w:r>
-      <w:proofErr w:type="spellEnd"/>
-      <w:r>
-        <w:t xml:space="preserve">. Ya que no está incluido en el JDK estándar de Java. </w:t>
+        <w:jc w:val="both"/>
+      </w:pPr>
+      <w:r>
+        <w:t xml:space="preserve">Un entorno de desarrollo moderno desde el que ejecutar un proyecto JavaFX. Ya que no está incluido en el JDK estándar de Java. </w:t>
       </w:r>
     </w:p>
     <w:p>
@@ -11645,6 +9798,7 @@
           <w:ilvl w:val="0"/>
           <w:numId w:val="21"/>
         </w:numPr>
+        <w:jc w:val="both"/>
       </w:pPr>
       <w:r>
         <w:t xml:space="preserve">Tener SQL Server Management Studio </w:t>
@@ -11653,15 +9807,7 @@
         <w:t xml:space="preserve">instalado en el PC. Debes tener el puerto TCP/IP 1433 habilitado, así como tener el modo de autenticación de SQL Server activado y </w:t>
       </w:r>
       <w:r>
-        <w:t>el usuario “</w:t>
-      </w:r>
-      <w:proofErr w:type="spellStart"/>
-      <w:r>
-        <w:t>sa</w:t>
-      </w:r>
-      <w:proofErr w:type="spellEnd"/>
-      <w:r>
-        <w:t xml:space="preserve">” activo. La contraseña de este usuario deber ser “roomie1234”. </w:t>
+        <w:t xml:space="preserve">el usuario “sa” activo. La contraseña de este usuario deber ser “roomie1234”. </w:t>
       </w:r>
     </w:p>
     <w:p>
@@ -11675,50 +9821,39 @@
       <w:bookmarkEnd w:id="47"/>
     </w:p>
     <w:p>
+      <w:pPr>
+        <w:jc w:val="both"/>
+      </w:pPr>
       <w:r>
         <w:t xml:space="preserve">Una vez más, la página web del proyecto se podrá abrir desde cualquier dispositivo que tenga conexión a internet y a un navegador. Y en el caso de no tener acceso a red, se puede abrir en local si se dispone del árbol de ficheros con los HTML, CSS y JS. Simplemente clonar el repositorio del proyecto entero en tu dispositivo, entrar a la carpeta de la web, y abrir los HTML deseados. </w:t>
       </w:r>
     </w:p>
     <w:p>
+      <w:pPr>
+        <w:jc w:val="both"/>
+      </w:pPr>
       <w:r>
         <w:lastRenderedPageBreak/>
-        <w:t xml:space="preserve">Para el proyecto de </w:t>
-      </w:r>
-      <w:proofErr w:type="spellStart"/>
-      <w:r>
-        <w:t>JavaFX</w:t>
-      </w:r>
-      <w:proofErr w:type="spellEnd"/>
-      <w:r>
-        <w:t xml:space="preserve">, se debe abrir el proyecto de programación desde un entorno de desarrollo compatible, como es IntelliJ IDEA. </w:t>
-      </w:r>
-      <w:r>
-        <w:br/>
-        <w:t>Y para poder recrear la base de datos, se debe ejecutar el script que se encuentra en la carpeta “</w:t>
-      </w:r>
-      <w:proofErr w:type="spellStart"/>
-      <w:r>
-        <w:t>Database</w:t>
-      </w:r>
-      <w:proofErr w:type="spellEnd"/>
-      <w:r>
-        <w:t>”,</w:t>
+        <w:t xml:space="preserve">Para el proyecto de JavaFX, se debe abrir el proyecto de programación desde un entorno de desarrollo compatible, como es IntelliJ IDEA. </w:t>
+      </w:r>
+    </w:p>
+    <w:p>
+      <w:pPr>
+        <w:jc w:val="both"/>
+      </w:pPr>
+      <w:r>
+        <w:t>Y para poder recrear la base de datos, se debe ejecutar el script que se encuentra en la carpeta “Database”,</w:t>
       </w:r>
       <w:r>
         <w:t xml:space="preserve"> desde una consulta nueva en SQL Server Management Studio. </w:t>
       </w:r>
     </w:p>
     <w:p>
-      <w:r>
-        <w:t xml:space="preserve">Siguiendo todos estos requisitos, podrás abrir el proyecto </w:t>
-      </w:r>
-      <w:proofErr w:type="spellStart"/>
-      <w:r>
-        <w:t>Roomie</w:t>
-      </w:r>
-      <w:proofErr w:type="spellEnd"/>
-      <w:r>
-        <w:t xml:space="preserve"> en tú PC. </w:t>
+      <w:pPr>
+        <w:jc w:val="both"/>
+      </w:pPr>
+      <w:r>
+        <w:t xml:space="preserve">Siguiendo todos estos requisitos, podrás abrir el proyecto Roomie en tú PC. </w:t>
       </w:r>
     </w:p>
     <w:p/>
@@ -11757,6 +9892,7 @@
     <w:p>
       <w:pPr>
         <w:spacing w:after="142" w:line="276" w:lineRule="auto"/>
+        <w:jc w:val="both"/>
       </w:pPr>
       <w:r>
         <w:rPr>
@@ -11768,6 +9904,7 @@
     <w:p>
       <w:pPr>
         <w:spacing w:before="240" w:after="142" w:line="276" w:lineRule="auto"/>
+        <w:jc w:val="both"/>
       </w:pPr>
       <w:r>
         <w:rPr>
@@ -11927,7 +10064,6 @@
         <w:rPr>
           <w:rFonts w:ascii="Aptos" w:eastAsia="Aptos" w:hAnsi="Aptos" w:cs="Aptos"/>
         </w:rPr>
-        <w:lastRenderedPageBreak/>
         <w:t>Desplazamiento (visitar casas que soliciten ser anunciadas en la página)</w:t>
       </w:r>
     </w:p>
@@ -12575,16 +10711,7 @@
         <w:rPr>
           <w:rFonts w:ascii="Aptos" w:eastAsia="Aptos" w:hAnsi="Aptos" w:cs="Aptos"/>
         </w:rPr>
-        <w:t xml:space="preserve">temperatura inadecuada puede provocar desde simples resfriados o </w:t>
-      </w:r>
-      <w:r>
-        <w:tab/>
-      </w:r>
-      <w:r>
-        <w:rPr>
-          <w:rFonts w:ascii="Aptos" w:eastAsia="Aptos" w:hAnsi="Aptos" w:cs="Aptos"/>
-        </w:rPr>
-        <w:t>deshidratación hasta hipotermia o golpes de calor.</w:t>
+        <w:t>temperatura inadecuada puede provocar desde simples resfriados o deshidratación hasta hipotermia o golpes de calor.</w:t>
       </w:r>
     </w:p>
     <w:p>
@@ -12806,35 +10933,7 @@
         <w:rPr>
           <w:rFonts w:ascii="Aptos" w:eastAsia="Aptos" w:hAnsi="Aptos" w:cs="Aptos"/>
         </w:rPr>
-        <w:t xml:space="preserve">Caldas Blanco, M. E., Hidalgo Ortega, M. L. y </w:t>
-      </w:r>
-      <w:proofErr w:type="spellStart"/>
-      <w:r>
-        <w:rPr>
-          <w:rFonts w:ascii="Aptos" w:eastAsia="Aptos" w:hAnsi="Aptos" w:cs="Aptos"/>
-        </w:rPr>
-        <w:t>Laraño</w:t>
-      </w:r>
-      <w:proofErr w:type="spellEnd"/>
-      <w:r>
-        <w:rPr>
-          <w:rFonts w:ascii="Aptos" w:eastAsia="Aptos" w:hAnsi="Aptos" w:cs="Aptos"/>
-        </w:rPr>
-        <w:t xml:space="preserve"> </w:t>
-      </w:r>
-      <w:proofErr w:type="spellStart"/>
-      <w:r>
-        <w:rPr>
-          <w:rFonts w:ascii="Aptos" w:eastAsia="Aptos" w:hAnsi="Aptos" w:cs="Aptos"/>
-        </w:rPr>
-        <w:t>DIaz</w:t>
-      </w:r>
-      <w:proofErr w:type="spellEnd"/>
-      <w:r>
-        <w:rPr>
-          <w:rFonts w:ascii="Aptos" w:eastAsia="Aptos" w:hAnsi="Aptos" w:cs="Aptos"/>
-        </w:rPr>
-        <w:t xml:space="preserve">, J. (2024). </w:t>
+        <w:t xml:space="preserve">Caldas Blanco, M. E., Hidalgo Ortega, M. L. y Laraño DIaz, J. (2024). </w:t>
       </w:r>
       <w:r>
         <w:rPr>
@@ -12848,40 +10947,18 @@
         <w:rPr>
           <w:rFonts w:ascii="Aptos" w:eastAsia="Aptos" w:hAnsi="Aptos" w:cs="Aptos"/>
         </w:rPr>
-        <w:t xml:space="preserve">(Capítulo 4). </w:t>
-      </w:r>
-      <w:proofErr w:type="spellStart"/>
-      <w:r>
-        <w:rPr>
-          <w:rFonts w:ascii="Aptos" w:eastAsia="Aptos" w:hAnsi="Aptos" w:cs="Aptos"/>
-        </w:rPr>
-        <w:t>Editex</w:t>
-      </w:r>
-      <w:proofErr w:type="spellEnd"/>
-      <w:r>
-        <w:rPr>
-          <w:rFonts w:ascii="Aptos" w:eastAsia="Aptos" w:hAnsi="Aptos" w:cs="Aptos"/>
-        </w:rPr>
-        <w:t>.</w:t>
+        <w:t>(Capítulo 4). Editex.</w:t>
       </w:r>
     </w:p>
     <w:p>
       <w:pPr>
         <w:spacing w:line="276" w:lineRule="auto"/>
       </w:pPr>
-      <w:proofErr w:type="spellStart"/>
-      <w:r>
-        <w:rPr>
-          <w:rFonts w:ascii="Aptos" w:eastAsia="Aptos" w:hAnsi="Aptos" w:cs="Aptos"/>
-        </w:rPr>
-        <w:t>elEconomista</w:t>
-      </w:r>
-      <w:proofErr w:type="spellEnd"/>
-      <w:r>
-        <w:rPr>
-          <w:rFonts w:ascii="Aptos" w:eastAsia="Aptos" w:hAnsi="Aptos" w:cs="Aptos"/>
-        </w:rPr>
-        <w:t xml:space="preserve">. (15 de septiembre de 2023). </w:t>
+      <w:r>
+        <w:rPr>
+          <w:rFonts w:ascii="Aptos" w:eastAsia="Aptos" w:hAnsi="Aptos" w:cs="Aptos"/>
+        </w:rPr>
+        <w:t xml:space="preserve">elEconomista. (15 de septiembre de 2023). </w:t>
       </w:r>
       <w:r>
         <w:rPr>
@@ -12889,25 +10966,7 @@
           <w:i/>
           <w:iCs/>
         </w:rPr>
-        <w:t xml:space="preserve">Crece el número de estudiantes que </w:t>
-      </w:r>
-      <w:proofErr w:type="spellStart"/>
-      <w:r>
-        <w:rPr>
-          <w:rFonts w:ascii="Aptos" w:eastAsia="Aptos" w:hAnsi="Aptos" w:cs="Aptos"/>
-          <w:i/>
-          <w:iCs/>
-        </w:rPr>
-        <w:t>decicen</w:t>
-      </w:r>
-      <w:proofErr w:type="spellEnd"/>
-      <w:r>
-        <w:rPr>
-          <w:rFonts w:ascii="Aptos" w:eastAsia="Aptos" w:hAnsi="Aptos" w:cs="Aptos"/>
-          <w:i/>
-          <w:iCs/>
-        </w:rPr>
-        <w:t xml:space="preserve"> alquilar habitaciones en pisos compartidos.</w:t>
+        <w:t>Crece el número de estudiantes que decicen alquilar habitaciones en pisos compartidos.</w:t>
       </w:r>
       <w:r>
         <w:rPr>
@@ -12929,19 +10988,11 @@
       <w:pPr>
         <w:spacing w:line="276" w:lineRule="auto"/>
       </w:pPr>
-      <w:proofErr w:type="spellStart"/>
-      <w:r>
-        <w:rPr>
-          <w:rFonts w:ascii="Aptos" w:eastAsia="Aptos" w:hAnsi="Aptos" w:cs="Aptos"/>
-        </w:rPr>
-        <w:t>Diánez</w:t>
-      </w:r>
-      <w:proofErr w:type="spellEnd"/>
-      <w:r>
-        <w:rPr>
-          <w:rFonts w:ascii="Aptos" w:eastAsia="Aptos" w:hAnsi="Aptos" w:cs="Aptos"/>
-        </w:rPr>
-        <w:t xml:space="preserve"> Juan, S. (2025). </w:t>
+      <w:r>
+        <w:rPr>
+          <w:rFonts w:ascii="Aptos" w:eastAsia="Aptos" w:hAnsi="Aptos" w:cs="Aptos"/>
+        </w:rPr>
+        <w:t xml:space="preserve">Diánez Juan, S. (2025). </w:t>
       </w:r>
       <w:r>
         <w:rPr>
@@ -12971,19 +11022,11 @@
       <w:pPr>
         <w:spacing w:line="276" w:lineRule="auto"/>
       </w:pPr>
-      <w:proofErr w:type="spellStart"/>
-      <w:r>
-        <w:rPr>
-          <w:rFonts w:ascii="Aptos" w:eastAsia="Aptos" w:hAnsi="Aptos" w:cs="Aptos"/>
-        </w:rPr>
-        <w:t>Diánez</w:t>
-      </w:r>
-      <w:proofErr w:type="spellEnd"/>
-      <w:r>
-        <w:rPr>
-          <w:rFonts w:ascii="Aptos" w:eastAsia="Aptos" w:hAnsi="Aptos" w:cs="Aptos"/>
-        </w:rPr>
-        <w:t xml:space="preserve"> Juan, S. (2025). </w:t>
+      <w:r>
+        <w:rPr>
+          <w:rFonts w:ascii="Aptos" w:eastAsia="Aptos" w:hAnsi="Aptos" w:cs="Aptos"/>
+        </w:rPr>
+        <w:t xml:space="preserve">Diánez Juan, S. (2025). </w:t>
       </w:r>
       <w:r>
         <w:rPr>
@@ -16761,12 +14804,7 @@
 </file>
 
 <file path=customXml/item3.xml><?xml version="1.0" encoding="utf-8"?>
-<?mso-contentType ?>
-<FormTemplates xmlns="http://schemas.microsoft.com/sharepoint/v3/contenttype/forms">
-  <Display>DocumentLibraryForm</Display>
-  <Edit>DocumentLibraryForm</Edit>
-  <New>DocumentLibraryForm</New>
-</FormTemplates>
+<b:Sources xmlns:b="http://schemas.openxmlformats.org/officeDocument/2006/bibliography" xmlns="http://schemas.openxmlformats.org/officeDocument/2006/bibliography" SelectedStyle="\APASixthEditionOfficeOnline.xsl" StyleName="APA" Version="6"/>
 </file>
 
 <file path=customXml/item4.xml><?xml version="1.0" encoding="utf-8"?>
@@ -16920,7 +14958,12 @@
 </file>
 
 <file path=customXml/item5.xml><?xml version="1.0" encoding="utf-8"?>
-<b:Sources xmlns:b="http://schemas.openxmlformats.org/officeDocument/2006/bibliography" xmlns="http://schemas.openxmlformats.org/officeDocument/2006/bibliography" SelectedStyle="\APASixthEditionOfficeOnline.xsl" StyleName="APA" Version="6"/>
+<?mso-contentType ?>
+<FormTemplates xmlns="http://schemas.microsoft.com/sharepoint/v3/contenttype/forms">
+  <Display>DocumentLibraryForm</Display>
+  <Edit>DocumentLibraryForm</Edit>
+  <New>DocumentLibraryForm</New>
+</FormTemplates>
 </file>
 
 <file path=customXml/itemProps1.xml><?xml version="1.0" encoding="utf-8"?>
@@ -16942,9 +14985,9 @@
 </file>
 
 <file path=customXml/itemProps3.xml><?xml version="1.0" encoding="utf-8"?>
-<ds:datastoreItem xmlns:ds="http://schemas.openxmlformats.org/officeDocument/2006/customXml" ds:itemID="{9C62D19F-2C4B-4163-B98D-18BF5B309744}">
+<ds:datastoreItem xmlns:ds="http://schemas.openxmlformats.org/officeDocument/2006/customXml" ds:itemID="{84CA4A16-CE6B-4C64-8CA7-CF5CBE9EE313}">
   <ds:schemaRefs>
-    <ds:schemaRef ds:uri="http://schemas.microsoft.com/sharepoint/v3/contenttype/forms"/>
+    <ds:schemaRef ds:uri="http://schemas.openxmlformats.org/officeDocument/2006/bibliography"/>
   </ds:schemaRefs>
 </ds:datastoreItem>
 </file>
@@ -16968,9 +15011,9 @@
 </file>
 
 <file path=customXml/itemProps5.xml><?xml version="1.0" encoding="utf-8"?>
-<ds:datastoreItem xmlns:ds="http://schemas.openxmlformats.org/officeDocument/2006/customXml" ds:itemID="{84CA4A16-CE6B-4C64-8CA7-CF5CBE9EE313}">
+<ds:datastoreItem xmlns:ds="http://schemas.openxmlformats.org/officeDocument/2006/customXml" ds:itemID="{9C62D19F-2C4B-4163-B98D-18BF5B309744}">
   <ds:schemaRefs>
-    <ds:schemaRef ds:uri="http://schemas.openxmlformats.org/officeDocument/2006/bibliography"/>
+    <ds:schemaRef ds:uri="http://schemas.microsoft.com/sharepoint/v3/contenttype/forms"/>
   </ds:schemaRefs>
 </ds:datastoreItem>
 </file>
</xml_diff>

<commit_message>
Documentacion final acabada. Diagrama de clases creado y actualizado
</commit_message>
<xml_diff>
--- a/Documentación_final.docx
+++ b/Documentación_final.docx
@@ -1577,7 +1577,7 @@
           <w:r>
             <w:fldChar w:fldCharType="separate"/>
           </w:r>
-          <w:hyperlink w:anchor="_Toc229424473" w:history="1">
+          <w:hyperlink w:anchor="_Toc229690636" w:history="1">
             <w:r>
               <w:rPr>
                 <w:rStyle w:val="Hipervnculo"/>
@@ -1621,7 +1621,7 @@
                 <w:noProof/>
                 <w:webHidden/>
               </w:rPr>
-              <w:instrText xml:space="preserve"> PAGEREF _Toc229424473 \h </w:instrText>
+              <w:instrText xml:space="preserve"> PAGEREF _Toc229690636 \h </w:instrText>
             </w:r>
             <w:r>
               <w:rPr>
@@ -1641,7 +1641,7 @@
                 <w:noProof/>
                 <w:webHidden/>
               </w:rPr>
-              <w:t>5</w:t>
+              <w:t>6</w:t>
             </w:r>
             <w:r>
               <w:rPr>
@@ -1666,7 +1666,7 @@
               <w14:ligatures w14:val="standardContextual"/>
             </w:rPr>
           </w:pPr>
-          <w:hyperlink w:anchor="_Toc229424474" w:history="1">
+          <w:hyperlink w:anchor="_Toc229690637" w:history="1">
             <w:r>
               <w:rPr>
                 <w:rStyle w:val="Hipervnculo"/>
@@ -1693,7 +1693,7 @@
                 <w:noProof/>
                 <w:webHidden/>
               </w:rPr>
-              <w:instrText xml:space="preserve"> PAGEREF _Toc229424474 \h </w:instrText>
+              <w:instrText xml:space="preserve"> PAGEREF _Toc229690637 \h </w:instrText>
             </w:r>
             <w:r>
               <w:rPr>
@@ -1713,7 +1713,7 @@
                 <w:noProof/>
                 <w:webHidden/>
               </w:rPr>
-              <w:t>5</w:t>
+              <w:t>6</w:t>
             </w:r>
             <w:r>
               <w:rPr>
@@ -1738,7 +1738,7 @@
               <w14:ligatures w14:val="standardContextual"/>
             </w:rPr>
           </w:pPr>
-          <w:hyperlink w:anchor="_Toc229424475" w:history="1">
+          <w:hyperlink w:anchor="_Toc229690638" w:history="1">
             <w:r>
               <w:rPr>
                 <w:rStyle w:val="Hipervnculo"/>
@@ -1765,7 +1765,7 @@
                 <w:noProof/>
                 <w:webHidden/>
               </w:rPr>
-              <w:instrText xml:space="preserve"> PAGEREF _Toc229424475 \h </w:instrText>
+              <w:instrText xml:space="preserve"> PAGEREF _Toc229690638 \h </w:instrText>
             </w:r>
             <w:r>
               <w:rPr>
@@ -1785,7 +1785,7 @@
                 <w:noProof/>
                 <w:webHidden/>
               </w:rPr>
-              <w:t>5</w:t>
+              <w:t>6</w:t>
             </w:r>
             <w:r>
               <w:rPr>
@@ -1810,7 +1810,7 @@
               <w14:ligatures w14:val="standardContextual"/>
             </w:rPr>
           </w:pPr>
-          <w:hyperlink w:anchor="_Toc229424476" w:history="1">
+          <w:hyperlink w:anchor="_Toc229690639" w:history="1">
             <w:r>
               <w:rPr>
                 <w:rStyle w:val="Hipervnculo"/>
@@ -1837,7 +1837,7 @@
                 <w:noProof/>
                 <w:webHidden/>
               </w:rPr>
-              <w:instrText xml:space="preserve"> PAGEREF _Toc229424476 \h </w:instrText>
+              <w:instrText xml:space="preserve"> PAGEREF _Toc229690639 \h </w:instrText>
             </w:r>
             <w:r>
               <w:rPr>
@@ -1857,7 +1857,7 @@
                 <w:noProof/>
                 <w:webHidden/>
               </w:rPr>
-              <w:t>5</w:t>
+              <w:t>6</w:t>
             </w:r>
             <w:r>
               <w:rPr>
@@ -1883,7 +1883,7 @@
               <w14:ligatures w14:val="standardContextual"/>
             </w:rPr>
           </w:pPr>
-          <w:hyperlink w:anchor="_Toc229424477" w:history="1">
+          <w:hyperlink w:anchor="_Toc229690640" w:history="1">
             <w:r>
               <w:rPr>
                 <w:rStyle w:val="Hipervnculo"/>
@@ -1927,7 +1927,7 @@
                 <w:noProof/>
                 <w:webHidden/>
               </w:rPr>
-              <w:instrText xml:space="preserve"> PAGEREF _Toc229424477 \h </w:instrText>
+              <w:instrText xml:space="preserve"> PAGEREF _Toc229690640 \h </w:instrText>
             </w:r>
             <w:r>
               <w:rPr>
@@ -1947,7 +1947,7 @@
                 <w:noProof/>
                 <w:webHidden/>
               </w:rPr>
-              <w:t>6</w:t>
+              <w:t>7</w:t>
             </w:r>
             <w:r>
               <w:rPr>
@@ -1972,7 +1972,7 @@
               <w14:ligatures w14:val="standardContextual"/>
             </w:rPr>
           </w:pPr>
-          <w:hyperlink w:anchor="_Toc229424478" w:history="1">
+          <w:hyperlink w:anchor="_Toc229690641" w:history="1">
             <w:r>
               <w:rPr>
                 <w:rStyle w:val="Hipervnculo"/>
@@ -1999,7 +1999,7 @@
                 <w:noProof/>
                 <w:webHidden/>
               </w:rPr>
-              <w:instrText xml:space="preserve"> PAGEREF _Toc229424478 \h </w:instrText>
+              <w:instrText xml:space="preserve"> PAGEREF _Toc229690641 \h </w:instrText>
             </w:r>
             <w:r>
               <w:rPr>
@@ -2019,7 +2019,7 @@
                 <w:noProof/>
                 <w:webHidden/>
               </w:rPr>
-              <w:t>6</w:t>
+              <w:t>7</w:t>
             </w:r>
             <w:r>
               <w:rPr>
@@ -2044,7 +2044,7 @@
               <w14:ligatures w14:val="standardContextual"/>
             </w:rPr>
           </w:pPr>
-          <w:hyperlink w:anchor="_Toc229424479" w:history="1">
+          <w:hyperlink w:anchor="_Toc229690642" w:history="1">
             <w:r>
               <w:rPr>
                 <w:rStyle w:val="Hipervnculo"/>
@@ -2071,7 +2071,7 @@
                 <w:noProof/>
                 <w:webHidden/>
               </w:rPr>
-              <w:instrText xml:space="preserve"> PAGEREF _Toc229424479 \h </w:instrText>
+              <w:instrText xml:space="preserve"> PAGEREF _Toc229690642 \h </w:instrText>
             </w:r>
             <w:r>
               <w:rPr>
@@ -2091,7 +2091,7 @@
                 <w:noProof/>
                 <w:webHidden/>
               </w:rPr>
-              <w:t>7</w:t>
+              <w:t>8</w:t>
             </w:r>
             <w:r>
               <w:rPr>
@@ -2116,7 +2116,7 @@
               <w14:ligatures w14:val="standardContextual"/>
             </w:rPr>
           </w:pPr>
-          <w:hyperlink w:anchor="_Toc229424480" w:history="1">
+          <w:hyperlink w:anchor="_Toc229690643" w:history="1">
             <w:r>
               <w:rPr>
                 <w:rStyle w:val="Hipervnculo"/>
@@ -2144,7 +2144,7 @@
                 <w:noProof/>
                 <w:webHidden/>
               </w:rPr>
-              <w:instrText xml:space="preserve"> PAGEREF _Toc229424480 \h </w:instrText>
+              <w:instrText xml:space="preserve"> PAGEREF _Toc229690643 \h </w:instrText>
             </w:r>
             <w:r>
               <w:rPr>
@@ -2164,7 +2164,7 @@
                 <w:noProof/>
                 <w:webHidden/>
               </w:rPr>
-              <w:t>8</w:t>
+              <w:t>9</w:t>
             </w:r>
             <w:r>
               <w:rPr>
@@ -2190,7 +2190,7 @@
               <w14:ligatures w14:val="standardContextual"/>
             </w:rPr>
           </w:pPr>
-          <w:hyperlink w:anchor="_Toc229424481" w:history="1">
+          <w:hyperlink w:anchor="_Toc229690644" w:history="1">
             <w:r>
               <w:rPr>
                 <w:rStyle w:val="Hipervnculo"/>
@@ -2234,7 +2234,7 @@
                 <w:noProof/>
                 <w:webHidden/>
               </w:rPr>
-              <w:instrText xml:space="preserve"> PAGEREF _Toc229424481 \h </w:instrText>
+              <w:instrText xml:space="preserve"> PAGEREF _Toc229690644 \h </w:instrText>
             </w:r>
             <w:r>
               <w:rPr>
@@ -2254,7 +2254,7 @@
                 <w:noProof/>
                 <w:webHidden/>
               </w:rPr>
-              <w:t>9</w:t>
+              <w:t>10</w:t>
             </w:r>
             <w:r>
               <w:rPr>
@@ -2279,7 +2279,7 @@
               <w14:ligatures w14:val="standardContextual"/>
             </w:rPr>
           </w:pPr>
-          <w:hyperlink w:anchor="_Toc229424482" w:history="1">
+          <w:hyperlink w:anchor="_Toc229690645" w:history="1">
             <w:r>
               <w:rPr>
                 <w:rStyle w:val="Hipervnculo"/>
@@ -2306,7 +2306,7 @@
                 <w:noProof/>
                 <w:webHidden/>
               </w:rPr>
-              <w:instrText xml:space="preserve"> PAGEREF _Toc229424482 \h </w:instrText>
+              <w:instrText xml:space="preserve"> PAGEREF _Toc229690645 \h </w:instrText>
             </w:r>
             <w:r>
               <w:rPr>
@@ -2326,7 +2326,7 @@
                 <w:noProof/>
                 <w:webHidden/>
               </w:rPr>
-              <w:t>9</w:t>
+              <w:t>10</w:t>
             </w:r>
             <w:r>
               <w:rPr>
@@ -2351,7 +2351,7 @@
               <w14:ligatures w14:val="standardContextual"/>
             </w:rPr>
           </w:pPr>
-          <w:hyperlink w:anchor="_Toc229424483" w:history="1">
+          <w:hyperlink w:anchor="_Toc229690646" w:history="1">
             <w:r>
               <w:rPr>
                 <w:rStyle w:val="Hipervnculo"/>
@@ -2378,7 +2378,7 @@
                 <w:noProof/>
                 <w:webHidden/>
               </w:rPr>
-              <w:instrText xml:space="preserve"> PAGEREF _Toc229424483 \h </w:instrText>
+              <w:instrText xml:space="preserve"> PAGEREF _Toc229690646 \h </w:instrText>
             </w:r>
             <w:r>
               <w:rPr>
@@ -2398,7 +2398,7 @@
                 <w:noProof/>
                 <w:webHidden/>
               </w:rPr>
-              <w:t>10</w:t>
+              <w:t>11</w:t>
             </w:r>
             <w:r>
               <w:rPr>
@@ -2423,7 +2423,7 @@
               <w14:ligatures w14:val="standardContextual"/>
             </w:rPr>
           </w:pPr>
-          <w:hyperlink w:anchor="_Toc229424484" w:history="1">
+          <w:hyperlink w:anchor="_Toc229690647" w:history="1">
             <w:r>
               <w:rPr>
                 <w:rStyle w:val="Hipervnculo"/>
@@ -2450,7 +2450,7 @@
                 <w:noProof/>
                 <w:webHidden/>
               </w:rPr>
-              <w:instrText xml:space="preserve"> PAGEREF _Toc229424484 \h </w:instrText>
+              <w:instrText xml:space="preserve"> PAGEREF _Toc229690647 \h </w:instrText>
             </w:r>
             <w:r>
               <w:rPr>
@@ -2470,7 +2470,7 @@
                 <w:noProof/>
                 <w:webHidden/>
               </w:rPr>
-              <w:t>11</w:t>
+              <w:t>12</w:t>
             </w:r>
             <w:r>
               <w:rPr>
@@ -2495,7 +2495,7 @@
               <w14:ligatures w14:val="standardContextual"/>
             </w:rPr>
           </w:pPr>
-          <w:hyperlink w:anchor="_Toc229424485" w:history="1">
+          <w:hyperlink w:anchor="_Toc229690648" w:history="1">
             <w:r>
               <w:rPr>
                 <w:rStyle w:val="Hipervnculo"/>
@@ -2522,7 +2522,7 @@
                 <w:noProof/>
                 <w:webHidden/>
               </w:rPr>
-              <w:instrText xml:space="preserve"> PAGEREF _Toc229424485 \h </w:instrText>
+              <w:instrText xml:space="preserve"> PAGEREF _Toc229690648 \h </w:instrText>
             </w:r>
             <w:r>
               <w:rPr>
@@ -2542,7 +2542,7 @@
                 <w:noProof/>
                 <w:webHidden/>
               </w:rPr>
-              <w:t>12</w:t>
+              <w:t>13</w:t>
             </w:r>
             <w:r>
               <w:rPr>
@@ -2567,7 +2567,7 @@
               <w14:ligatures w14:val="standardContextual"/>
             </w:rPr>
           </w:pPr>
-          <w:hyperlink w:anchor="_Toc229424486" w:history="1">
+          <w:hyperlink w:anchor="_Toc229690649" w:history="1">
             <w:r>
               <w:rPr>
                 <w:rStyle w:val="Hipervnculo"/>
@@ -2594,7 +2594,7 @@
                 <w:noProof/>
                 <w:webHidden/>
               </w:rPr>
-              <w:instrText xml:space="preserve"> PAGEREF _Toc229424486 \h </w:instrText>
+              <w:instrText xml:space="preserve"> PAGEREF _Toc229690649 \h </w:instrText>
             </w:r>
             <w:r>
               <w:rPr>
@@ -2614,7 +2614,7 @@
                 <w:noProof/>
                 <w:webHidden/>
               </w:rPr>
-              <w:t>12</w:t>
+              <w:t>13</w:t>
             </w:r>
             <w:r>
               <w:rPr>
@@ -2639,7 +2639,7 @@
               <w14:ligatures w14:val="standardContextual"/>
             </w:rPr>
           </w:pPr>
-          <w:hyperlink w:anchor="_Toc229424487" w:history="1">
+          <w:hyperlink w:anchor="_Toc229690650" w:history="1">
             <w:r>
               <w:rPr>
                 <w:rStyle w:val="Hipervnculo"/>
@@ -2666,7 +2666,7 @@
                 <w:noProof/>
                 <w:webHidden/>
               </w:rPr>
-              <w:instrText xml:space="preserve"> PAGEREF _Toc229424487 \h </w:instrText>
+              <w:instrText xml:space="preserve"> PAGEREF _Toc229690650 \h </w:instrText>
             </w:r>
             <w:r>
               <w:rPr>
@@ -2686,7 +2686,7 @@
                 <w:noProof/>
                 <w:webHidden/>
               </w:rPr>
-              <w:t>13</w:t>
+              <w:t>14</w:t>
             </w:r>
             <w:r>
               <w:rPr>
@@ -2712,7 +2712,7 @@
               <w14:ligatures w14:val="standardContextual"/>
             </w:rPr>
           </w:pPr>
-          <w:hyperlink w:anchor="_Toc229424488" w:history="1">
+          <w:hyperlink w:anchor="_Toc229690651" w:history="1">
             <w:r>
               <w:rPr>
                 <w:rStyle w:val="Hipervnculo"/>
@@ -2756,7 +2756,7 @@
                 <w:noProof/>
                 <w:webHidden/>
               </w:rPr>
-              <w:instrText xml:space="preserve"> PAGEREF _Toc229424488 \h </w:instrText>
+              <w:instrText xml:space="preserve"> PAGEREF _Toc229690651 \h </w:instrText>
             </w:r>
             <w:r>
               <w:rPr>
@@ -2776,7 +2776,7 @@
                 <w:noProof/>
                 <w:webHidden/>
               </w:rPr>
-              <w:t>15</w:t>
+              <w:t>16</w:t>
             </w:r>
             <w:r>
               <w:rPr>
@@ -2801,7 +2801,7 @@
               <w14:ligatures w14:val="standardContextual"/>
             </w:rPr>
           </w:pPr>
-          <w:hyperlink w:anchor="_Toc229424489" w:history="1">
+          <w:hyperlink w:anchor="_Toc229690652" w:history="1">
             <w:r>
               <w:rPr>
                 <w:rStyle w:val="Hipervnculo"/>
@@ -2828,7 +2828,7 @@
                 <w:noProof/>
                 <w:webHidden/>
               </w:rPr>
-              <w:instrText xml:space="preserve"> PAGEREF _Toc229424489 \h </w:instrText>
+              <w:instrText xml:space="preserve"> PAGEREF _Toc229690652 \h </w:instrText>
             </w:r>
             <w:r>
               <w:rPr>
@@ -2848,7 +2848,7 @@
                 <w:noProof/>
                 <w:webHidden/>
               </w:rPr>
-              <w:t>15</w:t>
+              <w:t>16</w:t>
             </w:r>
             <w:r>
               <w:rPr>
@@ -2873,7 +2873,7 @@
               <w14:ligatures w14:val="standardContextual"/>
             </w:rPr>
           </w:pPr>
-          <w:hyperlink w:anchor="_Toc229424490" w:history="1">
+          <w:hyperlink w:anchor="_Toc229690653" w:history="1">
             <w:r>
               <w:rPr>
                 <w:rStyle w:val="Hipervnculo"/>
@@ -2900,7 +2900,7 @@
                 <w:noProof/>
                 <w:webHidden/>
               </w:rPr>
-              <w:instrText xml:space="preserve"> PAGEREF _Toc229424490 \h </w:instrText>
+              <w:instrText xml:space="preserve"> PAGEREF _Toc229690653 \h </w:instrText>
             </w:r>
             <w:r>
               <w:rPr>
@@ -2920,7 +2920,7 @@
                 <w:noProof/>
                 <w:webHidden/>
               </w:rPr>
-              <w:t>16</w:t>
+              <w:t>17</w:t>
             </w:r>
             <w:r>
               <w:rPr>
@@ -2945,7 +2945,7 @@
               <w14:ligatures w14:val="standardContextual"/>
             </w:rPr>
           </w:pPr>
-          <w:hyperlink w:anchor="_Toc229424491" w:history="1">
+          <w:hyperlink w:anchor="_Toc229690654" w:history="1">
             <w:r>
               <w:rPr>
                 <w:rStyle w:val="Hipervnculo"/>
@@ -2972,7 +2972,7 @@
                 <w:noProof/>
                 <w:webHidden/>
               </w:rPr>
-              <w:instrText xml:space="preserve"> PAGEREF _Toc229424491 \h </w:instrText>
+              <w:instrText xml:space="preserve"> PAGEREF _Toc229690654 \h </w:instrText>
             </w:r>
             <w:r>
               <w:rPr>
@@ -2992,7 +2992,7 @@
                 <w:noProof/>
                 <w:webHidden/>
               </w:rPr>
-              <w:t>17</w:t>
+              <w:t>18</w:t>
             </w:r>
             <w:r>
               <w:rPr>
@@ -3017,7 +3017,7 @@
               <w14:ligatures w14:val="standardContextual"/>
             </w:rPr>
           </w:pPr>
-          <w:hyperlink w:anchor="_Toc229424492" w:history="1">
+          <w:hyperlink w:anchor="_Toc229690655" w:history="1">
             <w:r>
               <w:rPr>
                 <w:rStyle w:val="Hipervnculo"/>
@@ -3044,7 +3044,7 @@
                 <w:noProof/>
                 <w:webHidden/>
               </w:rPr>
-              <w:instrText xml:space="preserve"> PAGEREF _Toc229424492 \h </w:instrText>
+              <w:instrText xml:space="preserve"> PAGEREF _Toc229690655 \h </w:instrText>
             </w:r>
             <w:r>
               <w:rPr>
@@ -3064,7 +3064,7 @@
                 <w:noProof/>
                 <w:webHidden/>
               </w:rPr>
-              <w:t>18</w:t>
+              <w:t>19</w:t>
             </w:r>
             <w:r>
               <w:rPr>
@@ -3090,7 +3090,7 @@
               <w14:ligatures w14:val="standardContextual"/>
             </w:rPr>
           </w:pPr>
-          <w:hyperlink w:anchor="_Toc229424493" w:history="1">
+          <w:hyperlink w:anchor="_Toc229690656" w:history="1">
             <w:r>
               <w:rPr>
                 <w:rStyle w:val="Hipervnculo"/>
@@ -3134,7 +3134,7 @@
                 <w:noProof/>
                 <w:webHidden/>
               </w:rPr>
-              <w:instrText xml:space="preserve"> PAGEREF _Toc229424493 \h </w:instrText>
+              <w:instrText xml:space="preserve"> PAGEREF _Toc229690656 \h </w:instrText>
             </w:r>
             <w:r>
               <w:rPr>
@@ -3154,7 +3154,7 @@
                 <w:noProof/>
                 <w:webHidden/>
               </w:rPr>
-              <w:t>20</w:t>
+              <w:t>21</w:t>
             </w:r>
             <w:r>
               <w:rPr>
@@ -3179,7 +3179,7 @@
               <w14:ligatures w14:val="standardContextual"/>
             </w:rPr>
           </w:pPr>
-          <w:hyperlink w:anchor="_Toc229424494" w:history="1">
+          <w:hyperlink w:anchor="_Toc229690657" w:history="1">
             <w:r>
               <w:rPr>
                 <w:rStyle w:val="Hipervnculo"/>
@@ -3206,7 +3206,7 @@
                 <w:noProof/>
                 <w:webHidden/>
               </w:rPr>
-              <w:instrText xml:space="preserve"> PAGEREF _Toc229424494 \h </w:instrText>
+              <w:instrText xml:space="preserve"> PAGEREF _Toc229690657 \h </w:instrText>
             </w:r>
             <w:r>
               <w:rPr>
@@ -3226,7 +3226,7 @@
                 <w:noProof/>
                 <w:webHidden/>
               </w:rPr>
-              <w:t>20</w:t>
+              <w:t>21</w:t>
             </w:r>
             <w:r>
               <w:rPr>
@@ -3251,7 +3251,7 @@
               <w14:ligatures w14:val="standardContextual"/>
             </w:rPr>
           </w:pPr>
-          <w:hyperlink w:anchor="_Toc229424495" w:history="1">
+          <w:hyperlink w:anchor="_Toc229690658" w:history="1">
             <w:r>
               <w:rPr>
                 <w:rStyle w:val="Hipervnculo"/>
@@ -3278,7 +3278,7 @@
                 <w:noProof/>
                 <w:webHidden/>
               </w:rPr>
-              <w:instrText xml:space="preserve"> PAGEREF _Toc229424495 \h </w:instrText>
+              <w:instrText xml:space="preserve"> PAGEREF _Toc229690658 \h </w:instrText>
             </w:r>
             <w:r>
               <w:rPr>
@@ -3298,7 +3298,7 @@
                 <w:noProof/>
                 <w:webHidden/>
               </w:rPr>
-              <w:t>20</w:t>
+              <w:t>21</w:t>
             </w:r>
             <w:r>
               <w:rPr>
@@ -3323,7 +3323,7 @@
               <w14:ligatures w14:val="standardContextual"/>
             </w:rPr>
           </w:pPr>
-          <w:hyperlink w:anchor="_Toc229424496" w:history="1">
+          <w:hyperlink w:anchor="_Toc229690659" w:history="1">
             <w:r>
               <w:rPr>
                 <w:rStyle w:val="Hipervnculo"/>
@@ -3350,7 +3350,7 @@
                 <w:noProof/>
                 <w:webHidden/>
               </w:rPr>
-              <w:instrText xml:space="preserve"> PAGEREF _Toc229424496 \h </w:instrText>
+              <w:instrText xml:space="preserve"> PAGEREF _Toc229690659 \h </w:instrText>
             </w:r>
             <w:r>
               <w:rPr>
@@ -3370,7 +3370,7 @@
                 <w:noProof/>
                 <w:webHidden/>
               </w:rPr>
-              <w:t>20</w:t>
+              <w:t>21</w:t>
             </w:r>
             <w:r>
               <w:rPr>
@@ -3396,7 +3396,7 @@
               <w14:ligatures w14:val="standardContextual"/>
             </w:rPr>
           </w:pPr>
-          <w:hyperlink w:anchor="_Toc229424497" w:history="1">
+          <w:hyperlink w:anchor="_Toc229690660" w:history="1">
             <w:r>
               <w:rPr>
                 <w:rStyle w:val="Hipervnculo"/>
@@ -3440,7 +3440,7 @@
                 <w:noProof/>
                 <w:webHidden/>
               </w:rPr>
-              <w:instrText xml:space="preserve"> PAGEREF _Toc229424497 \h </w:instrText>
+              <w:instrText xml:space="preserve"> PAGEREF _Toc229690660 \h </w:instrText>
             </w:r>
             <w:r>
               <w:rPr>
@@ -3460,7 +3460,7 @@
                 <w:noProof/>
                 <w:webHidden/>
               </w:rPr>
-              <w:t>25</w:t>
+              <w:t>27</w:t>
             </w:r>
             <w:r>
               <w:rPr>
@@ -3485,7 +3485,7 @@
               <w14:ligatures w14:val="standardContextual"/>
             </w:rPr>
           </w:pPr>
-          <w:hyperlink w:anchor="_Toc229424498" w:history="1">
+          <w:hyperlink w:anchor="_Toc229690661" w:history="1">
             <w:r>
               <w:rPr>
                 <w:rStyle w:val="Hipervnculo"/>
@@ -3512,7 +3512,7 @@
                 <w:noProof/>
                 <w:webHidden/>
               </w:rPr>
-              <w:instrText xml:space="preserve"> PAGEREF _Toc229424498 \h </w:instrText>
+              <w:instrText xml:space="preserve"> PAGEREF _Toc229690661 \h </w:instrText>
             </w:r>
             <w:r>
               <w:rPr>
@@ -3532,7 +3532,7 @@
                 <w:noProof/>
                 <w:webHidden/>
               </w:rPr>
-              <w:t>25</w:t>
+              <w:t>27</w:t>
             </w:r>
             <w:r>
               <w:rPr>
@@ -3557,7 +3557,7 @@
               <w14:ligatures w14:val="standardContextual"/>
             </w:rPr>
           </w:pPr>
-          <w:hyperlink w:anchor="_Toc229424499" w:history="1">
+          <w:hyperlink w:anchor="_Toc229690662" w:history="1">
             <w:r>
               <w:rPr>
                 <w:rStyle w:val="Hipervnculo"/>
@@ -3584,7 +3584,7 @@
                 <w:noProof/>
                 <w:webHidden/>
               </w:rPr>
-              <w:instrText xml:space="preserve"> PAGEREF _Toc229424499 \h </w:instrText>
+              <w:instrText xml:space="preserve"> PAGEREF _Toc229690662 \h </w:instrText>
             </w:r>
             <w:r>
               <w:rPr>
@@ -3604,7 +3604,7 @@
                 <w:noProof/>
                 <w:webHidden/>
               </w:rPr>
-              <w:t>26</w:t>
+              <w:t>28</w:t>
             </w:r>
             <w:r>
               <w:rPr>
@@ -3629,7 +3629,7 @@
               <w14:ligatures w14:val="standardContextual"/>
             </w:rPr>
           </w:pPr>
-          <w:hyperlink w:anchor="_Toc229424500" w:history="1">
+          <w:hyperlink w:anchor="_Toc229690663" w:history="1">
             <w:r>
               <w:rPr>
                 <w:rStyle w:val="Hipervnculo"/>
@@ -3656,7 +3656,7 @@
                 <w:noProof/>
                 <w:webHidden/>
               </w:rPr>
-              <w:instrText xml:space="preserve"> PAGEREF _Toc229424500 \h </w:instrText>
+              <w:instrText xml:space="preserve"> PAGEREF _Toc229690663 \h </w:instrText>
             </w:r>
             <w:r>
               <w:rPr>
@@ -3676,7 +3676,7 @@
                 <w:noProof/>
                 <w:webHidden/>
               </w:rPr>
-              <w:t>28</w:t>
+              <w:t>30</w:t>
             </w:r>
             <w:r>
               <w:rPr>
@@ -3702,7 +3702,7 @@
               <w14:ligatures w14:val="standardContextual"/>
             </w:rPr>
           </w:pPr>
-          <w:hyperlink w:anchor="_Toc229424501" w:history="1">
+          <w:hyperlink w:anchor="_Toc229690664" w:history="1">
             <w:r>
               <w:rPr>
                 <w:rStyle w:val="Hipervnculo"/>
@@ -3746,7 +3746,7 @@
                 <w:noProof/>
                 <w:webHidden/>
               </w:rPr>
-              <w:instrText xml:space="preserve"> PAGEREF _Toc229424501 \h </w:instrText>
+              <w:instrText xml:space="preserve"> PAGEREF _Toc229690664 \h </w:instrText>
             </w:r>
             <w:r>
               <w:rPr>
@@ -3766,7 +3766,7 @@
                 <w:noProof/>
                 <w:webHidden/>
               </w:rPr>
-              <w:t>28</w:t>
+              <w:t>30</w:t>
             </w:r>
             <w:r>
               <w:rPr>
@@ -3791,7 +3791,7 @@
               <w14:ligatures w14:val="standardContextual"/>
             </w:rPr>
           </w:pPr>
-          <w:hyperlink w:anchor="_Toc229424502" w:history="1">
+          <w:hyperlink w:anchor="_Toc229690665" w:history="1">
             <w:r>
               <w:rPr>
                 <w:rStyle w:val="Hipervnculo"/>
@@ -3818,7 +3818,7 @@
                 <w:noProof/>
                 <w:webHidden/>
               </w:rPr>
-              <w:instrText xml:space="preserve"> PAGEREF _Toc229424502 \h </w:instrText>
+              <w:instrText xml:space="preserve"> PAGEREF _Toc229690665 \h </w:instrText>
             </w:r>
             <w:r>
               <w:rPr>
@@ -3838,7 +3838,7 @@
                 <w:noProof/>
                 <w:webHidden/>
               </w:rPr>
-              <w:t>28</w:t>
+              <w:t>30</w:t>
             </w:r>
             <w:r>
               <w:rPr>
@@ -3863,7 +3863,7 @@
               <w14:ligatures w14:val="standardContextual"/>
             </w:rPr>
           </w:pPr>
-          <w:hyperlink w:anchor="_Toc229424503" w:history="1">
+          <w:hyperlink w:anchor="_Toc229690666" w:history="1">
             <w:r>
               <w:rPr>
                 <w:rStyle w:val="Hipervnculo"/>
@@ -3890,7 +3890,7 @@
                 <w:noProof/>
                 <w:webHidden/>
               </w:rPr>
-              <w:instrText xml:space="preserve"> PAGEREF _Toc229424503 \h </w:instrText>
+              <w:instrText xml:space="preserve"> PAGEREF _Toc229690666 \h </w:instrText>
             </w:r>
             <w:r>
               <w:rPr>
@@ -3910,7 +3910,7 @@
                 <w:noProof/>
                 <w:webHidden/>
               </w:rPr>
-              <w:t>28</w:t>
+              <w:t>30</w:t>
             </w:r>
             <w:r>
               <w:rPr>
@@ -3936,7 +3936,7 @@
               <w14:ligatures w14:val="standardContextual"/>
             </w:rPr>
           </w:pPr>
-          <w:hyperlink w:anchor="_Toc229424504" w:history="1">
+          <w:hyperlink w:anchor="_Toc229690667" w:history="1">
             <w:r>
               <w:rPr>
                 <w:rStyle w:val="Hipervnculo"/>
@@ -3980,7 +3980,7 @@
                 <w:noProof/>
                 <w:webHidden/>
               </w:rPr>
-              <w:instrText xml:space="preserve"> PAGEREF _Toc229424504 \h </w:instrText>
+              <w:instrText xml:space="preserve"> PAGEREF _Toc229690667 \h </w:instrText>
             </w:r>
             <w:r>
               <w:rPr>
@@ -4000,7 +4000,151 @@
                 <w:noProof/>
                 <w:webHidden/>
               </w:rPr>
-              <w:t>29</w:t>
+              <w:t>31</w:t>
+            </w:r>
+            <w:r>
+              <w:rPr>
+                <w:noProof/>
+                <w:webHidden/>
+              </w:rPr>
+              <w:fldChar w:fldCharType="end"/>
+            </w:r>
+          </w:hyperlink>
+        </w:p>
+        <w:p>
+          <w:pPr>
+            <w:pStyle w:val="TDC2"/>
+            <w:tabs>
+              <w:tab w:val="right" w:leader="dot" w:pos="9016"/>
+            </w:tabs>
+            <w:rPr>
+              <w:rFonts w:eastAsiaTheme="minorEastAsia"/>
+              <w:noProof/>
+              <w:kern w:val="2"/>
+              <w:lang w:eastAsia="es-ES"/>
+              <w14:ligatures w14:val="standardContextual"/>
+            </w:rPr>
+          </w:pPr>
+          <w:hyperlink w:anchor="_Toc229690668" w:history="1">
+            <w:r>
+              <w:rPr>
+                <w:rStyle w:val="Hipervnculo"/>
+                <w:noProof/>
+              </w:rPr>
+              <w:t>Conclusiones sobre el trabajo realizado</w:t>
+            </w:r>
+            <w:r>
+              <w:rPr>
+                <w:noProof/>
+                <w:webHidden/>
+              </w:rPr>
+              <w:tab/>
+            </w:r>
+            <w:r>
+              <w:rPr>
+                <w:noProof/>
+                <w:webHidden/>
+              </w:rPr>
+              <w:fldChar w:fldCharType="begin"/>
+            </w:r>
+            <w:r>
+              <w:rPr>
+                <w:noProof/>
+                <w:webHidden/>
+              </w:rPr>
+              <w:instrText xml:space="preserve"> PAGEREF _Toc229690668 \h </w:instrText>
+            </w:r>
+            <w:r>
+              <w:rPr>
+                <w:noProof/>
+                <w:webHidden/>
+              </w:rPr>
+            </w:r>
+            <w:r>
+              <w:rPr>
+                <w:noProof/>
+                <w:webHidden/>
+              </w:rPr>
+              <w:fldChar w:fldCharType="separate"/>
+            </w:r>
+            <w:r>
+              <w:rPr>
+                <w:noProof/>
+                <w:webHidden/>
+              </w:rPr>
+              <w:t>31</w:t>
+            </w:r>
+            <w:r>
+              <w:rPr>
+                <w:noProof/>
+                <w:webHidden/>
+              </w:rPr>
+              <w:fldChar w:fldCharType="end"/>
+            </w:r>
+          </w:hyperlink>
+        </w:p>
+        <w:p>
+          <w:pPr>
+            <w:pStyle w:val="TDC2"/>
+            <w:tabs>
+              <w:tab w:val="right" w:leader="dot" w:pos="9016"/>
+            </w:tabs>
+            <w:rPr>
+              <w:rFonts w:eastAsiaTheme="minorEastAsia"/>
+              <w:noProof/>
+              <w:kern w:val="2"/>
+              <w:lang w:eastAsia="es-ES"/>
+              <w14:ligatures w14:val="standardContextual"/>
+            </w:rPr>
+          </w:pPr>
+          <w:hyperlink w:anchor="_Toc229690669" w:history="1">
+            <w:r>
+              <w:rPr>
+                <w:rStyle w:val="Hipervnculo"/>
+                <w:noProof/>
+              </w:rPr>
+              <w:t>Posibles ampliaciones y mejoras</w:t>
+            </w:r>
+            <w:r>
+              <w:rPr>
+                <w:noProof/>
+                <w:webHidden/>
+              </w:rPr>
+              <w:tab/>
+            </w:r>
+            <w:r>
+              <w:rPr>
+                <w:noProof/>
+                <w:webHidden/>
+              </w:rPr>
+              <w:fldChar w:fldCharType="begin"/>
+            </w:r>
+            <w:r>
+              <w:rPr>
+                <w:noProof/>
+                <w:webHidden/>
+              </w:rPr>
+              <w:instrText xml:space="preserve"> PAGEREF _Toc229690669 \h </w:instrText>
+            </w:r>
+            <w:r>
+              <w:rPr>
+                <w:noProof/>
+                <w:webHidden/>
+              </w:rPr>
+            </w:r>
+            <w:r>
+              <w:rPr>
+                <w:noProof/>
+                <w:webHidden/>
+              </w:rPr>
+              <w:fldChar w:fldCharType="separate"/>
+            </w:r>
+            <w:r>
+              <w:rPr>
+                <w:noProof/>
+                <w:webHidden/>
+              </w:rPr>
+              <w:t>31</w:t>
             </w:r>
             <w:r>
               <w:rPr>
@@ -4026,7 +4170,7 @@
               <w14:ligatures w14:val="standardContextual"/>
             </w:rPr>
           </w:pPr>
-          <w:hyperlink w:anchor="_Toc229424505" w:history="1">
+          <w:hyperlink w:anchor="_Toc229690670" w:history="1">
             <w:r>
               <w:rPr>
                 <w:rStyle w:val="Hipervnculo"/>
@@ -4070,7 +4214,7 @@
                 <w:noProof/>
                 <w:webHidden/>
               </w:rPr>
-              <w:instrText xml:space="preserve"> PAGEREF _Toc229424505 \h </w:instrText>
+              <w:instrText xml:space="preserve"> PAGEREF _Toc229690670 \h </w:instrText>
             </w:r>
             <w:r>
               <w:rPr>
@@ -4090,7 +4234,7 @@
                 <w:noProof/>
                 <w:webHidden/>
               </w:rPr>
-              <w:t>29</w:t>
+              <w:t>32</w:t>
             </w:r>
             <w:r>
               <w:rPr>
@@ -4115,7 +4259,7 @@
               <w14:ligatures w14:val="standardContextual"/>
             </w:rPr>
           </w:pPr>
-          <w:hyperlink w:anchor="_Toc229424506" w:history="1">
+          <w:hyperlink w:anchor="_Toc229690671" w:history="1">
             <w:r>
               <w:rPr>
                 <w:rStyle w:val="Hipervnculo"/>
@@ -4142,7 +4286,7 @@
                 <w:noProof/>
                 <w:webHidden/>
               </w:rPr>
-              <w:instrText xml:space="preserve"> PAGEREF _Toc229424506 \h </w:instrText>
+              <w:instrText xml:space="preserve"> PAGEREF _Toc229690671 \h </w:instrText>
             </w:r>
             <w:r>
               <w:rPr>
@@ -4162,7 +4306,7 @@
                 <w:noProof/>
                 <w:webHidden/>
               </w:rPr>
-              <w:t>29</w:t>
+              <w:t>32</w:t>
             </w:r>
             <w:r>
               <w:rPr>
@@ -4187,7 +4331,7 @@
               <w14:ligatures w14:val="standardContextual"/>
             </w:rPr>
           </w:pPr>
-          <w:hyperlink w:anchor="_Toc229424507" w:history="1">
+          <w:hyperlink w:anchor="_Toc229690672" w:history="1">
             <w:r>
               <w:rPr>
                 <w:rStyle w:val="Hipervnculo"/>
@@ -4214,7 +4358,7 @@
                 <w:noProof/>
                 <w:webHidden/>
               </w:rPr>
-              <w:instrText xml:space="preserve"> PAGEREF _Toc229424507 \h </w:instrText>
+              <w:instrText xml:space="preserve"> PAGEREF _Toc229690672 \h </w:instrText>
             </w:r>
             <w:r>
               <w:rPr>
@@ -4234,7 +4378,7 @@
                 <w:noProof/>
                 <w:webHidden/>
               </w:rPr>
-              <w:t>29</w:t>
+              <w:t>32</w:t>
             </w:r>
             <w:r>
               <w:rPr>
@@ -4259,7 +4403,7 @@
               <w14:ligatures w14:val="standardContextual"/>
             </w:rPr>
           </w:pPr>
-          <w:hyperlink w:anchor="_Toc229424508" w:history="1">
+          <w:hyperlink w:anchor="_Toc229690673" w:history="1">
             <w:r>
               <w:rPr>
                 <w:rStyle w:val="Hipervnculo"/>
@@ -4286,7 +4430,7 @@
                 <w:noProof/>
                 <w:webHidden/>
               </w:rPr>
-              <w:instrText xml:space="preserve"> PAGEREF _Toc229424508 \h </w:instrText>
+              <w:instrText xml:space="preserve"> PAGEREF _Toc229690673 \h </w:instrText>
             </w:r>
             <w:r>
               <w:rPr>
@@ -4306,7 +4450,7 @@
                 <w:noProof/>
                 <w:webHidden/>
               </w:rPr>
-              <w:t>29</w:t>
+              <w:t>32</w:t>
             </w:r>
             <w:r>
               <w:rPr>
@@ -4332,7 +4476,7 @@
               <w14:ligatures w14:val="standardContextual"/>
             </w:rPr>
           </w:pPr>
-          <w:hyperlink w:anchor="_Toc229424509" w:history="1">
+          <w:hyperlink w:anchor="_Toc229690674" w:history="1">
             <w:r>
               <w:rPr>
                 <w:rStyle w:val="Hipervnculo"/>
@@ -4376,7 +4520,7 @@
                 <w:noProof/>
                 <w:webHidden/>
               </w:rPr>
-              <w:instrText xml:space="preserve"> PAGEREF _Toc229424509 \h </w:instrText>
+              <w:instrText xml:space="preserve"> PAGEREF _Toc229690674 \h </w:instrText>
             </w:r>
             <w:r>
               <w:rPr>
@@ -4396,7 +4540,7 @@
                 <w:noProof/>
                 <w:webHidden/>
               </w:rPr>
-              <w:t>31</w:t>
+              <w:t>34</w:t>
             </w:r>
             <w:r>
               <w:rPr>
@@ -4421,7 +4565,7 @@
               <w14:ligatures w14:val="standardContextual"/>
             </w:rPr>
           </w:pPr>
-          <w:hyperlink w:anchor="_Toc229424510" w:history="1">
+          <w:hyperlink w:anchor="_Toc229690675" w:history="1">
             <w:r>
               <w:rPr>
                 <w:rStyle w:val="Hipervnculo"/>
@@ -4448,7 +4592,7 @@
                 <w:noProof/>
                 <w:webHidden/>
               </w:rPr>
-              <w:instrText xml:space="preserve"> PAGEREF _Toc229424510 \h </w:instrText>
+              <w:instrText xml:space="preserve"> PAGEREF _Toc229690675 \h </w:instrText>
             </w:r>
             <w:r>
               <w:rPr>
@@ -4468,7 +4612,7 @@
                 <w:noProof/>
                 <w:webHidden/>
               </w:rPr>
-              <w:t>31</w:t>
+              <w:t>34</w:t>
             </w:r>
             <w:r>
               <w:rPr>
@@ -4493,7 +4637,7 @@
               <w14:ligatures w14:val="standardContextual"/>
             </w:rPr>
           </w:pPr>
-          <w:hyperlink w:anchor="_Toc229424511" w:history="1">
+          <w:hyperlink w:anchor="_Toc229690676" w:history="1">
             <w:r>
               <w:rPr>
                 <w:rStyle w:val="Hipervnculo"/>
@@ -4520,7 +4664,7 @@
                 <w:noProof/>
                 <w:webHidden/>
               </w:rPr>
-              <w:instrText xml:space="preserve"> PAGEREF _Toc229424511 \h </w:instrText>
+              <w:instrText xml:space="preserve"> PAGEREF _Toc229690676 \h </w:instrText>
             </w:r>
             <w:r>
               <w:rPr>
@@ -4540,7 +4684,7 @@
                 <w:noProof/>
                 <w:webHidden/>
               </w:rPr>
-              <w:t>31</w:t>
+              <w:t>34</w:t>
             </w:r>
             <w:r>
               <w:rPr>
@@ -4565,7 +4709,7 @@
               <w14:ligatures w14:val="standardContextual"/>
             </w:rPr>
           </w:pPr>
-          <w:hyperlink w:anchor="_Toc229424512" w:history="1">
+          <w:hyperlink w:anchor="_Toc229690677" w:history="1">
             <w:r>
               <w:rPr>
                 <w:rStyle w:val="Hipervnculo"/>
@@ -4592,7 +4736,7 @@
                 <w:noProof/>
                 <w:webHidden/>
               </w:rPr>
-              <w:instrText xml:space="preserve"> PAGEREF _Toc229424512 \h </w:instrText>
+              <w:instrText xml:space="preserve"> PAGEREF _Toc229690677 \h </w:instrText>
             </w:r>
             <w:r>
               <w:rPr>
@@ -4612,7 +4756,7 @@
                 <w:noProof/>
                 <w:webHidden/>
               </w:rPr>
-              <w:t>32</w:t>
+              <w:t>35</w:t>
             </w:r>
             <w:r>
               <w:rPr>
@@ -4638,7 +4782,7 @@
               <w14:ligatures w14:val="standardContextual"/>
             </w:rPr>
           </w:pPr>
-          <w:hyperlink w:anchor="_Toc229424513" w:history="1">
+          <w:hyperlink w:anchor="_Toc229690678" w:history="1">
             <w:r>
               <w:rPr>
                 <w:rStyle w:val="Hipervnculo"/>
@@ -4682,7 +4826,7 @@
                 <w:noProof/>
                 <w:webHidden/>
               </w:rPr>
-              <w:instrText xml:space="preserve"> PAGEREF _Toc229424513 \h </w:instrText>
+              <w:instrText xml:space="preserve"> PAGEREF _Toc229690678 \h </w:instrText>
             </w:r>
             <w:r>
               <w:rPr>
@@ -4702,7 +4846,7 @@
                 <w:noProof/>
                 <w:webHidden/>
               </w:rPr>
-              <w:t>33</w:t>
+              <w:t>36</w:t>
             </w:r>
             <w:r>
               <w:rPr>
@@ -4770,7 +4914,7 @@
       <w:r>
         <w:fldChar w:fldCharType="separate"/>
       </w:r>
-      <w:hyperlink w:anchor="_Toc229424514" w:history="1">
+      <w:hyperlink w:anchor="_Toc229690679" w:history="1">
         <w:r>
           <w:rPr>
             <w:rStyle w:val="Hipervnculo"/>
@@ -4797,79 +4941,7 @@
             <w:noProof/>
             <w:webHidden/>
           </w:rPr>
-          <w:instrText xml:space="preserve"> PAGEREF _Toc229424514 \h </w:instrText>
-        </w:r>
-        <w:r>
-          <w:rPr>
-            <w:noProof/>
-            <w:webHidden/>
-          </w:rPr>
-        </w:r>
-        <w:r>
-          <w:rPr>
-            <w:noProof/>
-            <w:webHidden/>
-          </w:rPr>
-          <w:fldChar w:fldCharType="separate"/>
-        </w:r>
-        <w:r>
-          <w:rPr>
-            <w:noProof/>
-            <w:webHidden/>
-          </w:rPr>
-          <w:t>9</w:t>
-        </w:r>
-        <w:r>
-          <w:rPr>
-            <w:noProof/>
-            <w:webHidden/>
-          </w:rPr>
-          <w:fldChar w:fldCharType="end"/>
-        </w:r>
-      </w:hyperlink>
-    </w:p>
-    <w:p>
-      <w:pPr>
-        <w:pStyle w:val="Tabladeilustraciones"/>
-        <w:tabs>
-          <w:tab w:val="right" w:leader="dot" w:pos="9016"/>
-        </w:tabs>
-        <w:rPr>
-          <w:rFonts w:eastAsiaTheme="minorEastAsia"/>
-          <w:noProof/>
-          <w:kern w:val="2"/>
-          <w:lang w:eastAsia="es-ES"/>
-          <w14:ligatures w14:val="standardContextual"/>
-        </w:rPr>
-      </w:pPr>
-      <w:hyperlink w:anchor="_Toc229424515" w:history="1">
-        <w:r>
-          <w:rPr>
-            <w:rStyle w:val="Hipervnculo"/>
-            <w:noProof/>
-          </w:rPr>
-          <w:t>2-Diagrama de casos de uso</w:t>
-        </w:r>
-        <w:r>
-          <w:rPr>
-            <w:noProof/>
-            <w:webHidden/>
-          </w:rPr>
-          <w:tab/>
-        </w:r>
-        <w:r>
-          <w:rPr>
-            <w:noProof/>
-            <w:webHidden/>
-          </w:rPr>
-          <w:fldChar w:fldCharType="begin"/>
-        </w:r>
-        <w:r>
-          <w:rPr>
-            <w:noProof/>
-            <w:webHidden/>
-          </w:rPr>
-          <w:instrText xml:space="preserve"> PAGEREF _Toc229424515 \h </w:instrText>
+          <w:instrText xml:space="preserve"> PAGEREF _Toc229690679 \h </w:instrText>
         </w:r>
         <w:r>
           <w:rPr>
@@ -4914,13 +4986,13 @@
           <w14:ligatures w14:val="standardContextual"/>
         </w:rPr>
       </w:pPr>
-      <w:hyperlink w:anchor="_Toc229424516" w:history="1">
+      <w:hyperlink w:anchor="_Toc229690680" w:history="1">
         <w:r>
           <w:rPr>
             <w:rStyle w:val="Hipervnculo"/>
             <w:noProof/>
           </w:rPr>
-          <w:t>3- Diagrama de clases</w:t>
+          <w:t>2-Diagrama de casos de uso</w:t>
         </w:r>
         <w:r>
           <w:rPr>
@@ -4941,7 +5013,7 @@
             <w:noProof/>
             <w:webHidden/>
           </w:rPr>
-          <w:instrText xml:space="preserve"> PAGEREF _Toc229424516 \h </w:instrText>
+          <w:instrText xml:space="preserve"> PAGEREF _Toc229690680 \h </w:instrText>
         </w:r>
         <w:r>
           <w:rPr>
@@ -4986,13 +5058,13 @@
           <w14:ligatures w14:val="standardContextual"/>
         </w:rPr>
       </w:pPr>
-      <w:hyperlink w:anchor="_Toc229424517" w:history="1">
+      <w:hyperlink w:anchor="_Toc229690681" w:history="1">
         <w:r>
           <w:rPr>
             <w:rStyle w:val="Hipervnculo"/>
             <w:noProof/>
           </w:rPr>
-          <w:t>4 Diagrama entidad-relación</w:t>
+          <w:t>3- Diagrama de clases</w:t>
         </w:r>
         <w:r>
           <w:rPr>
@@ -5013,7 +5085,7 @@
             <w:noProof/>
             <w:webHidden/>
           </w:rPr>
-          <w:instrText xml:space="preserve"> PAGEREF _Toc229424517 \h </w:instrText>
+          <w:instrText xml:space="preserve"> PAGEREF _Toc229690681 \h </w:instrText>
         </w:r>
         <w:r>
           <w:rPr>
@@ -5058,7 +5130,79 @@
           <w14:ligatures w14:val="standardContextual"/>
         </w:rPr>
       </w:pPr>
-      <w:hyperlink w:anchor="_Toc229424518" w:history="1">
+      <w:hyperlink w:anchor="_Toc229690682" w:history="1">
+        <w:r>
+          <w:rPr>
+            <w:rStyle w:val="Hipervnculo"/>
+            <w:noProof/>
+          </w:rPr>
+          <w:t>4 Diagrama entidad-relación</w:t>
+        </w:r>
+        <w:r>
+          <w:rPr>
+            <w:noProof/>
+            <w:webHidden/>
+          </w:rPr>
+          <w:tab/>
+        </w:r>
+        <w:r>
+          <w:rPr>
+            <w:noProof/>
+            <w:webHidden/>
+          </w:rPr>
+          <w:fldChar w:fldCharType="begin"/>
+        </w:r>
+        <w:r>
+          <w:rPr>
+            <w:noProof/>
+            <w:webHidden/>
+          </w:rPr>
+          <w:instrText xml:space="preserve"> PAGEREF _Toc229690682 \h </w:instrText>
+        </w:r>
+        <w:r>
+          <w:rPr>
+            <w:noProof/>
+            <w:webHidden/>
+          </w:rPr>
+        </w:r>
+        <w:r>
+          <w:rPr>
+            <w:noProof/>
+            <w:webHidden/>
+          </w:rPr>
+          <w:fldChar w:fldCharType="separate"/>
+        </w:r>
+        <w:r>
+          <w:rPr>
+            <w:noProof/>
+            <w:webHidden/>
+          </w:rPr>
+          <w:t>13</w:t>
+        </w:r>
+        <w:r>
+          <w:rPr>
+            <w:noProof/>
+            <w:webHidden/>
+          </w:rPr>
+          <w:fldChar w:fldCharType="end"/>
+        </w:r>
+      </w:hyperlink>
+    </w:p>
+    <w:p>
+      <w:pPr>
+        <w:pStyle w:val="Tabladeilustraciones"/>
+        <w:tabs>
+          <w:tab w:val="right" w:leader="dot" w:pos="9016"/>
+        </w:tabs>
+        <w:rPr>
+          <w:rFonts w:eastAsiaTheme="minorEastAsia"/>
+          <w:noProof/>
+          <w:kern w:val="2"/>
+          <w:lang w:eastAsia="es-ES"/>
+          <w14:ligatures w14:val="standardContextual"/>
+        </w:rPr>
+      </w:pPr>
+      <w:hyperlink w:anchor="_Toc229690683" w:history="1">
         <w:r>
           <w:rPr>
             <w:rStyle w:val="Hipervnculo"/>
@@ -5085,151 +5229,7 @@
             <w:noProof/>
             <w:webHidden/>
           </w:rPr>
-          <w:instrText xml:space="preserve"> PAGEREF _Toc229424518 \h </w:instrText>
-        </w:r>
-        <w:r>
-          <w:rPr>
-            <w:noProof/>
-            <w:webHidden/>
-          </w:rPr>
-        </w:r>
-        <w:r>
-          <w:rPr>
-            <w:noProof/>
-            <w:webHidden/>
-          </w:rPr>
-          <w:fldChar w:fldCharType="separate"/>
-        </w:r>
-        <w:r>
-          <w:rPr>
-            <w:noProof/>
-            <w:webHidden/>
-          </w:rPr>
-          <w:t>17</w:t>
-        </w:r>
-        <w:r>
-          <w:rPr>
-            <w:noProof/>
-            <w:webHidden/>
-          </w:rPr>
-          <w:fldChar w:fldCharType="end"/>
-        </w:r>
-      </w:hyperlink>
-    </w:p>
-    <w:p>
-      <w:pPr>
-        <w:pStyle w:val="Tabladeilustraciones"/>
-        <w:tabs>
-          <w:tab w:val="right" w:leader="dot" w:pos="9016"/>
-        </w:tabs>
-        <w:rPr>
-          <w:rFonts w:eastAsiaTheme="minorEastAsia"/>
-          <w:noProof/>
-          <w:kern w:val="2"/>
-          <w:lang w:eastAsia="es-ES"/>
-          <w14:ligatures w14:val="standardContextual"/>
-        </w:rPr>
-      </w:pPr>
-      <w:hyperlink w:anchor="_Toc229424519" w:history="1">
-        <w:r>
-          <w:rPr>
-            <w:rStyle w:val="Hipervnculo"/>
-            <w:noProof/>
-          </w:rPr>
-          <w:t>6- Tablero Trello Hito 2 2/2</w:t>
-        </w:r>
-        <w:r>
-          <w:rPr>
-            <w:noProof/>
-            <w:webHidden/>
-          </w:rPr>
-          <w:tab/>
-        </w:r>
-        <w:r>
-          <w:rPr>
-            <w:noProof/>
-            <w:webHidden/>
-          </w:rPr>
-          <w:fldChar w:fldCharType="begin"/>
-        </w:r>
-        <w:r>
-          <w:rPr>
-            <w:noProof/>
-            <w:webHidden/>
-          </w:rPr>
-          <w:instrText xml:space="preserve"> PAGEREF _Toc229424519 \h </w:instrText>
-        </w:r>
-        <w:r>
-          <w:rPr>
-            <w:noProof/>
-            <w:webHidden/>
-          </w:rPr>
-        </w:r>
-        <w:r>
-          <w:rPr>
-            <w:noProof/>
-            <w:webHidden/>
-          </w:rPr>
-          <w:fldChar w:fldCharType="separate"/>
-        </w:r>
-        <w:r>
-          <w:rPr>
-            <w:noProof/>
-            <w:webHidden/>
-          </w:rPr>
-          <w:t>17</w:t>
-        </w:r>
-        <w:r>
-          <w:rPr>
-            <w:noProof/>
-            <w:webHidden/>
-          </w:rPr>
-          <w:fldChar w:fldCharType="end"/>
-        </w:r>
-      </w:hyperlink>
-    </w:p>
-    <w:p>
-      <w:pPr>
-        <w:pStyle w:val="Tabladeilustraciones"/>
-        <w:tabs>
-          <w:tab w:val="right" w:leader="dot" w:pos="9016"/>
-        </w:tabs>
-        <w:rPr>
-          <w:rFonts w:eastAsiaTheme="minorEastAsia"/>
-          <w:noProof/>
-          <w:kern w:val="2"/>
-          <w:lang w:eastAsia="es-ES"/>
-          <w14:ligatures w14:val="standardContextual"/>
-        </w:rPr>
-      </w:pPr>
-      <w:hyperlink w:anchor="_Toc229424520" w:history="1">
-        <w:r>
-          <w:rPr>
-            <w:rStyle w:val="Hipervnculo"/>
-            <w:noProof/>
-          </w:rPr>
-          <w:t>7- Planificación de Tareas</w:t>
-        </w:r>
-        <w:r>
-          <w:rPr>
-            <w:noProof/>
-            <w:webHidden/>
-          </w:rPr>
-          <w:tab/>
-        </w:r>
-        <w:r>
-          <w:rPr>
-            <w:noProof/>
-            <w:webHidden/>
-          </w:rPr>
-          <w:fldChar w:fldCharType="begin"/>
-        </w:r>
-        <w:r>
-          <w:rPr>
-            <w:noProof/>
-            <w:webHidden/>
-          </w:rPr>
-          <w:instrText xml:space="preserve"> PAGEREF _Toc229424520 \h </w:instrText>
+          <w:instrText xml:space="preserve"> PAGEREF _Toc229690683 \h </w:instrText>
         </w:r>
         <w:r>
           <w:rPr>
@@ -5274,13 +5274,13 @@
           <w14:ligatures w14:val="standardContextual"/>
         </w:rPr>
       </w:pPr>
-      <w:hyperlink w:anchor="_Toc229424521" w:history="1">
+      <w:hyperlink w:anchor="_Toc229690684" w:history="1">
         <w:r>
           <w:rPr>
             <w:rStyle w:val="Hipervnculo"/>
             <w:noProof/>
           </w:rPr>
-          <w:t>8- Roles de equipo</w:t>
+          <w:t>6- Tablero Trello Hito 2 2/2</w:t>
         </w:r>
         <w:r>
           <w:rPr>
@@ -5301,7 +5301,79 @@
             <w:noProof/>
             <w:webHidden/>
           </w:rPr>
-          <w:instrText xml:space="preserve"> PAGEREF _Toc229424521 \h </w:instrText>
+          <w:instrText xml:space="preserve"> PAGEREF _Toc229690684 \h </w:instrText>
+        </w:r>
+        <w:r>
+          <w:rPr>
+            <w:noProof/>
+            <w:webHidden/>
+          </w:rPr>
+        </w:r>
+        <w:r>
+          <w:rPr>
+            <w:noProof/>
+            <w:webHidden/>
+          </w:rPr>
+          <w:fldChar w:fldCharType="separate"/>
+        </w:r>
+        <w:r>
+          <w:rPr>
+            <w:noProof/>
+            <w:webHidden/>
+          </w:rPr>
+          <w:t>18</w:t>
+        </w:r>
+        <w:r>
+          <w:rPr>
+            <w:noProof/>
+            <w:webHidden/>
+          </w:rPr>
+          <w:fldChar w:fldCharType="end"/>
+        </w:r>
+      </w:hyperlink>
+    </w:p>
+    <w:p>
+      <w:pPr>
+        <w:pStyle w:val="Tabladeilustraciones"/>
+        <w:tabs>
+          <w:tab w:val="right" w:leader="dot" w:pos="9016"/>
+        </w:tabs>
+        <w:rPr>
+          <w:rFonts w:eastAsiaTheme="minorEastAsia"/>
+          <w:noProof/>
+          <w:kern w:val="2"/>
+          <w:lang w:eastAsia="es-ES"/>
+          <w14:ligatures w14:val="standardContextual"/>
+        </w:rPr>
+      </w:pPr>
+      <w:hyperlink w:anchor="_Toc229690685" w:history="1">
+        <w:r>
+          <w:rPr>
+            <w:rStyle w:val="Hipervnculo"/>
+            <w:noProof/>
+          </w:rPr>
+          <w:t>7- Planificación de Tareas</w:t>
+        </w:r>
+        <w:r>
+          <w:rPr>
+            <w:noProof/>
+            <w:webHidden/>
+          </w:rPr>
+          <w:tab/>
+        </w:r>
+        <w:r>
+          <w:rPr>
+            <w:noProof/>
+            <w:webHidden/>
+          </w:rPr>
+          <w:fldChar w:fldCharType="begin"/>
+        </w:r>
+        <w:r>
+          <w:rPr>
+            <w:noProof/>
+            <w:webHidden/>
+          </w:rPr>
+          <w:instrText xml:space="preserve"> PAGEREF _Toc229690685 \h </w:instrText>
         </w:r>
         <w:r>
           <w:rPr>
@@ -5346,7 +5418,79 @@
           <w14:ligatures w14:val="standardContextual"/>
         </w:rPr>
       </w:pPr>
-      <w:hyperlink w:anchor="_Toc229424522" w:history="1">
+      <w:hyperlink w:anchor="_Toc229690686" w:history="1">
+        <w:r>
+          <w:rPr>
+            <w:rStyle w:val="Hipervnculo"/>
+            <w:noProof/>
+          </w:rPr>
+          <w:t>8- Roles de equipo</w:t>
+        </w:r>
+        <w:r>
+          <w:rPr>
+            <w:noProof/>
+            <w:webHidden/>
+          </w:rPr>
+          <w:tab/>
+        </w:r>
+        <w:r>
+          <w:rPr>
+            <w:noProof/>
+            <w:webHidden/>
+          </w:rPr>
+          <w:fldChar w:fldCharType="begin"/>
+        </w:r>
+        <w:r>
+          <w:rPr>
+            <w:noProof/>
+            <w:webHidden/>
+          </w:rPr>
+          <w:instrText xml:space="preserve"> PAGEREF _Toc229690686 \h </w:instrText>
+        </w:r>
+        <w:r>
+          <w:rPr>
+            <w:noProof/>
+            <w:webHidden/>
+          </w:rPr>
+        </w:r>
+        <w:r>
+          <w:rPr>
+            <w:noProof/>
+            <w:webHidden/>
+          </w:rPr>
+          <w:fldChar w:fldCharType="separate"/>
+        </w:r>
+        <w:r>
+          <w:rPr>
+            <w:noProof/>
+            <w:webHidden/>
+          </w:rPr>
+          <w:t>20</w:t>
+        </w:r>
+        <w:r>
+          <w:rPr>
+            <w:noProof/>
+            <w:webHidden/>
+          </w:rPr>
+          <w:fldChar w:fldCharType="end"/>
+        </w:r>
+      </w:hyperlink>
+    </w:p>
+    <w:p>
+      <w:pPr>
+        <w:pStyle w:val="Tabladeilustraciones"/>
+        <w:tabs>
+          <w:tab w:val="right" w:leader="dot" w:pos="9016"/>
+        </w:tabs>
+        <w:rPr>
+          <w:rFonts w:eastAsiaTheme="minorEastAsia"/>
+          <w:noProof/>
+          <w:kern w:val="2"/>
+          <w:lang w:eastAsia="es-ES"/>
+          <w14:ligatures w14:val="standardContextual"/>
+        </w:rPr>
+      </w:pPr>
+      <w:hyperlink w:anchor="_Toc229690687" w:history="1">
         <w:r>
           <w:rPr>
             <w:rStyle w:val="Hipervnculo"/>
@@ -5373,7 +5517,7 @@
             <w:noProof/>
             <w:webHidden/>
           </w:rPr>
-          <w:instrText xml:space="preserve"> PAGEREF _Toc229424522 \h </w:instrText>
+          <w:instrText xml:space="preserve"> PAGEREF _Toc229690687 \h </w:instrText>
         </w:r>
         <w:r>
           <w:rPr>
@@ -5393,7 +5537,7 @@
             <w:noProof/>
             <w:webHidden/>
           </w:rPr>
-          <w:t>21</w:t>
+          <w:t>22</w:t>
         </w:r>
         <w:r>
           <w:rPr>
@@ -5418,7 +5562,7 @@
           <w14:ligatures w14:val="standardContextual"/>
         </w:rPr>
       </w:pPr>
-      <w:hyperlink w:anchor="_Toc229424523" w:history="1">
+      <w:hyperlink w:anchor="_Toc229690688" w:history="1">
         <w:r>
           <w:rPr>
             <w:rStyle w:val="Hipervnculo"/>
@@ -5445,7 +5589,7 @@
             <w:noProof/>
             <w:webHidden/>
           </w:rPr>
-          <w:instrText xml:space="preserve"> PAGEREF _Toc229424523 \h </w:instrText>
+          <w:instrText xml:space="preserve"> PAGEREF _Toc229690688 \h </w:instrText>
         </w:r>
         <w:r>
           <w:rPr>
@@ -5465,7 +5609,7 @@
             <w:noProof/>
             <w:webHidden/>
           </w:rPr>
-          <w:t>21</w:t>
+          <w:t>22</w:t>
         </w:r>
         <w:r>
           <w:rPr>
@@ -5490,7 +5634,7 @@
           <w14:ligatures w14:val="standardContextual"/>
         </w:rPr>
       </w:pPr>
-      <w:hyperlink w:anchor="_Toc229424524" w:history="1">
+      <w:hyperlink w:anchor="_Toc229690689" w:history="1">
         <w:r>
           <w:rPr>
             <w:rStyle w:val="Hipervnculo"/>
@@ -5517,7 +5661,7 @@
             <w:noProof/>
             <w:webHidden/>
           </w:rPr>
-          <w:instrText xml:space="preserve"> PAGEREF _Toc229424524 \h </w:instrText>
+          <w:instrText xml:space="preserve"> PAGEREF _Toc229690689 \h </w:instrText>
         </w:r>
         <w:r>
           <w:rPr>
@@ -5537,7 +5681,7 @@
             <w:noProof/>
             <w:webHidden/>
           </w:rPr>
-          <w:t>21</w:t>
+          <w:t>22</w:t>
         </w:r>
         <w:r>
           <w:rPr>
@@ -5562,7 +5706,7 @@
           <w14:ligatures w14:val="standardContextual"/>
         </w:rPr>
       </w:pPr>
-      <w:hyperlink w:anchor="_Toc229424525" w:history="1">
+      <w:hyperlink w:anchor="_Toc229690690" w:history="1">
         <w:r>
           <w:rPr>
             <w:rStyle w:val="Hipervnculo"/>
@@ -5598,79 +5742,7 @@
             <w:noProof/>
             <w:webHidden/>
           </w:rPr>
-          <w:instrText xml:space="preserve"> PAGEREF _Toc229424525 \h </w:instrText>
-        </w:r>
-        <w:r>
-          <w:rPr>
-            <w:noProof/>
-            <w:webHidden/>
-          </w:rPr>
-        </w:r>
-        <w:r>
-          <w:rPr>
-            <w:noProof/>
-            <w:webHidden/>
-          </w:rPr>
-          <w:fldChar w:fldCharType="separate"/>
-        </w:r>
-        <w:r>
-          <w:rPr>
-            <w:noProof/>
-            <w:webHidden/>
-          </w:rPr>
-          <w:t>22</w:t>
-        </w:r>
-        <w:r>
-          <w:rPr>
-            <w:noProof/>
-            <w:webHidden/>
-          </w:rPr>
-          <w:fldChar w:fldCharType="end"/>
-        </w:r>
-      </w:hyperlink>
-    </w:p>
-    <w:p>
-      <w:pPr>
-        <w:pStyle w:val="Tabladeilustraciones"/>
-        <w:tabs>
-          <w:tab w:val="right" w:leader="dot" w:pos="9016"/>
-        </w:tabs>
-        <w:rPr>
-          <w:rFonts w:eastAsiaTheme="minorEastAsia"/>
-          <w:noProof/>
-          <w:kern w:val="2"/>
-          <w:lang w:eastAsia="es-ES"/>
-          <w14:ligatures w14:val="standardContextual"/>
-        </w:rPr>
-      </w:pPr>
-      <w:hyperlink w:anchor="_Toc229424526" w:history="1">
-        <w:r>
-          <w:rPr>
-            <w:rStyle w:val="Hipervnculo"/>
-            <w:noProof/>
-          </w:rPr>
-          <w:t>13 Método conexión a BD</w:t>
-        </w:r>
-        <w:r>
-          <w:rPr>
-            <w:noProof/>
-            <w:webHidden/>
-          </w:rPr>
-          <w:tab/>
-        </w:r>
-        <w:r>
-          <w:rPr>
-            <w:noProof/>
-            <w:webHidden/>
-          </w:rPr>
-          <w:fldChar w:fldCharType="begin"/>
-        </w:r>
-        <w:r>
-          <w:rPr>
-            <w:noProof/>
-            <w:webHidden/>
-          </w:rPr>
-          <w:instrText xml:space="preserve"> PAGEREF _Toc229424526 \h </w:instrText>
+          <w:instrText xml:space="preserve"> PAGEREF _Toc229690690 \h </w:instrText>
         </w:r>
         <w:r>
           <w:rPr>
@@ -5715,13 +5787,13 @@
           <w14:ligatures w14:val="standardContextual"/>
         </w:rPr>
       </w:pPr>
-      <w:hyperlink w:anchor="_Toc229424527" w:history="1">
+      <w:hyperlink w:anchor="_Toc229690691" w:history="1">
         <w:r>
           <w:rPr>
             <w:rStyle w:val="Hipervnculo"/>
             <w:noProof/>
           </w:rPr>
-          <w:t>14  Reconocimiento facial 2/3</w:t>
+          <w:t>13 Método conexión a BD</w:t>
         </w:r>
         <w:r>
           <w:rPr>
@@ -5742,7 +5814,7 @@
             <w:noProof/>
             <w:webHidden/>
           </w:rPr>
-          <w:instrText xml:space="preserve"> PAGEREF _Toc229424527 \h </w:instrText>
+          <w:instrText xml:space="preserve"> PAGEREF _Toc229690691 \h </w:instrText>
         </w:r>
         <w:r>
           <w:rPr>
@@ -5787,13 +5859,13 @@
           <w14:ligatures w14:val="standardContextual"/>
         </w:rPr>
       </w:pPr>
-      <w:hyperlink w:anchor="_Toc229424528" w:history="1">
+      <w:hyperlink w:anchor="_Toc229690692" w:history="1">
         <w:r>
           <w:rPr>
             <w:rStyle w:val="Hipervnculo"/>
             <w:noProof/>
           </w:rPr>
-          <w:t>15 Reconocimiento facial 1/3</w:t>
+          <w:t>14  Reconocimiento facial 2/3</w:t>
         </w:r>
         <w:r>
           <w:rPr>
@@ -5814,79 +5886,7 @@
             <w:noProof/>
             <w:webHidden/>
           </w:rPr>
-          <w:instrText xml:space="preserve"> PAGEREF _Toc229424528 \h </w:instrText>
-        </w:r>
-        <w:r>
-          <w:rPr>
-            <w:noProof/>
-            <w:webHidden/>
-          </w:rPr>
-        </w:r>
-        <w:r>
-          <w:rPr>
-            <w:noProof/>
-            <w:webHidden/>
-          </w:rPr>
-          <w:fldChar w:fldCharType="separate"/>
-        </w:r>
-        <w:r>
-          <w:rPr>
-            <w:noProof/>
-            <w:webHidden/>
-          </w:rPr>
-          <w:t>24</w:t>
-        </w:r>
-        <w:r>
-          <w:rPr>
-            <w:noProof/>
-            <w:webHidden/>
-          </w:rPr>
-          <w:fldChar w:fldCharType="end"/>
-        </w:r>
-      </w:hyperlink>
-    </w:p>
-    <w:p>
-      <w:pPr>
-        <w:pStyle w:val="Tabladeilustraciones"/>
-        <w:tabs>
-          <w:tab w:val="right" w:leader="dot" w:pos="9016"/>
-        </w:tabs>
-        <w:rPr>
-          <w:rFonts w:eastAsiaTheme="minorEastAsia"/>
-          <w:noProof/>
-          <w:kern w:val="2"/>
-          <w:lang w:eastAsia="es-ES"/>
-          <w14:ligatures w14:val="standardContextual"/>
-        </w:rPr>
-      </w:pPr>
-      <w:hyperlink w:anchor="_Toc229424529" w:history="1">
-        <w:r>
-          <w:rPr>
-            <w:rStyle w:val="Hipervnculo"/>
-            <w:noProof/>
-          </w:rPr>
-          <w:t>16  Reconocimiento facial 3/3</w:t>
-        </w:r>
-        <w:r>
-          <w:rPr>
-            <w:noProof/>
-            <w:webHidden/>
-          </w:rPr>
-          <w:tab/>
-        </w:r>
-        <w:r>
-          <w:rPr>
-            <w:noProof/>
-            <w:webHidden/>
-          </w:rPr>
-          <w:fldChar w:fldCharType="begin"/>
-        </w:r>
-        <w:r>
-          <w:rPr>
-            <w:noProof/>
-            <w:webHidden/>
-          </w:rPr>
-          <w:instrText xml:space="preserve"> PAGEREF _Toc229424529 \h </w:instrText>
+          <w:instrText xml:space="preserve"> PAGEREF _Toc229690692 \h </w:instrText>
         </w:r>
         <w:r>
           <w:rPr>
@@ -5931,13 +5931,13 @@
           <w14:ligatures w14:val="standardContextual"/>
         </w:rPr>
       </w:pPr>
-      <w:hyperlink w:anchor="_Toc229424530" w:history="1">
+      <w:hyperlink w:anchor="_Toc229690693" w:history="1">
         <w:r>
           <w:rPr>
             <w:rStyle w:val="Hipervnculo"/>
             <w:noProof/>
           </w:rPr>
-          <w:t>17 Creación de cuenta</w:t>
+          <w:t>15 Reconocimiento facial 1/3</w:t>
         </w:r>
         <w:r>
           <w:rPr>
@@ -5958,7 +5958,79 @@
             <w:noProof/>
             <w:webHidden/>
           </w:rPr>
-          <w:instrText xml:space="preserve"> PAGEREF _Toc229424530 \h </w:instrText>
+          <w:instrText xml:space="preserve"> PAGEREF _Toc229690693 \h </w:instrText>
+        </w:r>
+        <w:r>
+          <w:rPr>
+            <w:noProof/>
+            <w:webHidden/>
+          </w:rPr>
+        </w:r>
+        <w:r>
+          <w:rPr>
+            <w:noProof/>
+            <w:webHidden/>
+          </w:rPr>
+          <w:fldChar w:fldCharType="separate"/>
+        </w:r>
+        <w:r>
+          <w:rPr>
+            <w:noProof/>
+            <w:webHidden/>
+          </w:rPr>
+          <w:t>25</w:t>
+        </w:r>
+        <w:r>
+          <w:rPr>
+            <w:noProof/>
+            <w:webHidden/>
+          </w:rPr>
+          <w:fldChar w:fldCharType="end"/>
+        </w:r>
+      </w:hyperlink>
+    </w:p>
+    <w:p>
+      <w:pPr>
+        <w:pStyle w:val="Tabladeilustraciones"/>
+        <w:tabs>
+          <w:tab w:val="right" w:leader="dot" w:pos="9016"/>
+        </w:tabs>
+        <w:rPr>
+          <w:rFonts w:eastAsiaTheme="minorEastAsia"/>
+          <w:noProof/>
+          <w:kern w:val="2"/>
+          <w:lang w:eastAsia="es-ES"/>
+          <w14:ligatures w14:val="standardContextual"/>
+        </w:rPr>
+      </w:pPr>
+      <w:hyperlink w:anchor="_Toc229690694" w:history="1">
+        <w:r>
+          <w:rPr>
+            <w:rStyle w:val="Hipervnculo"/>
+            <w:noProof/>
+          </w:rPr>
+          <w:t>16  Reconocimiento facial 3/3</w:t>
+        </w:r>
+        <w:r>
+          <w:rPr>
+            <w:noProof/>
+            <w:webHidden/>
+          </w:rPr>
+          <w:tab/>
+        </w:r>
+        <w:r>
+          <w:rPr>
+            <w:noProof/>
+            <w:webHidden/>
+          </w:rPr>
+          <w:fldChar w:fldCharType="begin"/>
+        </w:r>
+        <w:r>
+          <w:rPr>
+            <w:noProof/>
+            <w:webHidden/>
+          </w:rPr>
+          <w:instrText xml:space="preserve"> PAGEREF _Toc229690694 \h </w:instrText>
         </w:r>
         <w:r>
           <w:rPr>
@@ -6003,7 +6075,79 @@
           <w14:ligatures w14:val="standardContextual"/>
         </w:rPr>
       </w:pPr>
-      <w:hyperlink w:anchor="_Toc229424531" w:history="1">
+      <w:hyperlink w:anchor="_Toc229690695" w:history="1">
+        <w:r>
+          <w:rPr>
+            <w:rStyle w:val="Hipervnculo"/>
+            <w:noProof/>
+          </w:rPr>
+          <w:t>17 Creación de cuenta</w:t>
+        </w:r>
+        <w:r>
+          <w:rPr>
+            <w:noProof/>
+            <w:webHidden/>
+          </w:rPr>
+          <w:tab/>
+        </w:r>
+        <w:r>
+          <w:rPr>
+            <w:noProof/>
+            <w:webHidden/>
+          </w:rPr>
+          <w:fldChar w:fldCharType="begin"/>
+        </w:r>
+        <w:r>
+          <w:rPr>
+            <w:noProof/>
+            <w:webHidden/>
+          </w:rPr>
+          <w:instrText xml:space="preserve"> PAGEREF _Toc229690695 \h </w:instrText>
+        </w:r>
+        <w:r>
+          <w:rPr>
+            <w:noProof/>
+            <w:webHidden/>
+          </w:rPr>
+        </w:r>
+        <w:r>
+          <w:rPr>
+            <w:noProof/>
+            <w:webHidden/>
+          </w:rPr>
+          <w:fldChar w:fldCharType="separate"/>
+        </w:r>
+        <w:r>
+          <w:rPr>
+            <w:noProof/>
+            <w:webHidden/>
+          </w:rPr>
+          <w:t>28</w:t>
+        </w:r>
+        <w:r>
+          <w:rPr>
+            <w:noProof/>
+            <w:webHidden/>
+          </w:rPr>
+          <w:fldChar w:fldCharType="end"/>
+        </w:r>
+      </w:hyperlink>
+    </w:p>
+    <w:p>
+      <w:pPr>
+        <w:pStyle w:val="Tabladeilustraciones"/>
+        <w:tabs>
+          <w:tab w:val="right" w:leader="dot" w:pos="9016"/>
+        </w:tabs>
+        <w:rPr>
+          <w:rFonts w:eastAsiaTheme="minorEastAsia"/>
+          <w:noProof/>
+          <w:kern w:val="2"/>
+          <w:lang w:eastAsia="es-ES"/>
+          <w14:ligatures w14:val="standardContextual"/>
+        </w:rPr>
+      </w:pPr>
+      <w:hyperlink w:anchor="_Toc229690696" w:history="1">
         <w:r>
           <w:rPr>
             <w:rStyle w:val="Hipervnculo"/>
@@ -6030,7 +6174,7 @@
             <w:noProof/>
             <w:webHidden/>
           </w:rPr>
-          <w:instrText xml:space="preserve"> PAGEREF _Toc229424531 \h </w:instrText>
+          <w:instrText xml:space="preserve"> PAGEREF _Toc229690696 \h </w:instrText>
         </w:r>
         <w:r>
           <w:rPr>
@@ -6050,7 +6194,7 @@
             <w:noProof/>
             <w:webHidden/>
           </w:rPr>
-          <w:t>27</w:t>
+          <w:t>29</w:t>
         </w:r>
         <w:r>
           <w:rPr>
@@ -6068,6 +6212,7 @@
     </w:p>
     <w:p>
       <w:r>
+        <w:lastRenderedPageBreak/>
         <w:br w:type="page"/>
       </w:r>
     </w:p>
@@ -6075,7 +6220,7 @@
       <w:pPr>
         <w:pStyle w:val="Ttulo1"/>
       </w:pPr>
-      <w:bookmarkStart w:id="0" w:name="_Toc229424473"/>
+      <w:bookmarkStart w:id="0" w:name="_Toc229690636"/>
       <w:r>
         <w:lastRenderedPageBreak/>
         <w:t>Introducción</w:t>
@@ -6086,7 +6231,7 @@
       <w:pPr>
         <w:pStyle w:val="Ttulo2"/>
       </w:pPr>
-      <w:bookmarkStart w:id="1" w:name="_Toc229424474"/>
+      <w:bookmarkStart w:id="1" w:name="_Toc229690637"/>
       <w:r>
         <w:t>Objetivo del proyecto</w:t>
       </w:r>
@@ -6125,7 +6270,7 @@
         <w:pStyle w:val="Ttulo2"/>
         <w:jc w:val="both"/>
       </w:pPr>
-      <w:bookmarkStart w:id="2" w:name="_Toc229424475"/>
+      <w:bookmarkStart w:id="2" w:name="_Toc229690638"/>
       <w:r>
         <w:t>Justificación del proyecto</w:t>
       </w:r>
@@ -6236,7 +6381,7 @@
         <w:pStyle w:val="Ttulo2"/>
         <w:jc w:val="both"/>
       </w:pPr>
-      <w:bookmarkStart w:id="3" w:name="_Toc229424476"/>
+      <w:bookmarkStart w:id="3" w:name="_Toc229690639"/>
       <w:r>
         <w:t>Análisis de lo existente</w:t>
       </w:r>
@@ -6305,7 +6450,7 @@
       <w:pPr>
         <w:pStyle w:val="Ttulo1"/>
       </w:pPr>
-      <w:bookmarkStart w:id="4" w:name="_Toc229424477"/>
+      <w:bookmarkStart w:id="4" w:name="_Toc229690640"/>
       <w:r>
         <w:t xml:space="preserve">Requisitos Funcionales de la </w:t>
       </w:r>
@@ -6360,7 +6505,7 @@
       <w:pPr>
         <w:pStyle w:val="Ttulo2"/>
       </w:pPr>
-      <w:bookmarkStart w:id="5" w:name="_Toc229424478"/>
+      <w:bookmarkStart w:id="5" w:name="_Toc229690641"/>
       <w:r>
         <w:t>Inquilino</w:t>
       </w:r>
@@ -6984,7 +7129,7 @@
       <w:pPr>
         <w:pStyle w:val="Ttulo2"/>
       </w:pPr>
-      <w:bookmarkStart w:id="6" w:name="_Toc229424479"/>
+      <w:bookmarkStart w:id="6" w:name="_Toc229690642"/>
       <w:r>
         <w:t>Arrendador</w:t>
       </w:r>
@@ -7719,7 +7864,7 @@
           <w:rFonts w:eastAsia="Aptos"/>
         </w:rPr>
       </w:pPr>
-      <w:bookmarkStart w:id="7" w:name="_Toc229424480"/>
+      <w:bookmarkStart w:id="7" w:name="_Toc229690643"/>
       <w:r>
         <w:rPr>
           <w:rFonts w:eastAsia="Aptos"/>
@@ -7880,7 +8025,7 @@
       <w:pPr>
         <w:pStyle w:val="Ttulo1"/>
       </w:pPr>
-      <w:bookmarkStart w:id="8" w:name="_Toc229424481"/>
+      <w:bookmarkStart w:id="8" w:name="_Toc229690644"/>
       <w:r>
         <w:t>Análisis y Diseño</w:t>
       </w:r>
@@ -7891,7 +8036,7 @@
         <w:pStyle w:val="Ttulo2"/>
       </w:pPr>
       <w:bookmarkStart w:id="9" w:name="_Toc225415558"/>
-      <w:bookmarkStart w:id="10" w:name="_Toc229424482"/>
+      <w:bookmarkStart w:id="10" w:name="_Toc229690645"/>
       <w:r>
         <w:t>Diagrama de Arquitectura</w:t>
       </w:r>
@@ -7954,7 +8099,7 @@
         <w:pStyle w:val="Descripcin"/>
       </w:pPr>
       <w:fldSimple w:instr=" SEQ Ilustración \* ARABIC ">
-        <w:bookmarkStart w:id="11" w:name="_Toc229424514"/>
+        <w:bookmarkStart w:id="11" w:name="_Toc229690679"/>
         <w:r>
           <w:rPr>
             <w:noProof/>
@@ -8035,7 +8180,7 @@
       <w:pPr>
         <w:pStyle w:val="Ttulo2"/>
       </w:pPr>
-      <w:bookmarkStart w:id="12" w:name="_Toc229424483"/>
+      <w:bookmarkStart w:id="12" w:name="_Toc229690646"/>
       <w:r>
         <w:lastRenderedPageBreak/>
         <w:t xml:space="preserve">Diagrama </w:t>
@@ -8118,7 +8263,7 @@
         <w:pStyle w:val="Descripcin"/>
       </w:pPr>
       <w:fldSimple w:instr=" SEQ Ilustración \* ARABIC ">
-        <w:bookmarkStart w:id="13" w:name="_Toc229424515"/>
+        <w:bookmarkStart w:id="13" w:name="_Toc229690680"/>
         <w:r>
           <w:rPr>
             <w:noProof/>
@@ -8157,7 +8302,7 @@
       <w:pPr>
         <w:pStyle w:val="Ttulo2"/>
       </w:pPr>
-      <w:bookmarkStart w:id="14" w:name="_Toc229424484"/>
+      <w:bookmarkStart w:id="14" w:name="_Toc229690647"/>
       <w:r>
         <w:lastRenderedPageBreak/>
         <w:t>Diagrama de clases</w:t>
@@ -8167,17 +8312,16 @@
     <w:p>
       <w:pPr>
         <w:keepNext/>
-        <w:jc w:val="center"/>
       </w:pPr>
       <w:r>
         <w:rPr>
           <w:noProof/>
         </w:rPr>
         <w:drawing>
-          <wp:inline distT="0" distB="0" distL="0" distR="0" wp14:anchorId="189049AB" wp14:editId="70E05026">
-            <wp:extent cx="4696084" cy="7863901"/>
-            <wp:effectExtent l="0" t="0" r="0" b="0"/>
-            <wp:docPr id="779105116" name="drawing"/>
+          <wp:inline distT="0" distB="0" distL="0" distR="0" wp14:anchorId="67E3B4D2" wp14:editId="5C00D363">
+            <wp:extent cx="5731510" cy="6417310"/>
+            <wp:effectExtent l="0" t="0" r="2540" b="2540"/>
+            <wp:docPr id="682627866" name="Imagen 2"/>
             <wp:cNvGraphicFramePr>
               <a:graphicFrameLocks xmlns:a="http://schemas.openxmlformats.org/drawingml/2006/main" noChangeAspect="1"/>
             </wp:cNvGraphicFramePr>
@@ -8185,14 +8329,14 @@
               <a:graphicData uri="http://schemas.openxmlformats.org/drawingml/2006/picture">
                 <pic:pic xmlns:pic="http://schemas.openxmlformats.org/drawingml/2006/picture">
                   <pic:nvPicPr>
-                    <pic:cNvPr id="779105116" name="Picture 779105116"/>
+                    <pic:cNvPr id="682627866" name="Imagen 682627866"/>
                     <pic:cNvPicPr/>
                   </pic:nvPicPr>
                   <pic:blipFill>
-                    <a:blip r:embed="rId15">
+                    <a:blip r:embed="rId15" cstate="print">
                       <a:extLst>
                         <a:ext uri="{28A0092B-C50C-407E-A947-70E740481C1C}">
-                          <a14:useLocalDpi xmlns:a14="http://schemas.microsoft.com/office/drawing/2010/main"/>
+                          <a14:useLocalDpi xmlns:a14="http://schemas.microsoft.com/office/drawing/2010/main" val="0"/>
                         </a:ext>
                       </a:extLst>
                     </a:blip>
@@ -8203,7 +8347,7 @@
                   <pic:spPr>
                     <a:xfrm>
                       <a:off x="0" y="0"/>
-                      <a:ext cx="4696084" cy="7863901"/>
+                      <a:ext cx="5731510" cy="6417310"/>
                     </a:xfrm>
                     <a:prstGeom prst="rect">
                       <a:avLst/>
@@ -8221,7 +8365,7 @@
         <w:pStyle w:val="Descripcin"/>
       </w:pPr>
       <w:fldSimple w:instr=" SEQ Ilustración \* ARABIC ">
-        <w:bookmarkStart w:id="15" w:name="_Toc229424516"/>
+        <w:bookmarkStart w:id="15" w:name="_Toc229690681"/>
         <w:r>
           <w:rPr>
             <w:noProof/>
@@ -8239,7 +8383,7 @@
       <w:pPr>
         <w:pStyle w:val="Ttulo2"/>
       </w:pPr>
-      <w:bookmarkStart w:id="16" w:name="_Toc229424485"/>
+      <w:bookmarkStart w:id="16" w:name="_Toc229690648"/>
       <w:r>
         <w:lastRenderedPageBreak/>
         <w:t>Diagrama Entidad-Relación</w:t>
@@ -8302,7 +8446,7 @@
         <w:pStyle w:val="Descripcin"/>
       </w:pPr>
       <w:fldSimple w:instr=" SEQ Ilustración \* ARABIC ">
-        <w:bookmarkStart w:id="17" w:name="_Toc229424517"/>
+        <w:bookmarkStart w:id="17" w:name="_Toc229690682"/>
         <w:r>
           <w:rPr>
             <w:noProof/>
@@ -8330,11 +8474,9 @@
       <w:r>
         <w:t xml:space="preserve">”. Los usuarios registrados, los pisos añadidos, los contratos pendientes y las habitaciones con sus </w:t>
       </w:r>
-      <w:proofErr w:type="gramStart"/>
-      <w:r>
-        <w:t>muebles,</w:t>
-      </w:r>
-      <w:proofErr w:type="gramEnd"/>
+      <w:r>
+        <w:t>muebles</w:t>
+      </w:r>
       <w:r>
         <w:t xml:space="preserve"> son los datos que se guardarán en la base de datos y que manipularemos a través de programación orientada a objetos. </w:t>
       </w:r>
@@ -8343,7 +8485,7 @@
       <w:pPr>
         <w:pStyle w:val="Ttulo2"/>
       </w:pPr>
-      <w:bookmarkStart w:id="18" w:name="_Toc229424486"/>
+      <w:bookmarkStart w:id="18" w:name="_Toc229690649"/>
       <w:r>
         <w:t>Modelo Relacional</w:t>
       </w:r>
@@ -9378,7 +9520,7 @@
         <w:pStyle w:val="Ttulo2"/>
       </w:pPr>
       <w:bookmarkStart w:id="19" w:name="_Toc225415563"/>
-      <w:bookmarkStart w:id="20" w:name="_Toc229424487"/>
+      <w:bookmarkStart w:id="20" w:name="_Toc229690650"/>
       <w:r>
         <w:t>Script SQL</w:t>
       </w:r>
@@ -9387,6 +9529,9 @@
     </w:p>
     <w:p>
       <w:r>
+        <w:rPr>
+          <w:noProof/>
+        </w:rPr>
         <w:drawing>
           <wp:inline distT="0" distB="0" distL="0" distR="0" wp14:anchorId="1B389AF5" wp14:editId="4CB4CE3C">
             <wp:extent cx="5731510" cy="3256915"/>
@@ -9426,6 +9571,9 @@
     </w:p>
     <w:p>
       <w:r>
+        <w:rPr>
+          <w:noProof/>
+        </w:rPr>
         <w:lastRenderedPageBreak/>
         <w:drawing>
           <wp:inline distT="0" distB="0" distL="0" distR="0" wp14:anchorId="2BE82D0A" wp14:editId="5FC2EED0">
@@ -9466,6 +9614,9 @@
     </w:p>
     <w:p>
       <w:r>
+        <w:rPr>
+          <w:noProof/>
+        </w:rPr>
         <w:drawing>
           <wp:inline distT="0" distB="0" distL="0" distR="0" wp14:anchorId="58D892C4" wp14:editId="76969854">
             <wp:extent cx="5731510" cy="3706495"/>
@@ -9505,6 +9656,9 @@
     </w:p>
     <w:p>
       <w:r>
+        <w:rPr>
+          <w:noProof/>
+        </w:rPr>
         <w:lastRenderedPageBreak/>
         <w:drawing>
           <wp:inline distT="0" distB="0" distL="0" distR="0" wp14:anchorId="4A166CE7" wp14:editId="146B2E49">
@@ -9545,6 +9699,9 @@
     </w:p>
     <w:p>
       <w:r>
+        <w:rPr>
+          <w:noProof/>
+        </w:rPr>
         <w:drawing>
           <wp:inline distT="0" distB="0" distL="0" distR="0" wp14:anchorId="7E2CF8C5" wp14:editId="30DB2E95">
             <wp:extent cx="5731510" cy="1707515"/>
@@ -9586,7 +9743,7 @@
       <w:pPr>
         <w:pStyle w:val="Ttulo1"/>
       </w:pPr>
-      <w:bookmarkStart w:id="21" w:name="_Toc229424488"/>
+      <w:bookmarkStart w:id="21" w:name="_Toc229690651"/>
       <w:r>
         <w:t>Metodología de desarrollo</w:t>
       </w:r>
@@ -9597,7 +9754,7 @@
         <w:pStyle w:val="Ttulo2"/>
         <w:jc w:val="both"/>
       </w:pPr>
-      <w:bookmarkStart w:id="22" w:name="_Toc229424489"/>
+      <w:bookmarkStart w:id="22" w:name="_Toc229690652"/>
       <w:r>
         <w:t>Ciclo de vida</w:t>
       </w:r>
@@ -9697,7 +9854,7 @@
       <w:pPr>
         <w:pStyle w:val="Ttulo2"/>
       </w:pPr>
-      <w:bookmarkStart w:id="23" w:name="_Toc229424490"/>
+      <w:bookmarkStart w:id="23" w:name="_Toc229690653"/>
       <w:r>
         <w:lastRenderedPageBreak/>
         <w:t>Metodología ágil</w:t>
@@ -10013,7 +10170,7 @@
       <w:pPr>
         <w:pStyle w:val="Ttulo2"/>
       </w:pPr>
-      <w:bookmarkStart w:id="24" w:name="_Toc229424491"/>
+      <w:bookmarkStart w:id="24" w:name="_Toc229690654"/>
       <w:r>
         <w:lastRenderedPageBreak/>
         <w:t xml:space="preserve">Nuestro Tablero </w:t>
@@ -10097,7 +10254,7 @@
         <w:pStyle w:val="Descripcin"/>
       </w:pPr>
       <w:fldSimple w:instr=" SEQ Ilustración \* ARABIC ">
-        <w:bookmarkStart w:id="25" w:name="_Toc229424518"/>
+        <w:bookmarkStart w:id="25" w:name="_Toc229690683"/>
         <w:r>
           <w:rPr>
             <w:noProof/>
@@ -10167,7 +10324,7 @@
         <w:pStyle w:val="Descripcin"/>
       </w:pPr>
       <w:fldSimple w:instr=" SEQ Ilustración \* ARABIC ">
-        <w:bookmarkStart w:id="26" w:name="_Toc229424519"/>
+        <w:bookmarkStart w:id="26" w:name="_Toc229690684"/>
         <w:r>
           <w:rPr>
             <w:noProof/>
@@ -10189,7 +10346,7 @@
       <w:pPr>
         <w:pStyle w:val="Ttulo2"/>
       </w:pPr>
-      <w:bookmarkStart w:id="27" w:name="_Toc229424492"/>
+      <w:bookmarkStart w:id="27" w:name="_Toc229690655"/>
       <w:r>
         <w:lastRenderedPageBreak/>
         <w:t>Planificación de tareas y toles de equipo</w:t>
@@ -10671,7 +10828,7 @@
         <w:pStyle w:val="Descripcin"/>
       </w:pPr>
       <w:fldSimple w:instr=" SEQ Ilustración \* ARABIC ">
-        <w:bookmarkStart w:id="28" w:name="_Toc229424520"/>
+        <w:bookmarkStart w:id="28" w:name="_Toc229690685"/>
         <w:r>
           <w:rPr>
             <w:noProof/>
@@ -11039,7 +11196,7 @@
         <w:pStyle w:val="Descripcin"/>
       </w:pPr>
       <w:fldSimple w:instr=" SEQ Ilustración \* ARABIC ">
-        <w:bookmarkStart w:id="29" w:name="_Toc229424521"/>
+        <w:bookmarkStart w:id="29" w:name="_Toc229690686"/>
         <w:r>
           <w:rPr>
             <w:noProof/>
@@ -11061,7 +11218,7 @@
       <w:pPr>
         <w:pStyle w:val="Ttulo1"/>
       </w:pPr>
-      <w:bookmarkStart w:id="30" w:name="_Toc229424493"/>
+      <w:bookmarkStart w:id="30" w:name="_Toc229690656"/>
       <w:r>
         <w:lastRenderedPageBreak/>
         <w:t>Codificación</w:t>
@@ -11072,7 +11229,7 @@
       <w:pPr>
         <w:pStyle w:val="Ttulo2"/>
       </w:pPr>
-      <w:bookmarkStart w:id="31" w:name="_Toc229424494"/>
+      <w:bookmarkStart w:id="31" w:name="_Toc229690657"/>
       <w:r>
         <w:t>Entorno de programación</w:t>
       </w:r>
@@ -11234,7 +11391,7 @@
         <w:pStyle w:val="Ttulo2"/>
         <w:jc w:val="both"/>
       </w:pPr>
-      <w:bookmarkStart w:id="32" w:name="_Toc229424495"/>
+      <w:bookmarkStart w:id="32" w:name="_Toc229690658"/>
       <w:r>
         <w:t>Lenguajes y herramientas</w:t>
       </w:r>
@@ -11402,7 +11559,7 @@
       <w:pPr>
         <w:pStyle w:val="Ttulo2"/>
       </w:pPr>
-      <w:bookmarkStart w:id="33" w:name="_Toc229424496"/>
+      <w:bookmarkStart w:id="33" w:name="_Toc229690659"/>
       <w:r>
         <w:t>Aspectos relevantes de la implementación</w:t>
       </w:r>
@@ -11576,7 +11733,7 @@
         <w:pStyle w:val="Descripcin"/>
       </w:pPr>
       <w:fldSimple w:instr=" SEQ Ilustración \* ARABIC ">
-        <w:bookmarkStart w:id="34" w:name="_Toc229424522"/>
+        <w:bookmarkStart w:id="34" w:name="_Toc229690687"/>
         <w:r>
           <w:rPr>
             <w:noProof/>
@@ -11639,7 +11796,7 @@
         <w:pStyle w:val="Descripcin"/>
       </w:pPr>
       <w:fldSimple w:instr=" SEQ Ilustración \* ARABIC ">
-        <w:bookmarkStart w:id="35" w:name="_Toc229424523"/>
+        <w:bookmarkStart w:id="35" w:name="_Toc229690688"/>
         <w:r>
           <w:rPr>
             <w:noProof/>
@@ -11702,7 +11859,7 @@
         <w:pStyle w:val="Descripcin"/>
       </w:pPr>
       <w:fldSimple w:instr=" SEQ Ilustración \* ARABIC ">
-        <w:bookmarkStart w:id="36" w:name="_Toc229424524"/>
+        <w:bookmarkStart w:id="36" w:name="_Toc229690689"/>
         <w:r>
           <w:rPr>
             <w:noProof/>
@@ -11818,7 +11975,7 @@
         </w:rPr>
         <w:fldChar w:fldCharType="separate"/>
       </w:r>
-      <w:bookmarkStart w:id="37" w:name="_Toc229424525"/>
+      <w:bookmarkStart w:id="37" w:name="_Toc229690690"/>
       <w:r>
         <w:rPr>
           <w:b/>
@@ -11965,7 +12122,7 @@
         <w:pStyle w:val="Descripcin"/>
       </w:pPr>
       <w:fldSimple w:instr=" SEQ Ilustración \* ARABIC ">
-        <w:bookmarkStart w:id="38" w:name="_Toc229424526"/>
+        <w:bookmarkStart w:id="38" w:name="_Toc229690691"/>
         <w:r>
           <w:rPr>
             <w:noProof/>
@@ -12151,7 +12308,7 @@
                               </w:rPr>
                               <w:fldChar w:fldCharType="separate"/>
                             </w:r>
-                            <w:bookmarkStart w:id="39" w:name="_Toc229424527"/>
+                            <w:bookmarkStart w:id="39" w:name="_Toc229690692"/>
                             <w:r>
                               <w:rPr>
                                 <w:noProof/>
@@ -12226,7 +12383,7 @@
                         </w:rPr>
                         <w:fldChar w:fldCharType="separate"/>
                       </w:r>
-                      <w:bookmarkStart w:id="40" w:name="_Toc229424527"/>
+                      <w:bookmarkStart w:id="40" w:name="_Toc229690692"/>
                       <w:r>
                         <w:rPr>
                           <w:noProof/>
@@ -12377,7 +12534,7 @@
         <w:jc w:val="both"/>
       </w:pPr>
       <w:fldSimple w:instr=" SEQ Ilustración \* ARABIC ">
-        <w:bookmarkStart w:id="41" w:name="_Toc229424528"/>
+        <w:bookmarkStart w:id="41" w:name="_Toc229690693"/>
         <w:r>
           <w:rPr>
             <w:noProof/>
@@ -12449,7 +12606,7 @@
         <w:jc w:val="both"/>
       </w:pPr>
       <w:fldSimple w:instr=" SEQ Ilustración \* ARABIC ">
-        <w:bookmarkStart w:id="42" w:name="_Toc229424529"/>
+        <w:bookmarkStart w:id="42" w:name="_Toc229690694"/>
         <w:r>
           <w:rPr>
             <w:noProof/>
@@ -12474,14 +12631,113 @@
     <w:p>
       <w:pPr>
         <w:jc w:val="both"/>
-      </w:pPr>
+        <w:rPr>
+          <w:b/>
+          <w:bCs/>
+          <w:u w:val="single"/>
+        </w:rPr>
+      </w:pPr>
+      <w:r>
+        <w:rPr>
+          <w:b/>
+          <w:bCs/>
+          <w:u w:val="single"/>
+        </w:rPr>
+        <w:t>Filtro de búsqueda habitaciones</w:t>
+      </w:r>
+    </w:p>
+    <w:p>
+      <w:pPr>
+        <w:jc w:val="both"/>
+      </w:pPr>
+      <w:r>
+        <w:t xml:space="preserve">En la sección de búsqueda de la página web, se pueden ver las habitaciones que hay disponibles en la web para alquilar. En la parte alta de la página se encuentra la opción de filtrar las habitaciones por precio, opciones que incluyen las habitaciones y tipo de habitación. Al elegir tus filtros deseados y darle al botón de pulsar se aplican los filtros a través del siguiente código de JavaScript. </w:t>
+      </w:r>
+    </w:p>
+    <w:p>
+      <w:pPr>
+        <w:jc w:val="both"/>
+      </w:pPr>
+      <w:r>
+        <w:t>Se controla el “</w:t>
+      </w:r>
+      <w:proofErr w:type="spellStart"/>
+      <w:r>
+        <w:t>display</w:t>
+      </w:r>
+      <w:proofErr w:type="spellEnd"/>
+      <w:r>
+        <w:t>” de los contenedores que tienen las habitaciones. Se cambia entre “</w:t>
+      </w:r>
+      <w:proofErr w:type="spellStart"/>
+      <w:r>
+        <w:t>flex</w:t>
+      </w:r>
+      <w:proofErr w:type="spellEnd"/>
+      <w:r>
+        <w:t>” y “</w:t>
+      </w:r>
+      <w:proofErr w:type="spellStart"/>
+      <w:r>
+        <w:t>none</w:t>
+      </w:r>
+      <w:proofErr w:type="spellEnd"/>
+      <w:r>
+        <w:t xml:space="preserve">”, para enseñar o esconder las habitaciones. Para esto se cogen los valores de las opciones que has seleccionado en los filtros. Luego con un bucle se recorren todas las habitaciones </w:t>
+      </w:r>
+      <w:r>
+        <w:t xml:space="preserve">para comparar sus datos con los del filtro y se decide si la habitación se verá o esconderá. </w:t>
+      </w:r>
+    </w:p>
+    <w:p>
+      <w:pPr>
+        <w:jc w:val="both"/>
+      </w:pPr>
+      <w:r>
+        <w:lastRenderedPageBreak/>
+        <w:drawing>
+          <wp:inline distT="0" distB="0" distL="0" distR="0" wp14:anchorId="34197E09" wp14:editId="10EDE698">
+            <wp:extent cx="5731510" cy="4493260"/>
+            <wp:effectExtent l="0" t="0" r="2540" b="2540"/>
+            <wp:docPr id="1431624887" name="Imagen 1"/>
+            <wp:cNvGraphicFramePr>
+              <a:graphicFrameLocks xmlns:a="http://schemas.openxmlformats.org/drawingml/2006/main" noChangeAspect="1"/>
+            </wp:cNvGraphicFramePr>
+            <a:graphic xmlns:a="http://schemas.openxmlformats.org/drawingml/2006/main">
+              <a:graphicData uri="http://schemas.openxmlformats.org/drawingml/2006/picture">
+                <pic:pic xmlns:pic="http://schemas.openxmlformats.org/drawingml/2006/picture">
+                  <pic:nvPicPr>
+                    <pic:cNvPr id="1431624887" name=""/>
+                    <pic:cNvPicPr/>
+                  </pic:nvPicPr>
+                  <pic:blipFill>
+                    <a:blip r:embed="rId33"/>
+                    <a:stretch>
+                      <a:fillRect/>
+                    </a:stretch>
+                  </pic:blipFill>
+                  <pic:spPr>
+                    <a:xfrm>
+                      <a:off x="0" y="0"/>
+                      <a:ext cx="5731510" cy="4493260"/>
+                    </a:xfrm>
+                    <a:prstGeom prst="rect">
+                      <a:avLst/>
+                    </a:prstGeom>
+                  </pic:spPr>
+                </pic:pic>
+              </a:graphicData>
+            </a:graphic>
+          </wp:inline>
+        </w:drawing>
+      </w:r>
     </w:p>
     <w:p/>
     <w:p>
       <w:pPr>
         <w:pStyle w:val="Ttulo1"/>
       </w:pPr>
-      <w:bookmarkStart w:id="43" w:name="_Toc229424497"/>
+      <w:bookmarkStart w:id="43" w:name="_Toc229690660"/>
       <w:r>
         <w:t>Manual de usuario</w:t>
       </w:r>
@@ -12491,7 +12747,7 @@
       <w:pPr>
         <w:pStyle w:val="Ttulo2"/>
       </w:pPr>
-      <w:bookmarkStart w:id="44" w:name="_Toc229424498"/>
+      <w:bookmarkStart w:id="44" w:name="_Toc229690661"/>
       <w:r>
         <w:t>Entrar al proyecto</w:t>
       </w:r>
@@ -12507,24 +12763,12 @@
       <w:r>
         <w:t xml:space="preserve"> </w:t>
       </w:r>
-      <w:hyperlink r:id="rId33" w:history="1">
+      <w:hyperlink r:id="rId34" w:history="1">
         <w:r>
           <w:rPr>
             <w:rStyle w:val="Hipervnculo"/>
           </w:rPr>
-          <w:t>www.roomie-web-blue.vercel.a</w:t>
-        </w:r>
-        <w:r>
-          <w:rPr>
-            <w:rStyle w:val="Hipervnculo"/>
-          </w:rPr>
-          <w:t>p</w:t>
-        </w:r>
-        <w:r>
-          <w:rPr>
-            <w:rStyle w:val="Hipervnculo"/>
-          </w:rPr>
-          <w:t>p</w:t>
+          <w:t>www.roomie-web-blue.vercel.app</w:t>
         </w:r>
       </w:hyperlink>
       <w:r>
@@ -12573,7 +12817,7 @@
       <w:pPr>
         <w:pStyle w:val="Ttulo2"/>
       </w:pPr>
-      <w:bookmarkStart w:id="45" w:name="_Toc229424499"/>
+      <w:bookmarkStart w:id="45" w:name="_Toc229690662"/>
       <w:r>
         <w:lastRenderedPageBreak/>
         <w:t>Registro, inicio de sesión y navegación.</w:t>
@@ -12618,7 +12862,7 @@
                     <pic:cNvPicPr/>
                   </pic:nvPicPr>
                   <pic:blipFill>
-                    <a:blip r:embed="rId34"/>
+                    <a:blip r:embed="rId35"/>
                     <a:stretch>
                       <a:fillRect/>
                     </a:stretch>
@@ -12644,7 +12888,7 @@
         <w:pStyle w:val="Descripcin"/>
       </w:pPr>
       <w:fldSimple w:instr=" SEQ Ilustración \* ARABIC ">
-        <w:bookmarkStart w:id="46" w:name="_Toc229424530"/>
+        <w:bookmarkStart w:id="46" w:name="_Toc229690695"/>
         <w:r>
           <w:rPr>
             <w:noProof/>
@@ -12676,6 +12920,9 @@
         <w:keepNext/>
       </w:pPr>
       <w:r>
+        <w:rPr>
+          <w:noProof/>
+        </w:rPr>
         <w:drawing>
           <wp:inline distT="0" distB="0" distL="0" distR="0" wp14:anchorId="14C8EE44" wp14:editId="15753FE5">
             <wp:extent cx="5731510" cy="5723890"/>
@@ -12692,7 +12939,7 @@
                     <pic:cNvPicPr/>
                   </pic:nvPicPr>
                   <pic:blipFill>
-                    <a:blip r:embed="rId35"/>
+                    <a:blip r:embed="rId36"/>
                     <a:stretch>
                       <a:fillRect/>
                     </a:stretch>
@@ -12718,7 +12965,7 @@
         <w:pStyle w:val="Descripcin"/>
       </w:pPr>
       <w:fldSimple w:instr=" SEQ Ilustración \* ARABIC ">
-        <w:bookmarkStart w:id="47" w:name="_Toc229424531"/>
+        <w:bookmarkStart w:id="47" w:name="_Toc229690696"/>
         <w:r>
           <w:rPr>
             <w:noProof/>
@@ -12757,7 +13004,7 @@
       <w:pPr>
         <w:pStyle w:val="Ttulo2"/>
       </w:pPr>
-      <w:bookmarkStart w:id="48" w:name="_Toc229424500"/>
+      <w:bookmarkStart w:id="48" w:name="_Toc229690663"/>
       <w:r>
         <w:lastRenderedPageBreak/>
         <w:t>Instrucciones manipulación base de datos</w:t>
@@ -12859,7 +13106,7 @@
       <w:pPr>
         <w:pStyle w:val="Ttulo1"/>
       </w:pPr>
-      <w:bookmarkStart w:id="49" w:name="_Toc229424501"/>
+      <w:bookmarkStart w:id="49" w:name="_Toc229690664"/>
       <w:r>
         <w:t>Requisitos e instalación</w:t>
       </w:r>
@@ -12869,7 +13116,7 @@
       <w:pPr>
         <w:pStyle w:val="Ttulo2"/>
       </w:pPr>
-      <w:bookmarkStart w:id="50" w:name="_Toc229424502"/>
+      <w:bookmarkStart w:id="50" w:name="_Toc229690665"/>
       <w:r>
         <w:t>Requisitos del sistema</w:t>
       </w:r>
@@ -12962,7 +13209,7 @@
       <w:pPr>
         <w:pStyle w:val="Ttulo2"/>
       </w:pPr>
-      <w:bookmarkStart w:id="51" w:name="_Toc229424503"/>
+      <w:bookmarkStart w:id="51" w:name="_Toc229690666"/>
       <w:r>
         <w:t>Instalación y ejecución</w:t>
       </w:r>
@@ -13033,33 +13280,223 @@
       <w:pPr>
         <w:pStyle w:val="Ttulo1"/>
       </w:pPr>
-      <w:bookmarkStart w:id="52" w:name="_Toc229424504"/>
+      <w:bookmarkStart w:id="52" w:name="_Toc229690667"/>
       <w:r>
         <w:t>Conclusiones</w:t>
       </w:r>
       <w:bookmarkEnd w:id="52"/>
     </w:p>
+    <w:p>
+      <w:pPr>
+        <w:pStyle w:val="Ttulo2"/>
+      </w:pPr>
+      <w:bookmarkStart w:id="53" w:name="_Toc229690668"/>
+      <w:r>
+        <w:t>Conclusiones sobre el trabajo realizado</w:t>
+      </w:r>
+      <w:bookmarkEnd w:id="53"/>
+    </w:p>
+    <w:p>
+      <w:pPr>
+        <w:jc w:val="both"/>
+      </w:pPr>
+      <w:r>
+        <w:t xml:space="preserve">Para este proyecto se ha logrado crear, por un lado, una página web funcional y atractiva con implementaciones modernas como el reconocimiento facial, el uso de filtros básicos y la utilización del almacenamiento local para simular una conexión con la base de datos. </w:t>
+      </w:r>
+    </w:p>
+    <w:p>
+      <w:pPr>
+        <w:jc w:val="both"/>
+      </w:pPr>
+      <w:r>
+        <w:t>Por otro lado, se ha construido una base de datos funcional y completa, con “</w:t>
+      </w:r>
+      <w:proofErr w:type="spellStart"/>
+      <w:r>
+        <w:t>triggers</w:t>
+      </w:r>
+      <w:proofErr w:type="spellEnd"/>
+      <w:r>
+        <w:t xml:space="preserve">” para controlar la eliminación e inserción de datos. Al igual que se ha creado una </w:t>
+      </w:r>
+      <w:proofErr w:type="gramStart"/>
+      <w:r>
+        <w:t>app</w:t>
+      </w:r>
+      <w:proofErr w:type="gramEnd"/>
+      <w:r>
+        <w:t xml:space="preserve"> de </w:t>
+      </w:r>
+      <w:proofErr w:type="spellStart"/>
+      <w:r>
+        <w:t>JavaFX</w:t>
+      </w:r>
+      <w:proofErr w:type="spellEnd"/>
+      <w:r>
+        <w:t xml:space="preserve"> que se conecta a esta base de datos y que facilita la inserción, actualización, comprobación y eliminación </w:t>
+      </w:r>
+      <w:r>
+        <w:t xml:space="preserve">de los datos de esta. </w:t>
+      </w:r>
+    </w:p>
+    <w:p>
+      <w:pPr>
+        <w:jc w:val="both"/>
+      </w:pPr>
+      <w:r>
+        <w:t xml:space="preserve">Un objetivo que no se ha cumplido ha sido la implementación de búsqueda a través de un mapa. No se ha conseguido hacer una conexión a API de mapas y usarlos. </w:t>
+      </w:r>
+    </w:p>
+    <w:p>
+      <w:pPr>
+        <w:jc w:val="both"/>
+      </w:pPr>
+      <w:r>
+        <w:t xml:space="preserve">Las mayores dificultades que se han encontrado han sido, la coordinación de todas las partes del equipo, en especial la sincronización de flujos de trabajo y la unión de criterios para cumplir los plazos establecidos. También, se han encontrado dificultades al intentar coordinar la realización del proyecto a la vez que la formación en centros de trabajo. </w:t>
+      </w:r>
+    </w:p>
+    <w:p>
+      <w:pPr>
+        <w:jc w:val="both"/>
+      </w:pPr>
+      <w:r>
+        <w:t>Gran parte del aprendizaje adquirido al realizar este proyecto viene de la investigación y búsqueda de información y</w:t>
+      </w:r>
+      <w:r>
+        <w:t xml:space="preserve"> de la necesidad de encontrar soluciones creativas por cuenta propia para superar los distintos obstáculos encontrados durante los diferentes hitos. </w:t>
+      </w:r>
+    </w:p>
+    <w:p>
+      <w:pPr>
+        <w:pStyle w:val="Ttulo2"/>
+      </w:pPr>
+      <w:bookmarkStart w:id="54" w:name="_Toc229690669"/>
+      <w:r>
+        <w:t>Posibles ampliaciones y mejoras</w:t>
+      </w:r>
+      <w:bookmarkEnd w:id="54"/>
+    </w:p>
+    <w:p>
+      <w:pPr>
+        <w:jc w:val="both"/>
+      </w:pPr>
+      <w:r>
+        <w:t xml:space="preserve"> </w:t>
+      </w:r>
+      <w:r>
+        <w:t xml:space="preserve">En las posibles mejoras de este proyecto, la primera sería la conexión real entre el </w:t>
+      </w:r>
+      <w:proofErr w:type="spellStart"/>
+      <w:r>
+        <w:t>frontend</w:t>
+      </w:r>
+      <w:proofErr w:type="spellEnd"/>
+      <w:r>
+        <w:t xml:space="preserve"> y </w:t>
+      </w:r>
+      <w:proofErr w:type="spellStart"/>
+      <w:r>
+        <w:t>backend</w:t>
+      </w:r>
+      <w:proofErr w:type="spellEnd"/>
+      <w:r>
+        <w:t xml:space="preserve"> para que el proyecto fuera realmente funcional. Ya que ahora los datos recogidos desde la página web no se guardan en la base de datos y los datos que usa la página web no provienen de la base de datos. </w:t>
+      </w:r>
+    </w:p>
+    <w:p>
+      <w:pPr>
+        <w:jc w:val="both"/>
+      </w:pPr>
+      <w:r>
+        <w:lastRenderedPageBreak/>
+        <w:t xml:space="preserve">Otra posible mejora sería, como se ha mencionado antes, la implementación de búsqueda a través de un mapa ya que haría la experiencia de búsqueda de habitaciones más visual y atractiva. </w:t>
+      </w:r>
+    </w:p>
+    <w:p>
+      <w:pPr>
+        <w:jc w:val="both"/>
+      </w:pPr>
+      <w:r>
+        <w:t xml:space="preserve">Finalmente, </w:t>
+      </w:r>
+      <w:proofErr w:type="spellStart"/>
+      <w:r>
+        <w:t>Ro</w:t>
+      </w:r>
+      <w:r>
+        <w:t>o</w:t>
+      </w:r>
+      <w:r>
+        <w:t>mie</w:t>
+      </w:r>
+      <w:proofErr w:type="spellEnd"/>
+      <w:r>
+        <w:t xml:space="preserve"> es actualmente sólo una página web, sin embargo</w:t>
+      </w:r>
+      <w:r>
+        <w:t xml:space="preserve">, la adaptación de esta idea a una </w:t>
+      </w:r>
+      <w:proofErr w:type="gramStart"/>
+      <w:r>
+        <w:t>app</w:t>
+      </w:r>
+      <w:proofErr w:type="gramEnd"/>
+      <w:r>
+        <w:t xml:space="preserve"> móvil es una posibilidad </w:t>
+      </w:r>
+      <w:proofErr w:type="gramStart"/>
+      <w:r>
+        <w:t>a</w:t>
+      </w:r>
+      <w:proofErr w:type="gramEnd"/>
+      <w:r>
+        <w:t xml:space="preserve"> tener en cuenta. Usando programas como </w:t>
+      </w:r>
+      <w:proofErr w:type="spellStart"/>
+      <w:r>
+        <w:t>Flutter</w:t>
+      </w:r>
+      <w:proofErr w:type="spellEnd"/>
+      <w:r>
+        <w:t xml:space="preserve"> o Android Studio y la creación de una API propia de </w:t>
+      </w:r>
+      <w:proofErr w:type="spellStart"/>
+      <w:r>
+        <w:t>Roomie</w:t>
+      </w:r>
+      <w:proofErr w:type="spellEnd"/>
+      <w:r>
+        <w:t xml:space="preserve">, se podría hacer una conexión de esta </w:t>
+      </w:r>
+      <w:proofErr w:type="gramStart"/>
+      <w:r>
+        <w:t>app</w:t>
+      </w:r>
+      <w:proofErr w:type="gramEnd"/>
+      <w:r>
+        <w:t xml:space="preserve"> con la base de datos que compartiría con la página web original. </w:t>
+      </w:r>
+    </w:p>
     <w:p/>
-    <w:p/>
     <w:p>
       <w:pPr>
         <w:pStyle w:val="Ttulo1"/>
       </w:pPr>
-      <w:bookmarkStart w:id="53" w:name="_Toc229424505"/>
+      <w:bookmarkStart w:id="55" w:name="_Toc229690670"/>
       <w:r>
         <w:t>Plan de negocio</w:t>
       </w:r>
-      <w:bookmarkEnd w:id="53"/>
+      <w:bookmarkEnd w:id="55"/>
     </w:p>
     <w:p>
       <w:pPr>
         <w:pStyle w:val="Ttulo2"/>
       </w:pPr>
-      <w:bookmarkStart w:id="54" w:name="_Toc229424506"/>
+      <w:bookmarkStart w:id="56" w:name="_Toc229690671"/>
       <w:r>
         <w:t>Público objetivo</w:t>
       </w:r>
-      <w:bookmarkEnd w:id="54"/>
+      <w:bookmarkEnd w:id="56"/>
     </w:p>
     <w:p>
       <w:pPr>
@@ -13090,11 +13527,11 @@
       <w:pPr>
         <w:pStyle w:val="Ttulo2"/>
       </w:pPr>
-      <w:bookmarkStart w:id="55" w:name="_Toc229424507"/>
+      <w:bookmarkStart w:id="57" w:name="_Toc229690672"/>
       <w:r>
         <w:t>Utilidad social</w:t>
       </w:r>
-      <w:bookmarkEnd w:id="55"/>
+      <w:bookmarkEnd w:id="57"/>
     </w:p>
     <w:p>
       <w:pPr>
@@ -13139,11 +13576,11 @@
       <w:pPr>
         <w:pStyle w:val="Ttulo2"/>
       </w:pPr>
-      <w:bookmarkStart w:id="56" w:name="_Toc229424508"/>
+      <w:bookmarkStart w:id="58" w:name="_Toc229690673"/>
       <w:r>
         <w:t>Costes y beneficios</w:t>
       </w:r>
-      <w:bookmarkEnd w:id="56"/>
+      <w:bookmarkEnd w:id="58"/>
     </w:p>
     <w:p>
       <w:pPr>
@@ -13181,7 +13618,7 @@
         </w:rPr>
         <w:t xml:space="preserve">Alquiler de oficinas </w:t>
       </w:r>
-      <w:hyperlink r:id="rId36">
+      <w:hyperlink r:id="rId37">
         <w:r>
           <w:rPr>
             <w:rStyle w:val="Hipervnculo"/>
@@ -13278,6 +13715,7 @@
         <w:rPr>
           <w:rFonts w:ascii="Aptos" w:eastAsia="Aptos" w:hAnsi="Aptos" w:cs="Aptos"/>
         </w:rPr>
+        <w:lastRenderedPageBreak/>
         <w:t xml:space="preserve">Publicidad: folletos y carteles en universidades, anuncios en </w:t>
       </w:r>
       <w:r>
@@ -13476,22 +13914,22 @@
       <w:pPr>
         <w:pStyle w:val="Ttulo1"/>
       </w:pPr>
-      <w:bookmarkStart w:id="57" w:name="_Toc229424509"/>
+      <w:bookmarkStart w:id="59" w:name="_Toc229690674"/>
       <w:r>
         <w:lastRenderedPageBreak/>
         <w:t>Prevención de Riesgos Laborales</w:t>
       </w:r>
-      <w:bookmarkEnd w:id="57"/>
+      <w:bookmarkEnd w:id="59"/>
     </w:p>
     <w:p>
       <w:pPr>
         <w:pStyle w:val="Ttulo2"/>
       </w:pPr>
-      <w:bookmarkStart w:id="58" w:name="_Toc229424510"/>
+      <w:bookmarkStart w:id="60" w:name="_Toc229690675"/>
       <w:r>
         <w:t>Riesgos derivados de los espacio y equipos de trabajo</w:t>
       </w:r>
-      <w:bookmarkEnd w:id="58"/>
+      <w:bookmarkEnd w:id="60"/>
     </w:p>
     <w:p>
       <w:pPr>
@@ -13642,11 +14080,11 @@
       <w:pPr>
         <w:pStyle w:val="Ttulo2"/>
       </w:pPr>
-      <w:bookmarkStart w:id="59" w:name="_Toc229424511"/>
+      <w:bookmarkStart w:id="61" w:name="_Toc229690676"/>
       <w:r>
         <w:t>Agentes físicos</w:t>
       </w:r>
-      <w:bookmarkEnd w:id="59"/>
+      <w:bookmarkEnd w:id="61"/>
     </w:p>
     <w:p>
       <w:pPr>
@@ -14041,11 +14479,11 @@
       <w:pPr>
         <w:pStyle w:val="Ttulo2"/>
       </w:pPr>
-      <w:bookmarkStart w:id="60" w:name="_Toc229424512"/>
+      <w:bookmarkStart w:id="62" w:name="_Toc229690677"/>
       <w:r>
         <w:t>Riesgos ergonómicos y psicosociales</w:t>
       </w:r>
-      <w:bookmarkEnd w:id="60"/>
+      <w:bookmarkEnd w:id="62"/>
     </w:p>
     <w:p>
       <w:pPr>
@@ -14126,12 +14564,12 @@
       <w:pPr>
         <w:pStyle w:val="Ttulo1"/>
       </w:pPr>
-      <w:bookmarkStart w:id="61" w:name="_Toc229424513"/>
+      <w:bookmarkStart w:id="63" w:name="_Toc229690678"/>
       <w:r>
         <w:lastRenderedPageBreak/>
         <w:t>Bibliografía</w:t>
       </w:r>
-      <w:bookmarkEnd w:id="61"/>
+      <w:bookmarkEnd w:id="63"/>
     </w:p>
     <w:p>
       <w:pPr>
@@ -14250,7 +14688,7 @@
         </w:rPr>
         <w:t xml:space="preserve"> </w:t>
       </w:r>
-      <w:hyperlink r:id="rId37">
+      <w:hyperlink r:id="rId38">
         <w:r>
           <w:rPr>
             <w:rStyle w:val="Hipervnculo"/>
@@ -14292,7 +14730,7 @@
         </w:rPr>
         <w:t xml:space="preserve">IES Mutxamel. </w:t>
       </w:r>
-      <w:hyperlink r:id="rId38">
+      <w:hyperlink r:id="rId39">
         <w:r>
           <w:rPr>
             <w:rStyle w:val="Hipervnculo"/>
@@ -14334,7 +14772,7 @@
         </w:rPr>
         <w:t xml:space="preserve">IES Mutxamel. </w:t>
       </w:r>
-      <w:hyperlink r:id="rId39">
+      <w:hyperlink r:id="rId40">
         <w:r>
           <w:rPr>
             <w:rStyle w:val="Hipervnculo"/>
@@ -14368,7 +14806,7 @@
         </w:rPr>
         <w:t xml:space="preserve">. </w:t>
       </w:r>
-      <w:hyperlink r:id="rId40">
+      <w:hyperlink r:id="rId41">
         <w:r>
           <w:rPr>
             <w:rStyle w:val="Hipervnculo"/>
@@ -14380,8 +14818,8 @@
     </w:p>
     <w:p/>
     <w:sectPr>
-      <w:headerReference w:type="default" r:id="rId41"/>
-      <w:footerReference w:type="default" r:id="rId42"/>
+      <w:headerReference w:type="default" r:id="rId42"/>
+      <w:footerReference w:type="default" r:id="rId43"/>
       <w:pgSz w:w="11906" w:h="16838"/>
       <w:pgMar w:top="1440" w:right="1440" w:bottom="1440" w:left="1440" w:header="283" w:footer="720" w:gutter="0"/>
       <w:cols w:space="720"/>
@@ -18096,12 +18534,7 @@
 </file>
 
 <file path=customXml/item3.xml><?xml version="1.0" encoding="utf-8"?>
-<?mso-contentType ?>
-<FormTemplates xmlns="http://schemas.microsoft.com/sharepoint/v3/contenttype/forms">
-  <Display>DocumentLibraryForm</Display>
-  <Edit>DocumentLibraryForm</Edit>
-  <New>DocumentLibraryForm</New>
-</FormTemplates>
+<b:Sources xmlns:b="http://schemas.openxmlformats.org/officeDocument/2006/bibliography" xmlns="http://schemas.openxmlformats.org/officeDocument/2006/bibliography" SelectedStyle="\APASixthEditionOfficeOnline.xsl" StyleName="APA" Version="6"/>
 </file>
 
 <file path=customXml/item4.xml><?xml version="1.0" encoding="utf-8"?>
@@ -18255,7 +18688,12 @@
 </file>
 
 <file path=customXml/item5.xml><?xml version="1.0" encoding="utf-8"?>
-<b:Sources xmlns:b="http://schemas.openxmlformats.org/officeDocument/2006/bibliography" xmlns="http://schemas.openxmlformats.org/officeDocument/2006/bibliography" SelectedStyle="\APASixthEditionOfficeOnline.xsl" StyleName="APA" Version="6"/>
+<?mso-contentType ?>
+<FormTemplates xmlns="http://schemas.microsoft.com/sharepoint/v3/contenttype/forms">
+  <Display>DocumentLibraryForm</Display>
+  <Edit>DocumentLibraryForm</Edit>
+  <New>DocumentLibraryForm</New>
+</FormTemplates>
 </file>
 
 <file path=customXml/itemProps1.xml><?xml version="1.0" encoding="utf-8"?>
@@ -18277,9 +18715,9 @@
 </file>
 
 <file path=customXml/itemProps3.xml><?xml version="1.0" encoding="utf-8"?>
-<ds:datastoreItem xmlns:ds="http://schemas.openxmlformats.org/officeDocument/2006/customXml" ds:itemID="{9C62D19F-2C4B-4163-B98D-18BF5B309744}">
+<ds:datastoreItem xmlns:ds="http://schemas.openxmlformats.org/officeDocument/2006/customXml" ds:itemID="{84CA4A16-CE6B-4C64-8CA7-CF5CBE9EE313}">
   <ds:schemaRefs>
-    <ds:schemaRef ds:uri="http://schemas.microsoft.com/sharepoint/v3/contenttype/forms"/>
+    <ds:schemaRef ds:uri="http://schemas.openxmlformats.org/officeDocument/2006/bibliography"/>
   </ds:schemaRefs>
 </ds:datastoreItem>
 </file>
@@ -18303,9 +18741,9 @@
 </file>
 
 <file path=customXml/itemProps5.xml><?xml version="1.0" encoding="utf-8"?>
-<ds:datastoreItem xmlns:ds="http://schemas.openxmlformats.org/officeDocument/2006/customXml" ds:itemID="{84CA4A16-CE6B-4C64-8CA7-CF5CBE9EE313}">
+<ds:datastoreItem xmlns:ds="http://schemas.openxmlformats.org/officeDocument/2006/customXml" ds:itemID="{9C62D19F-2C4B-4163-B98D-18BF5B309744}">
   <ds:schemaRefs>
-    <ds:schemaRef ds:uri="http://schemas.openxmlformats.org/officeDocument/2006/bibliography"/>
+    <ds:schemaRef ds:uri="http://schemas.microsoft.com/sharepoint/v3/contenttype/forms"/>
   </ds:schemaRefs>
 </ds:datastoreItem>
 </file>
</xml_diff>

<commit_message>
Doc final acabada a falta de foto del Javafx
</commit_message>
<xml_diff>
--- a/Documentación_final.docx
+++ b/Documentación_final.docx
@@ -1577,7 +1577,7 @@
           <w:r>
             <w:fldChar w:fldCharType="separate"/>
           </w:r>
-          <w:hyperlink w:anchor="_Toc229690829" w:history="1">
+          <w:hyperlink w:anchor="_Toc229852050" w:history="1">
             <w:r>
               <w:rPr>
                 <w:rStyle w:val="Hipervnculo"/>
@@ -1621,7 +1621,7 @@
                 <w:noProof/>
                 <w:webHidden/>
               </w:rPr>
-              <w:instrText xml:space="preserve"> PAGEREF _Toc229690829 \h </w:instrText>
+              <w:instrText xml:space="preserve"> PAGEREF _Toc229852050 \h </w:instrText>
             </w:r>
             <w:r>
               <w:rPr>
@@ -1641,7 +1641,7 @@
                 <w:noProof/>
                 <w:webHidden/>
               </w:rPr>
-              <w:t>6</w:t>
+              <w:t>5</w:t>
             </w:r>
             <w:r>
               <w:rPr>
@@ -1666,7 +1666,7 @@
               <w14:ligatures w14:val="standardContextual"/>
             </w:rPr>
           </w:pPr>
-          <w:hyperlink w:anchor="_Toc229690830" w:history="1">
+          <w:hyperlink w:anchor="_Toc229852051" w:history="1">
             <w:r>
               <w:rPr>
                 <w:rStyle w:val="Hipervnculo"/>
@@ -1693,7 +1693,7 @@
                 <w:noProof/>
                 <w:webHidden/>
               </w:rPr>
-              <w:instrText xml:space="preserve"> PAGEREF _Toc229690830 \h </w:instrText>
+              <w:instrText xml:space="preserve"> PAGEREF _Toc229852051 \h </w:instrText>
             </w:r>
             <w:r>
               <w:rPr>
@@ -1713,7 +1713,7 @@
                 <w:noProof/>
                 <w:webHidden/>
               </w:rPr>
-              <w:t>6</w:t>
+              <w:t>5</w:t>
             </w:r>
             <w:r>
               <w:rPr>
@@ -1738,7 +1738,7 @@
               <w14:ligatures w14:val="standardContextual"/>
             </w:rPr>
           </w:pPr>
-          <w:hyperlink w:anchor="_Toc229690831" w:history="1">
+          <w:hyperlink w:anchor="_Toc229852052" w:history="1">
             <w:r>
               <w:rPr>
                 <w:rStyle w:val="Hipervnculo"/>
@@ -1765,7 +1765,7 @@
                 <w:noProof/>
                 <w:webHidden/>
               </w:rPr>
-              <w:instrText xml:space="preserve"> PAGEREF _Toc229690831 \h </w:instrText>
+              <w:instrText xml:space="preserve"> PAGEREF _Toc229852052 \h </w:instrText>
             </w:r>
             <w:r>
               <w:rPr>
@@ -1785,7 +1785,7 @@
                 <w:noProof/>
                 <w:webHidden/>
               </w:rPr>
-              <w:t>6</w:t>
+              <w:t>5</w:t>
             </w:r>
             <w:r>
               <w:rPr>
@@ -1810,7 +1810,7 @@
               <w14:ligatures w14:val="standardContextual"/>
             </w:rPr>
           </w:pPr>
-          <w:hyperlink w:anchor="_Toc229690832" w:history="1">
+          <w:hyperlink w:anchor="_Toc229852053" w:history="1">
             <w:r>
               <w:rPr>
                 <w:rStyle w:val="Hipervnculo"/>
@@ -1837,7 +1837,7 @@
                 <w:noProof/>
                 <w:webHidden/>
               </w:rPr>
-              <w:instrText xml:space="preserve"> PAGEREF _Toc229690832 \h </w:instrText>
+              <w:instrText xml:space="preserve"> PAGEREF _Toc229852053 \h </w:instrText>
             </w:r>
             <w:r>
               <w:rPr>
@@ -1857,7 +1857,7 @@
                 <w:noProof/>
                 <w:webHidden/>
               </w:rPr>
-              <w:t>6</w:t>
+              <w:t>5</w:t>
             </w:r>
             <w:r>
               <w:rPr>
@@ -1883,7 +1883,7 @@
               <w14:ligatures w14:val="standardContextual"/>
             </w:rPr>
           </w:pPr>
-          <w:hyperlink w:anchor="_Toc229690833" w:history="1">
+          <w:hyperlink w:anchor="_Toc229852054" w:history="1">
             <w:r>
               <w:rPr>
                 <w:rStyle w:val="Hipervnculo"/>
@@ -1927,7 +1927,7 @@
                 <w:noProof/>
                 <w:webHidden/>
               </w:rPr>
-              <w:instrText xml:space="preserve"> PAGEREF _Toc229690833 \h </w:instrText>
+              <w:instrText xml:space="preserve"> PAGEREF _Toc229852054 \h </w:instrText>
             </w:r>
             <w:r>
               <w:rPr>
@@ -1947,7 +1947,7 @@
                 <w:noProof/>
                 <w:webHidden/>
               </w:rPr>
-              <w:t>7</w:t>
+              <w:t>6</w:t>
             </w:r>
             <w:r>
               <w:rPr>
@@ -1972,7 +1972,7 @@
               <w14:ligatures w14:val="standardContextual"/>
             </w:rPr>
           </w:pPr>
-          <w:hyperlink w:anchor="_Toc229690834" w:history="1">
+          <w:hyperlink w:anchor="_Toc229852055" w:history="1">
             <w:r>
               <w:rPr>
                 <w:rStyle w:val="Hipervnculo"/>
@@ -1999,7 +1999,7 @@
                 <w:noProof/>
                 <w:webHidden/>
               </w:rPr>
-              <w:instrText xml:space="preserve"> PAGEREF _Toc229690834 \h </w:instrText>
+              <w:instrText xml:space="preserve"> PAGEREF _Toc229852055 \h </w:instrText>
             </w:r>
             <w:r>
               <w:rPr>
@@ -2019,7 +2019,7 @@
                 <w:noProof/>
                 <w:webHidden/>
               </w:rPr>
-              <w:t>7</w:t>
+              <w:t>6</w:t>
             </w:r>
             <w:r>
               <w:rPr>
@@ -2044,7 +2044,7 @@
               <w14:ligatures w14:val="standardContextual"/>
             </w:rPr>
           </w:pPr>
-          <w:hyperlink w:anchor="_Toc229690835" w:history="1">
+          <w:hyperlink w:anchor="_Toc229852056" w:history="1">
             <w:r>
               <w:rPr>
                 <w:rStyle w:val="Hipervnculo"/>
@@ -2071,7 +2071,7 @@
                 <w:noProof/>
                 <w:webHidden/>
               </w:rPr>
-              <w:instrText xml:space="preserve"> PAGEREF _Toc229690835 \h </w:instrText>
+              <w:instrText xml:space="preserve"> PAGEREF _Toc229852056 \h </w:instrText>
             </w:r>
             <w:r>
               <w:rPr>
@@ -2091,7 +2091,7 @@
                 <w:noProof/>
                 <w:webHidden/>
               </w:rPr>
-              <w:t>8</w:t>
+              <w:t>7</w:t>
             </w:r>
             <w:r>
               <w:rPr>
@@ -2116,7 +2116,7 @@
               <w14:ligatures w14:val="standardContextual"/>
             </w:rPr>
           </w:pPr>
-          <w:hyperlink w:anchor="_Toc229690836" w:history="1">
+          <w:hyperlink w:anchor="_Toc229852057" w:history="1">
             <w:r>
               <w:rPr>
                 <w:rStyle w:val="Hipervnculo"/>
@@ -2144,7 +2144,7 @@
                 <w:noProof/>
                 <w:webHidden/>
               </w:rPr>
-              <w:instrText xml:space="preserve"> PAGEREF _Toc229690836 \h </w:instrText>
+              <w:instrText xml:space="preserve"> PAGEREF _Toc229852057 \h </w:instrText>
             </w:r>
             <w:r>
               <w:rPr>
@@ -2164,7 +2164,7 @@
                 <w:noProof/>
                 <w:webHidden/>
               </w:rPr>
-              <w:t>9</w:t>
+              <w:t>8</w:t>
             </w:r>
             <w:r>
               <w:rPr>
@@ -2190,7 +2190,7 @@
               <w14:ligatures w14:val="standardContextual"/>
             </w:rPr>
           </w:pPr>
-          <w:hyperlink w:anchor="_Toc229690837" w:history="1">
+          <w:hyperlink w:anchor="_Toc229852058" w:history="1">
             <w:r>
               <w:rPr>
                 <w:rStyle w:val="Hipervnculo"/>
@@ -2234,7 +2234,7 @@
                 <w:noProof/>
                 <w:webHidden/>
               </w:rPr>
-              <w:instrText xml:space="preserve"> PAGEREF _Toc229690837 \h </w:instrText>
+              <w:instrText xml:space="preserve"> PAGEREF _Toc229852058 \h </w:instrText>
             </w:r>
             <w:r>
               <w:rPr>
@@ -2254,7 +2254,7 @@
                 <w:noProof/>
                 <w:webHidden/>
               </w:rPr>
-              <w:t>10</w:t>
+              <w:t>9</w:t>
             </w:r>
             <w:r>
               <w:rPr>
@@ -2279,7 +2279,7 @@
               <w14:ligatures w14:val="standardContextual"/>
             </w:rPr>
           </w:pPr>
-          <w:hyperlink w:anchor="_Toc229690838" w:history="1">
+          <w:hyperlink w:anchor="_Toc229852059" w:history="1">
             <w:r>
               <w:rPr>
                 <w:rStyle w:val="Hipervnculo"/>
@@ -2306,7 +2306,7 @@
                 <w:noProof/>
                 <w:webHidden/>
               </w:rPr>
-              <w:instrText xml:space="preserve"> PAGEREF _Toc229690838 \h </w:instrText>
+              <w:instrText xml:space="preserve"> PAGEREF _Toc229852059 \h </w:instrText>
             </w:r>
             <w:r>
               <w:rPr>
@@ -2326,7 +2326,7 @@
                 <w:noProof/>
                 <w:webHidden/>
               </w:rPr>
-              <w:t>10</w:t>
+              <w:t>9</w:t>
             </w:r>
             <w:r>
               <w:rPr>
@@ -2351,7 +2351,7 @@
               <w14:ligatures w14:val="standardContextual"/>
             </w:rPr>
           </w:pPr>
-          <w:hyperlink w:anchor="_Toc229690839" w:history="1">
+          <w:hyperlink w:anchor="_Toc229852060" w:history="1">
             <w:r>
               <w:rPr>
                 <w:rStyle w:val="Hipervnculo"/>
@@ -2378,7 +2378,7 @@
                 <w:noProof/>
                 <w:webHidden/>
               </w:rPr>
-              <w:instrText xml:space="preserve"> PAGEREF _Toc229690839 \h </w:instrText>
+              <w:instrText xml:space="preserve"> PAGEREF _Toc229852060 \h </w:instrText>
             </w:r>
             <w:r>
               <w:rPr>
@@ -2398,7 +2398,7 @@
                 <w:noProof/>
                 <w:webHidden/>
               </w:rPr>
-              <w:t>11</w:t>
+              <w:t>10</w:t>
             </w:r>
             <w:r>
               <w:rPr>
@@ -2423,7 +2423,7 @@
               <w14:ligatures w14:val="standardContextual"/>
             </w:rPr>
           </w:pPr>
-          <w:hyperlink w:anchor="_Toc229690840" w:history="1">
+          <w:hyperlink w:anchor="_Toc229852061" w:history="1">
             <w:r>
               <w:rPr>
                 <w:rStyle w:val="Hipervnculo"/>
@@ -2450,7 +2450,7 @@
                 <w:noProof/>
                 <w:webHidden/>
               </w:rPr>
-              <w:instrText xml:space="preserve"> PAGEREF _Toc229690840 \h </w:instrText>
+              <w:instrText xml:space="preserve"> PAGEREF _Toc229852061 \h </w:instrText>
             </w:r>
             <w:r>
               <w:rPr>
@@ -2470,7 +2470,7 @@
                 <w:noProof/>
                 <w:webHidden/>
               </w:rPr>
-              <w:t>12</w:t>
+              <w:t>11</w:t>
             </w:r>
             <w:r>
               <w:rPr>
@@ -2495,7 +2495,7 @@
               <w14:ligatures w14:val="standardContextual"/>
             </w:rPr>
           </w:pPr>
-          <w:hyperlink w:anchor="_Toc229690841" w:history="1">
+          <w:hyperlink w:anchor="_Toc229852062" w:history="1">
             <w:r>
               <w:rPr>
                 <w:rStyle w:val="Hipervnculo"/>
@@ -2522,7 +2522,7 @@
                 <w:noProof/>
                 <w:webHidden/>
               </w:rPr>
-              <w:instrText xml:space="preserve"> PAGEREF _Toc229690841 \h </w:instrText>
+              <w:instrText xml:space="preserve"> PAGEREF _Toc229852062 \h </w:instrText>
             </w:r>
             <w:r>
               <w:rPr>
@@ -2542,7 +2542,7 @@
                 <w:noProof/>
                 <w:webHidden/>
               </w:rPr>
-              <w:t>13</w:t>
+              <w:t>12</w:t>
             </w:r>
             <w:r>
               <w:rPr>
@@ -2567,7 +2567,7 @@
               <w14:ligatures w14:val="standardContextual"/>
             </w:rPr>
           </w:pPr>
-          <w:hyperlink w:anchor="_Toc229690842" w:history="1">
+          <w:hyperlink w:anchor="_Toc229852063" w:history="1">
             <w:r>
               <w:rPr>
                 <w:rStyle w:val="Hipervnculo"/>
@@ -2594,7 +2594,7 @@
                 <w:noProof/>
                 <w:webHidden/>
               </w:rPr>
-              <w:instrText xml:space="preserve"> PAGEREF _Toc229690842 \h </w:instrText>
+              <w:instrText xml:space="preserve"> PAGEREF _Toc229852063 \h </w:instrText>
             </w:r>
             <w:r>
               <w:rPr>
@@ -2614,7 +2614,7 @@
                 <w:noProof/>
                 <w:webHidden/>
               </w:rPr>
-              <w:t>13</w:t>
+              <w:t>12</w:t>
             </w:r>
             <w:r>
               <w:rPr>
@@ -2639,7 +2639,7 @@
               <w14:ligatures w14:val="standardContextual"/>
             </w:rPr>
           </w:pPr>
-          <w:hyperlink w:anchor="_Toc229690843" w:history="1">
+          <w:hyperlink w:anchor="_Toc229852064" w:history="1">
             <w:r>
               <w:rPr>
                 <w:rStyle w:val="Hipervnculo"/>
@@ -2666,7 +2666,7 @@
                 <w:noProof/>
                 <w:webHidden/>
               </w:rPr>
-              <w:instrText xml:space="preserve"> PAGEREF _Toc229690843 \h </w:instrText>
+              <w:instrText xml:space="preserve"> PAGEREF _Toc229852064 \h </w:instrText>
             </w:r>
             <w:r>
               <w:rPr>
@@ -2686,7 +2686,7 @@
                 <w:noProof/>
                 <w:webHidden/>
               </w:rPr>
-              <w:t>14</w:t>
+              <w:t>13</w:t>
             </w:r>
             <w:r>
               <w:rPr>
@@ -2712,7 +2712,7 @@
               <w14:ligatures w14:val="standardContextual"/>
             </w:rPr>
           </w:pPr>
-          <w:hyperlink w:anchor="_Toc229690844" w:history="1">
+          <w:hyperlink w:anchor="_Toc229852065" w:history="1">
             <w:r>
               <w:rPr>
                 <w:rStyle w:val="Hipervnculo"/>
@@ -2756,7 +2756,7 @@
                 <w:noProof/>
                 <w:webHidden/>
               </w:rPr>
-              <w:instrText xml:space="preserve"> PAGEREF _Toc229690844 \h </w:instrText>
+              <w:instrText xml:space="preserve"> PAGEREF _Toc229852065 \h </w:instrText>
             </w:r>
             <w:r>
               <w:rPr>
@@ -2776,7 +2776,7 @@
                 <w:noProof/>
                 <w:webHidden/>
               </w:rPr>
-              <w:t>16</w:t>
+              <w:t>15</w:t>
             </w:r>
             <w:r>
               <w:rPr>
@@ -2801,7 +2801,7 @@
               <w14:ligatures w14:val="standardContextual"/>
             </w:rPr>
           </w:pPr>
-          <w:hyperlink w:anchor="_Toc229690845" w:history="1">
+          <w:hyperlink w:anchor="_Toc229852066" w:history="1">
             <w:r>
               <w:rPr>
                 <w:rStyle w:val="Hipervnculo"/>
@@ -2828,7 +2828,7 @@
                 <w:noProof/>
                 <w:webHidden/>
               </w:rPr>
-              <w:instrText xml:space="preserve"> PAGEREF _Toc229690845 \h </w:instrText>
+              <w:instrText xml:space="preserve"> PAGEREF _Toc229852066 \h </w:instrText>
             </w:r>
             <w:r>
               <w:rPr>
@@ -2848,7 +2848,7 @@
                 <w:noProof/>
                 <w:webHidden/>
               </w:rPr>
-              <w:t>16</w:t>
+              <w:t>15</w:t>
             </w:r>
             <w:r>
               <w:rPr>
@@ -2873,7 +2873,7 @@
               <w14:ligatures w14:val="standardContextual"/>
             </w:rPr>
           </w:pPr>
-          <w:hyperlink w:anchor="_Toc229690846" w:history="1">
+          <w:hyperlink w:anchor="_Toc229852067" w:history="1">
             <w:r>
               <w:rPr>
                 <w:rStyle w:val="Hipervnculo"/>
@@ -2900,7 +2900,7 @@
                 <w:noProof/>
                 <w:webHidden/>
               </w:rPr>
-              <w:instrText xml:space="preserve"> PAGEREF _Toc229690846 \h </w:instrText>
+              <w:instrText xml:space="preserve"> PAGEREF _Toc229852067 \h </w:instrText>
             </w:r>
             <w:r>
               <w:rPr>
@@ -2920,7 +2920,7 @@
                 <w:noProof/>
                 <w:webHidden/>
               </w:rPr>
-              <w:t>17</w:t>
+              <w:t>16</w:t>
             </w:r>
             <w:r>
               <w:rPr>
@@ -2945,7 +2945,7 @@
               <w14:ligatures w14:val="standardContextual"/>
             </w:rPr>
           </w:pPr>
-          <w:hyperlink w:anchor="_Toc229690847" w:history="1">
+          <w:hyperlink w:anchor="_Toc229852068" w:history="1">
             <w:r>
               <w:rPr>
                 <w:rStyle w:val="Hipervnculo"/>
@@ -2972,7 +2972,7 @@
                 <w:noProof/>
                 <w:webHidden/>
               </w:rPr>
-              <w:instrText xml:space="preserve"> PAGEREF _Toc229690847 \h </w:instrText>
+              <w:instrText xml:space="preserve"> PAGEREF _Toc229852068 \h </w:instrText>
             </w:r>
             <w:r>
               <w:rPr>
@@ -2992,7 +2992,7 @@
                 <w:noProof/>
                 <w:webHidden/>
               </w:rPr>
-              <w:t>18</w:t>
+              <w:t>17</w:t>
             </w:r>
             <w:r>
               <w:rPr>
@@ -3017,7 +3017,7 @@
               <w14:ligatures w14:val="standardContextual"/>
             </w:rPr>
           </w:pPr>
-          <w:hyperlink w:anchor="_Toc229690848" w:history="1">
+          <w:hyperlink w:anchor="_Toc229852069" w:history="1">
             <w:r>
               <w:rPr>
                 <w:rStyle w:val="Hipervnculo"/>
@@ -3044,7 +3044,7 @@
                 <w:noProof/>
                 <w:webHidden/>
               </w:rPr>
-              <w:instrText xml:space="preserve"> PAGEREF _Toc229690848 \h </w:instrText>
+              <w:instrText xml:space="preserve"> PAGEREF _Toc229852069 \h </w:instrText>
             </w:r>
             <w:r>
               <w:rPr>
@@ -3064,7 +3064,7 @@
                 <w:noProof/>
                 <w:webHidden/>
               </w:rPr>
-              <w:t>19</w:t>
+              <w:t>18</w:t>
             </w:r>
             <w:r>
               <w:rPr>
@@ -3090,7 +3090,7 @@
               <w14:ligatures w14:val="standardContextual"/>
             </w:rPr>
           </w:pPr>
-          <w:hyperlink w:anchor="_Toc229690849" w:history="1">
+          <w:hyperlink w:anchor="_Toc229852070" w:history="1">
             <w:r>
               <w:rPr>
                 <w:rStyle w:val="Hipervnculo"/>
@@ -3134,7 +3134,7 @@
                 <w:noProof/>
                 <w:webHidden/>
               </w:rPr>
-              <w:instrText xml:space="preserve"> PAGEREF _Toc229690849 \h </w:instrText>
+              <w:instrText xml:space="preserve"> PAGEREF _Toc229852070 \h </w:instrText>
             </w:r>
             <w:r>
               <w:rPr>
@@ -3154,7 +3154,7 @@
                 <w:noProof/>
                 <w:webHidden/>
               </w:rPr>
-              <w:t>21</w:t>
+              <w:t>20</w:t>
             </w:r>
             <w:r>
               <w:rPr>
@@ -3179,7 +3179,7 @@
               <w14:ligatures w14:val="standardContextual"/>
             </w:rPr>
           </w:pPr>
-          <w:hyperlink w:anchor="_Toc229690850" w:history="1">
+          <w:hyperlink w:anchor="_Toc229852071" w:history="1">
             <w:r>
               <w:rPr>
                 <w:rStyle w:val="Hipervnculo"/>
@@ -3206,7 +3206,7 @@
                 <w:noProof/>
                 <w:webHidden/>
               </w:rPr>
-              <w:instrText xml:space="preserve"> PAGEREF _Toc229690850 \h </w:instrText>
+              <w:instrText xml:space="preserve"> PAGEREF _Toc229852071 \h </w:instrText>
             </w:r>
             <w:r>
               <w:rPr>
@@ -3226,7 +3226,7 @@
                 <w:noProof/>
                 <w:webHidden/>
               </w:rPr>
-              <w:t>21</w:t>
+              <w:t>20</w:t>
             </w:r>
             <w:r>
               <w:rPr>
@@ -3251,7 +3251,7 @@
               <w14:ligatures w14:val="standardContextual"/>
             </w:rPr>
           </w:pPr>
-          <w:hyperlink w:anchor="_Toc229690851" w:history="1">
+          <w:hyperlink w:anchor="_Toc229852072" w:history="1">
             <w:r>
               <w:rPr>
                 <w:rStyle w:val="Hipervnculo"/>
@@ -3278,7 +3278,7 @@
                 <w:noProof/>
                 <w:webHidden/>
               </w:rPr>
-              <w:instrText xml:space="preserve"> PAGEREF _Toc229690851 \h </w:instrText>
+              <w:instrText xml:space="preserve"> PAGEREF _Toc229852072 \h </w:instrText>
             </w:r>
             <w:r>
               <w:rPr>
@@ -3298,7 +3298,7 @@
                 <w:noProof/>
                 <w:webHidden/>
               </w:rPr>
-              <w:t>21</w:t>
+              <w:t>20</w:t>
             </w:r>
             <w:r>
               <w:rPr>
@@ -3323,7 +3323,7 @@
               <w14:ligatures w14:val="standardContextual"/>
             </w:rPr>
           </w:pPr>
-          <w:hyperlink w:anchor="_Toc229690852" w:history="1">
+          <w:hyperlink w:anchor="_Toc229852073" w:history="1">
             <w:r>
               <w:rPr>
                 <w:rStyle w:val="Hipervnculo"/>
@@ -3350,7 +3350,7 @@
                 <w:noProof/>
                 <w:webHidden/>
               </w:rPr>
-              <w:instrText xml:space="preserve"> PAGEREF _Toc229690852 \h </w:instrText>
+              <w:instrText xml:space="preserve"> PAGEREF _Toc229852073 \h </w:instrText>
             </w:r>
             <w:r>
               <w:rPr>
@@ -3370,7 +3370,7 @@
                 <w:noProof/>
                 <w:webHidden/>
               </w:rPr>
-              <w:t>21</w:t>
+              <w:t>20</w:t>
             </w:r>
             <w:r>
               <w:rPr>
@@ -3396,7 +3396,7 @@
               <w14:ligatures w14:val="standardContextual"/>
             </w:rPr>
           </w:pPr>
-          <w:hyperlink w:anchor="_Toc229690853" w:history="1">
+          <w:hyperlink w:anchor="_Toc229852074" w:history="1">
             <w:r>
               <w:rPr>
                 <w:rStyle w:val="Hipervnculo"/>
@@ -3440,7 +3440,7 @@
                 <w:noProof/>
                 <w:webHidden/>
               </w:rPr>
-              <w:instrText xml:space="preserve"> PAGEREF _Toc229690853 \h </w:instrText>
+              <w:instrText xml:space="preserve"> PAGEREF _Toc229852074 \h </w:instrText>
             </w:r>
             <w:r>
               <w:rPr>
@@ -3485,7 +3485,7 @@
               <w14:ligatures w14:val="standardContextual"/>
             </w:rPr>
           </w:pPr>
-          <w:hyperlink w:anchor="_Toc229690854" w:history="1">
+          <w:hyperlink w:anchor="_Toc229852075" w:history="1">
             <w:r>
               <w:rPr>
                 <w:rStyle w:val="Hipervnculo"/>
@@ -3512,7 +3512,7 @@
                 <w:noProof/>
                 <w:webHidden/>
               </w:rPr>
-              <w:instrText xml:space="preserve"> PAGEREF _Toc229690854 \h </w:instrText>
+              <w:instrText xml:space="preserve"> PAGEREF _Toc229852075 \h </w:instrText>
             </w:r>
             <w:r>
               <w:rPr>
@@ -3557,7 +3557,7 @@
               <w14:ligatures w14:val="standardContextual"/>
             </w:rPr>
           </w:pPr>
-          <w:hyperlink w:anchor="_Toc229690855" w:history="1">
+          <w:hyperlink w:anchor="_Toc229852076" w:history="1">
             <w:r>
               <w:rPr>
                 <w:rStyle w:val="Hipervnculo"/>
@@ -3584,7 +3584,7 @@
                 <w:noProof/>
                 <w:webHidden/>
               </w:rPr>
-              <w:instrText xml:space="preserve"> PAGEREF _Toc229690855 \h </w:instrText>
+              <w:instrText xml:space="preserve"> PAGEREF _Toc229852076 \h </w:instrText>
             </w:r>
             <w:r>
               <w:rPr>
@@ -3604,7 +3604,7 @@
                 <w:noProof/>
                 <w:webHidden/>
               </w:rPr>
-              <w:t>28</w:t>
+              <w:t>27</w:t>
             </w:r>
             <w:r>
               <w:rPr>
@@ -3629,7 +3629,7 @@
               <w14:ligatures w14:val="standardContextual"/>
             </w:rPr>
           </w:pPr>
-          <w:hyperlink w:anchor="_Toc229690856" w:history="1">
+          <w:hyperlink w:anchor="_Toc229852077" w:history="1">
             <w:r>
               <w:rPr>
                 <w:rStyle w:val="Hipervnculo"/>
@@ -3656,7 +3656,7 @@
                 <w:noProof/>
                 <w:webHidden/>
               </w:rPr>
-              <w:instrText xml:space="preserve"> PAGEREF _Toc229690856 \h </w:instrText>
+              <w:instrText xml:space="preserve"> PAGEREF _Toc229852077 \h </w:instrText>
             </w:r>
             <w:r>
               <w:rPr>
@@ -3676,7 +3676,7 @@
                 <w:noProof/>
                 <w:webHidden/>
               </w:rPr>
-              <w:t>30</w:t>
+              <w:t>31</w:t>
             </w:r>
             <w:r>
               <w:rPr>
@@ -3702,7 +3702,7 @@
               <w14:ligatures w14:val="standardContextual"/>
             </w:rPr>
           </w:pPr>
-          <w:hyperlink w:anchor="_Toc229690857" w:history="1">
+          <w:hyperlink w:anchor="_Toc229852078" w:history="1">
             <w:r>
               <w:rPr>
                 <w:rStyle w:val="Hipervnculo"/>
@@ -3746,7 +3746,7 @@
                 <w:noProof/>
                 <w:webHidden/>
               </w:rPr>
-              <w:instrText xml:space="preserve"> PAGEREF _Toc229690857 \h </w:instrText>
+              <w:instrText xml:space="preserve"> PAGEREF _Toc229852078 \h </w:instrText>
             </w:r>
             <w:r>
               <w:rPr>
@@ -3766,7 +3766,7 @@
                 <w:noProof/>
                 <w:webHidden/>
               </w:rPr>
-              <w:t>30</w:t>
+              <w:t>31</w:t>
             </w:r>
             <w:r>
               <w:rPr>
@@ -3791,7 +3791,7 @@
               <w14:ligatures w14:val="standardContextual"/>
             </w:rPr>
           </w:pPr>
-          <w:hyperlink w:anchor="_Toc229690858" w:history="1">
+          <w:hyperlink w:anchor="_Toc229852079" w:history="1">
             <w:r>
               <w:rPr>
                 <w:rStyle w:val="Hipervnculo"/>
@@ -3818,7 +3818,7 @@
                 <w:noProof/>
                 <w:webHidden/>
               </w:rPr>
-              <w:instrText xml:space="preserve"> PAGEREF _Toc229690858 \h </w:instrText>
+              <w:instrText xml:space="preserve"> PAGEREF _Toc229852079 \h </w:instrText>
             </w:r>
             <w:r>
               <w:rPr>
@@ -3838,7 +3838,7 @@
                 <w:noProof/>
                 <w:webHidden/>
               </w:rPr>
-              <w:t>30</w:t>
+              <w:t>31</w:t>
             </w:r>
             <w:r>
               <w:rPr>
@@ -3863,7 +3863,7 @@
               <w14:ligatures w14:val="standardContextual"/>
             </w:rPr>
           </w:pPr>
-          <w:hyperlink w:anchor="_Toc229690859" w:history="1">
+          <w:hyperlink w:anchor="_Toc229852080" w:history="1">
             <w:r>
               <w:rPr>
                 <w:rStyle w:val="Hipervnculo"/>
@@ -3890,7 +3890,7 @@
                 <w:noProof/>
                 <w:webHidden/>
               </w:rPr>
-              <w:instrText xml:space="preserve"> PAGEREF _Toc229690859 \h </w:instrText>
+              <w:instrText xml:space="preserve"> PAGEREF _Toc229852080 \h </w:instrText>
             </w:r>
             <w:r>
               <w:rPr>
@@ -3910,7 +3910,7 @@
                 <w:noProof/>
                 <w:webHidden/>
               </w:rPr>
-              <w:t>30</w:t>
+              <w:t>31</w:t>
             </w:r>
             <w:r>
               <w:rPr>
@@ -3936,7 +3936,7 @@
               <w14:ligatures w14:val="standardContextual"/>
             </w:rPr>
           </w:pPr>
-          <w:hyperlink w:anchor="_Toc229690860" w:history="1">
+          <w:hyperlink w:anchor="_Toc229852081" w:history="1">
             <w:r>
               <w:rPr>
                 <w:rStyle w:val="Hipervnculo"/>
@@ -3980,7 +3980,7 @@
                 <w:noProof/>
                 <w:webHidden/>
               </w:rPr>
-              <w:instrText xml:space="preserve"> PAGEREF _Toc229690860 \h </w:instrText>
+              <w:instrText xml:space="preserve"> PAGEREF _Toc229852081 \h </w:instrText>
             </w:r>
             <w:r>
               <w:rPr>
@@ -4000,7 +4000,7 @@
                 <w:noProof/>
                 <w:webHidden/>
               </w:rPr>
-              <w:t>31</w:t>
+              <w:t>32</w:t>
             </w:r>
             <w:r>
               <w:rPr>
@@ -4025,7 +4025,7 @@
               <w14:ligatures w14:val="standardContextual"/>
             </w:rPr>
           </w:pPr>
-          <w:hyperlink w:anchor="_Toc229690861" w:history="1">
+          <w:hyperlink w:anchor="_Toc229852082" w:history="1">
             <w:r>
               <w:rPr>
                 <w:rStyle w:val="Hipervnculo"/>
@@ -4052,7 +4052,7 @@
                 <w:noProof/>
                 <w:webHidden/>
               </w:rPr>
-              <w:instrText xml:space="preserve"> PAGEREF _Toc229690861 \h </w:instrText>
+              <w:instrText xml:space="preserve"> PAGEREF _Toc229852082 \h </w:instrText>
             </w:r>
             <w:r>
               <w:rPr>
@@ -4072,7 +4072,7 @@
                 <w:noProof/>
                 <w:webHidden/>
               </w:rPr>
-              <w:t>31</w:t>
+              <w:t>32</w:t>
             </w:r>
             <w:r>
               <w:rPr>
@@ -4097,7 +4097,7 @@
               <w14:ligatures w14:val="standardContextual"/>
             </w:rPr>
           </w:pPr>
-          <w:hyperlink w:anchor="_Toc229690862" w:history="1">
+          <w:hyperlink w:anchor="_Toc229852083" w:history="1">
             <w:r>
               <w:rPr>
                 <w:rStyle w:val="Hipervnculo"/>
@@ -4124,7 +4124,7 @@
                 <w:noProof/>
                 <w:webHidden/>
               </w:rPr>
-              <w:instrText xml:space="preserve"> PAGEREF _Toc229690862 \h </w:instrText>
+              <w:instrText xml:space="preserve"> PAGEREF _Toc229852083 \h </w:instrText>
             </w:r>
             <w:r>
               <w:rPr>
@@ -4144,7 +4144,7 @@
                 <w:noProof/>
                 <w:webHidden/>
               </w:rPr>
-              <w:t>31</w:t>
+              <w:t>32</w:t>
             </w:r>
             <w:r>
               <w:rPr>
@@ -4169,7 +4169,7 @@
               <w14:ligatures w14:val="standardContextual"/>
             </w:rPr>
           </w:pPr>
-          <w:hyperlink w:anchor="_Toc229690863" w:history="1">
+          <w:hyperlink w:anchor="_Toc229852084" w:history="1">
             <w:r>
               <w:rPr>
                 <w:rStyle w:val="Hipervnculo"/>
@@ -4196,7 +4196,7 @@
                 <w:noProof/>
                 <w:webHidden/>
               </w:rPr>
-              <w:instrText xml:space="preserve"> PAGEREF _Toc229690863 \h </w:instrText>
+              <w:instrText xml:space="preserve"> PAGEREF _Toc229852084 \h </w:instrText>
             </w:r>
             <w:r>
               <w:rPr>
@@ -4216,7 +4216,7 @@
                 <w:noProof/>
                 <w:webHidden/>
               </w:rPr>
-              <w:t>31</w:t>
+              <w:t>32</w:t>
             </w:r>
             <w:r>
               <w:rPr>
@@ -4242,7 +4242,7 @@
               <w14:ligatures w14:val="standardContextual"/>
             </w:rPr>
           </w:pPr>
-          <w:hyperlink w:anchor="_Toc229690864" w:history="1">
+          <w:hyperlink w:anchor="_Toc229852085" w:history="1">
             <w:r>
               <w:rPr>
                 <w:rStyle w:val="Hipervnculo"/>
@@ -4286,7 +4286,7 @@
                 <w:noProof/>
                 <w:webHidden/>
               </w:rPr>
-              <w:instrText xml:space="preserve"> PAGEREF _Toc229690864 \h </w:instrText>
+              <w:instrText xml:space="preserve"> PAGEREF _Toc229852085 \h </w:instrText>
             </w:r>
             <w:r>
               <w:rPr>
@@ -4306,7 +4306,7 @@
                 <w:noProof/>
                 <w:webHidden/>
               </w:rPr>
-              <w:t>33</w:t>
+              <w:t>34</w:t>
             </w:r>
             <w:r>
               <w:rPr>
@@ -4331,7 +4331,7 @@
               <w14:ligatures w14:val="standardContextual"/>
             </w:rPr>
           </w:pPr>
-          <w:hyperlink w:anchor="_Toc229690865" w:history="1">
+          <w:hyperlink w:anchor="_Toc229852086" w:history="1">
             <w:r>
               <w:rPr>
                 <w:rStyle w:val="Hipervnculo"/>
@@ -4358,7 +4358,7 @@
                 <w:noProof/>
                 <w:webHidden/>
               </w:rPr>
-              <w:instrText xml:space="preserve"> PAGEREF _Toc229690865 \h </w:instrText>
+              <w:instrText xml:space="preserve"> PAGEREF _Toc229852086 \h </w:instrText>
             </w:r>
             <w:r>
               <w:rPr>
@@ -4378,7 +4378,7 @@
                 <w:noProof/>
                 <w:webHidden/>
               </w:rPr>
-              <w:t>33</w:t>
+              <w:t>34</w:t>
             </w:r>
             <w:r>
               <w:rPr>
@@ -4403,7 +4403,7 @@
               <w14:ligatures w14:val="standardContextual"/>
             </w:rPr>
           </w:pPr>
-          <w:hyperlink w:anchor="_Toc229690866" w:history="1">
+          <w:hyperlink w:anchor="_Toc229852087" w:history="1">
             <w:r>
               <w:rPr>
                 <w:rStyle w:val="Hipervnculo"/>
@@ -4430,7 +4430,7 @@
                 <w:noProof/>
                 <w:webHidden/>
               </w:rPr>
-              <w:instrText xml:space="preserve"> PAGEREF _Toc229690866 \h </w:instrText>
+              <w:instrText xml:space="preserve"> PAGEREF _Toc229852087 \h </w:instrText>
             </w:r>
             <w:r>
               <w:rPr>
@@ -4450,7 +4450,7 @@
                 <w:noProof/>
                 <w:webHidden/>
               </w:rPr>
-              <w:t>33</w:t>
+              <w:t>34</w:t>
             </w:r>
             <w:r>
               <w:rPr>
@@ -4475,7 +4475,7 @@
               <w14:ligatures w14:val="standardContextual"/>
             </w:rPr>
           </w:pPr>
-          <w:hyperlink w:anchor="_Toc229690867" w:history="1">
+          <w:hyperlink w:anchor="_Toc229852088" w:history="1">
             <w:r>
               <w:rPr>
                 <w:rStyle w:val="Hipervnculo"/>
@@ -4502,7 +4502,7 @@
                 <w:noProof/>
                 <w:webHidden/>
               </w:rPr>
-              <w:instrText xml:space="preserve"> PAGEREF _Toc229690867 \h </w:instrText>
+              <w:instrText xml:space="preserve"> PAGEREF _Toc229852088 \h </w:instrText>
             </w:r>
             <w:r>
               <w:rPr>
@@ -4522,7 +4522,7 @@
                 <w:noProof/>
                 <w:webHidden/>
               </w:rPr>
-              <w:t>34</w:t>
+              <w:t>35</w:t>
             </w:r>
             <w:r>
               <w:rPr>
@@ -4548,7 +4548,7 @@
               <w14:ligatures w14:val="standardContextual"/>
             </w:rPr>
           </w:pPr>
-          <w:hyperlink w:anchor="_Toc229690868" w:history="1">
+          <w:hyperlink w:anchor="_Toc229852089" w:history="1">
             <w:r>
               <w:rPr>
                 <w:rStyle w:val="Hipervnculo"/>
@@ -4592,7 +4592,7 @@
                 <w:noProof/>
                 <w:webHidden/>
               </w:rPr>
-              <w:instrText xml:space="preserve"> PAGEREF _Toc229690868 \h </w:instrText>
+              <w:instrText xml:space="preserve"> PAGEREF _Toc229852089 \h </w:instrText>
             </w:r>
             <w:r>
               <w:rPr>
@@ -4612,7 +4612,7 @@
                 <w:noProof/>
                 <w:webHidden/>
               </w:rPr>
-              <w:t>34</w:t>
+              <w:t>35</w:t>
             </w:r>
             <w:r>
               <w:rPr>
@@ -4637,7 +4637,7 @@
               <w14:ligatures w14:val="standardContextual"/>
             </w:rPr>
           </w:pPr>
-          <w:hyperlink w:anchor="_Toc229690869" w:history="1">
+          <w:hyperlink w:anchor="_Toc229852090" w:history="1">
             <w:r>
               <w:rPr>
                 <w:rStyle w:val="Hipervnculo"/>
@@ -4664,7 +4664,7 @@
                 <w:noProof/>
                 <w:webHidden/>
               </w:rPr>
-              <w:instrText xml:space="preserve"> PAGEREF _Toc229690869 \h </w:instrText>
+              <w:instrText xml:space="preserve"> PAGEREF _Toc229852090 \h </w:instrText>
             </w:r>
             <w:r>
               <w:rPr>
@@ -4684,7 +4684,7 @@
                 <w:noProof/>
                 <w:webHidden/>
               </w:rPr>
-              <w:t>34</w:t>
+              <w:t>35</w:t>
             </w:r>
             <w:r>
               <w:rPr>
@@ -4709,7 +4709,7 @@
               <w14:ligatures w14:val="standardContextual"/>
             </w:rPr>
           </w:pPr>
-          <w:hyperlink w:anchor="_Toc229690870" w:history="1">
+          <w:hyperlink w:anchor="_Toc229852091" w:history="1">
             <w:r>
               <w:rPr>
                 <w:rStyle w:val="Hipervnculo"/>
@@ -4736,7 +4736,7 @@
                 <w:noProof/>
                 <w:webHidden/>
               </w:rPr>
-              <w:instrText xml:space="preserve"> PAGEREF _Toc229690870 \h </w:instrText>
+              <w:instrText xml:space="preserve"> PAGEREF _Toc229852091 \h </w:instrText>
             </w:r>
             <w:r>
               <w:rPr>
@@ -4756,7 +4756,7 @@
                 <w:noProof/>
                 <w:webHidden/>
               </w:rPr>
-              <w:t>35</w:t>
+              <w:t>36</w:t>
             </w:r>
             <w:r>
               <w:rPr>
@@ -4782,7 +4782,7 @@
               <w14:ligatures w14:val="standardContextual"/>
             </w:rPr>
           </w:pPr>
-          <w:hyperlink w:anchor="_Toc229690871" w:history="1">
+          <w:hyperlink w:anchor="_Toc229852092" w:history="1">
             <w:r>
               <w:rPr>
                 <w:rStyle w:val="Hipervnculo"/>
@@ -4826,7 +4826,7 @@
                 <w:noProof/>
                 <w:webHidden/>
               </w:rPr>
-              <w:instrText xml:space="preserve"> PAGEREF _Toc229690871 \h </w:instrText>
+              <w:instrText xml:space="preserve"> PAGEREF _Toc229852092 \h </w:instrText>
             </w:r>
             <w:r>
               <w:rPr>
@@ -4846,7 +4846,7 @@
                 <w:noProof/>
                 <w:webHidden/>
               </w:rPr>
-              <w:t>36</w:t>
+              <w:t>37</w:t>
             </w:r>
             <w:r>
               <w:rPr>
@@ -4914,7 +4914,7 @@
       <w:r>
         <w:fldChar w:fldCharType="separate"/>
       </w:r>
-      <w:hyperlink w:anchor="_Toc229690872" w:history="1">
+      <w:hyperlink w:anchor="_Toc229852093" w:history="1">
         <w:r>
           <w:rPr>
             <w:rStyle w:val="Hipervnculo"/>
@@ -4941,7 +4941,7 @@
             <w:noProof/>
             <w:webHidden/>
           </w:rPr>
-          <w:instrText xml:space="preserve"> PAGEREF _Toc229690872 \h </w:instrText>
+          <w:instrText xml:space="preserve"> PAGEREF _Toc229852093 \h </w:instrText>
         </w:r>
         <w:r>
           <w:rPr>
@@ -4961,7 +4961,7 @@
             <w:noProof/>
             <w:webHidden/>
           </w:rPr>
-          <w:t>10</w:t>
+          <w:t>9</w:t>
         </w:r>
         <w:r>
           <w:rPr>
@@ -4986,7 +4986,7 @@
           <w14:ligatures w14:val="standardContextual"/>
         </w:rPr>
       </w:pPr>
-      <w:hyperlink w:anchor="_Toc229690873" w:history="1">
+      <w:hyperlink w:anchor="_Toc229852094" w:history="1">
         <w:r>
           <w:rPr>
             <w:rStyle w:val="Hipervnculo"/>
@@ -5013,7 +5013,7 @@
             <w:noProof/>
             <w:webHidden/>
           </w:rPr>
-          <w:instrText xml:space="preserve"> PAGEREF _Toc229690873 \h </w:instrText>
+          <w:instrText xml:space="preserve"> PAGEREF _Toc229852094 \h </w:instrText>
         </w:r>
         <w:r>
           <w:rPr>
@@ -5033,7 +5033,7 @@
             <w:noProof/>
             <w:webHidden/>
           </w:rPr>
-          <w:t>11</w:t>
+          <w:t>10</w:t>
         </w:r>
         <w:r>
           <w:rPr>
@@ -5058,7 +5058,7 @@
           <w14:ligatures w14:val="standardContextual"/>
         </w:rPr>
       </w:pPr>
-      <w:hyperlink w:anchor="_Toc229690874" w:history="1">
+      <w:hyperlink w:anchor="_Toc229852095" w:history="1">
         <w:r>
           <w:rPr>
             <w:rStyle w:val="Hipervnculo"/>
@@ -5085,7 +5085,7 @@
             <w:noProof/>
             <w:webHidden/>
           </w:rPr>
-          <w:instrText xml:space="preserve"> PAGEREF _Toc229690874 \h </w:instrText>
+          <w:instrText xml:space="preserve"> PAGEREF _Toc229852095 \h </w:instrText>
         </w:r>
         <w:r>
           <w:rPr>
@@ -5105,7 +5105,7 @@
             <w:noProof/>
             <w:webHidden/>
           </w:rPr>
-          <w:t>12</w:t>
+          <w:t>11</w:t>
         </w:r>
         <w:r>
           <w:rPr>
@@ -5130,7 +5130,7 @@
           <w14:ligatures w14:val="standardContextual"/>
         </w:rPr>
       </w:pPr>
-      <w:hyperlink w:anchor="_Toc229690875" w:history="1">
+      <w:hyperlink w:anchor="_Toc229852096" w:history="1">
         <w:r>
           <w:rPr>
             <w:rStyle w:val="Hipervnculo"/>
@@ -5157,7 +5157,7 @@
             <w:noProof/>
             <w:webHidden/>
           </w:rPr>
-          <w:instrText xml:space="preserve"> PAGEREF _Toc229690875 \h </w:instrText>
+          <w:instrText xml:space="preserve"> PAGEREF _Toc229852096 \h </w:instrText>
         </w:r>
         <w:r>
           <w:rPr>
@@ -5177,7 +5177,7 @@
             <w:noProof/>
             <w:webHidden/>
           </w:rPr>
-          <w:t>13</w:t>
+          <w:t>12</w:t>
         </w:r>
         <w:r>
           <w:rPr>
@@ -5202,7 +5202,7 @@
           <w14:ligatures w14:val="standardContextual"/>
         </w:rPr>
       </w:pPr>
-      <w:hyperlink w:anchor="_Toc229690876" w:history="1">
+      <w:hyperlink w:anchor="_Toc229852097" w:history="1">
         <w:r>
           <w:rPr>
             <w:rStyle w:val="Hipervnculo"/>
@@ -5229,7 +5229,7 @@
             <w:noProof/>
             <w:webHidden/>
           </w:rPr>
-          <w:instrText xml:space="preserve"> PAGEREF _Toc229690876 \h </w:instrText>
+          <w:instrText xml:space="preserve"> PAGEREF _Toc229852097 \h </w:instrText>
         </w:r>
         <w:r>
           <w:rPr>
@@ -5249,7 +5249,7 @@
             <w:noProof/>
             <w:webHidden/>
           </w:rPr>
-          <w:t>18</w:t>
+          <w:t>17</w:t>
         </w:r>
         <w:r>
           <w:rPr>
@@ -5274,7 +5274,7 @@
           <w14:ligatures w14:val="standardContextual"/>
         </w:rPr>
       </w:pPr>
-      <w:hyperlink w:anchor="_Toc229690877" w:history="1">
+      <w:hyperlink w:anchor="_Toc229852098" w:history="1">
         <w:r>
           <w:rPr>
             <w:rStyle w:val="Hipervnculo"/>
@@ -5301,7 +5301,7 @@
             <w:noProof/>
             <w:webHidden/>
           </w:rPr>
-          <w:instrText xml:space="preserve"> PAGEREF _Toc229690877 \h </w:instrText>
+          <w:instrText xml:space="preserve"> PAGEREF _Toc229852098 \h </w:instrText>
         </w:r>
         <w:r>
           <w:rPr>
@@ -5321,7 +5321,7 @@
             <w:noProof/>
             <w:webHidden/>
           </w:rPr>
-          <w:t>18</w:t>
+          <w:t>17</w:t>
         </w:r>
         <w:r>
           <w:rPr>
@@ -5346,7 +5346,7 @@
           <w14:ligatures w14:val="standardContextual"/>
         </w:rPr>
       </w:pPr>
-      <w:hyperlink w:anchor="_Toc229690878" w:history="1">
+      <w:hyperlink w:anchor="_Toc229852099" w:history="1">
         <w:r>
           <w:rPr>
             <w:rStyle w:val="Hipervnculo"/>
@@ -5373,7 +5373,7 @@
             <w:noProof/>
             <w:webHidden/>
           </w:rPr>
-          <w:instrText xml:space="preserve"> PAGEREF _Toc229690878 \h </w:instrText>
+          <w:instrText xml:space="preserve"> PAGEREF _Toc229852099 \h </w:instrText>
         </w:r>
         <w:r>
           <w:rPr>
@@ -5393,7 +5393,7 @@
             <w:noProof/>
             <w:webHidden/>
           </w:rPr>
-          <w:t>19</w:t>
+          <w:t>18</w:t>
         </w:r>
         <w:r>
           <w:rPr>
@@ -5418,7 +5418,7 @@
           <w14:ligatures w14:val="standardContextual"/>
         </w:rPr>
       </w:pPr>
-      <w:hyperlink w:anchor="_Toc229690879" w:history="1">
+      <w:hyperlink w:anchor="_Toc229852100" w:history="1">
         <w:r>
           <w:rPr>
             <w:rStyle w:val="Hipervnculo"/>
@@ -5445,7 +5445,7 @@
             <w:noProof/>
             <w:webHidden/>
           </w:rPr>
-          <w:instrText xml:space="preserve"> PAGEREF _Toc229690879 \h </w:instrText>
+          <w:instrText xml:space="preserve"> PAGEREF _Toc229852100 \h </w:instrText>
         </w:r>
         <w:r>
           <w:rPr>
@@ -5465,7 +5465,7 @@
             <w:noProof/>
             <w:webHidden/>
           </w:rPr>
-          <w:t>20</w:t>
+          <w:t>19</w:t>
         </w:r>
         <w:r>
           <w:rPr>
@@ -5490,7 +5490,7 @@
           <w14:ligatures w14:val="standardContextual"/>
         </w:rPr>
       </w:pPr>
-      <w:hyperlink w:anchor="_Toc229690880" w:history="1">
+      <w:hyperlink w:anchor="_Toc229852101" w:history="1">
         <w:r>
           <w:rPr>
             <w:rStyle w:val="Hipervnculo"/>
@@ -5517,7 +5517,7 @@
             <w:noProof/>
             <w:webHidden/>
           </w:rPr>
-          <w:instrText xml:space="preserve"> PAGEREF _Toc229690880 \h </w:instrText>
+          <w:instrText xml:space="preserve"> PAGEREF _Toc229852101 \h </w:instrText>
         </w:r>
         <w:r>
           <w:rPr>
@@ -5537,7 +5537,7 @@
             <w:noProof/>
             <w:webHidden/>
           </w:rPr>
-          <w:t>22</w:t>
+          <w:t>21</w:t>
         </w:r>
         <w:r>
           <w:rPr>
@@ -5562,7 +5562,7 @@
           <w14:ligatures w14:val="standardContextual"/>
         </w:rPr>
       </w:pPr>
-      <w:hyperlink w:anchor="_Toc229690881" w:history="1">
+      <w:hyperlink w:anchor="_Toc229852102" w:history="1">
         <w:r>
           <w:rPr>
             <w:rStyle w:val="Hipervnculo"/>
@@ -5589,7 +5589,7 @@
             <w:noProof/>
             <w:webHidden/>
           </w:rPr>
-          <w:instrText xml:space="preserve"> PAGEREF _Toc229690881 \h </w:instrText>
+          <w:instrText xml:space="preserve"> PAGEREF _Toc229852102 \h </w:instrText>
         </w:r>
         <w:r>
           <w:rPr>
@@ -5609,7 +5609,7 @@
             <w:noProof/>
             <w:webHidden/>
           </w:rPr>
-          <w:t>22</w:t>
+          <w:t>21</w:t>
         </w:r>
         <w:r>
           <w:rPr>
@@ -5634,7 +5634,7 @@
           <w14:ligatures w14:val="standardContextual"/>
         </w:rPr>
       </w:pPr>
-      <w:hyperlink w:anchor="_Toc229690882" w:history="1">
+      <w:hyperlink w:anchor="_Toc229852103" w:history="1">
         <w:r>
           <w:rPr>
             <w:rStyle w:val="Hipervnculo"/>
@@ -5661,7 +5661,7 @@
             <w:noProof/>
             <w:webHidden/>
           </w:rPr>
-          <w:instrText xml:space="preserve"> PAGEREF _Toc229690882 \h </w:instrText>
+          <w:instrText xml:space="preserve"> PAGEREF _Toc229852103 \h </w:instrText>
         </w:r>
         <w:r>
           <w:rPr>
@@ -5681,7 +5681,7 @@
             <w:noProof/>
             <w:webHidden/>
           </w:rPr>
-          <w:t>22</w:t>
+          <w:t>21</w:t>
         </w:r>
         <w:r>
           <w:rPr>
@@ -5706,7 +5706,7 @@
           <w14:ligatures w14:val="standardContextual"/>
         </w:rPr>
       </w:pPr>
-      <w:hyperlink w:anchor="_Toc229690883" w:history="1">
+      <w:hyperlink w:anchor="_Toc229852104" w:history="1">
         <w:r>
           <w:rPr>
             <w:rStyle w:val="Hipervnculo"/>
@@ -5742,7 +5742,7 @@
             <w:noProof/>
             <w:webHidden/>
           </w:rPr>
-          <w:instrText xml:space="preserve"> PAGEREF _Toc229690883 \h </w:instrText>
+          <w:instrText xml:space="preserve"> PAGEREF _Toc229852104 \h </w:instrText>
         </w:r>
         <w:r>
           <w:rPr>
@@ -5762,7 +5762,7 @@
             <w:noProof/>
             <w:webHidden/>
           </w:rPr>
-          <w:t>23</w:t>
+          <w:t>22</w:t>
         </w:r>
         <w:r>
           <w:rPr>
@@ -5787,13 +5787,13 @@
           <w14:ligatures w14:val="standardContextual"/>
         </w:rPr>
       </w:pPr>
-      <w:hyperlink w:anchor="_Toc229690884" w:history="1">
+      <w:hyperlink w:anchor="_Toc229852105" w:history="1">
         <w:r>
           <w:rPr>
             <w:rStyle w:val="Hipervnculo"/>
             <w:noProof/>
           </w:rPr>
-          <w:t>13 Método conexión a BD</w:t>
+          <w:t>13 Botón de solicitar cita</w:t>
         </w:r>
         <w:r>
           <w:rPr>
@@ -5814,7 +5814,7 @@
             <w:noProof/>
             <w:webHidden/>
           </w:rPr>
-          <w:instrText xml:space="preserve"> PAGEREF _Toc229690884 \h </w:instrText>
+          <w:instrText xml:space="preserve"> PAGEREF _Toc229852105 \h </w:instrText>
         </w:r>
         <w:r>
           <w:rPr>
@@ -5834,7 +5834,7 @@
             <w:noProof/>
             <w:webHidden/>
           </w:rPr>
-          <w:t>24</w:t>
+          <w:t>22</w:t>
         </w:r>
         <w:r>
           <w:rPr>
@@ -5859,13 +5859,13 @@
           <w14:ligatures w14:val="standardContextual"/>
         </w:rPr>
       </w:pPr>
-      <w:hyperlink w:anchor="_Toc229690885" w:history="1">
+      <w:hyperlink w:anchor="_Toc229852106" w:history="1">
         <w:r>
           <w:rPr>
             <w:rStyle w:val="Hipervnculo"/>
             <w:noProof/>
           </w:rPr>
-          <w:t>14  Reconocimiento facial 2/3</w:t>
+          <w:t>14 Método usado para crear habitación</w:t>
         </w:r>
         <w:r>
           <w:rPr>
@@ -5886,7 +5886,7 @@
             <w:noProof/>
             <w:webHidden/>
           </w:rPr>
-          <w:instrText xml:space="preserve"> PAGEREF _Toc229690885 \h </w:instrText>
+          <w:instrText xml:space="preserve"> PAGEREF _Toc229852106 \h </w:instrText>
         </w:r>
         <w:r>
           <w:rPr>
@@ -5906,7 +5906,7 @@
             <w:noProof/>
             <w:webHidden/>
           </w:rPr>
-          <w:t>25</w:t>
+          <w:t>23</w:t>
         </w:r>
         <w:r>
           <w:rPr>
@@ -5931,13 +5931,13 @@
           <w14:ligatures w14:val="standardContextual"/>
         </w:rPr>
       </w:pPr>
-      <w:hyperlink w:anchor="_Toc229690886" w:history="1">
+      <w:hyperlink w:anchor="_Toc229852107" w:history="1">
         <w:r>
           <w:rPr>
             <w:rStyle w:val="Hipervnculo"/>
             <w:noProof/>
           </w:rPr>
-          <w:t>15 Reconocimiento facial 1/3</w:t>
+          <w:t>15 Método conexión a BD</w:t>
         </w:r>
         <w:r>
           <w:rPr>
@@ -5958,7 +5958,7 @@
             <w:noProof/>
             <w:webHidden/>
           </w:rPr>
-          <w:instrText xml:space="preserve"> PAGEREF _Toc229690886 \h </w:instrText>
+          <w:instrText xml:space="preserve"> PAGEREF _Toc229852107 \h </w:instrText>
         </w:r>
         <w:r>
           <w:rPr>
@@ -5978,7 +5978,7 @@
             <w:noProof/>
             <w:webHidden/>
           </w:rPr>
-          <w:t>25</w:t>
+          <w:t>24</w:t>
         </w:r>
         <w:r>
           <w:rPr>
@@ -6003,13 +6003,13 @@
           <w14:ligatures w14:val="standardContextual"/>
         </w:rPr>
       </w:pPr>
-      <w:hyperlink w:anchor="_Toc229690887" w:history="1">
+      <w:hyperlink w:anchor="_Toc229852108" w:history="1">
         <w:r>
           <w:rPr>
             <w:rStyle w:val="Hipervnculo"/>
             <w:noProof/>
           </w:rPr>
-          <w:t>16  Reconocimiento facial 3/3</w:t>
+          <w:t>16  Reconocimiento facial 2/3</w:t>
         </w:r>
         <w:r>
           <w:rPr>
@@ -6030,7 +6030,7 @@
             <w:noProof/>
             <w:webHidden/>
           </w:rPr>
-          <w:instrText xml:space="preserve"> PAGEREF _Toc229690887 \h </w:instrText>
+          <w:instrText xml:space="preserve"> PAGEREF _Toc229852108 \h </w:instrText>
         </w:r>
         <w:r>
           <w:rPr>
@@ -6050,7 +6050,7 @@
             <w:noProof/>
             <w:webHidden/>
           </w:rPr>
-          <w:t>26</w:t>
+          <w:t>25</w:t>
         </w:r>
         <w:r>
           <w:rPr>
@@ -6075,13 +6075,13 @@
           <w14:ligatures w14:val="standardContextual"/>
         </w:rPr>
       </w:pPr>
-      <w:hyperlink w:anchor="_Toc229690888" w:history="1">
+      <w:hyperlink w:anchor="_Toc229852109" w:history="1">
         <w:r>
           <w:rPr>
             <w:rStyle w:val="Hipervnculo"/>
             <w:noProof/>
           </w:rPr>
-          <w:t>17 Creación de cuenta</w:t>
+          <w:t>17 Reconocimiento facial 1/3</w:t>
         </w:r>
         <w:r>
           <w:rPr>
@@ -6102,7 +6102,7 @@
             <w:noProof/>
             <w:webHidden/>
           </w:rPr>
-          <w:instrText xml:space="preserve"> PAGEREF _Toc229690888 \h </w:instrText>
+          <w:instrText xml:space="preserve"> PAGEREF _Toc229852109 \h </w:instrText>
         </w:r>
         <w:r>
           <w:rPr>
@@ -6122,7 +6122,7 @@
             <w:noProof/>
             <w:webHidden/>
           </w:rPr>
-          <w:t>28</w:t>
+          <w:t>25</w:t>
         </w:r>
         <w:r>
           <w:rPr>
@@ -6147,13 +6147,13 @@
           <w14:ligatures w14:val="standardContextual"/>
         </w:rPr>
       </w:pPr>
-      <w:hyperlink w:anchor="_Toc229690889" w:history="1">
+      <w:hyperlink w:anchor="_Toc229852110" w:history="1">
         <w:r>
           <w:rPr>
             <w:rStyle w:val="Hipervnculo"/>
             <w:noProof/>
           </w:rPr>
-          <w:t>18 Inicio de sesión</w:t>
+          <w:t>18  Reconocimiento facial 3/3</w:t>
         </w:r>
         <w:r>
           <w:rPr>
@@ -6174,7 +6174,7 @@
             <w:noProof/>
             <w:webHidden/>
           </w:rPr>
-          <w:instrText xml:space="preserve"> PAGEREF _Toc229690889 \h </w:instrText>
+          <w:instrText xml:space="preserve"> PAGEREF _Toc229852110 \h </w:instrText>
         </w:r>
         <w:r>
           <w:rPr>
@@ -6194,6 +6194,150 @@
             <w:noProof/>
             <w:webHidden/>
           </w:rPr>
+          <w:t>26</w:t>
+        </w:r>
+        <w:r>
+          <w:rPr>
+            <w:noProof/>
+            <w:webHidden/>
+          </w:rPr>
+          <w:fldChar w:fldCharType="end"/>
+        </w:r>
+      </w:hyperlink>
+    </w:p>
+    <w:p>
+      <w:pPr>
+        <w:pStyle w:val="Tabladeilustraciones"/>
+        <w:tabs>
+          <w:tab w:val="right" w:leader="dot" w:pos="9016"/>
+        </w:tabs>
+        <w:rPr>
+          <w:rFonts w:eastAsiaTheme="minorEastAsia"/>
+          <w:noProof/>
+          <w:kern w:val="2"/>
+          <w:lang w:eastAsia="es-ES"/>
+          <w14:ligatures w14:val="standardContextual"/>
+        </w:rPr>
+      </w:pPr>
+      <w:hyperlink w:anchor="_Toc229852111" w:history="1">
+        <w:r>
+          <w:rPr>
+            <w:rStyle w:val="Hipervnculo"/>
+            <w:noProof/>
+          </w:rPr>
+          <w:t>19 Creación de cuenta</w:t>
+        </w:r>
+        <w:r>
+          <w:rPr>
+            <w:noProof/>
+            <w:webHidden/>
+          </w:rPr>
+          <w:tab/>
+        </w:r>
+        <w:r>
+          <w:rPr>
+            <w:noProof/>
+            <w:webHidden/>
+          </w:rPr>
+          <w:fldChar w:fldCharType="begin"/>
+        </w:r>
+        <w:r>
+          <w:rPr>
+            <w:noProof/>
+            <w:webHidden/>
+          </w:rPr>
+          <w:instrText xml:space="preserve"> PAGEREF _Toc229852111 \h </w:instrText>
+        </w:r>
+        <w:r>
+          <w:rPr>
+            <w:noProof/>
+            <w:webHidden/>
+          </w:rPr>
+        </w:r>
+        <w:r>
+          <w:rPr>
+            <w:noProof/>
+            <w:webHidden/>
+          </w:rPr>
+          <w:fldChar w:fldCharType="separate"/>
+        </w:r>
+        <w:r>
+          <w:rPr>
+            <w:noProof/>
+            <w:webHidden/>
+          </w:rPr>
+          <w:t>28</w:t>
+        </w:r>
+        <w:r>
+          <w:rPr>
+            <w:noProof/>
+            <w:webHidden/>
+          </w:rPr>
+          <w:fldChar w:fldCharType="end"/>
+        </w:r>
+      </w:hyperlink>
+    </w:p>
+    <w:p>
+      <w:pPr>
+        <w:pStyle w:val="Tabladeilustraciones"/>
+        <w:tabs>
+          <w:tab w:val="right" w:leader="dot" w:pos="9016"/>
+        </w:tabs>
+        <w:rPr>
+          <w:rFonts w:eastAsiaTheme="minorEastAsia"/>
+          <w:noProof/>
+          <w:kern w:val="2"/>
+          <w:lang w:eastAsia="es-ES"/>
+          <w14:ligatures w14:val="standardContextual"/>
+        </w:rPr>
+      </w:pPr>
+      <w:hyperlink w:anchor="_Toc229852112" w:history="1">
+        <w:r>
+          <w:rPr>
+            <w:rStyle w:val="Hipervnculo"/>
+            <w:noProof/>
+          </w:rPr>
+          <w:t>20 Inicio de sesión</w:t>
+        </w:r>
+        <w:r>
+          <w:rPr>
+            <w:noProof/>
+            <w:webHidden/>
+          </w:rPr>
+          <w:tab/>
+        </w:r>
+        <w:r>
+          <w:rPr>
+            <w:noProof/>
+            <w:webHidden/>
+          </w:rPr>
+          <w:fldChar w:fldCharType="begin"/>
+        </w:r>
+        <w:r>
+          <w:rPr>
+            <w:noProof/>
+            <w:webHidden/>
+          </w:rPr>
+          <w:instrText xml:space="preserve"> PAGEREF _Toc229852112 \h </w:instrText>
+        </w:r>
+        <w:r>
+          <w:rPr>
+            <w:noProof/>
+            <w:webHidden/>
+          </w:rPr>
+        </w:r>
+        <w:r>
+          <w:rPr>
+            <w:noProof/>
+            <w:webHidden/>
+          </w:rPr>
+          <w:fldChar w:fldCharType="separate"/>
+        </w:r>
+        <w:r>
+          <w:rPr>
+            <w:noProof/>
+            <w:webHidden/>
+          </w:rPr>
           <w:t>29</w:t>
         </w:r>
         <w:r>
@@ -6206,17 +6350,166 @@
       </w:hyperlink>
     </w:p>
     <w:p>
+      <w:pPr>
+        <w:pStyle w:val="Tabladeilustraciones"/>
+        <w:tabs>
+          <w:tab w:val="right" w:leader="dot" w:pos="9016"/>
+        </w:tabs>
+        <w:rPr>
+          <w:rFonts w:eastAsiaTheme="minorEastAsia"/>
+          <w:noProof/>
+          <w:kern w:val="2"/>
+          <w:lang w:eastAsia="es-ES"/>
+          <w14:ligatures w14:val="standardContextual"/>
+        </w:rPr>
+      </w:pPr>
+      <w:hyperlink w:anchor="_Toc229852113" w:history="1">
+        <w:r>
+          <w:rPr>
+            <w:rStyle w:val="Hipervnculo"/>
+            <w:noProof/>
+          </w:rPr>
+          <w:t>21 Página búsqueda</w:t>
+        </w:r>
+        <w:r>
+          <w:rPr>
+            <w:noProof/>
+            <w:webHidden/>
+          </w:rPr>
+          <w:tab/>
+        </w:r>
+        <w:r>
+          <w:rPr>
+            <w:noProof/>
+            <w:webHidden/>
+          </w:rPr>
+          <w:fldChar w:fldCharType="begin"/>
+        </w:r>
+        <w:r>
+          <w:rPr>
+            <w:noProof/>
+            <w:webHidden/>
+          </w:rPr>
+          <w:instrText xml:space="preserve"> PAGEREF _Toc229852113 \h </w:instrText>
+        </w:r>
+        <w:r>
+          <w:rPr>
+            <w:noProof/>
+            <w:webHidden/>
+          </w:rPr>
+        </w:r>
+        <w:r>
+          <w:rPr>
+            <w:noProof/>
+            <w:webHidden/>
+          </w:rPr>
+          <w:fldChar w:fldCharType="separate"/>
+        </w:r>
+        <w:r>
+          <w:rPr>
+            <w:noProof/>
+            <w:webHidden/>
+          </w:rPr>
+          <w:t>30</w:t>
+        </w:r>
+        <w:r>
+          <w:rPr>
+            <w:noProof/>
+            <w:webHidden/>
+          </w:rPr>
+          <w:fldChar w:fldCharType="end"/>
+        </w:r>
+      </w:hyperlink>
+    </w:p>
+    <w:p>
+      <w:pPr>
+        <w:pStyle w:val="Tabladeilustraciones"/>
+        <w:tabs>
+          <w:tab w:val="right" w:leader="dot" w:pos="9016"/>
+        </w:tabs>
+        <w:rPr>
+          <w:rFonts w:eastAsiaTheme="minorEastAsia"/>
+          <w:noProof/>
+          <w:kern w:val="2"/>
+          <w:lang w:eastAsia="es-ES"/>
+          <w14:ligatures w14:val="standardContextual"/>
+        </w:rPr>
+      </w:pPr>
+      <w:hyperlink w:anchor="_Toc229852114" w:history="1">
+        <w:r>
+          <w:rPr>
+            <w:rStyle w:val="Hipervnculo"/>
+            <w:noProof/>
+          </w:rPr>
+          <w:t>22 Modal búsqueda</w:t>
+        </w:r>
+        <w:r>
+          <w:rPr>
+            <w:noProof/>
+            <w:webHidden/>
+          </w:rPr>
+          <w:tab/>
+        </w:r>
+        <w:r>
+          <w:rPr>
+            <w:noProof/>
+            <w:webHidden/>
+          </w:rPr>
+          <w:fldChar w:fldCharType="begin"/>
+        </w:r>
+        <w:r>
+          <w:rPr>
+            <w:noProof/>
+            <w:webHidden/>
+          </w:rPr>
+          <w:instrText xml:space="preserve"> PAGEREF _Toc229852114 \h </w:instrText>
+        </w:r>
+        <w:r>
+          <w:rPr>
+            <w:noProof/>
+            <w:webHidden/>
+          </w:rPr>
+        </w:r>
+        <w:r>
+          <w:rPr>
+            <w:noProof/>
+            <w:webHidden/>
+          </w:rPr>
+          <w:fldChar w:fldCharType="separate"/>
+        </w:r>
+        <w:r>
+          <w:rPr>
+            <w:noProof/>
+            <w:webHidden/>
+          </w:rPr>
+          <w:t>30</w:t>
+        </w:r>
+        <w:r>
+          <w:rPr>
+            <w:noProof/>
+            <w:webHidden/>
+          </w:rPr>
+          <w:fldChar w:fldCharType="end"/>
+        </w:r>
+      </w:hyperlink>
+    </w:p>
+    <w:p>
       <w:r>
         <w:fldChar w:fldCharType="end"/>
       </w:r>
     </w:p>
     <w:p>
+      <w:r>
+        <w:br w:type="page"/>
+      </w:r>
+    </w:p>
+    <w:p/>
+    <w:p>
       <w:pPr>
         <w:pStyle w:val="Ttulo1"/>
       </w:pPr>
-      <w:bookmarkStart w:id="0" w:name="_Toc229690829"/>
-      <w:r>
-        <w:lastRenderedPageBreak/>
+      <w:bookmarkStart w:id="0" w:name="_Toc229852050"/>
+      <w:r>
         <w:t>Introducción</w:t>
       </w:r>
       <w:bookmarkEnd w:id="0"/>
@@ -6225,7 +6518,7 @@
       <w:pPr>
         <w:pStyle w:val="Ttulo2"/>
       </w:pPr>
-      <w:bookmarkStart w:id="1" w:name="_Toc229690830"/>
+      <w:bookmarkStart w:id="1" w:name="_Toc229852051"/>
       <w:r>
         <w:t>Objetivo del proyecto</w:t>
       </w:r>
@@ -6264,7 +6557,7 @@
         <w:pStyle w:val="Ttulo2"/>
         <w:jc w:val="both"/>
       </w:pPr>
-      <w:bookmarkStart w:id="2" w:name="_Toc229690831"/>
+      <w:bookmarkStart w:id="2" w:name="_Toc229852052"/>
       <w:r>
         <w:t>Justificación del proyecto</w:t>
       </w:r>
@@ -6375,7 +6668,7 @@
         <w:pStyle w:val="Ttulo2"/>
         <w:jc w:val="both"/>
       </w:pPr>
-      <w:bookmarkStart w:id="3" w:name="_Toc229690832"/>
+      <w:bookmarkStart w:id="3" w:name="_Toc229852053"/>
       <w:r>
         <w:t>Análisis de lo existente</w:t>
       </w:r>
@@ -6444,7 +6737,7 @@
       <w:pPr>
         <w:pStyle w:val="Ttulo1"/>
       </w:pPr>
-      <w:bookmarkStart w:id="4" w:name="_Toc229690833"/>
+      <w:bookmarkStart w:id="4" w:name="_Toc229852054"/>
       <w:r>
         <w:t xml:space="preserve">Requisitos Funcionales de la </w:t>
       </w:r>
@@ -6499,7 +6792,7 @@
       <w:pPr>
         <w:pStyle w:val="Ttulo2"/>
       </w:pPr>
-      <w:bookmarkStart w:id="5" w:name="_Toc229690834"/>
+      <w:bookmarkStart w:id="5" w:name="_Toc229852055"/>
       <w:r>
         <w:t>Inquilino</w:t>
       </w:r>
@@ -6948,7 +7241,15 @@
           <w:b/>
           <w:bCs/>
         </w:rPr>
-        <w:t xml:space="preserve"> (M) Contacto: </w:t>
+        <w:t xml:space="preserve"> </w:t>
+      </w:r>
+      <w:r>
+        <w:rPr>
+          <w:rFonts w:ascii="Aptos" w:eastAsia="Aptos" w:hAnsi="Aptos" w:cs="Aptos"/>
+          <w:b/>
+          <w:bCs/>
+        </w:rPr>
+        <w:t xml:space="preserve">(M) Contacto: </w:t>
       </w:r>
       <w:r>
         <w:rPr>
@@ -7123,7 +7424,7 @@
       <w:pPr>
         <w:pStyle w:val="Ttulo2"/>
       </w:pPr>
-      <w:bookmarkStart w:id="6" w:name="_Toc229690835"/>
+      <w:bookmarkStart w:id="6" w:name="_Toc229852056"/>
       <w:r>
         <w:t>Arrendador</w:t>
       </w:r>
@@ -7858,7 +8159,7 @@
           <w:rFonts w:eastAsia="Aptos"/>
         </w:rPr>
       </w:pPr>
-      <w:bookmarkStart w:id="7" w:name="_Toc229690836"/>
+      <w:bookmarkStart w:id="7" w:name="_Toc229852057"/>
       <w:r>
         <w:rPr>
           <w:rFonts w:eastAsia="Aptos"/>
@@ -8019,7 +8320,7 @@
       <w:pPr>
         <w:pStyle w:val="Ttulo1"/>
       </w:pPr>
-      <w:bookmarkStart w:id="8" w:name="_Toc229690837"/>
+      <w:bookmarkStart w:id="8" w:name="_Toc229852058"/>
       <w:r>
         <w:t>Análisis y Diseño</w:t>
       </w:r>
@@ -8030,7 +8331,7 @@
         <w:pStyle w:val="Ttulo2"/>
       </w:pPr>
       <w:bookmarkStart w:id="9" w:name="_Toc225415558"/>
-      <w:bookmarkStart w:id="10" w:name="_Toc229690838"/>
+      <w:bookmarkStart w:id="10" w:name="_Toc229852059"/>
       <w:r>
         <w:t>Diagrama de Arquitectura</w:t>
       </w:r>
@@ -8093,7 +8394,7 @@
         <w:pStyle w:val="Descripcin"/>
       </w:pPr>
       <w:fldSimple w:instr=" SEQ Ilustración \* ARABIC ">
-        <w:bookmarkStart w:id="11" w:name="_Toc229690872"/>
+        <w:bookmarkStart w:id="11" w:name="_Toc229852093"/>
         <w:r>
           <w:rPr>
             <w:noProof/>
@@ -8174,7 +8475,7 @@
       <w:pPr>
         <w:pStyle w:val="Ttulo2"/>
       </w:pPr>
-      <w:bookmarkStart w:id="12" w:name="_Toc229690839"/>
+      <w:bookmarkStart w:id="12" w:name="_Toc229852060"/>
       <w:r>
         <w:lastRenderedPageBreak/>
         <w:t xml:space="preserve">Diagrama </w:t>
@@ -8183,14 +8484,6 @@
         <w:t>de casos de uso</w:t>
       </w:r>
       <w:bookmarkEnd w:id="12"/>
-    </w:p>
-    <w:p>
-      <w:pPr>
-        <w:keepNext/>
-        <w:rPr>
-          <w:noProof/>
-        </w:rPr>
-      </w:pPr>
     </w:p>
     <w:p>
       <w:pPr>
@@ -8257,7 +8550,7 @@
         <w:pStyle w:val="Descripcin"/>
       </w:pPr>
       <w:fldSimple w:instr=" SEQ Ilustración \* ARABIC ">
-        <w:bookmarkStart w:id="13" w:name="_Toc229690873"/>
+        <w:bookmarkStart w:id="13" w:name="_Toc229852094"/>
         <w:r>
           <w:rPr>
             <w:noProof/>
@@ -8296,7 +8589,7 @@
       <w:pPr>
         <w:pStyle w:val="Ttulo2"/>
       </w:pPr>
-      <w:bookmarkStart w:id="14" w:name="_Toc229690840"/>
+      <w:bookmarkStart w:id="14" w:name="_Toc229852061"/>
       <w:r>
         <w:lastRenderedPageBreak/>
         <w:t>Diagrama de clases</w:t>
@@ -8312,7 +8605,7 @@
           <w:noProof/>
         </w:rPr>
         <w:drawing>
-          <wp:inline distT="0" distB="0" distL="0" distR="0" wp14:anchorId="67E3B4D2" wp14:editId="2DBFD28F">
+          <wp:inline distT="0" distB="0" distL="0" distR="0" wp14:anchorId="67E3B4D2" wp14:editId="1BFFC5C2">
             <wp:extent cx="5731510" cy="6417310"/>
             <wp:effectExtent l="0" t="0" r="2540" b="2540"/>
             <wp:docPr id="682627866" name="Imagen 2"/>
@@ -8359,7 +8652,7 @@
         <w:pStyle w:val="Descripcin"/>
       </w:pPr>
       <w:fldSimple w:instr=" SEQ Ilustración \* ARABIC ">
-        <w:bookmarkStart w:id="15" w:name="_Toc229690874"/>
+        <w:bookmarkStart w:id="15" w:name="_Toc229852095"/>
         <w:r>
           <w:rPr>
             <w:noProof/>
@@ -8377,7 +8670,7 @@
       <w:pPr>
         <w:pStyle w:val="Ttulo2"/>
       </w:pPr>
-      <w:bookmarkStart w:id="16" w:name="_Toc229690841"/>
+      <w:bookmarkStart w:id="16" w:name="_Toc229852062"/>
       <w:r>
         <w:lastRenderedPageBreak/>
         <w:t>Diagrama Entidad-Relación</w:t>
@@ -8440,7 +8733,7 @@
         <w:pStyle w:val="Descripcin"/>
       </w:pPr>
       <w:fldSimple w:instr=" SEQ Ilustración \* ARABIC ">
-        <w:bookmarkStart w:id="17" w:name="_Toc229690875"/>
+        <w:bookmarkStart w:id="17" w:name="_Toc229852096"/>
         <w:r>
           <w:rPr>
             <w:noProof/>
@@ -8477,9 +8770,14 @@
     </w:p>
     <w:p>
       <w:pPr>
+        <w:jc w:val="both"/>
+      </w:pPr>
+    </w:p>
+    <w:p>
+      <w:pPr>
         <w:pStyle w:val="Ttulo2"/>
       </w:pPr>
-      <w:bookmarkStart w:id="18" w:name="_Toc229690842"/>
+      <w:bookmarkStart w:id="18" w:name="_Toc229852063"/>
       <w:r>
         <w:t>Modelo Relacional</w:t>
       </w:r>
@@ -9514,7 +9812,7 @@
         <w:pStyle w:val="Ttulo2"/>
       </w:pPr>
       <w:bookmarkStart w:id="19" w:name="_Toc225415563"/>
-      <w:bookmarkStart w:id="20" w:name="_Toc229690843"/>
+      <w:bookmarkStart w:id="20" w:name="_Toc229852064"/>
       <w:r>
         <w:t>Script SQL</w:t>
       </w:r>
@@ -9737,7 +10035,7 @@
       <w:pPr>
         <w:pStyle w:val="Ttulo1"/>
       </w:pPr>
-      <w:bookmarkStart w:id="21" w:name="_Toc229690844"/>
+      <w:bookmarkStart w:id="21" w:name="_Toc229852065"/>
       <w:r>
         <w:t>Metodología de desarrollo</w:t>
       </w:r>
@@ -9748,7 +10046,7 @@
         <w:pStyle w:val="Ttulo2"/>
         <w:jc w:val="both"/>
       </w:pPr>
-      <w:bookmarkStart w:id="22" w:name="_Toc229690845"/>
+      <w:bookmarkStart w:id="22" w:name="_Toc229852066"/>
       <w:r>
         <w:t>Ciclo de vida</w:t>
       </w:r>
@@ -9808,14 +10106,12 @@
         </w:rPr>
         <w:t xml:space="preserve">más, se exige entregar prototipos funcionales repartidos en hitos, por </w:t>
       </w:r>
-      <w:proofErr w:type="gramStart"/>
-      <w:r>
-        <w:rPr>
-          <w:rFonts w:ascii="Aptos" w:eastAsia="Aptos" w:hAnsi="Aptos" w:cs="Aptos"/>
-        </w:rPr>
-        <w:t>tanto</w:t>
-      </w:r>
-      <w:proofErr w:type="gramEnd"/>
+      <w:r>
+        <w:rPr>
+          <w:rFonts w:ascii="Aptos" w:eastAsia="Aptos" w:hAnsi="Aptos" w:cs="Aptos"/>
+        </w:rPr>
+        <w:t>tanto,</w:t>
+      </w:r>
       <w:r>
         <w:rPr>
           <w:rFonts w:ascii="Aptos" w:eastAsia="Aptos" w:hAnsi="Aptos" w:cs="Aptos"/>
@@ -9848,7 +10144,7 @@
       <w:pPr>
         <w:pStyle w:val="Ttulo2"/>
       </w:pPr>
-      <w:bookmarkStart w:id="23" w:name="_Toc229690846"/>
+      <w:bookmarkStart w:id="23" w:name="_Toc229852067"/>
       <w:r>
         <w:lastRenderedPageBreak/>
         <w:t>Metodología ágil</w:t>
@@ -10164,7 +10460,7 @@
       <w:pPr>
         <w:pStyle w:val="Ttulo2"/>
       </w:pPr>
-      <w:bookmarkStart w:id="24" w:name="_Toc229690847"/>
+      <w:bookmarkStart w:id="24" w:name="_Toc229852068"/>
       <w:r>
         <w:lastRenderedPageBreak/>
         <w:t xml:space="preserve">Nuestro Tablero </w:t>
@@ -10248,7 +10544,7 @@
         <w:pStyle w:val="Descripcin"/>
       </w:pPr>
       <w:fldSimple w:instr=" SEQ Ilustración \* ARABIC ">
-        <w:bookmarkStart w:id="25" w:name="_Toc229690876"/>
+        <w:bookmarkStart w:id="25" w:name="_Toc229852097"/>
         <w:r>
           <w:rPr>
             <w:noProof/>
@@ -10318,7 +10614,7 @@
         <w:pStyle w:val="Descripcin"/>
       </w:pPr>
       <w:fldSimple w:instr=" SEQ Ilustración \* ARABIC ">
-        <w:bookmarkStart w:id="26" w:name="_Toc229690877"/>
+        <w:bookmarkStart w:id="26" w:name="_Toc229852098"/>
         <w:r>
           <w:rPr>
             <w:noProof/>
@@ -10340,7 +10636,7 @@
       <w:pPr>
         <w:pStyle w:val="Ttulo2"/>
       </w:pPr>
-      <w:bookmarkStart w:id="27" w:name="_Toc229690848"/>
+      <w:bookmarkStart w:id="27" w:name="_Toc229852069"/>
       <w:r>
         <w:lastRenderedPageBreak/>
         <w:t>Planificación de tareas y toles de equipo</w:t>
@@ -10361,19 +10657,29 @@
         </w:rPr>
         <w:t xml:space="preserve">En las primeras iteraciones del proyecto la mayoría de </w:t>
       </w:r>
-      <w:proofErr w:type="gramStart"/>
-      <w:r>
-        <w:rPr>
-          <w:rFonts w:ascii="Aptos" w:eastAsia="Aptos" w:hAnsi="Aptos" w:cs="Aptos"/>
-        </w:rPr>
-        <w:t>roles</w:t>
-      </w:r>
-      <w:proofErr w:type="gramEnd"/>
-      <w:r>
-        <w:rPr>
-          <w:rFonts w:ascii="Aptos" w:eastAsia="Aptos" w:hAnsi="Aptos" w:cs="Aptos"/>
-        </w:rPr>
-        <w:t xml:space="preserve"> y tareas son compartidas, ya que todos estamos participando conjuntamente en todo tipo de tareas y no necesitamos aún a nadie que haga el rol de jefe de proyecto. En iteraciones más avanzadas tendremos roles y tareas más diferenciadas.</w:t>
+      <w:r>
+        <w:rPr>
+          <w:rFonts w:ascii="Aptos" w:eastAsia="Aptos" w:hAnsi="Aptos" w:cs="Aptos"/>
+        </w:rPr>
+        <w:t>los roles</w:t>
+      </w:r>
+      <w:r>
+        <w:rPr>
+          <w:rFonts w:ascii="Aptos" w:eastAsia="Aptos" w:hAnsi="Aptos" w:cs="Aptos"/>
+        </w:rPr>
+        <w:t xml:space="preserve"> y tareas son compartidas, ya que todos estamos participando conjuntamente en todo tipo de tareas y no necesitamos aún a nadie que haga el rol de jefe de proyecto. En iteraciones más avanzadas ten</w:t>
+      </w:r>
+      <w:r>
+        <w:rPr>
+          <w:rFonts w:ascii="Aptos" w:eastAsia="Aptos" w:hAnsi="Aptos" w:cs="Aptos"/>
+        </w:rPr>
+        <w:t>emos</w:t>
+      </w:r>
+      <w:r>
+        <w:rPr>
+          <w:rFonts w:ascii="Aptos" w:eastAsia="Aptos" w:hAnsi="Aptos" w:cs="Aptos"/>
+        </w:rPr>
+        <w:t xml:space="preserve"> roles y tareas más diferenciadas.</w:t>
       </w:r>
     </w:p>
     <w:p>
@@ -10822,7 +11128,7 @@
         <w:pStyle w:val="Descripcin"/>
       </w:pPr>
       <w:fldSimple w:instr=" SEQ Ilustración \* ARABIC ">
-        <w:bookmarkStart w:id="28" w:name="_Toc229690878"/>
+        <w:bookmarkStart w:id="28" w:name="_Toc229852099"/>
         <w:r>
           <w:rPr>
             <w:noProof/>
@@ -11190,7 +11496,7 @@
         <w:pStyle w:val="Descripcin"/>
       </w:pPr>
       <w:fldSimple w:instr=" SEQ Ilustración \* ARABIC ">
-        <w:bookmarkStart w:id="29" w:name="_Toc229690879"/>
+        <w:bookmarkStart w:id="29" w:name="_Toc229852100"/>
         <w:r>
           <w:rPr>
             <w:noProof/>
@@ -11212,7 +11518,7 @@
       <w:pPr>
         <w:pStyle w:val="Ttulo1"/>
       </w:pPr>
-      <w:bookmarkStart w:id="30" w:name="_Toc229690849"/>
+      <w:bookmarkStart w:id="30" w:name="_Toc229852070"/>
       <w:r>
         <w:lastRenderedPageBreak/>
         <w:t>Codificación</w:t>
@@ -11223,7 +11529,7 @@
       <w:pPr>
         <w:pStyle w:val="Ttulo2"/>
       </w:pPr>
-      <w:bookmarkStart w:id="31" w:name="_Toc229690850"/>
+      <w:bookmarkStart w:id="31" w:name="_Toc229852071"/>
       <w:r>
         <w:t>Entorno de programación</w:t>
       </w:r>
@@ -11392,7 +11698,7 @@
         <w:pStyle w:val="Ttulo2"/>
         <w:jc w:val="both"/>
       </w:pPr>
-      <w:bookmarkStart w:id="32" w:name="_Toc229690851"/>
+      <w:bookmarkStart w:id="32" w:name="_Toc229852072"/>
       <w:r>
         <w:t>Lenguajes y herramientas</w:t>
       </w:r>
@@ -11423,7 +11729,13 @@
         <w:t>JavaScript</w:t>
       </w:r>
       <w:r>
-        <w:t xml:space="preserve"> para añadir interactividad a nuestra página web y guardar datos básicos en el ordenador usando el Local</w:t>
+        <w:t xml:space="preserve"> para añadir interactividad a nuestra página web y guardar datos básicos en el ordenador usando el </w:t>
+      </w:r>
+      <w:r>
+        <w:t>l</w:t>
+      </w:r>
+      <w:r>
+        <w:t>ocal</w:t>
       </w:r>
       <w:r>
         <w:t xml:space="preserve"> </w:t>
@@ -11447,7 +11759,21 @@
         <w:t>Java</w:t>
       </w:r>
       <w:r>
-        <w:t>, para la creación de clases usando la programación orientada a objetos.</w:t>
+        <w:t>, para la creación de clases usando la programación orientada a objetos</w:t>
+      </w:r>
+      <w:r>
+        <w:t xml:space="preserve"> y la creación de métodos para la conexión de la </w:t>
+      </w:r>
+      <w:proofErr w:type="gramStart"/>
+      <w:r>
+        <w:t>app</w:t>
+      </w:r>
+      <w:proofErr w:type="gramEnd"/>
+      <w:r>
+        <w:t xml:space="preserve"> CRUD a la base de datos y su gestión</w:t>
+      </w:r>
+      <w:r>
+        <w:t>.</w:t>
       </w:r>
       <w:r>
         <w:t xml:space="preserve"> </w:t>
@@ -11566,7 +11892,7 @@
       <w:pPr>
         <w:pStyle w:val="Ttulo2"/>
       </w:pPr>
-      <w:bookmarkStart w:id="33" w:name="_Toc229690852"/>
+      <w:bookmarkStart w:id="33" w:name="_Toc229852073"/>
       <w:r>
         <w:t>Aspectos relevantes de la implementación</w:t>
       </w:r>
@@ -11635,7 +11961,16 @@
       </w:r>
       <w:r>
         <w:br/>
-        <w:t>La forma en que se ha realizado esta simulación es usando el Local</w:t>
+      </w:r>
+      <w:r>
+        <w:lastRenderedPageBreak/>
+        <w:t xml:space="preserve">La forma en que se ha realizado esta simulación es usando el </w:t>
+      </w:r>
+      <w:r>
+        <w:t>l</w:t>
+      </w:r>
+      <w:r>
+        <w:t>ocal</w:t>
       </w:r>
       <w:r>
         <w:t xml:space="preserve"> </w:t>
@@ -11649,11 +11984,7 @@
       </w:r>
       <w:proofErr w:type="spellEnd"/>
       <w:r>
-        <w:t xml:space="preserve">. Al rellenar </w:t>
-      </w:r>
-      <w:r>
-        <w:lastRenderedPageBreak/>
-        <w:t xml:space="preserve">el formulario de registro de la página web, se recogen los datos insertados y se crea un objeto usuario que se almacena en una lista alojada en el </w:t>
+        <w:t xml:space="preserve">. Al rellenar el formulario de registro de la página web, se recogen los datos insertados y se crea un objeto usuario que se almacena en una lista alojada en el </w:t>
       </w:r>
       <w:r>
         <w:t>L</w:t>
@@ -11761,7 +12092,7 @@
         <w:pStyle w:val="Descripcin"/>
       </w:pPr>
       <w:fldSimple w:instr=" SEQ Ilustración \* ARABIC ">
-        <w:bookmarkStart w:id="34" w:name="_Toc229690880"/>
+        <w:bookmarkStart w:id="34" w:name="_Toc229852101"/>
         <w:r>
           <w:rPr>
             <w:noProof/>
@@ -11824,7 +12155,7 @@
         <w:pStyle w:val="Descripcin"/>
       </w:pPr>
       <w:fldSimple w:instr=" SEQ Ilustración \* ARABIC ">
-        <w:bookmarkStart w:id="35" w:name="_Toc229690881"/>
+        <w:bookmarkStart w:id="35" w:name="_Toc229852102"/>
         <w:r>
           <w:rPr>
             <w:noProof/>
@@ -11887,7 +12218,7 @@
         <w:pStyle w:val="Descripcin"/>
       </w:pPr>
       <w:fldSimple w:instr=" SEQ Ilustración \* ARABIC ">
-        <w:bookmarkStart w:id="36" w:name="_Toc229690882"/>
+        <w:bookmarkStart w:id="36" w:name="_Toc229852103"/>
         <w:r>
           <w:rPr>
             <w:noProof/>
@@ -11907,13 +12238,14 @@
           <w:bCs/>
         </w:rPr>
       </w:pPr>
-      <w:r>
+    </w:p>
+    <w:p>
+      <w:pPr>
         <w:rPr>
           <w:b/>
           <w:bCs/>
         </w:rPr>
-        <w:br w:type="page"/>
-      </w:r>
+      </w:pPr>
     </w:p>
     <w:p>
       <w:pPr>
@@ -12003,7 +12335,7 @@
         </w:rPr>
         <w:fldChar w:fldCharType="separate"/>
       </w:r>
-      <w:bookmarkStart w:id="37" w:name="_Toc229690883"/>
+      <w:bookmarkStart w:id="37" w:name="_Toc229852104"/>
       <w:r>
         <w:rPr>
           <w:b/>
@@ -12023,6 +12355,159 @@
         <w:t xml:space="preserve"> Control acceso plataforma</w:t>
       </w:r>
       <w:bookmarkEnd w:id="37"/>
+    </w:p>
+    <w:p>
+      <w:pPr>
+        <w:jc w:val="both"/>
+      </w:pPr>
+      <w:r>
+        <w:t xml:space="preserve">Por otro lado, también usamos el local </w:t>
+      </w:r>
+      <w:proofErr w:type="spellStart"/>
+      <w:r>
+        <w:t>storage</w:t>
+      </w:r>
+      <w:proofErr w:type="spellEnd"/>
+      <w:r>
+        <w:t xml:space="preserve"> para almacenar código HTML. En la página de búsqueda, si estás usando un perfil de inquilino, puedes solicitar una visita a la habitación seleccionada. El HTML de esta habitación se guarda en el local </w:t>
+      </w:r>
+      <w:proofErr w:type="spellStart"/>
+      <w:r>
+        <w:t>storage</w:t>
+      </w:r>
+      <w:proofErr w:type="spellEnd"/>
+      <w:r>
+        <w:t xml:space="preserve"> para más tarde, en la página de perfil de inquilino, sacarlo del local </w:t>
+      </w:r>
+      <w:proofErr w:type="spellStart"/>
+      <w:r>
+        <w:t>storage</w:t>
+      </w:r>
+      <w:proofErr w:type="spellEnd"/>
+      <w:r>
+        <w:t xml:space="preserve"> e insertarlo en el bloque “Tus solicitudes”. Sólo permite guardar una habitación a la vez. </w:t>
+      </w:r>
+    </w:p>
+    <w:p>
+      <w:pPr>
+        <w:keepNext/>
+      </w:pPr>
+      <w:r>
+        <w:drawing>
+          <wp:inline distT="0" distB="0" distL="0" distR="0" wp14:anchorId="22B629F7" wp14:editId="4174B8A4">
+            <wp:extent cx="5731510" cy="1966595"/>
+            <wp:effectExtent l="0" t="0" r="2540" b="0"/>
+            <wp:docPr id="290310729" name="Imagen 1"/>
+            <wp:cNvGraphicFramePr>
+              <a:graphicFrameLocks xmlns:a="http://schemas.openxmlformats.org/drawingml/2006/main" noChangeAspect="1"/>
+            </wp:cNvGraphicFramePr>
+            <a:graphic xmlns:a="http://schemas.openxmlformats.org/drawingml/2006/main">
+              <a:graphicData uri="http://schemas.openxmlformats.org/drawingml/2006/picture">
+                <pic:pic xmlns:pic="http://schemas.openxmlformats.org/drawingml/2006/picture">
+                  <pic:nvPicPr>
+                    <pic:cNvPr id="290310729" name=""/>
+                    <pic:cNvPicPr/>
+                  </pic:nvPicPr>
+                  <pic:blipFill>
+                    <a:blip r:embed="rId28"/>
+                    <a:stretch>
+                      <a:fillRect/>
+                    </a:stretch>
+                  </pic:blipFill>
+                  <pic:spPr>
+                    <a:xfrm>
+                      <a:off x="0" y="0"/>
+                      <a:ext cx="5731510" cy="1966595"/>
+                    </a:xfrm>
+                    <a:prstGeom prst="rect">
+                      <a:avLst/>
+                    </a:prstGeom>
+                  </pic:spPr>
+                </pic:pic>
+              </a:graphicData>
+            </a:graphic>
+          </wp:inline>
+        </w:drawing>
+      </w:r>
+    </w:p>
+    <w:p>
+      <w:pPr>
+        <w:pStyle w:val="Descripcin"/>
+      </w:pPr>
+      <w:fldSimple w:instr=" SEQ Ilustración \* ARABIC ">
+        <w:bookmarkStart w:id="38" w:name="_Toc229852105"/>
+        <w:r>
+          <w:rPr>
+            <w:noProof/>
+          </w:rPr>
+          <w:t>13</w:t>
+        </w:r>
+      </w:fldSimple>
+      <w:r>
+        <w:t xml:space="preserve"> Botón de solicitar cita</w:t>
+      </w:r>
+      <w:bookmarkEnd w:id="38"/>
+    </w:p>
+    <w:p>
+      <w:pPr>
+        <w:keepNext/>
+      </w:pPr>
+      <w:r>
+        <w:lastRenderedPageBreak/>
+        <w:drawing>
+          <wp:inline distT="0" distB="0" distL="0" distR="0" wp14:anchorId="35DC4DD9" wp14:editId="5FA34CF4">
+            <wp:extent cx="5731510" cy="3143885"/>
+            <wp:effectExtent l="0" t="0" r="2540" b="0"/>
+            <wp:docPr id="835484553" name="Imagen 1"/>
+            <wp:cNvGraphicFramePr>
+              <a:graphicFrameLocks xmlns:a="http://schemas.openxmlformats.org/drawingml/2006/main" noChangeAspect="1"/>
+            </wp:cNvGraphicFramePr>
+            <a:graphic xmlns:a="http://schemas.openxmlformats.org/drawingml/2006/main">
+              <a:graphicData uri="http://schemas.openxmlformats.org/drawingml/2006/picture">
+                <pic:pic xmlns:pic="http://schemas.openxmlformats.org/drawingml/2006/picture">
+                  <pic:nvPicPr>
+                    <pic:cNvPr id="835484553" name=""/>
+                    <pic:cNvPicPr/>
+                  </pic:nvPicPr>
+                  <pic:blipFill>
+                    <a:blip r:embed="rId29"/>
+                    <a:stretch>
+                      <a:fillRect/>
+                    </a:stretch>
+                  </pic:blipFill>
+                  <pic:spPr>
+                    <a:xfrm>
+                      <a:off x="0" y="0"/>
+                      <a:ext cx="5731510" cy="3143885"/>
+                    </a:xfrm>
+                    <a:prstGeom prst="rect">
+                      <a:avLst/>
+                    </a:prstGeom>
+                  </pic:spPr>
+                </pic:pic>
+              </a:graphicData>
+            </a:graphic>
+          </wp:inline>
+        </w:drawing>
+      </w:r>
+    </w:p>
+    <w:p>
+      <w:pPr>
+        <w:pStyle w:val="Descripcin"/>
+      </w:pPr>
+      <w:fldSimple w:instr=" SEQ Ilustración \* ARABIC ">
+        <w:bookmarkStart w:id="39" w:name="_Toc229852106"/>
+        <w:r>
+          <w:rPr>
+            <w:noProof/>
+          </w:rPr>
+          <w:t>14</w:t>
+        </w:r>
+      </w:fldSimple>
+      <w:r>
+        <w:t xml:space="preserve"> Método usado para crear habitación</w:t>
+      </w:r>
+      <w:bookmarkEnd w:id="39"/>
     </w:p>
     <w:p/>
     <w:p>
@@ -12124,7 +12609,7 @@
                     <pic:cNvPicPr/>
                   </pic:nvPicPr>
                   <pic:blipFill>
-                    <a:blip r:embed="rId28"/>
+                    <a:blip r:embed="rId30"/>
                     <a:stretch>
                       <a:fillRect/>
                     </a:stretch>
@@ -12150,18 +12635,18 @@
         <w:pStyle w:val="Descripcin"/>
       </w:pPr>
       <w:fldSimple w:instr=" SEQ Ilustración \* ARABIC ">
-        <w:bookmarkStart w:id="38" w:name="_Toc229690884"/>
-        <w:r>
-          <w:rPr>
-            <w:noProof/>
-          </w:rPr>
-          <w:t>13</w:t>
+        <w:bookmarkStart w:id="40" w:name="_Toc229852107"/>
+        <w:r>
+          <w:rPr>
+            <w:noProof/>
+          </w:rPr>
+          <w:t>15</w:t>
         </w:r>
       </w:fldSimple>
       <w:r>
         <w:t xml:space="preserve"> Método conexión a BD</w:t>
       </w:r>
-      <w:bookmarkEnd w:id="38"/>
+      <w:bookmarkEnd w:id="40"/>
     </w:p>
     <w:p/>
     <w:p>
@@ -12204,7 +12689,7 @@
       <w:r>
         <w:t xml:space="preserve"> Google, se ha creado un modelo de reconocimiento facial. Para este proyecto tenemos la cara de un integrante del grupo asignada a la cuenta de usuario </w:t>
       </w:r>
-      <w:hyperlink r:id="rId29" w:history="1">
+      <w:hyperlink r:id="rId31" w:history="1">
         <w:r>
           <w:rPr>
             <w:rStyle w:val="Hipervnculo"/>
@@ -12336,12 +12821,12 @@
                               </w:rPr>
                               <w:fldChar w:fldCharType="separate"/>
                             </w:r>
-                            <w:bookmarkStart w:id="39" w:name="_Toc229690885"/>
+                            <w:bookmarkStart w:id="41" w:name="_Toc229852108"/>
                             <w:r>
                               <w:rPr>
                                 <w:noProof/>
                               </w:rPr>
-                              <w:t>14</w:t>
+                              <w:t>16</w:t>
                             </w:r>
                             <w:r>
                               <w:rPr>
@@ -12361,7 +12846,7 @@
                             <w:r>
                               <w:t>/3</w:t>
                             </w:r>
-                            <w:bookmarkEnd w:id="39"/>
+                            <w:bookmarkEnd w:id="41"/>
                           </w:p>
                         </w:txbxContent>
                       </wps:txbx>
@@ -12411,12 +12896,12 @@
                         </w:rPr>
                         <w:fldChar w:fldCharType="separate"/>
                       </w:r>
-                      <w:bookmarkStart w:id="40" w:name="_Toc229690885"/>
+                      <w:bookmarkStart w:id="42" w:name="_Toc229852108"/>
                       <w:r>
                         <w:rPr>
                           <w:noProof/>
                         </w:rPr>
-                        <w:t>14</w:t>
+                        <w:t>16</w:t>
                       </w:r>
                       <w:r>
                         <w:rPr>
@@ -12436,7 +12921,7 @@
                       <w:r>
                         <w:t>/3</w:t>
                       </w:r>
-                      <w:bookmarkEnd w:id="40"/>
+                      <w:bookmarkEnd w:id="42"/>
                     </w:p>
                   </w:txbxContent>
                 </v:textbox>
@@ -12474,7 +12959,7 @@
                     <pic:cNvPicPr/>
                   </pic:nvPicPr>
                   <pic:blipFill>
-                    <a:blip r:embed="rId30">
+                    <a:blip r:embed="rId32">
                       <a:extLst>
                         <a:ext uri="{28A0092B-C50C-407E-A947-70E740481C1C}">
                           <a14:useLocalDpi xmlns:a14="http://schemas.microsoft.com/office/drawing/2010/main" val="0"/>
@@ -12529,7 +13014,7 @@
                     <pic:cNvPicPr/>
                   </pic:nvPicPr>
                   <pic:blipFill>
-                    <a:blip r:embed="rId31">
+                    <a:blip r:embed="rId33">
                       <a:extLst>
                         <a:ext uri="{28A0092B-C50C-407E-A947-70E740481C1C}">
                           <a14:useLocalDpi xmlns:a14="http://schemas.microsoft.com/office/drawing/2010/main" val="0"/>
@@ -12562,18 +13047,18 @@
         <w:jc w:val="both"/>
       </w:pPr>
       <w:fldSimple w:instr=" SEQ Ilustración \* ARABIC ">
-        <w:bookmarkStart w:id="40" w:name="_Toc229690886"/>
-        <w:r>
-          <w:rPr>
-            <w:noProof/>
-          </w:rPr>
-          <w:t>15</w:t>
+        <w:bookmarkStart w:id="43" w:name="_Toc229852109"/>
+        <w:r>
+          <w:rPr>
+            <w:noProof/>
+          </w:rPr>
+          <w:t>17</w:t>
         </w:r>
       </w:fldSimple>
       <w:r>
         <w:t xml:space="preserve"> Reconocimiento facial 1/3</w:t>
       </w:r>
-      <w:bookmarkEnd w:id="40"/>
+      <w:bookmarkEnd w:id="43"/>
     </w:p>
     <w:p>
       <w:pPr>
@@ -12601,7 +13086,7 @@
                     <pic:cNvPicPr/>
                   </pic:nvPicPr>
                   <pic:blipFill>
-                    <a:blip r:embed="rId32">
+                    <a:blip r:embed="rId34">
                       <a:extLst>
                         <a:ext uri="{28A0092B-C50C-407E-A947-70E740481C1C}">
                           <a14:useLocalDpi xmlns:a14="http://schemas.microsoft.com/office/drawing/2010/main" val="0"/>
@@ -12634,12 +13119,12 @@
         <w:jc w:val="both"/>
       </w:pPr>
       <w:fldSimple w:instr=" SEQ Ilustración \* ARABIC ">
-        <w:bookmarkStart w:id="41" w:name="_Toc229690887"/>
-        <w:r>
-          <w:rPr>
-            <w:noProof/>
-          </w:rPr>
-          <w:t>16</w:t>
+        <w:bookmarkStart w:id="44" w:name="_Toc229852110"/>
+        <w:r>
+          <w:rPr>
+            <w:noProof/>
+          </w:rPr>
+          <w:t>18</w:t>
         </w:r>
       </w:fldSimple>
       <w:r>
@@ -12654,7 +13139,7 @@
       <w:r>
         <w:t>/3</w:t>
       </w:r>
-      <w:bookmarkEnd w:id="41"/>
+      <w:bookmarkEnd w:id="44"/>
     </w:p>
     <w:p>
       <w:pPr>
@@ -12742,7 +13227,7 @@
                     <pic:cNvPicPr/>
                   </pic:nvPicPr>
                   <pic:blipFill>
-                    <a:blip r:embed="rId33"/>
+                    <a:blip r:embed="rId35"/>
                     <a:stretch>
                       <a:fillRect/>
                     </a:stretch>
@@ -12768,21 +13253,21 @@
       <w:pPr>
         <w:pStyle w:val="Ttulo1"/>
       </w:pPr>
-      <w:bookmarkStart w:id="42" w:name="_Toc229690853"/>
+      <w:bookmarkStart w:id="45" w:name="_Toc229852074"/>
       <w:r>
         <w:t>Manual de usuario</w:t>
       </w:r>
-      <w:bookmarkEnd w:id="42"/>
+      <w:bookmarkEnd w:id="45"/>
     </w:p>
     <w:p>
       <w:pPr>
         <w:pStyle w:val="Ttulo2"/>
       </w:pPr>
-      <w:bookmarkStart w:id="43" w:name="_Toc229690854"/>
+      <w:bookmarkStart w:id="46" w:name="_Toc229852075"/>
       <w:r>
         <w:t>Entrar al proyecto</w:t>
       </w:r>
-      <w:bookmarkEnd w:id="43"/>
+      <w:bookmarkEnd w:id="46"/>
     </w:p>
     <w:p>
       <w:pPr>
@@ -12794,30 +13279,16 @@
       <w:r>
         <w:t xml:space="preserve"> </w:t>
       </w:r>
-      <w:hyperlink r:id="rId34" w:history="1">
-        <w:r>
-          <w:rPr>
-            <w:rStyle w:val="Hipervnculo"/>
-          </w:rPr>
-          <w:t>www.roomie-web-blue.vercel.app</w:t>
-        </w:r>
-      </w:hyperlink>
-      <w:r>
-        <w:t>/</w:t>
-      </w:r>
-      <w:proofErr w:type="gramStart"/>
-      <w:r>
-        <w:t>index.html</w:t>
-      </w:r>
-      <w:r>
-        <w:t xml:space="preserve"> </w:t>
-      </w:r>
-      <w:r>
-        <w:t>.</w:t>
-      </w:r>
-      <w:proofErr w:type="gramEnd"/>
-      <w:r>
-        <w:t xml:space="preserve"> </w:t>
+      <w:r>
+        <w:rPr>
+          <w:b/>
+          <w:bCs/>
+          <w:color w:val="0070C0"/>
+        </w:rPr>
+        <w:t>https://roomie-web-blue.vercel.app/index.html</w:t>
+      </w:r>
+      <w:r>
+        <w:t xml:space="preserve">. </w:t>
       </w:r>
       <w:r>
         <w:t>En el caso de abrirlo desde una carpeta local, se podrá igualmente abrir cualquier archivo con formato .</w:t>
@@ -12828,55 +13299,50 @@
       </w:r>
       <w:proofErr w:type="spellEnd"/>
       <w:r>
-        <w:t xml:space="preserve"> usando cualquier navegador.  </w:t>
-      </w:r>
-    </w:p>
-    <w:p>
-      <w:pPr>
-        <w:rPr>
-          <w:rFonts w:asciiTheme="majorHAnsi" w:eastAsiaTheme="majorEastAsia" w:hAnsiTheme="majorHAnsi" w:cstheme="majorBidi"/>
-          <w:color w:val="0F4761" w:themeColor="accent1" w:themeShade="BF"/>
-          <w:sz w:val="32"/>
-          <w:szCs w:val="32"/>
-        </w:rPr>
-      </w:pPr>
-      <w:r>
-        <w:br w:type="page"/>
-      </w:r>
+        <w:t xml:space="preserve"> usando cualquier navegador. </w:t>
+      </w:r>
+      <w:r>
+        <w:t xml:space="preserve"> Sin embargo, en este caso, el reconocimiento facial no funcionará, ya que necesita ejecución en servidor. </w:t>
+      </w:r>
+    </w:p>
+    <w:p>
+      <w:pPr>
+        <w:jc w:val="both"/>
+      </w:pPr>
     </w:p>
     <w:p>
       <w:pPr>
         <w:pStyle w:val="Ttulo2"/>
       </w:pPr>
-      <w:bookmarkStart w:id="44" w:name="_Toc229690855"/>
-      <w:r>
+      <w:bookmarkStart w:id="47" w:name="_Toc229852076"/>
+      <w:r>
+        <w:t>Registro, inicio de sesión y navegación.</w:t>
+      </w:r>
+      <w:bookmarkEnd w:id="47"/>
+    </w:p>
+    <w:p>
+      <w:pPr>
+        <w:jc w:val="both"/>
+      </w:pPr>
+      <w:r>
+        <w:t>En la página de registro podrás crear tu cuenta simulada de usuario</w:t>
+      </w:r>
+      <w:r>
+        <w:t xml:space="preserve"> donde eliges si quieres acceder como inquilino o arrendador</w:t>
+      </w:r>
+      <w:r>
+        <w:t>. Insertando tu nombre, apellidos, correo electrónico, teléfono y contraseña.</w:t>
+      </w:r>
+    </w:p>
+    <w:p>
+      <w:pPr>
+        <w:keepNext/>
+      </w:pPr>
+      <w:r>
+        <w:rPr>
+          <w:noProof/>
+        </w:rPr>
         <w:lastRenderedPageBreak/>
-        <w:t>Registro, inicio de sesión y navegación.</w:t>
-      </w:r>
-      <w:bookmarkEnd w:id="44"/>
-    </w:p>
-    <w:p>
-      <w:pPr>
-        <w:jc w:val="both"/>
-      </w:pPr>
-      <w:r>
-        <w:t>En la página de registro podrás crear tu cuenta simulada de usuario</w:t>
-      </w:r>
-      <w:r>
-        <w:t xml:space="preserve"> donde eliges si quieres acceder como inquilino o arrendador</w:t>
-      </w:r>
-      <w:r>
-        <w:t>. Insertando tu nombre, apellidos, correo electrónico, teléfono y contraseña.</w:t>
-      </w:r>
-    </w:p>
-    <w:p>
-      <w:pPr>
-        <w:keepNext/>
-      </w:pPr>
-      <w:r>
-        <w:rPr>
-          <w:noProof/>
-        </w:rPr>
         <w:drawing>
           <wp:inline distT="0" distB="0" distL="0" distR="0" wp14:anchorId="65AB6F30" wp14:editId="634884E8">
             <wp:extent cx="4802529" cy="7296150"/>
@@ -12893,7 +13359,7 @@
                     <pic:cNvPicPr/>
                   </pic:nvPicPr>
                   <pic:blipFill>
-                    <a:blip r:embed="rId35"/>
+                    <a:blip r:embed="rId36"/>
                     <a:stretch>
                       <a:fillRect/>
                     </a:stretch>
@@ -12919,31 +13385,40 @@
         <w:pStyle w:val="Descripcin"/>
       </w:pPr>
       <w:fldSimple w:instr=" SEQ Ilustración \* ARABIC ">
-        <w:bookmarkStart w:id="45" w:name="_Toc229690888"/>
-        <w:r>
-          <w:rPr>
-            <w:noProof/>
-          </w:rPr>
-          <w:t>17</w:t>
+        <w:bookmarkStart w:id="48" w:name="_Toc229852111"/>
+        <w:r>
+          <w:rPr>
+            <w:noProof/>
+          </w:rPr>
+          <w:t>19</w:t>
         </w:r>
       </w:fldSimple>
       <w:r>
         <w:t xml:space="preserve"> Creación de cuenta</w:t>
       </w:r>
-      <w:bookmarkEnd w:id="45"/>
-    </w:p>
-    <w:p>
+      <w:bookmarkEnd w:id="48"/>
+    </w:p>
+    <w:p>
+      <w:r>
+        <w:br/>
+      </w:r>
+    </w:p>
+    <w:p>
+      <w:pPr>
+        <w:jc w:val="both"/>
+      </w:pPr>
+      <w:r>
+        <w:t xml:space="preserve">Usando tu correo y contraseña, a partir de ahora, podrás acceder a tu perfil desde la pantalla de inicio de sesión. Desde tu perfil podrás publicar las habitaciones que </w:t>
+      </w:r>
       <w:r>
         <w:lastRenderedPageBreak/>
-        <w:br/>
-      </w:r>
-    </w:p>
-    <w:p>
-      <w:pPr>
-        <w:jc w:val="both"/>
-      </w:pPr>
-      <w:r>
-        <w:t xml:space="preserve">Usando tu correo y contraseña, a partir de ahora, podrás acceder a tu perfil desde la pantalla de inicio de sesión. Desde tu perfil podrás publicar las habitaciones que ofreces, si eres arrendador, o ver tu habitación alquilada, si eres inquilino. </w:t>
+        <w:t xml:space="preserve">ofreces, si eres arrendador, o ver tu habitación </w:t>
+      </w:r>
+      <w:r>
+        <w:t>a la que has solicitado visita</w:t>
+      </w:r>
+      <w:r>
+        <w:t xml:space="preserve">, si eres inquilino. </w:t>
       </w:r>
     </w:p>
     <w:p>
@@ -12970,7 +13445,7 @@
                     <pic:cNvPicPr/>
                   </pic:nvPicPr>
                   <pic:blipFill>
-                    <a:blip r:embed="rId36"/>
+                    <a:blip r:embed="rId37"/>
                     <a:stretch>
                       <a:fillRect/>
                     </a:stretch>
@@ -12996,32 +13471,163 @@
         <w:pStyle w:val="Descripcin"/>
       </w:pPr>
       <w:fldSimple w:instr=" SEQ Ilustración \* ARABIC ">
-        <w:bookmarkStart w:id="46" w:name="_Toc229690889"/>
-        <w:r>
-          <w:rPr>
-            <w:noProof/>
-          </w:rPr>
-          <w:t>18</w:t>
+        <w:bookmarkStart w:id="49" w:name="_Toc229852112"/>
+        <w:r>
+          <w:rPr>
+            <w:noProof/>
+          </w:rPr>
+          <w:t>20</w:t>
         </w:r>
       </w:fldSimple>
       <w:r>
         <w:t xml:space="preserve"> Inicio de sesión</w:t>
       </w:r>
-      <w:bookmarkEnd w:id="46"/>
+      <w:bookmarkEnd w:id="49"/>
     </w:p>
     <w:p>
       <w:pPr>
         <w:jc w:val="both"/>
       </w:pPr>
       <w:r>
-        <w:t xml:space="preserve">En la pestaña de Buscar, podrás explorar los diferentes anuncios de habitaciones disponibles. Podrás filtrar los resultados que buscas desde el buscador. </w:t>
-      </w:r>
-    </w:p>
-    <w:p>
-      <w:pPr>
+        <w:t>En la pestaña de Buscar, podrás explorar los diferentes anuncios de habitaciones disponibles. Podrás filtrar los resultados que buscas desde el buscador.</w:t>
+      </w:r>
+      <w:r>
+        <w:t xml:space="preserve"> Al seleccionar una habitación se abrirá un modal en el que podrás solicitar una visita si tienes una sesión abierta como inquilino. </w:t>
+      </w:r>
+    </w:p>
+    <w:p>
+      <w:pPr>
+        <w:keepNext/>
         <w:jc w:val="both"/>
       </w:pPr>
       <w:r>
+        <w:lastRenderedPageBreak/>
+        <w:drawing>
+          <wp:inline distT="0" distB="0" distL="0" distR="0" wp14:anchorId="46A5C485" wp14:editId="09DC3D56">
+            <wp:extent cx="5731510" cy="2720975"/>
+            <wp:effectExtent l="0" t="0" r="2540" b="3175"/>
+            <wp:docPr id="1690884593" name="Imagen 1"/>
+            <wp:cNvGraphicFramePr>
+              <a:graphicFrameLocks xmlns:a="http://schemas.openxmlformats.org/drawingml/2006/main" noChangeAspect="1"/>
+            </wp:cNvGraphicFramePr>
+            <a:graphic xmlns:a="http://schemas.openxmlformats.org/drawingml/2006/main">
+              <a:graphicData uri="http://schemas.openxmlformats.org/drawingml/2006/picture">
+                <pic:pic xmlns:pic="http://schemas.openxmlformats.org/drawingml/2006/picture">
+                  <pic:nvPicPr>
+                    <pic:cNvPr id="1690884593" name=""/>
+                    <pic:cNvPicPr/>
+                  </pic:nvPicPr>
+                  <pic:blipFill>
+                    <a:blip r:embed="rId38"/>
+                    <a:stretch>
+                      <a:fillRect/>
+                    </a:stretch>
+                  </pic:blipFill>
+                  <pic:spPr>
+                    <a:xfrm>
+                      <a:off x="0" y="0"/>
+                      <a:ext cx="5731510" cy="2720975"/>
+                    </a:xfrm>
+                    <a:prstGeom prst="rect">
+                      <a:avLst/>
+                    </a:prstGeom>
+                  </pic:spPr>
+                </pic:pic>
+              </a:graphicData>
+            </a:graphic>
+          </wp:inline>
+        </w:drawing>
+      </w:r>
+    </w:p>
+    <w:p>
+      <w:pPr>
+        <w:pStyle w:val="Descripcin"/>
+        <w:jc w:val="both"/>
+      </w:pPr>
+      <w:fldSimple w:instr=" SEQ Ilustración \* ARABIC ">
+        <w:bookmarkStart w:id="50" w:name="_Toc229852113"/>
+        <w:r>
+          <w:rPr>
+            <w:noProof/>
+          </w:rPr>
+          <w:t>21</w:t>
+        </w:r>
+      </w:fldSimple>
+      <w:r>
+        <w:t xml:space="preserve"> Página búsqueda</w:t>
+      </w:r>
+      <w:bookmarkEnd w:id="50"/>
+    </w:p>
+    <w:p>
+      <w:pPr>
+        <w:keepNext/>
+      </w:pPr>
+      <w:r>
+        <w:drawing>
+          <wp:inline distT="0" distB="0" distL="0" distR="0" wp14:anchorId="3B931D98" wp14:editId="652EFAF8">
+            <wp:extent cx="5731510" cy="2700655"/>
+            <wp:effectExtent l="0" t="0" r="2540" b="4445"/>
+            <wp:docPr id="811486564" name="Imagen 1"/>
+            <wp:cNvGraphicFramePr>
+              <a:graphicFrameLocks xmlns:a="http://schemas.openxmlformats.org/drawingml/2006/main" noChangeAspect="1"/>
+            </wp:cNvGraphicFramePr>
+            <a:graphic xmlns:a="http://schemas.openxmlformats.org/drawingml/2006/main">
+              <a:graphicData uri="http://schemas.openxmlformats.org/drawingml/2006/picture">
+                <pic:pic xmlns:pic="http://schemas.openxmlformats.org/drawingml/2006/picture">
+                  <pic:nvPicPr>
+                    <pic:cNvPr id="811486564" name=""/>
+                    <pic:cNvPicPr/>
+                  </pic:nvPicPr>
+                  <pic:blipFill>
+                    <a:blip r:embed="rId39"/>
+                    <a:stretch>
+                      <a:fillRect/>
+                    </a:stretch>
+                  </pic:blipFill>
+                  <pic:spPr>
+                    <a:xfrm>
+                      <a:off x="0" y="0"/>
+                      <a:ext cx="5731510" cy="2700655"/>
+                    </a:xfrm>
+                    <a:prstGeom prst="rect">
+                      <a:avLst/>
+                    </a:prstGeom>
+                  </pic:spPr>
+                </pic:pic>
+              </a:graphicData>
+            </a:graphic>
+          </wp:inline>
+        </w:drawing>
+      </w:r>
+    </w:p>
+    <w:p>
+      <w:pPr>
+        <w:pStyle w:val="Descripcin"/>
+      </w:pPr>
+      <w:fldSimple w:instr=" SEQ Ilustración \* ARABIC ">
+        <w:bookmarkStart w:id="51" w:name="_Toc229852114"/>
+        <w:r>
+          <w:rPr>
+            <w:noProof/>
+          </w:rPr>
+          <w:t>22</w:t>
+        </w:r>
+      </w:fldSimple>
+      <w:r>
+        <w:t xml:space="preserve"> Modal búsqueda</w:t>
+      </w:r>
+      <w:bookmarkEnd w:id="51"/>
+    </w:p>
+    <w:p>
+      <w:pPr>
+        <w:jc w:val="both"/>
+      </w:pPr>
+    </w:p>
+    <w:p>
+      <w:pPr>
+        <w:jc w:val="both"/>
+      </w:pPr>
+      <w:r>
         <w:t xml:space="preserve">En la pantalla de inicio encontrarás un resumen del proyecto y sus objetivos. </w:t>
       </w:r>
     </w:p>
@@ -13035,12 +13641,12 @@
       <w:pPr>
         <w:pStyle w:val="Ttulo2"/>
       </w:pPr>
-      <w:bookmarkStart w:id="47" w:name="_Toc229690856"/>
+      <w:bookmarkStart w:id="52" w:name="_Toc229852077"/>
       <w:r>
         <w:lastRenderedPageBreak/>
         <w:t>Instrucciones manipulación base de datos</w:t>
       </w:r>
-      <w:bookmarkEnd w:id="47"/>
+      <w:bookmarkEnd w:id="52"/>
     </w:p>
     <w:p>
       <w:pPr>
@@ -13137,21 +13743,21 @@
       <w:pPr>
         <w:pStyle w:val="Ttulo1"/>
       </w:pPr>
-      <w:bookmarkStart w:id="48" w:name="_Toc229690857"/>
+      <w:bookmarkStart w:id="53" w:name="_Toc229852078"/>
       <w:r>
         <w:t>Requisitos e instalación</w:t>
       </w:r>
-      <w:bookmarkEnd w:id="48"/>
+      <w:bookmarkEnd w:id="53"/>
     </w:p>
     <w:p>
       <w:pPr>
         <w:pStyle w:val="Ttulo2"/>
       </w:pPr>
-      <w:bookmarkStart w:id="49" w:name="_Toc229690858"/>
+      <w:bookmarkStart w:id="54" w:name="_Toc229852079"/>
       <w:r>
         <w:t>Requisitos del sistema</w:t>
       </w:r>
-      <w:bookmarkEnd w:id="49"/>
+      <w:bookmarkEnd w:id="54"/>
     </w:p>
     <w:p>
       <w:pPr>
@@ -13240,11 +13846,11 @@
       <w:pPr>
         <w:pStyle w:val="Ttulo2"/>
       </w:pPr>
-      <w:bookmarkStart w:id="50" w:name="_Toc229690859"/>
+      <w:bookmarkStart w:id="55" w:name="_Toc229852080"/>
       <w:r>
         <w:t>Instalación y ejecución</w:t>
       </w:r>
-      <w:bookmarkEnd w:id="50"/>
+      <w:bookmarkEnd w:id="55"/>
     </w:p>
     <w:p>
       <w:pPr>
@@ -13276,12 +13882,29 @@
         <w:jc w:val="both"/>
       </w:pPr>
       <w:r>
-        <w:t>Y para poder recrear la base de datos, se debe ejecutar el script que se encuentra en la carpeta “</w:t>
+        <w:t xml:space="preserve">Y para poder recrear la base de datos, se debe ejecutar el script </w:t>
+      </w:r>
+      <w:r>
+        <w:t>“</w:t>
+      </w:r>
+      <w:proofErr w:type="spellStart"/>
+      <w:r>
+        <w:t>AAscript_database_TODO.sql</w:t>
+      </w:r>
+      <w:proofErr w:type="spellEnd"/>
+      <w:r>
+        <w:t xml:space="preserve">” </w:t>
+      </w:r>
+      <w:r>
+        <w:t>que se encuentra en la carpeta “</w:t>
       </w:r>
       <w:proofErr w:type="spellStart"/>
       <w:r>
         <w:t>Database</w:t>
       </w:r>
+      <w:r>
+        <w:t>_scripts</w:t>
+      </w:r>
       <w:proofErr w:type="spellEnd"/>
       <w:r>
         <w:t>”,</w:t>
@@ -13311,21 +13934,21 @@
       <w:pPr>
         <w:pStyle w:val="Ttulo1"/>
       </w:pPr>
-      <w:bookmarkStart w:id="51" w:name="_Toc229690860"/>
+      <w:bookmarkStart w:id="56" w:name="_Toc229852081"/>
       <w:r>
         <w:t>Plan de negocio</w:t>
       </w:r>
-      <w:bookmarkEnd w:id="51"/>
+      <w:bookmarkEnd w:id="56"/>
     </w:p>
     <w:p>
       <w:pPr>
         <w:pStyle w:val="Ttulo2"/>
       </w:pPr>
-      <w:bookmarkStart w:id="52" w:name="_Toc229690861"/>
+      <w:bookmarkStart w:id="57" w:name="_Toc229852082"/>
       <w:r>
         <w:t>Público objetivo</w:t>
       </w:r>
-      <w:bookmarkEnd w:id="52"/>
+      <w:bookmarkEnd w:id="57"/>
     </w:p>
     <w:p>
       <w:pPr>
@@ -13356,11 +13979,11 @@
       <w:pPr>
         <w:pStyle w:val="Ttulo2"/>
       </w:pPr>
-      <w:bookmarkStart w:id="53" w:name="_Toc229690862"/>
+      <w:bookmarkStart w:id="58" w:name="_Toc229852083"/>
       <w:r>
         <w:t>Utilidad social</w:t>
       </w:r>
-      <w:bookmarkEnd w:id="53"/>
+      <w:bookmarkEnd w:id="58"/>
     </w:p>
     <w:p>
       <w:pPr>
@@ -13405,11 +14028,11 @@
       <w:pPr>
         <w:pStyle w:val="Ttulo2"/>
       </w:pPr>
-      <w:bookmarkStart w:id="54" w:name="_Toc229690863"/>
+      <w:bookmarkStart w:id="59" w:name="_Toc229852084"/>
       <w:r>
         <w:t>Costes y beneficios</w:t>
       </w:r>
-      <w:bookmarkEnd w:id="54"/>
+      <w:bookmarkEnd w:id="59"/>
     </w:p>
     <w:p>
       <w:pPr>
@@ -13447,7 +14070,7 @@
         </w:rPr>
         <w:t xml:space="preserve">Alquiler de oficinas </w:t>
       </w:r>
-      <w:hyperlink r:id="rId37">
+      <w:hyperlink r:id="rId40">
         <w:r>
           <w:rPr>
             <w:rStyle w:val="Hipervnculo"/>
@@ -13581,7 +14204,6 @@
         <w:rPr>
           <w:rFonts w:ascii="Aptos" w:eastAsia="Aptos" w:hAnsi="Aptos" w:cs="Aptos"/>
         </w:rPr>
-        <w:lastRenderedPageBreak/>
         <w:t xml:space="preserve">Plan de Hostinger Cloud </w:t>
       </w:r>
       <w:proofErr w:type="gramStart"/>
@@ -13743,22 +14365,22 @@
       <w:pPr>
         <w:pStyle w:val="Ttulo1"/>
       </w:pPr>
-      <w:bookmarkStart w:id="55" w:name="_Toc229690864"/>
+      <w:bookmarkStart w:id="60" w:name="_Toc229852085"/>
       <w:r>
         <w:lastRenderedPageBreak/>
         <w:t>Prevención de Riesgos Laborales</w:t>
       </w:r>
-      <w:bookmarkEnd w:id="55"/>
+      <w:bookmarkEnd w:id="60"/>
     </w:p>
     <w:p>
       <w:pPr>
         <w:pStyle w:val="Ttulo2"/>
       </w:pPr>
-      <w:bookmarkStart w:id="56" w:name="_Toc229690865"/>
+      <w:bookmarkStart w:id="61" w:name="_Toc229852086"/>
       <w:r>
         <w:t>Riesgos derivados de los espacio y equipos de trabajo</w:t>
       </w:r>
-      <w:bookmarkEnd w:id="56"/>
+      <w:bookmarkEnd w:id="61"/>
     </w:p>
     <w:p>
       <w:pPr>
@@ -13909,11 +14531,11 @@
       <w:pPr>
         <w:pStyle w:val="Ttulo2"/>
       </w:pPr>
-      <w:bookmarkStart w:id="57" w:name="_Toc229690866"/>
+      <w:bookmarkStart w:id="62" w:name="_Toc229852087"/>
       <w:r>
         <w:t>Agentes físicos</w:t>
       </w:r>
-      <w:bookmarkEnd w:id="57"/>
+      <w:bookmarkEnd w:id="62"/>
     </w:p>
     <w:p>
       <w:pPr>
@@ -14308,11 +14930,11 @@
       <w:pPr>
         <w:pStyle w:val="Ttulo2"/>
       </w:pPr>
-      <w:bookmarkStart w:id="58" w:name="_Toc229690867"/>
+      <w:bookmarkStart w:id="63" w:name="_Toc229852088"/>
       <w:r>
         <w:t>Riesgos ergonómicos y psicosociales</w:t>
       </w:r>
-      <w:bookmarkEnd w:id="58"/>
+      <w:bookmarkEnd w:id="63"/>
     </w:p>
     <w:p>
       <w:pPr>
@@ -14396,21 +15018,21 @@
       <w:pPr>
         <w:pStyle w:val="Ttulo1"/>
       </w:pPr>
-      <w:bookmarkStart w:id="59" w:name="_Toc229690868"/>
+      <w:bookmarkStart w:id="64" w:name="_Toc229852089"/>
       <w:r>
         <w:t>Conclusiones</w:t>
       </w:r>
-      <w:bookmarkEnd w:id="59"/>
+      <w:bookmarkEnd w:id="64"/>
     </w:p>
     <w:p>
       <w:pPr>
         <w:pStyle w:val="Ttulo2"/>
       </w:pPr>
-      <w:bookmarkStart w:id="60" w:name="_Toc229690869"/>
+      <w:bookmarkStart w:id="65" w:name="_Toc229852090"/>
       <w:r>
         <w:t>Conclusiones sobre el trabajo realizado</w:t>
       </w:r>
-      <w:bookmarkEnd w:id="60"/>
+      <w:bookmarkEnd w:id="65"/>
     </w:p>
     <w:p>
       <w:pPr>
@@ -14484,11 +15106,11 @@
       <w:pPr>
         <w:pStyle w:val="Ttulo2"/>
       </w:pPr>
-      <w:bookmarkStart w:id="61" w:name="_Toc229690870"/>
+      <w:bookmarkStart w:id="66" w:name="_Toc229852091"/>
       <w:r>
         <w:t>Posibles ampliaciones y mejoras</w:t>
       </w:r>
-      <w:bookmarkEnd w:id="61"/>
+      <w:bookmarkEnd w:id="66"/>
     </w:p>
     <w:p>
       <w:pPr>
@@ -14519,7 +15141,13 @@
         <w:jc w:val="both"/>
       </w:pPr>
       <w:r>
-        <w:t xml:space="preserve">Otra posible mejora sería, como se ha mencionado antes, la implementación de búsqueda a través de un mapa ya que haría la experiencia de búsqueda de habitaciones más visual y atractiva. </w:t>
+        <w:t>Otra posible mejora sería, como se ha mencionado antes, la implementación de búsqueda a través de un mapa</w:t>
+      </w:r>
+      <w:r>
+        <w:t>,</w:t>
+      </w:r>
+      <w:r>
+        <w:t xml:space="preserve"> ya que haría la experiencia de búsqueda de habitaciones más visual y atractiva. </w:t>
       </w:r>
     </w:p>
     <w:p>
@@ -14545,11 +15173,9 @@
       <w:r>
         <w:t xml:space="preserve"> móvil es una posibilidad </w:t>
       </w:r>
-      <w:proofErr w:type="gramStart"/>
-      <w:r>
-        <w:t>a</w:t>
-      </w:r>
-      <w:proofErr w:type="gramEnd"/>
+      <w:r>
+        <w:t>para</w:t>
+      </w:r>
       <w:r>
         <w:t xml:space="preserve"> tener en cuenta. Usando programas como </w:t>
       </w:r>
@@ -14598,12 +15224,12 @@
       <w:pPr>
         <w:pStyle w:val="Ttulo1"/>
       </w:pPr>
-      <w:bookmarkStart w:id="62" w:name="_Toc229690871"/>
+      <w:bookmarkStart w:id="67" w:name="_Toc229852092"/>
       <w:r>
         <w:lastRenderedPageBreak/>
         <w:t>Bibliografía</w:t>
       </w:r>
-      <w:bookmarkEnd w:id="62"/>
+      <w:bookmarkEnd w:id="67"/>
     </w:p>
     <w:p>
       <w:pPr>
@@ -14722,7 +15348,7 @@
         </w:rPr>
         <w:t xml:space="preserve"> </w:t>
       </w:r>
-      <w:hyperlink r:id="rId38">
+      <w:hyperlink r:id="rId41">
         <w:r>
           <w:rPr>
             <w:rStyle w:val="Hipervnculo"/>
@@ -14764,7 +15390,7 @@
         </w:rPr>
         <w:t xml:space="preserve">IES Mutxamel. </w:t>
       </w:r>
-      <w:hyperlink r:id="rId39">
+      <w:hyperlink r:id="rId42">
         <w:r>
           <w:rPr>
             <w:rStyle w:val="Hipervnculo"/>
@@ -14806,7 +15432,7 @@
         </w:rPr>
         <w:t xml:space="preserve">IES Mutxamel. </w:t>
       </w:r>
-      <w:hyperlink r:id="rId40">
+      <w:hyperlink r:id="rId43">
         <w:r>
           <w:rPr>
             <w:rStyle w:val="Hipervnculo"/>
@@ -14840,7 +15466,7 @@
         </w:rPr>
         <w:t xml:space="preserve">. </w:t>
       </w:r>
-      <w:hyperlink r:id="rId41">
+      <w:hyperlink r:id="rId44">
         <w:r>
           <w:rPr>
             <w:rStyle w:val="Hipervnculo"/>
@@ -14852,8 +15478,8 @@
     </w:p>
     <w:p/>
     <w:sectPr>
-      <w:headerReference w:type="default" r:id="rId42"/>
-      <w:footerReference w:type="default" r:id="rId43"/>
+      <w:headerReference w:type="default" r:id="rId45"/>
+      <w:footerReference w:type="default" r:id="rId46"/>
       <w:pgSz w:w="11906" w:h="16838"/>
       <w:pgMar w:top="1440" w:right="1440" w:bottom="1440" w:left="1440" w:header="283" w:footer="720" w:gutter="0"/>
       <w:cols w:space="720"/>
@@ -18568,12 +19194,7 @@
 </file>
 
 <file path=customXml/item3.xml><?xml version="1.0" encoding="utf-8"?>
-<?mso-contentType ?>
-<FormTemplates xmlns="http://schemas.microsoft.com/sharepoint/v3/contenttype/forms">
-  <Display>DocumentLibraryForm</Display>
-  <Edit>DocumentLibraryForm</Edit>
-  <New>DocumentLibraryForm</New>
-</FormTemplates>
+<b:Sources xmlns:b="http://schemas.openxmlformats.org/officeDocument/2006/bibliography" xmlns="http://schemas.openxmlformats.org/officeDocument/2006/bibliography" SelectedStyle="\APASixthEditionOfficeOnline.xsl" StyleName="APA" Version="6"/>
 </file>
 
 <file path=customXml/item4.xml><?xml version="1.0" encoding="utf-8"?>
@@ -18727,7 +19348,12 @@
 </file>
 
 <file path=customXml/item5.xml><?xml version="1.0" encoding="utf-8"?>
-<b:Sources xmlns:b="http://schemas.openxmlformats.org/officeDocument/2006/bibliography" xmlns="http://schemas.openxmlformats.org/officeDocument/2006/bibliography" SelectedStyle="\APASixthEditionOfficeOnline.xsl" StyleName="APA" Version="6"/>
+<?mso-contentType ?>
+<FormTemplates xmlns="http://schemas.microsoft.com/sharepoint/v3/contenttype/forms">
+  <Display>DocumentLibraryForm</Display>
+  <Edit>DocumentLibraryForm</Edit>
+  <New>DocumentLibraryForm</New>
+</FormTemplates>
 </file>
 
 <file path=customXml/itemProps1.xml><?xml version="1.0" encoding="utf-8"?>
@@ -18749,9 +19375,9 @@
 </file>
 
 <file path=customXml/itemProps3.xml><?xml version="1.0" encoding="utf-8"?>
-<ds:datastoreItem xmlns:ds="http://schemas.openxmlformats.org/officeDocument/2006/customXml" ds:itemID="{9C62D19F-2C4B-4163-B98D-18BF5B309744}">
+<ds:datastoreItem xmlns:ds="http://schemas.openxmlformats.org/officeDocument/2006/customXml" ds:itemID="{84CA4A16-CE6B-4C64-8CA7-CF5CBE9EE313}">
   <ds:schemaRefs>
-    <ds:schemaRef ds:uri="http://schemas.microsoft.com/sharepoint/v3/contenttype/forms"/>
+    <ds:schemaRef ds:uri="http://schemas.openxmlformats.org/officeDocument/2006/bibliography"/>
   </ds:schemaRefs>
 </ds:datastoreItem>
 </file>
@@ -18775,9 +19401,9 @@
 </file>
 
 <file path=customXml/itemProps5.xml><?xml version="1.0" encoding="utf-8"?>
-<ds:datastoreItem xmlns:ds="http://schemas.openxmlformats.org/officeDocument/2006/customXml" ds:itemID="{84CA4A16-CE6B-4C64-8CA7-CF5CBE9EE313}">
+<ds:datastoreItem xmlns:ds="http://schemas.openxmlformats.org/officeDocument/2006/customXml" ds:itemID="{9C62D19F-2C4B-4163-B98D-18BF5B309744}">
   <ds:schemaRefs>
-    <ds:schemaRef ds:uri="http://schemas.openxmlformats.org/officeDocument/2006/bibliography"/>
+    <ds:schemaRef ds:uri="http://schemas.microsoft.com/sharepoint/v3/contenttype/forms"/>
   </ds:schemaRefs>
 </ds:datastoreItem>
 </file>
</xml_diff>

<commit_message>
Integración de modulos en el proyecto
</commit_message>
<xml_diff>
--- a/Documentación_final.docx
+++ b/Documentación_final.docx
@@ -1577,7 +1577,7 @@
           <w:r>
             <w:fldChar w:fldCharType="separate"/>
           </w:r>
-          <w:hyperlink w:anchor="_Toc229852050" w:history="1">
+          <w:hyperlink w:anchor="_Toc229854702" w:history="1">
             <w:r>
               <w:rPr>
                 <w:rStyle w:val="Hipervnculo"/>
@@ -1621,7 +1621,7 @@
                 <w:noProof/>
                 <w:webHidden/>
               </w:rPr>
-              <w:instrText xml:space="preserve"> PAGEREF _Toc229852050 \h </w:instrText>
+              <w:instrText xml:space="preserve"> PAGEREF _Toc229854702 \h </w:instrText>
             </w:r>
             <w:r>
               <w:rPr>
@@ -1641,7 +1641,7 @@
                 <w:noProof/>
                 <w:webHidden/>
               </w:rPr>
-              <w:t>5</w:t>
+              <w:t>6</w:t>
             </w:r>
             <w:r>
               <w:rPr>
@@ -1666,7 +1666,7 @@
               <w14:ligatures w14:val="standardContextual"/>
             </w:rPr>
           </w:pPr>
-          <w:hyperlink w:anchor="_Toc229852051" w:history="1">
+          <w:hyperlink w:anchor="_Toc229854703" w:history="1">
             <w:r>
               <w:rPr>
                 <w:rStyle w:val="Hipervnculo"/>
@@ -1693,7 +1693,7 @@
                 <w:noProof/>
                 <w:webHidden/>
               </w:rPr>
-              <w:instrText xml:space="preserve"> PAGEREF _Toc229852051 \h </w:instrText>
+              <w:instrText xml:space="preserve"> PAGEREF _Toc229854703 \h </w:instrText>
             </w:r>
             <w:r>
               <w:rPr>
@@ -1713,7 +1713,7 @@
                 <w:noProof/>
                 <w:webHidden/>
               </w:rPr>
-              <w:t>5</w:t>
+              <w:t>6</w:t>
             </w:r>
             <w:r>
               <w:rPr>
@@ -1738,7 +1738,7 @@
               <w14:ligatures w14:val="standardContextual"/>
             </w:rPr>
           </w:pPr>
-          <w:hyperlink w:anchor="_Toc229852052" w:history="1">
+          <w:hyperlink w:anchor="_Toc229854704" w:history="1">
             <w:r>
               <w:rPr>
                 <w:rStyle w:val="Hipervnculo"/>
@@ -1765,7 +1765,7 @@
                 <w:noProof/>
                 <w:webHidden/>
               </w:rPr>
-              <w:instrText xml:space="preserve"> PAGEREF _Toc229852052 \h </w:instrText>
+              <w:instrText xml:space="preserve"> PAGEREF _Toc229854704 \h </w:instrText>
             </w:r>
             <w:r>
               <w:rPr>
@@ -1785,7 +1785,7 @@
                 <w:noProof/>
                 <w:webHidden/>
               </w:rPr>
-              <w:t>5</w:t>
+              <w:t>6</w:t>
             </w:r>
             <w:r>
               <w:rPr>
@@ -1810,7 +1810,7 @@
               <w14:ligatures w14:val="standardContextual"/>
             </w:rPr>
           </w:pPr>
-          <w:hyperlink w:anchor="_Toc229852053" w:history="1">
+          <w:hyperlink w:anchor="_Toc229854705" w:history="1">
             <w:r>
               <w:rPr>
                 <w:rStyle w:val="Hipervnculo"/>
@@ -1837,7 +1837,7 @@
                 <w:noProof/>
                 <w:webHidden/>
               </w:rPr>
-              <w:instrText xml:space="preserve"> PAGEREF _Toc229852053 \h </w:instrText>
+              <w:instrText xml:space="preserve"> PAGEREF _Toc229854705 \h </w:instrText>
             </w:r>
             <w:r>
               <w:rPr>
@@ -1857,7 +1857,7 @@
                 <w:noProof/>
                 <w:webHidden/>
               </w:rPr>
-              <w:t>5</w:t>
+              <w:t>6</w:t>
             </w:r>
             <w:r>
               <w:rPr>
@@ -1883,7 +1883,7 @@
               <w14:ligatures w14:val="standardContextual"/>
             </w:rPr>
           </w:pPr>
-          <w:hyperlink w:anchor="_Toc229852054" w:history="1">
+          <w:hyperlink w:anchor="_Toc229854706" w:history="1">
             <w:r>
               <w:rPr>
                 <w:rStyle w:val="Hipervnculo"/>
@@ -1927,7 +1927,7 @@
                 <w:noProof/>
                 <w:webHidden/>
               </w:rPr>
-              <w:instrText xml:space="preserve"> PAGEREF _Toc229852054 \h </w:instrText>
+              <w:instrText xml:space="preserve"> PAGEREF _Toc229854706 \h </w:instrText>
             </w:r>
             <w:r>
               <w:rPr>
@@ -1947,7 +1947,7 @@
                 <w:noProof/>
                 <w:webHidden/>
               </w:rPr>
-              <w:t>6</w:t>
+              <w:t>7</w:t>
             </w:r>
             <w:r>
               <w:rPr>
@@ -1972,7 +1972,7 @@
               <w14:ligatures w14:val="standardContextual"/>
             </w:rPr>
           </w:pPr>
-          <w:hyperlink w:anchor="_Toc229852055" w:history="1">
+          <w:hyperlink w:anchor="_Toc229854707" w:history="1">
             <w:r>
               <w:rPr>
                 <w:rStyle w:val="Hipervnculo"/>
@@ -1999,7 +1999,7 @@
                 <w:noProof/>
                 <w:webHidden/>
               </w:rPr>
-              <w:instrText xml:space="preserve"> PAGEREF _Toc229852055 \h </w:instrText>
+              <w:instrText xml:space="preserve"> PAGEREF _Toc229854707 \h </w:instrText>
             </w:r>
             <w:r>
               <w:rPr>
@@ -2019,7 +2019,7 @@
                 <w:noProof/>
                 <w:webHidden/>
               </w:rPr>
-              <w:t>6</w:t>
+              <w:t>7</w:t>
             </w:r>
             <w:r>
               <w:rPr>
@@ -2044,7 +2044,7 @@
               <w14:ligatures w14:val="standardContextual"/>
             </w:rPr>
           </w:pPr>
-          <w:hyperlink w:anchor="_Toc229852056" w:history="1">
+          <w:hyperlink w:anchor="_Toc229854708" w:history="1">
             <w:r>
               <w:rPr>
                 <w:rStyle w:val="Hipervnculo"/>
@@ -2071,7 +2071,7 @@
                 <w:noProof/>
                 <w:webHidden/>
               </w:rPr>
-              <w:instrText xml:space="preserve"> PAGEREF _Toc229852056 \h </w:instrText>
+              <w:instrText xml:space="preserve"> PAGEREF _Toc229854708 \h </w:instrText>
             </w:r>
             <w:r>
               <w:rPr>
@@ -2091,7 +2091,7 @@
                 <w:noProof/>
                 <w:webHidden/>
               </w:rPr>
-              <w:t>7</w:t>
+              <w:t>8</w:t>
             </w:r>
             <w:r>
               <w:rPr>
@@ -2116,7 +2116,7 @@
               <w14:ligatures w14:val="standardContextual"/>
             </w:rPr>
           </w:pPr>
-          <w:hyperlink w:anchor="_Toc229852057" w:history="1">
+          <w:hyperlink w:anchor="_Toc229854709" w:history="1">
             <w:r>
               <w:rPr>
                 <w:rStyle w:val="Hipervnculo"/>
@@ -2144,7 +2144,7 @@
                 <w:noProof/>
                 <w:webHidden/>
               </w:rPr>
-              <w:instrText xml:space="preserve"> PAGEREF _Toc229852057 \h </w:instrText>
+              <w:instrText xml:space="preserve"> PAGEREF _Toc229854709 \h </w:instrText>
             </w:r>
             <w:r>
               <w:rPr>
@@ -2164,7 +2164,7 @@
                 <w:noProof/>
                 <w:webHidden/>
               </w:rPr>
-              <w:t>8</w:t>
+              <w:t>9</w:t>
             </w:r>
             <w:r>
               <w:rPr>
@@ -2190,7 +2190,7 @@
               <w14:ligatures w14:val="standardContextual"/>
             </w:rPr>
           </w:pPr>
-          <w:hyperlink w:anchor="_Toc229852058" w:history="1">
+          <w:hyperlink w:anchor="_Toc229854710" w:history="1">
             <w:r>
               <w:rPr>
                 <w:rStyle w:val="Hipervnculo"/>
@@ -2234,7 +2234,7 @@
                 <w:noProof/>
                 <w:webHidden/>
               </w:rPr>
-              <w:instrText xml:space="preserve"> PAGEREF _Toc229852058 \h </w:instrText>
+              <w:instrText xml:space="preserve"> PAGEREF _Toc229854710 \h </w:instrText>
             </w:r>
             <w:r>
               <w:rPr>
@@ -2254,7 +2254,7 @@
                 <w:noProof/>
                 <w:webHidden/>
               </w:rPr>
-              <w:t>9</w:t>
+              <w:t>10</w:t>
             </w:r>
             <w:r>
               <w:rPr>
@@ -2279,7 +2279,7 @@
               <w14:ligatures w14:val="standardContextual"/>
             </w:rPr>
           </w:pPr>
-          <w:hyperlink w:anchor="_Toc229852059" w:history="1">
+          <w:hyperlink w:anchor="_Toc229854711" w:history="1">
             <w:r>
               <w:rPr>
                 <w:rStyle w:val="Hipervnculo"/>
@@ -2306,7 +2306,7 @@
                 <w:noProof/>
                 <w:webHidden/>
               </w:rPr>
-              <w:instrText xml:space="preserve"> PAGEREF _Toc229852059 \h </w:instrText>
+              <w:instrText xml:space="preserve"> PAGEREF _Toc229854711 \h </w:instrText>
             </w:r>
             <w:r>
               <w:rPr>
@@ -2326,7 +2326,7 @@
                 <w:noProof/>
                 <w:webHidden/>
               </w:rPr>
-              <w:t>9</w:t>
+              <w:t>10</w:t>
             </w:r>
             <w:r>
               <w:rPr>
@@ -2351,7 +2351,7 @@
               <w14:ligatures w14:val="standardContextual"/>
             </w:rPr>
           </w:pPr>
-          <w:hyperlink w:anchor="_Toc229852060" w:history="1">
+          <w:hyperlink w:anchor="_Toc229854712" w:history="1">
             <w:r>
               <w:rPr>
                 <w:rStyle w:val="Hipervnculo"/>
@@ -2378,7 +2378,7 @@
                 <w:noProof/>
                 <w:webHidden/>
               </w:rPr>
-              <w:instrText xml:space="preserve"> PAGEREF _Toc229852060 \h </w:instrText>
+              <w:instrText xml:space="preserve"> PAGEREF _Toc229854712 \h </w:instrText>
             </w:r>
             <w:r>
               <w:rPr>
@@ -2398,7 +2398,7 @@
                 <w:noProof/>
                 <w:webHidden/>
               </w:rPr>
-              <w:t>10</w:t>
+              <w:t>11</w:t>
             </w:r>
             <w:r>
               <w:rPr>
@@ -2423,7 +2423,7 @@
               <w14:ligatures w14:val="standardContextual"/>
             </w:rPr>
           </w:pPr>
-          <w:hyperlink w:anchor="_Toc229852061" w:history="1">
+          <w:hyperlink w:anchor="_Toc229854713" w:history="1">
             <w:r>
               <w:rPr>
                 <w:rStyle w:val="Hipervnculo"/>
@@ -2450,7 +2450,7 @@
                 <w:noProof/>
                 <w:webHidden/>
               </w:rPr>
-              <w:instrText xml:space="preserve"> PAGEREF _Toc229852061 \h </w:instrText>
+              <w:instrText xml:space="preserve"> PAGEREF _Toc229854713 \h </w:instrText>
             </w:r>
             <w:r>
               <w:rPr>
@@ -2470,7 +2470,7 @@
                 <w:noProof/>
                 <w:webHidden/>
               </w:rPr>
-              <w:t>11</w:t>
+              <w:t>12</w:t>
             </w:r>
             <w:r>
               <w:rPr>
@@ -2495,7 +2495,7 @@
               <w14:ligatures w14:val="standardContextual"/>
             </w:rPr>
           </w:pPr>
-          <w:hyperlink w:anchor="_Toc229852062" w:history="1">
+          <w:hyperlink w:anchor="_Toc229854714" w:history="1">
             <w:r>
               <w:rPr>
                 <w:rStyle w:val="Hipervnculo"/>
@@ -2522,7 +2522,7 @@
                 <w:noProof/>
                 <w:webHidden/>
               </w:rPr>
-              <w:instrText xml:space="preserve"> PAGEREF _Toc229852062 \h </w:instrText>
+              <w:instrText xml:space="preserve"> PAGEREF _Toc229854714 \h </w:instrText>
             </w:r>
             <w:r>
               <w:rPr>
@@ -2542,7 +2542,7 @@
                 <w:noProof/>
                 <w:webHidden/>
               </w:rPr>
-              <w:t>12</w:t>
+              <w:t>13</w:t>
             </w:r>
             <w:r>
               <w:rPr>
@@ -2567,7 +2567,7 @@
               <w14:ligatures w14:val="standardContextual"/>
             </w:rPr>
           </w:pPr>
-          <w:hyperlink w:anchor="_Toc229852063" w:history="1">
+          <w:hyperlink w:anchor="_Toc229854715" w:history="1">
             <w:r>
               <w:rPr>
                 <w:rStyle w:val="Hipervnculo"/>
@@ -2594,7 +2594,7 @@
                 <w:noProof/>
                 <w:webHidden/>
               </w:rPr>
-              <w:instrText xml:space="preserve"> PAGEREF _Toc229852063 \h </w:instrText>
+              <w:instrText xml:space="preserve"> PAGEREF _Toc229854715 \h </w:instrText>
             </w:r>
             <w:r>
               <w:rPr>
@@ -2614,7 +2614,7 @@
                 <w:noProof/>
                 <w:webHidden/>
               </w:rPr>
-              <w:t>12</w:t>
+              <w:t>13</w:t>
             </w:r>
             <w:r>
               <w:rPr>
@@ -2639,7 +2639,7 @@
               <w14:ligatures w14:val="standardContextual"/>
             </w:rPr>
           </w:pPr>
-          <w:hyperlink w:anchor="_Toc229852064" w:history="1">
+          <w:hyperlink w:anchor="_Toc229854716" w:history="1">
             <w:r>
               <w:rPr>
                 <w:rStyle w:val="Hipervnculo"/>
@@ -2666,7 +2666,7 @@
                 <w:noProof/>
                 <w:webHidden/>
               </w:rPr>
-              <w:instrText xml:space="preserve"> PAGEREF _Toc229852064 \h </w:instrText>
+              <w:instrText xml:space="preserve"> PAGEREF _Toc229854716 \h </w:instrText>
             </w:r>
             <w:r>
               <w:rPr>
@@ -2686,7 +2686,7 @@
                 <w:noProof/>
                 <w:webHidden/>
               </w:rPr>
-              <w:t>13</w:t>
+              <w:t>14</w:t>
             </w:r>
             <w:r>
               <w:rPr>
@@ -2712,7 +2712,7 @@
               <w14:ligatures w14:val="standardContextual"/>
             </w:rPr>
           </w:pPr>
-          <w:hyperlink w:anchor="_Toc229852065" w:history="1">
+          <w:hyperlink w:anchor="_Toc229854717" w:history="1">
             <w:r>
               <w:rPr>
                 <w:rStyle w:val="Hipervnculo"/>
@@ -2756,7 +2756,7 @@
                 <w:noProof/>
                 <w:webHidden/>
               </w:rPr>
-              <w:instrText xml:space="preserve"> PAGEREF _Toc229852065 \h </w:instrText>
+              <w:instrText xml:space="preserve"> PAGEREF _Toc229854717 \h </w:instrText>
             </w:r>
             <w:r>
               <w:rPr>
@@ -2776,7 +2776,7 @@
                 <w:noProof/>
                 <w:webHidden/>
               </w:rPr>
-              <w:t>15</w:t>
+              <w:t>16</w:t>
             </w:r>
             <w:r>
               <w:rPr>
@@ -2801,7 +2801,7 @@
               <w14:ligatures w14:val="standardContextual"/>
             </w:rPr>
           </w:pPr>
-          <w:hyperlink w:anchor="_Toc229852066" w:history="1">
+          <w:hyperlink w:anchor="_Toc229854718" w:history="1">
             <w:r>
               <w:rPr>
                 <w:rStyle w:val="Hipervnculo"/>
@@ -2828,7 +2828,7 @@
                 <w:noProof/>
                 <w:webHidden/>
               </w:rPr>
-              <w:instrText xml:space="preserve"> PAGEREF _Toc229852066 \h </w:instrText>
+              <w:instrText xml:space="preserve"> PAGEREF _Toc229854718 \h </w:instrText>
             </w:r>
             <w:r>
               <w:rPr>
@@ -2848,7 +2848,7 @@
                 <w:noProof/>
                 <w:webHidden/>
               </w:rPr>
-              <w:t>15</w:t>
+              <w:t>16</w:t>
             </w:r>
             <w:r>
               <w:rPr>
@@ -2873,7 +2873,7 @@
               <w14:ligatures w14:val="standardContextual"/>
             </w:rPr>
           </w:pPr>
-          <w:hyperlink w:anchor="_Toc229852067" w:history="1">
+          <w:hyperlink w:anchor="_Toc229854719" w:history="1">
             <w:r>
               <w:rPr>
                 <w:rStyle w:val="Hipervnculo"/>
@@ -2900,7 +2900,7 @@
                 <w:noProof/>
                 <w:webHidden/>
               </w:rPr>
-              <w:instrText xml:space="preserve"> PAGEREF _Toc229852067 \h </w:instrText>
+              <w:instrText xml:space="preserve"> PAGEREF _Toc229854719 \h </w:instrText>
             </w:r>
             <w:r>
               <w:rPr>
@@ -2920,7 +2920,7 @@
                 <w:noProof/>
                 <w:webHidden/>
               </w:rPr>
-              <w:t>16</w:t>
+              <w:t>17</w:t>
             </w:r>
             <w:r>
               <w:rPr>
@@ -2945,7 +2945,7 @@
               <w14:ligatures w14:val="standardContextual"/>
             </w:rPr>
           </w:pPr>
-          <w:hyperlink w:anchor="_Toc229852068" w:history="1">
+          <w:hyperlink w:anchor="_Toc229854720" w:history="1">
             <w:r>
               <w:rPr>
                 <w:rStyle w:val="Hipervnculo"/>
@@ -2972,7 +2972,7 @@
                 <w:noProof/>
                 <w:webHidden/>
               </w:rPr>
-              <w:instrText xml:space="preserve"> PAGEREF _Toc229852068 \h </w:instrText>
+              <w:instrText xml:space="preserve"> PAGEREF _Toc229854720 \h </w:instrText>
             </w:r>
             <w:r>
               <w:rPr>
@@ -2992,7 +2992,7 @@
                 <w:noProof/>
                 <w:webHidden/>
               </w:rPr>
-              <w:t>17</w:t>
+              <w:t>18</w:t>
             </w:r>
             <w:r>
               <w:rPr>
@@ -3017,7 +3017,7 @@
               <w14:ligatures w14:val="standardContextual"/>
             </w:rPr>
           </w:pPr>
-          <w:hyperlink w:anchor="_Toc229852069" w:history="1">
+          <w:hyperlink w:anchor="_Toc229854721" w:history="1">
             <w:r>
               <w:rPr>
                 <w:rStyle w:val="Hipervnculo"/>
@@ -3044,7 +3044,7 @@
                 <w:noProof/>
                 <w:webHidden/>
               </w:rPr>
-              <w:instrText xml:space="preserve"> PAGEREF _Toc229852069 \h </w:instrText>
+              <w:instrText xml:space="preserve"> PAGEREF _Toc229854721 \h </w:instrText>
             </w:r>
             <w:r>
               <w:rPr>
@@ -3064,7 +3064,7 @@
                 <w:noProof/>
                 <w:webHidden/>
               </w:rPr>
-              <w:t>18</w:t>
+              <w:t>19</w:t>
             </w:r>
             <w:r>
               <w:rPr>
@@ -3090,7 +3090,7 @@
               <w14:ligatures w14:val="standardContextual"/>
             </w:rPr>
           </w:pPr>
-          <w:hyperlink w:anchor="_Toc229852070" w:history="1">
+          <w:hyperlink w:anchor="_Toc229854722" w:history="1">
             <w:r>
               <w:rPr>
                 <w:rStyle w:val="Hipervnculo"/>
@@ -3134,7 +3134,7 @@
                 <w:noProof/>
                 <w:webHidden/>
               </w:rPr>
-              <w:instrText xml:space="preserve"> PAGEREF _Toc229852070 \h </w:instrText>
+              <w:instrText xml:space="preserve"> PAGEREF _Toc229854722 \h </w:instrText>
             </w:r>
             <w:r>
               <w:rPr>
@@ -3154,7 +3154,7 @@
                 <w:noProof/>
                 <w:webHidden/>
               </w:rPr>
-              <w:t>20</w:t>
+              <w:t>21</w:t>
             </w:r>
             <w:r>
               <w:rPr>
@@ -3179,7 +3179,7 @@
               <w14:ligatures w14:val="standardContextual"/>
             </w:rPr>
           </w:pPr>
-          <w:hyperlink w:anchor="_Toc229852071" w:history="1">
+          <w:hyperlink w:anchor="_Toc229854723" w:history="1">
             <w:r>
               <w:rPr>
                 <w:rStyle w:val="Hipervnculo"/>
@@ -3206,7 +3206,7 @@
                 <w:noProof/>
                 <w:webHidden/>
               </w:rPr>
-              <w:instrText xml:space="preserve"> PAGEREF _Toc229852071 \h </w:instrText>
+              <w:instrText xml:space="preserve"> PAGEREF _Toc229854723 \h </w:instrText>
             </w:r>
             <w:r>
               <w:rPr>
@@ -3226,7 +3226,7 @@
                 <w:noProof/>
                 <w:webHidden/>
               </w:rPr>
-              <w:t>20</w:t>
+              <w:t>21</w:t>
             </w:r>
             <w:r>
               <w:rPr>
@@ -3251,7 +3251,7 @@
               <w14:ligatures w14:val="standardContextual"/>
             </w:rPr>
           </w:pPr>
-          <w:hyperlink w:anchor="_Toc229852072" w:history="1">
+          <w:hyperlink w:anchor="_Toc229854724" w:history="1">
             <w:r>
               <w:rPr>
                 <w:rStyle w:val="Hipervnculo"/>
@@ -3278,7 +3278,7 @@
                 <w:noProof/>
                 <w:webHidden/>
               </w:rPr>
-              <w:instrText xml:space="preserve"> PAGEREF _Toc229852072 \h </w:instrText>
+              <w:instrText xml:space="preserve"> PAGEREF _Toc229854724 \h </w:instrText>
             </w:r>
             <w:r>
               <w:rPr>
@@ -3298,7 +3298,7 @@
                 <w:noProof/>
                 <w:webHidden/>
               </w:rPr>
-              <w:t>20</w:t>
+              <w:t>21</w:t>
             </w:r>
             <w:r>
               <w:rPr>
@@ -3323,7 +3323,7 @@
               <w14:ligatures w14:val="standardContextual"/>
             </w:rPr>
           </w:pPr>
-          <w:hyperlink w:anchor="_Toc229852073" w:history="1">
+          <w:hyperlink w:anchor="_Toc229854725" w:history="1">
             <w:r>
               <w:rPr>
                 <w:rStyle w:val="Hipervnculo"/>
@@ -3350,7 +3350,7 @@
                 <w:noProof/>
                 <w:webHidden/>
               </w:rPr>
-              <w:instrText xml:space="preserve"> PAGEREF _Toc229852073 \h </w:instrText>
+              <w:instrText xml:space="preserve"> PAGEREF _Toc229854725 \h </w:instrText>
             </w:r>
             <w:r>
               <w:rPr>
@@ -3370,7 +3370,7 @@
                 <w:noProof/>
                 <w:webHidden/>
               </w:rPr>
-              <w:t>20</w:t>
+              <w:t>21</w:t>
             </w:r>
             <w:r>
               <w:rPr>
@@ -3396,7 +3396,7 @@
               <w14:ligatures w14:val="standardContextual"/>
             </w:rPr>
           </w:pPr>
-          <w:hyperlink w:anchor="_Toc229852074" w:history="1">
+          <w:hyperlink w:anchor="_Toc229854726" w:history="1">
             <w:r>
               <w:rPr>
                 <w:rStyle w:val="Hipervnculo"/>
@@ -3440,7 +3440,7 @@
                 <w:noProof/>
                 <w:webHidden/>
               </w:rPr>
-              <w:instrText xml:space="preserve"> PAGEREF _Toc229852074 \h </w:instrText>
+              <w:instrText xml:space="preserve"> PAGEREF _Toc229854726 \h </w:instrText>
             </w:r>
             <w:r>
               <w:rPr>
@@ -3460,7 +3460,7 @@
                 <w:noProof/>
                 <w:webHidden/>
               </w:rPr>
-              <w:t>27</w:t>
+              <w:t>28</w:t>
             </w:r>
             <w:r>
               <w:rPr>
@@ -3485,7 +3485,7 @@
               <w14:ligatures w14:val="standardContextual"/>
             </w:rPr>
           </w:pPr>
-          <w:hyperlink w:anchor="_Toc229852075" w:history="1">
+          <w:hyperlink w:anchor="_Toc229854727" w:history="1">
             <w:r>
               <w:rPr>
                 <w:rStyle w:val="Hipervnculo"/>
@@ -3512,7 +3512,7 @@
                 <w:noProof/>
                 <w:webHidden/>
               </w:rPr>
-              <w:instrText xml:space="preserve"> PAGEREF _Toc229852075 \h </w:instrText>
+              <w:instrText xml:space="preserve"> PAGEREF _Toc229854727 \h </w:instrText>
             </w:r>
             <w:r>
               <w:rPr>
@@ -3532,7 +3532,7 @@
                 <w:noProof/>
                 <w:webHidden/>
               </w:rPr>
-              <w:t>27</w:t>
+              <w:t>28</w:t>
             </w:r>
             <w:r>
               <w:rPr>
@@ -3557,7 +3557,7 @@
               <w14:ligatures w14:val="standardContextual"/>
             </w:rPr>
           </w:pPr>
-          <w:hyperlink w:anchor="_Toc229852076" w:history="1">
+          <w:hyperlink w:anchor="_Toc229854728" w:history="1">
             <w:r>
               <w:rPr>
                 <w:rStyle w:val="Hipervnculo"/>
@@ -3584,7 +3584,7 @@
                 <w:noProof/>
                 <w:webHidden/>
               </w:rPr>
-              <w:instrText xml:space="preserve"> PAGEREF _Toc229852076 \h </w:instrText>
+              <w:instrText xml:space="preserve"> PAGEREF _Toc229854728 \h </w:instrText>
             </w:r>
             <w:r>
               <w:rPr>
@@ -3604,7 +3604,7 @@
                 <w:noProof/>
                 <w:webHidden/>
               </w:rPr>
-              <w:t>27</w:t>
+              <w:t>28</w:t>
             </w:r>
             <w:r>
               <w:rPr>
@@ -3629,7 +3629,7 @@
               <w14:ligatures w14:val="standardContextual"/>
             </w:rPr>
           </w:pPr>
-          <w:hyperlink w:anchor="_Toc229852077" w:history="1">
+          <w:hyperlink w:anchor="_Toc229854729" w:history="1">
             <w:r>
               <w:rPr>
                 <w:rStyle w:val="Hipervnculo"/>
@@ -3656,7 +3656,7 @@
                 <w:noProof/>
                 <w:webHidden/>
               </w:rPr>
-              <w:instrText xml:space="preserve"> PAGEREF _Toc229852077 \h </w:instrText>
+              <w:instrText xml:space="preserve"> PAGEREF _Toc229854729 \h </w:instrText>
             </w:r>
             <w:r>
               <w:rPr>
@@ -3676,7 +3676,7 @@
                 <w:noProof/>
                 <w:webHidden/>
               </w:rPr>
-              <w:t>31</w:t>
+              <w:t>32</w:t>
             </w:r>
             <w:r>
               <w:rPr>
@@ -3702,7 +3702,7 @@
               <w14:ligatures w14:val="standardContextual"/>
             </w:rPr>
           </w:pPr>
-          <w:hyperlink w:anchor="_Toc229852078" w:history="1">
+          <w:hyperlink w:anchor="_Toc229854730" w:history="1">
             <w:r>
               <w:rPr>
                 <w:rStyle w:val="Hipervnculo"/>
@@ -3746,7 +3746,7 @@
                 <w:noProof/>
                 <w:webHidden/>
               </w:rPr>
-              <w:instrText xml:space="preserve"> PAGEREF _Toc229852078 \h </w:instrText>
+              <w:instrText xml:space="preserve"> PAGEREF _Toc229854730 \h </w:instrText>
             </w:r>
             <w:r>
               <w:rPr>
@@ -3766,7 +3766,7 @@
                 <w:noProof/>
                 <w:webHidden/>
               </w:rPr>
-              <w:t>31</w:t>
+              <w:t>32</w:t>
             </w:r>
             <w:r>
               <w:rPr>
@@ -3791,7 +3791,7 @@
               <w14:ligatures w14:val="standardContextual"/>
             </w:rPr>
           </w:pPr>
-          <w:hyperlink w:anchor="_Toc229852079" w:history="1">
+          <w:hyperlink w:anchor="_Toc229854731" w:history="1">
             <w:r>
               <w:rPr>
                 <w:rStyle w:val="Hipervnculo"/>
@@ -3818,7 +3818,7 @@
                 <w:noProof/>
                 <w:webHidden/>
               </w:rPr>
-              <w:instrText xml:space="preserve"> PAGEREF _Toc229852079 \h </w:instrText>
+              <w:instrText xml:space="preserve"> PAGEREF _Toc229854731 \h </w:instrText>
             </w:r>
             <w:r>
               <w:rPr>
@@ -3838,7 +3838,7 @@
                 <w:noProof/>
                 <w:webHidden/>
               </w:rPr>
-              <w:t>31</w:t>
+              <w:t>32</w:t>
             </w:r>
             <w:r>
               <w:rPr>
@@ -3863,7 +3863,7 @@
               <w14:ligatures w14:val="standardContextual"/>
             </w:rPr>
           </w:pPr>
-          <w:hyperlink w:anchor="_Toc229852080" w:history="1">
+          <w:hyperlink w:anchor="_Toc229854732" w:history="1">
             <w:r>
               <w:rPr>
                 <w:rStyle w:val="Hipervnculo"/>
@@ -3890,7 +3890,7 @@
                 <w:noProof/>
                 <w:webHidden/>
               </w:rPr>
-              <w:instrText xml:space="preserve"> PAGEREF _Toc229852080 \h </w:instrText>
+              <w:instrText xml:space="preserve"> PAGEREF _Toc229854732 \h </w:instrText>
             </w:r>
             <w:r>
               <w:rPr>
@@ -3910,7 +3910,7 @@
                 <w:noProof/>
                 <w:webHidden/>
               </w:rPr>
-              <w:t>31</w:t>
+              <w:t>32</w:t>
             </w:r>
             <w:r>
               <w:rPr>
@@ -3936,7 +3936,7 @@
               <w14:ligatures w14:val="standardContextual"/>
             </w:rPr>
           </w:pPr>
-          <w:hyperlink w:anchor="_Toc229852081" w:history="1">
+          <w:hyperlink w:anchor="_Toc229854733" w:history="1">
             <w:r>
               <w:rPr>
                 <w:rStyle w:val="Hipervnculo"/>
@@ -3980,7 +3980,7 @@
                 <w:noProof/>
                 <w:webHidden/>
               </w:rPr>
-              <w:instrText xml:space="preserve"> PAGEREF _Toc229852081 \h </w:instrText>
+              <w:instrText xml:space="preserve"> PAGEREF _Toc229854733 \h </w:instrText>
             </w:r>
             <w:r>
               <w:rPr>
@@ -4000,7 +4000,7 @@
                 <w:noProof/>
                 <w:webHidden/>
               </w:rPr>
-              <w:t>32</w:t>
+              <w:t>33</w:t>
             </w:r>
             <w:r>
               <w:rPr>
@@ -4025,7 +4025,7 @@
               <w14:ligatures w14:val="standardContextual"/>
             </w:rPr>
           </w:pPr>
-          <w:hyperlink w:anchor="_Toc229852082" w:history="1">
+          <w:hyperlink w:anchor="_Toc229854734" w:history="1">
             <w:r>
               <w:rPr>
                 <w:rStyle w:val="Hipervnculo"/>
@@ -4052,7 +4052,7 @@
                 <w:noProof/>
                 <w:webHidden/>
               </w:rPr>
-              <w:instrText xml:space="preserve"> PAGEREF _Toc229852082 \h </w:instrText>
+              <w:instrText xml:space="preserve"> PAGEREF _Toc229854734 \h </w:instrText>
             </w:r>
             <w:r>
               <w:rPr>
@@ -4072,7 +4072,7 @@
                 <w:noProof/>
                 <w:webHidden/>
               </w:rPr>
-              <w:t>32</w:t>
+              <w:t>33</w:t>
             </w:r>
             <w:r>
               <w:rPr>
@@ -4097,7 +4097,7 @@
               <w14:ligatures w14:val="standardContextual"/>
             </w:rPr>
           </w:pPr>
-          <w:hyperlink w:anchor="_Toc229852083" w:history="1">
+          <w:hyperlink w:anchor="_Toc229854735" w:history="1">
             <w:r>
               <w:rPr>
                 <w:rStyle w:val="Hipervnculo"/>
@@ -4124,7 +4124,7 @@
                 <w:noProof/>
                 <w:webHidden/>
               </w:rPr>
-              <w:instrText xml:space="preserve"> PAGEREF _Toc229852083 \h </w:instrText>
+              <w:instrText xml:space="preserve"> PAGEREF _Toc229854735 \h </w:instrText>
             </w:r>
             <w:r>
               <w:rPr>
@@ -4144,7 +4144,7 @@
                 <w:noProof/>
                 <w:webHidden/>
               </w:rPr>
-              <w:t>32</w:t>
+              <w:t>33</w:t>
             </w:r>
             <w:r>
               <w:rPr>
@@ -4169,7 +4169,7 @@
               <w14:ligatures w14:val="standardContextual"/>
             </w:rPr>
           </w:pPr>
-          <w:hyperlink w:anchor="_Toc229852084" w:history="1">
+          <w:hyperlink w:anchor="_Toc229854736" w:history="1">
             <w:r>
               <w:rPr>
                 <w:rStyle w:val="Hipervnculo"/>
@@ -4196,7 +4196,7 @@
                 <w:noProof/>
                 <w:webHidden/>
               </w:rPr>
-              <w:instrText xml:space="preserve"> PAGEREF _Toc229852084 \h </w:instrText>
+              <w:instrText xml:space="preserve"> PAGEREF _Toc229854736 \h </w:instrText>
             </w:r>
             <w:r>
               <w:rPr>
@@ -4216,7 +4216,7 @@
                 <w:noProof/>
                 <w:webHidden/>
               </w:rPr>
-              <w:t>32</w:t>
+              <w:t>33</w:t>
             </w:r>
             <w:r>
               <w:rPr>
@@ -4242,7 +4242,7 @@
               <w14:ligatures w14:val="standardContextual"/>
             </w:rPr>
           </w:pPr>
-          <w:hyperlink w:anchor="_Toc229852085" w:history="1">
+          <w:hyperlink w:anchor="_Toc229854737" w:history="1">
             <w:r>
               <w:rPr>
                 <w:rStyle w:val="Hipervnculo"/>
@@ -4286,7 +4286,7 @@
                 <w:noProof/>
                 <w:webHidden/>
               </w:rPr>
-              <w:instrText xml:space="preserve"> PAGEREF _Toc229852085 \h </w:instrText>
+              <w:instrText xml:space="preserve"> PAGEREF _Toc229854737 \h </w:instrText>
             </w:r>
             <w:r>
               <w:rPr>
@@ -4306,7 +4306,7 @@
                 <w:noProof/>
                 <w:webHidden/>
               </w:rPr>
-              <w:t>34</w:t>
+              <w:t>35</w:t>
             </w:r>
             <w:r>
               <w:rPr>
@@ -4331,7 +4331,7 @@
               <w14:ligatures w14:val="standardContextual"/>
             </w:rPr>
           </w:pPr>
-          <w:hyperlink w:anchor="_Toc229852086" w:history="1">
+          <w:hyperlink w:anchor="_Toc229854738" w:history="1">
             <w:r>
               <w:rPr>
                 <w:rStyle w:val="Hipervnculo"/>
@@ -4358,7 +4358,7 @@
                 <w:noProof/>
                 <w:webHidden/>
               </w:rPr>
-              <w:instrText xml:space="preserve"> PAGEREF _Toc229852086 \h </w:instrText>
+              <w:instrText xml:space="preserve"> PAGEREF _Toc229854738 \h </w:instrText>
             </w:r>
             <w:r>
               <w:rPr>
@@ -4378,7 +4378,7 @@
                 <w:noProof/>
                 <w:webHidden/>
               </w:rPr>
-              <w:t>34</w:t>
+              <w:t>35</w:t>
             </w:r>
             <w:r>
               <w:rPr>
@@ -4403,7 +4403,7 @@
               <w14:ligatures w14:val="standardContextual"/>
             </w:rPr>
           </w:pPr>
-          <w:hyperlink w:anchor="_Toc229852087" w:history="1">
+          <w:hyperlink w:anchor="_Toc229854739" w:history="1">
             <w:r>
               <w:rPr>
                 <w:rStyle w:val="Hipervnculo"/>
@@ -4430,7 +4430,7 @@
                 <w:noProof/>
                 <w:webHidden/>
               </w:rPr>
-              <w:instrText xml:space="preserve"> PAGEREF _Toc229852087 \h </w:instrText>
+              <w:instrText xml:space="preserve"> PAGEREF _Toc229854739 \h </w:instrText>
             </w:r>
             <w:r>
               <w:rPr>
@@ -4450,7 +4450,7 @@
                 <w:noProof/>
                 <w:webHidden/>
               </w:rPr>
-              <w:t>34</w:t>
+              <w:t>35</w:t>
             </w:r>
             <w:r>
               <w:rPr>
@@ -4475,7 +4475,7 @@
               <w14:ligatures w14:val="standardContextual"/>
             </w:rPr>
           </w:pPr>
-          <w:hyperlink w:anchor="_Toc229852088" w:history="1">
+          <w:hyperlink w:anchor="_Toc229854740" w:history="1">
             <w:r>
               <w:rPr>
                 <w:rStyle w:val="Hipervnculo"/>
@@ -4502,7 +4502,7 @@
                 <w:noProof/>
                 <w:webHidden/>
               </w:rPr>
-              <w:instrText xml:space="preserve"> PAGEREF _Toc229852088 \h </w:instrText>
+              <w:instrText xml:space="preserve"> PAGEREF _Toc229854740 \h </w:instrText>
             </w:r>
             <w:r>
               <w:rPr>
@@ -4522,7 +4522,7 @@
                 <w:noProof/>
                 <w:webHidden/>
               </w:rPr>
-              <w:t>35</w:t>
+              <w:t>36</w:t>
             </w:r>
             <w:r>
               <w:rPr>
@@ -4548,10 +4548,11 @@
               <w14:ligatures w14:val="standardContextual"/>
             </w:rPr>
           </w:pPr>
-          <w:hyperlink w:anchor="_Toc229852089" w:history="1">
+          <w:hyperlink w:anchor="_Toc229854741" w:history="1">
             <w:r>
               <w:rPr>
                 <w:rStyle w:val="Hipervnculo"/>
+                <w:rFonts w:eastAsia="Aptos"/>
                 <w:noProof/>
               </w:rPr>
               <w:t>10.</w:t>
@@ -4569,9 +4570,10 @@
             <w:r>
               <w:rPr>
                 <w:rStyle w:val="Hipervnculo"/>
-                <w:noProof/>
-              </w:rPr>
-              <w:t>Conclusiones</w:t>
+                <w:rFonts w:eastAsia="Aptos"/>
+                <w:noProof/>
+              </w:rPr>
+              <w:t>Integración de los módulos del ciclo en el proyecto</w:t>
             </w:r>
             <w:r>
               <w:rPr>
@@ -4592,151 +4594,7 @@
                 <w:noProof/>
                 <w:webHidden/>
               </w:rPr>
-              <w:instrText xml:space="preserve"> PAGEREF _Toc229852089 \h </w:instrText>
-            </w:r>
-            <w:r>
-              <w:rPr>
-                <w:noProof/>
-                <w:webHidden/>
-              </w:rPr>
-            </w:r>
-            <w:r>
-              <w:rPr>
-                <w:noProof/>
-                <w:webHidden/>
-              </w:rPr>
-              <w:fldChar w:fldCharType="separate"/>
-            </w:r>
-            <w:r>
-              <w:rPr>
-                <w:noProof/>
-                <w:webHidden/>
-              </w:rPr>
-              <w:t>35</w:t>
-            </w:r>
-            <w:r>
-              <w:rPr>
-                <w:noProof/>
-                <w:webHidden/>
-              </w:rPr>
-              <w:fldChar w:fldCharType="end"/>
-            </w:r>
-          </w:hyperlink>
-        </w:p>
-        <w:p>
-          <w:pPr>
-            <w:pStyle w:val="TDC2"/>
-            <w:tabs>
-              <w:tab w:val="right" w:leader="dot" w:pos="9016"/>
-            </w:tabs>
-            <w:rPr>
-              <w:rFonts w:eastAsiaTheme="minorEastAsia"/>
-              <w:noProof/>
-              <w:kern w:val="2"/>
-              <w:lang w:eastAsia="es-ES"/>
-              <w14:ligatures w14:val="standardContextual"/>
-            </w:rPr>
-          </w:pPr>
-          <w:hyperlink w:anchor="_Toc229852090" w:history="1">
-            <w:r>
-              <w:rPr>
-                <w:rStyle w:val="Hipervnculo"/>
-                <w:noProof/>
-              </w:rPr>
-              <w:t>Conclusiones sobre el trabajo realizado</w:t>
-            </w:r>
-            <w:r>
-              <w:rPr>
-                <w:noProof/>
-                <w:webHidden/>
-              </w:rPr>
-              <w:tab/>
-            </w:r>
-            <w:r>
-              <w:rPr>
-                <w:noProof/>
-                <w:webHidden/>
-              </w:rPr>
-              <w:fldChar w:fldCharType="begin"/>
-            </w:r>
-            <w:r>
-              <w:rPr>
-                <w:noProof/>
-                <w:webHidden/>
-              </w:rPr>
-              <w:instrText xml:space="preserve"> PAGEREF _Toc229852090 \h </w:instrText>
-            </w:r>
-            <w:r>
-              <w:rPr>
-                <w:noProof/>
-                <w:webHidden/>
-              </w:rPr>
-            </w:r>
-            <w:r>
-              <w:rPr>
-                <w:noProof/>
-                <w:webHidden/>
-              </w:rPr>
-              <w:fldChar w:fldCharType="separate"/>
-            </w:r>
-            <w:r>
-              <w:rPr>
-                <w:noProof/>
-                <w:webHidden/>
-              </w:rPr>
-              <w:t>35</w:t>
-            </w:r>
-            <w:r>
-              <w:rPr>
-                <w:noProof/>
-                <w:webHidden/>
-              </w:rPr>
-              <w:fldChar w:fldCharType="end"/>
-            </w:r>
-          </w:hyperlink>
-        </w:p>
-        <w:p>
-          <w:pPr>
-            <w:pStyle w:val="TDC2"/>
-            <w:tabs>
-              <w:tab w:val="right" w:leader="dot" w:pos="9016"/>
-            </w:tabs>
-            <w:rPr>
-              <w:rFonts w:eastAsiaTheme="minorEastAsia"/>
-              <w:noProof/>
-              <w:kern w:val="2"/>
-              <w:lang w:eastAsia="es-ES"/>
-              <w14:ligatures w14:val="standardContextual"/>
-            </w:rPr>
-          </w:pPr>
-          <w:hyperlink w:anchor="_Toc229852091" w:history="1">
-            <w:r>
-              <w:rPr>
-                <w:rStyle w:val="Hipervnculo"/>
-                <w:noProof/>
-              </w:rPr>
-              <w:t>Posibles ampliaciones y mejoras</w:t>
-            </w:r>
-            <w:r>
-              <w:rPr>
-                <w:noProof/>
-                <w:webHidden/>
-              </w:rPr>
-              <w:tab/>
-            </w:r>
-            <w:r>
-              <w:rPr>
-                <w:noProof/>
-                <w:webHidden/>
-              </w:rPr>
-              <w:fldChar w:fldCharType="begin"/>
-            </w:r>
-            <w:r>
-              <w:rPr>
-                <w:noProof/>
-                <w:webHidden/>
-              </w:rPr>
-              <w:instrText xml:space="preserve"> PAGEREF _Toc229852091 \h </w:instrText>
+              <w:instrText xml:space="preserve"> PAGEREF _Toc229854741 \h </w:instrText>
             </w:r>
             <w:r>
               <w:rPr>
@@ -4782,7 +4640,7 @@
               <w14:ligatures w14:val="standardContextual"/>
             </w:rPr>
           </w:pPr>
-          <w:hyperlink w:anchor="_Toc229852092" w:history="1">
+          <w:hyperlink w:anchor="_Toc229854742" w:history="1">
             <w:r>
               <w:rPr>
                 <w:rStyle w:val="Hipervnculo"/>
@@ -4805,6 +4663,240 @@
                 <w:rStyle w:val="Hipervnculo"/>
                 <w:noProof/>
               </w:rPr>
+              <w:t>Conclusiones</w:t>
+            </w:r>
+            <w:r>
+              <w:rPr>
+                <w:noProof/>
+                <w:webHidden/>
+              </w:rPr>
+              <w:tab/>
+            </w:r>
+            <w:r>
+              <w:rPr>
+                <w:noProof/>
+                <w:webHidden/>
+              </w:rPr>
+              <w:fldChar w:fldCharType="begin"/>
+            </w:r>
+            <w:r>
+              <w:rPr>
+                <w:noProof/>
+                <w:webHidden/>
+              </w:rPr>
+              <w:instrText xml:space="preserve"> PAGEREF _Toc229854742 \h </w:instrText>
+            </w:r>
+            <w:r>
+              <w:rPr>
+                <w:noProof/>
+                <w:webHidden/>
+              </w:rPr>
+            </w:r>
+            <w:r>
+              <w:rPr>
+                <w:noProof/>
+                <w:webHidden/>
+              </w:rPr>
+              <w:fldChar w:fldCharType="separate"/>
+            </w:r>
+            <w:r>
+              <w:rPr>
+                <w:noProof/>
+                <w:webHidden/>
+              </w:rPr>
+              <w:t>37</w:t>
+            </w:r>
+            <w:r>
+              <w:rPr>
+                <w:noProof/>
+                <w:webHidden/>
+              </w:rPr>
+              <w:fldChar w:fldCharType="end"/>
+            </w:r>
+          </w:hyperlink>
+        </w:p>
+        <w:p>
+          <w:pPr>
+            <w:pStyle w:val="TDC2"/>
+            <w:tabs>
+              <w:tab w:val="right" w:leader="dot" w:pos="9016"/>
+            </w:tabs>
+            <w:rPr>
+              <w:rFonts w:eastAsiaTheme="minorEastAsia"/>
+              <w:noProof/>
+              <w:kern w:val="2"/>
+              <w:lang w:eastAsia="es-ES"/>
+              <w14:ligatures w14:val="standardContextual"/>
+            </w:rPr>
+          </w:pPr>
+          <w:hyperlink w:anchor="_Toc229854743" w:history="1">
+            <w:r>
+              <w:rPr>
+                <w:rStyle w:val="Hipervnculo"/>
+                <w:noProof/>
+              </w:rPr>
+              <w:t>Conclusiones sobre el trabajo realizado</w:t>
+            </w:r>
+            <w:r>
+              <w:rPr>
+                <w:noProof/>
+                <w:webHidden/>
+              </w:rPr>
+              <w:tab/>
+            </w:r>
+            <w:r>
+              <w:rPr>
+                <w:noProof/>
+                <w:webHidden/>
+              </w:rPr>
+              <w:fldChar w:fldCharType="begin"/>
+            </w:r>
+            <w:r>
+              <w:rPr>
+                <w:noProof/>
+                <w:webHidden/>
+              </w:rPr>
+              <w:instrText xml:space="preserve"> PAGEREF _Toc229854743 \h </w:instrText>
+            </w:r>
+            <w:r>
+              <w:rPr>
+                <w:noProof/>
+                <w:webHidden/>
+              </w:rPr>
+            </w:r>
+            <w:r>
+              <w:rPr>
+                <w:noProof/>
+                <w:webHidden/>
+              </w:rPr>
+              <w:fldChar w:fldCharType="separate"/>
+            </w:r>
+            <w:r>
+              <w:rPr>
+                <w:noProof/>
+                <w:webHidden/>
+              </w:rPr>
+              <w:t>37</w:t>
+            </w:r>
+            <w:r>
+              <w:rPr>
+                <w:noProof/>
+                <w:webHidden/>
+              </w:rPr>
+              <w:fldChar w:fldCharType="end"/>
+            </w:r>
+          </w:hyperlink>
+        </w:p>
+        <w:p>
+          <w:pPr>
+            <w:pStyle w:val="TDC2"/>
+            <w:tabs>
+              <w:tab w:val="right" w:leader="dot" w:pos="9016"/>
+            </w:tabs>
+            <w:rPr>
+              <w:rFonts w:eastAsiaTheme="minorEastAsia"/>
+              <w:noProof/>
+              <w:kern w:val="2"/>
+              <w:lang w:eastAsia="es-ES"/>
+              <w14:ligatures w14:val="standardContextual"/>
+            </w:rPr>
+          </w:pPr>
+          <w:hyperlink w:anchor="_Toc229854744" w:history="1">
+            <w:r>
+              <w:rPr>
+                <w:rStyle w:val="Hipervnculo"/>
+                <w:noProof/>
+              </w:rPr>
+              <w:t>Posibles ampliaciones y mejoras</w:t>
+            </w:r>
+            <w:r>
+              <w:rPr>
+                <w:noProof/>
+                <w:webHidden/>
+              </w:rPr>
+              <w:tab/>
+            </w:r>
+            <w:r>
+              <w:rPr>
+                <w:noProof/>
+                <w:webHidden/>
+              </w:rPr>
+              <w:fldChar w:fldCharType="begin"/>
+            </w:r>
+            <w:r>
+              <w:rPr>
+                <w:noProof/>
+                <w:webHidden/>
+              </w:rPr>
+              <w:instrText xml:space="preserve"> PAGEREF _Toc229854744 \h </w:instrText>
+            </w:r>
+            <w:r>
+              <w:rPr>
+                <w:noProof/>
+                <w:webHidden/>
+              </w:rPr>
+            </w:r>
+            <w:r>
+              <w:rPr>
+                <w:noProof/>
+                <w:webHidden/>
+              </w:rPr>
+              <w:fldChar w:fldCharType="separate"/>
+            </w:r>
+            <w:r>
+              <w:rPr>
+                <w:noProof/>
+                <w:webHidden/>
+              </w:rPr>
+              <w:t>37</w:t>
+            </w:r>
+            <w:r>
+              <w:rPr>
+                <w:noProof/>
+                <w:webHidden/>
+              </w:rPr>
+              <w:fldChar w:fldCharType="end"/>
+            </w:r>
+          </w:hyperlink>
+        </w:p>
+        <w:p>
+          <w:pPr>
+            <w:pStyle w:val="TDC1"/>
+            <w:tabs>
+              <w:tab w:val="left" w:pos="720"/>
+              <w:tab w:val="right" w:leader="dot" w:pos="9016"/>
+            </w:tabs>
+            <w:rPr>
+              <w:rFonts w:eastAsiaTheme="minorEastAsia"/>
+              <w:noProof/>
+              <w:kern w:val="2"/>
+              <w:lang w:eastAsia="es-ES"/>
+              <w14:ligatures w14:val="standardContextual"/>
+            </w:rPr>
+          </w:pPr>
+          <w:hyperlink w:anchor="_Toc229854745" w:history="1">
+            <w:r>
+              <w:rPr>
+                <w:rStyle w:val="Hipervnculo"/>
+                <w:noProof/>
+              </w:rPr>
+              <w:t>12.</w:t>
+            </w:r>
+            <w:r>
+              <w:rPr>
+                <w:rFonts w:eastAsiaTheme="minorEastAsia"/>
+                <w:noProof/>
+                <w:kern w:val="2"/>
+                <w:lang w:eastAsia="es-ES"/>
+                <w14:ligatures w14:val="standardContextual"/>
+              </w:rPr>
+              <w:tab/>
+            </w:r>
+            <w:r>
+              <w:rPr>
+                <w:rStyle w:val="Hipervnculo"/>
+                <w:noProof/>
+              </w:rPr>
               <w:t>Bibliografía</w:t>
             </w:r>
             <w:r>
@@ -4826,7 +4918,7 @@
                 <w:noProof/>
                 <w:webHidden/>
               </w:rPr>
-              <w:instrText xml:space="preserve"> PAGEREF _Toc229852092 \h </w:instrText>
+              <w:instrText xml:space="preserve"> PAGEREF _Toc229854745 \h </w:instrText>
             </w:r>
             <w:r>
               <w:rPr>
@@ -4846,7 +4938,7 @@
                 <w:noProof/>
                 <w:webHidden/>
               </w:rPr>
-              <w:t>37</w:t>
+              <w:t>38</w:t>
             </w:r>
             <w:r>
               <w:rPr>
@@ -6508,7 +6600,7 @@
       <w:pPr>
         <w:pStyle w:val="Ttulo1"/>
       </w:pPr>
-      <w:bookmarkStart w:id="0" w:name="_Toc229852050"/>
+      <w:bookmarkStart w:id="0" w:name="_Toc229854702"/>
       <w:r>
         <w:t>Introducción</w:t>
       </w:r>
@@ -6518,7 +6610,7 @@
       <w:pPr>
         <w:pStyle w:val="Ttulo2"/>
       </w:pPr>
-      <w:bookmarkStart w:id="1" w:name="_Toc229852051"/>
+      <w:bookmarkStart w:id="1" w:name="_Toc229854703"/>
       <w:r>
         <w:t>Objetivo del proyecto</w:t>
       </w:r>
@@ -6557,7 +6649,7 @@
         <w:pStyle w:val="Ttulo2"/>
         <w:jc w:val="both"/>
       </w:pPr>
-      <w:bookmarkStart w:id="2" w:name="_Toc229852052"/>
+      <w:bookmarkStart w:id="2" w:name="_Toc229854704"/>
       <w:r>
         <w:t>Justificación del proyecto</w:t>
       </w:r>
@@ -6668,7 +6760,7 @@
         <w:pStyle w:val="Ttulo2"/>
         <w:jc w:val="both"/>
       </w:pPr>
-      <w:bookmarkStart w:id="3" w:name="_Toc229852053"/>
+      <w:bookmarkStart w:id="3" w:name="_Toc229854705"/>
       <w:r>
         <w:t>Análisis de lo existente</w:t>
       </w:r>
@@ -6737,7 +6829,7 @@
       <w:pPr>
         <w:pStyle w:val="Ttulo1"/>
       </w:pPr>
-      <w:bookmarkStart w:id="4" w:name="_Toc229852054"/>
+      <w:bookmarkStart w:id="4" w:name="_Toc229854706"/>
       <w:r>
         <w:t xml:space="preserve">Requisitos Funcionales de la </w:t>
       </w:r>
@@ -6792,7 +6884,7 @@
       <w:pPr>
         <w:pStyle w:val="Ttulo2"/>
       </w:pPr>
-      <w:bookmarkStart w:id="5" w:name="_Toc229852055"/>
+      <w:bookmarkStart w:id="5" w:name="_Toc229854707"/>
       <w:r>
         <w:t>Inquilino</w:t>
       </w:r>
@@ -7424,7 +7516,7 @@
       <w:pPr>
         <w:pStyle w:val="Ttulo2"/>
       </w:pPr>
-      <w:bookmarkStart w:id="6" w:name="_Toc229852056"/>
+      <w:bookmarkStart w:id="6" w:name="_Toc229854708"/>
       <w:r>
         <w:t>Arrendador</w:t>
       </w:r>
@@ -8159,7 +8251,7 @@
           <w:rFonts w:eastAsia="Aptos"/>
         </w:rPr>
       </w:pPr>
-      <w:bookmarkStart w:id="7" w:name="_Toc229852057"/>
+      <w:bookmarkStart w:id="7" w:name="_Toc229854709"/>
       <w:r>
         <w:rPr>
           <w:rFonts w:eastAsia="Aptos"/>
@@ -8320,7 +8412,7 @@
       <w:pPr>
         <w:pStyle w:val="Ttulo1"/>
       </w:pPr>
-      <w:bookmarkStart w:id="8" w:name="_Toc229852058"/>
+      <w:bookmarkStart w:id="8" w:name="_Toc229854710"/>
       <w:r>
         <w:t>Análisis y Diseño</w:t>
       </w:r>
@@ -8331,7 +8423,7 @@
         <w:pStyle w:val="Ttulo2"/>
       </w:pPr>
       <w:bookmarkStart w:id="9" w:name="_Toc225415558"/>
-      <w:bookmarkStart w:id="10" w:name="_Toc229852059"/>
+      <w:bookmarkStart w:id="10" w:name="_Toc229854711"/>
       <w:r>
         <w:t>Diagrama de Arquitectura</w:t>
       </w:r>
@@ -8475,7 +8567,7 @@
       <w:pPr>
         <w:pStyle w:val="Ttulo2"/>
       </w:pPr>
-      <w:bookmarkStart w:id="12" w:name="_Toc229852060"/>
+      <w:bookmarkStart w:id="12" w:name="_Toc229854712"/>
       <w:r>
         <w:lastRenderedPageBreak/>
         <w:t xml:space="preserve">Diagrama </w:t>
@@ -8589,7 +8681,7 @@
       <w:pPr>
         <w:pStyle w:val="Ttulo2"/>
       </w:pPr>
-      <w:bookmarkStart w:id="14" w:name="_Toc229852061"/>
+      <w:bookmarkStart w:id="14" w:name="_Toc229854713"/>
       <w:r>
         <w:lastRenderedPageBreak/>
         <w:t>Diagrama de clases</w:t>
@@ -8605,7 +8697,7 @@
           <w:noProof/>
         </w:rPr>
         <w:drawing>
-          <wp:inline distT="0" distB="0" distL="0" distR="0" wp14:anchorId="67E3B4D2" wp14:editId="1BFFC5C2">
+          <wp:inline distT="0" distB="0" distL="0" distR="0" wp14:anchorId="67E3B4D2" wp14:editId="4435BA76">
             <wp:extent cx="5731510" cy="6417310"/>
             <wp:effectExtent l="0" t="0" r="2540" b="2540"/>
             <wp:docPr id="682627866" name="Imagen 2"/>
@@ -8670,7 +8762,7 @@
       <w:pPr>
         <w:pStyle w:val="Ttulo2"/>
       </w:pPr>
-      <w:bookmarkStart w:id="16" w:name="_Toc229852062"/>
+      <w:bookmarkStart w:id="16" w:name="_Toc229854714"/>
       <w:r>
         <w:lastRenderedPageBreak/>
         <w:t>Diagrama Entidad-Relación</w:t>
@@ -8777,7 +8869,7 @@
       <w:pPr>
         <w:pStyle w:val="Ttulo2"/>
       </w:pPr>
-      <w:bookmarkStart w:id="18" w:name="_Toc229852063"/>
+      <w:bookmarkStart w:id="18" w:name="_Toc229854715"/>
       <w:r>
         <w:t>Modelo Relacional</w:t>
       </w:r>
@@ -9812,7 +9904,7 @@
         <w:pStyle w:val="Ttulo2"/>
       </w:pPr>
       <w:bookmarkStart w:id="19" w:name="_Toc225415563"/>
-      <w:bookmarkStart w:id="20" w:name="_Toc229852064"/>
+      <w:bookmarkStart w:id="20" w:name="_Toc229854716"/>
       <w:r>
         <w:t>Script SQL</w:t>
       </w:r>
@@ -10035,7 +10127,7 @@
       <w:pPr>
         <w:pStyle w:val="Ttulo1"/>
       </w:pPr>
-      <w:bookmarkStart w:id="21" w:name="_Toc229852065"/>
+      <w:bookmarkStart w:id="21" w:name="_Toc229854717"/>
       <w:r>
         <w:t>Metodología de desarrollo</w:t>
       </w:r>
@@ -10046,7 +10138,7 @@
         <w:pStyle w:val="Ttulo2"/>
         <w:jc w:val="both"/>
       </w:pPr>
-      <w:bookmarkStart w:id="22" w:name="_Toc229852066"/>
+      <w:bookmarkStart w:id="22" w:name="_Toc229854718"/>
       <w:r>
         <w:t>Ciclo de vida</w:t>
       </w:r>
@@ -10144,7 +10236,7 @@
       <w:pPr>
         <w:pStyle w:val="Ttulo2"/>
       </w:pPr>
-      <w:bookmarkStart w:id="23" w:name="_Toc229852067"/>
+      <w:bookmarkStart w:id="23" w:name="_Toc229854719"/>
       <w:r>
         <w:lastRenderedPageBreak/>
         <w:t>Metodología ágil</w:t>
@@ -10460,7 +10552,7 @@
       <w:pPr>
         <w:pStyle w:val="Ttulo2"/>
       </w:pPr>
-      <w:bookmarkStart w:id="24" w:name="_Toc229852068"/>
+      <w:bookmarkStart w:id="24" w:name="_Toc229854720"/>
       <w:r>
         <w:lastRenderedPageBreak/>
         <w:t xml:space="preserve">Nuestro Tablero </w:t>
@@ -10636,7 +10728,7 @@
       <w:pPr>
         <w:pStyle w:val="Ttulo2"/>
       </w:pPr>
-      <w:bookmarkStart w:id="27" w:name="_Toc229852069"/>
+      <w:bookmarkStart w:id="27" w:name="_Toc229854721"/>
       <w:r>
         <w:lastRenderedPageBreak/>
         <w:t>Planificación de tareas y toles de equipo</w:t>
@@ -11518,7 +11610,7 @@
       <w:pPr>
         <w:pStyle w:val="Ttulo1"/>
       </w:pPr>
-      <w:bookmarkStart w:id="30" w:name="_Toc229852070"/>
+      <w:bookmarkStart w:id="30" w:name="_Toc229854722"/>
       <w:r>
         <w:lastRenderedPageBreak/>
         <w:t>Codificación</w:t>
@@ -11529,7 +11621,7 @@
       <w:pPr>
         <w:pStyle w:val="Ttulo2"/>
       </w:pPr>
-      <w:bookmarkStart w:id="31" w:name="_Toc229852071"/>
+      <w:bookmarkStart w:id="31" w:name="_Toc229854723"/>
       <w:r>
         <w:t>Entorno de programación</w:t>
       </w:r>
@@ -11698,7 +11790,7 @@
         <w:pStyle w:val="Ttulo2"/>
         <w:jc w:val="both"/>
       </w:pPr>
-      <w:bookmarkStart w:id="32" w:name="_Toc229852072"/>
+      <w:bookmarkStart w:id="32" w:name="_Toc229854724"/>
       <w:r>
         <w:t>Lenguajes y herramientas</w:t>
       </w:r>
@@ -11892,7 +11984,7 @@
       <w:pPr>
         <w:pStyle w:val="Ttulo2"/>
       </w:pPr>
-      <w:bookmarkStart w:id="33" w:name="_Toc229852073"/>
+      <w:bookmarkStart w:id="33" w:name="_Toc229854725"/>
       <w:r>
         <w:t>Aspectos relevantes de la implementación</w:t>
       </w:r>
@@ -12393,6 +12485,9 @@
         <w:keepNext/>
       </w:pPr>
       <w:r>
+        <w:rPr>
+          <w:noProof/>
+        </w:rPr>
         <w:drawing>
           <wp:inline distT="0" distB="0" distL="0" distR="0" wp14:anchorId="22B629F7" wp14:editId="4174B8A4">
             <wp:extent cx="5731510" cy="1966595"/>
@@ -12453,6 +12548,9 @@
         <w:keepNext/>
       </w:pPr>
       <w:r>
+        <w:rPr>
+          <w:noProof/>
+        </w:rPr>
         <w:lastRenderedPageBreak/>
         <w:drawing>
           <wp:inline distT="0" distB="0" distL="0" distR="0" wp14:anchorId="35DC4DD9" wp14:editId="5FA34CF4">
@@ -13253,7 +13351,7 @@
       <w:pPr>
         <w:pStyle w:val="Ttulo1"/>
       </w:pPr>
-      <w:bookmarkStart w:id="45" w:name="_Toc229852074"/>
+      <w:bookmarkStart w:id="45" w:name="_Toc229854726"/>
       <w:r>
         <w:t>Manual de usuario</w:t>
       </w:r>
@@ -13263,7 +13361,7 @@
       <w:pPr>
         <w:pStyle w:val="Ttulo2"/>
       </w:pPr>
-      <w:bookmarkStart w:id="46" w:name="_Toc229852075"/>
+      <w:bookmarkStart w:id="46" w:name="_Toc229854727"/>
       <w:r>
         <w:t>Entrar al proyecto</w:t>
       </w:r>
@@ -13314,7 +13412,7 @@
       <w:pPr>
         <w:pStyle w:val="Ttulo2"/>
       </w:pPr>
-      <w:bookmarkStart w:id="47" w:name="_Toc229852076"/>
+      <w:bookmarkStart w:id="47" w:name="_Toc229854728"/>
       <w:r>
         <w:t>Registro, inicio de sesión y navegación.</w:t>
       </w:r>
@@ -13501,6 +13599,9 @@
         <w:jc w:val="both"/>
       </w:pPr>
       <w:r>
+        <w:rPr>
+          <w:noProof/>
+        </w:rPr>
         <w:lastRenderedPageBreak/>
         <w:drawing>
           <wp:inline distT="0" distB="0" distL="0" distR="0" wp14:anchorId="46A5C485" wp14:editId="09DC3D56">
@@ -13563,6 +13664,9 @@
         <w:keepNext/>
       </w:pPr>
       <w:r>
+        <w:rPr>
+          <w:noProof/>
+        </w:rPr>
         <w:drawing>
           <wp:inline distT="0" distB="0" distL="0" distR="0" wp14:anchorId="3B931D98" wp14:editId="652EFAF8">
             <wp:extent cx="5731510" cy="2700655"/>
@@ -13641,7 +13745,7 @@
       <w:pPr>
         <w:pStyle w:val="Ttulo2"/>
       </w:pPr>
-      <w:bookmarkStart w:id="52" w:name="_Toc229852077"/>
+      <w:bookmarkStart w:id="52" w:name="_Toc229854729"/>
       <w:r>
         <w:lastRenderedPageBreak/>
         <w:t>Instrucciones manipulación base de datos</w:t>
@@ -13743,7 +13847,7 @@
       <w:pPr>
         <w:pStyle w:val="Ttulo1"/>
       </w:pPr>
-      <w:bookmarkStart w:id="53" w:name="_Toc229852078"/>
+      <w:bookmarkStart w:id="53" w:name="_Toc229854730"/>
       <w:r>
         <w:t>Requisitos e instalación</w:t>
       </w:r>
@@ -13753,7 +13857,7 @@
       <w:pPr>
         <w:pStyle w:val="Ttulo2"/>
       </w:pPr>
-      <w:bookmarkStart w:id="54" w:name="_Toc229852079"/>
+      <w:bookmarkStart w:id="54" w:name="_Toc229854731"/>
       <w:r>
         <w:t>Requisitos del sistema</w:t>
       </w:r>
@@ -13846,7 +13950,7 @@
       <w:pPr>
         <w:pStyle w:val="Ttulo2"/>
       </w:pPr>
-      <w:bookmarkStart w:id="55" w:name="_Toc229852080"/>
+      <w:bookmarkStart w:id="55" w:name="_Toc229854732"/>
       <w:r>
         <w:t>Instalación y ejecución</w:t>
       </w:r>
@@ -13934,7 +14038,7 @@
       <w:pPr>
         <w:pStyle w:val="Ttulo1"/>
       </w:pPr>
-      <w:bookmarkStart w:id="56" w:name="_Toc229852081"/>
+      <w:bookmarkStart w:id="56" w:name="_Toc229854733"/>
       <w:r>
         <w:t>Plan de negocio</w:t>
       </w:r>
@@ -13944,7 +14048,7 @@
       <w:pPr>
         <w:pStyle w:val="Ttulo2"/>
       </w:pPr>
-      <w:bookmarkStart w:id="57" w:name="_Toc229852082"/>
+      <w:bookmarkStart w:id="57" w:name="_Toc229854734"/>
       <w:r>
         <w:t>Público objetivo</w:t>
       </w:r>
@@ -13979,7 +14083,7 @@
       <w:pPr>
         <w:pStyle w:val="Ttulo2"/>
       </w:pPr>
-      <w:bookmarkStart w:id="58" w:name="_Toc229852083"/>
+      <w:bookmarkStart w:id="58" w:name="_Toc229854735"/>
       <w:r>
         <w:t>Utilidad social</w:t>
       </w:r>
@@ -14028,7 +14132,7 @@
       <w:pPr>
         <w:pStyle w:val="Ttulo2"/>
       </w:pPr>
-      <w:bookmarkStart w:id="59" w:name="_Toc229852084"/>
+      <w:bookmarkStart w:id="59" w:name="_Toc229854736"/>
       <w:r>
         <w:t>Costes y beneficios</w:t>
       </w:r>
@@ -14365,7 +14469,7 @@
       <w:pPr>
         <w:pStyle w:val="Ttulo1"/>
       </w:pPr>
-      <w:bookmarkStart w:id="60" w:name="_Toc229852085"/>
+      <w:bookmarkStart w:id="60" w:name="_Toc229854737"/>
       <w:r>
         <w:lastRenderedPageBreak/>
         <w:t>Prevención de Riesgos Laborales</w:t>
@@ -14376,7 +14480,7 @@
       <w:pPr>
         <w:pStyle w:val="Ttulo2"/>
       </w:pPr>
-      <w:bookmarkStart w:id="61" w:name="_Toc229852086"/>
+      <w:bookmarkStart w:id="61" w:name="_Toc229854738"/>
       <w:r>
         <w:t>Riesgos derivados de los espacio y equipos de trabajo</w:t>
       </w:r>
@@ -14531,7 +14635,7 @@
       <w:pPr>
         <w:pStyle w:val="Ttulo2"/>
       </w:pPr>
-      <w:bookmarkStart w:id="62" w:name="_Toc229852087"/>
+      <w:bookmarkStart w:id="62" w:name="_Toc229854739"/>
       <w:r>
         <w:t>Agentes físicos</w:t>
       </w:r>
@@ -14930,7 +15034,7 @@
       <w:pPr>
         <w:pStyle w:val="Ttulo2"/>
       </w:pPr>
-      <w:bookmarkStart w:id="63" w:name="_Toc229852088"/>
+      <w:bookmarkStart w:id="63" w:name="_Toc229854740"/>
       <w:r>
         <w:t>Riesgos ergonómicos y psicosociales</w:t>
       </w:r>
@@ -15017,22 +15121,253 @@
     <w:p>
       <w:pPr>
         <w:pStyle w:val="Ttulo1"/>
-      </w:pPr>
-      <w:bookmarkStart w:id="64" w:name="_Toc229852089"/>
+        <w:rPr>
+          <w:rFonts w:eastAsia="Aptos"/>
+        </w:rPr>
+      </w:pPr>
+      <w:bookmarkStart w:id="64" w:name="_Toc229854741"/>
+      <w:r>
+        <w:rPr>
+          <w:rFonts w:eastAsia="Aptos"/>
+        </w:rPr>
+        <w:t>Integración de los módulos del ciclo en el proyecto</w:t>
+      </w:r>
+      <w:bookmarkEnd w:id="64"/>
+    </w:p>
+    <w:p/>
+    <w:p>
+      <w:pPr>
+        <w:pStyle w:val="Prrafodelista"/>
+        <w:numPr>
+          <w:ilvl w:val="0"/>
+          <w:numId w:val="22"/>
+        </w:numPr>
+        <w:jc w:val="both"/>
+        <w:rPr>
+          <w:b/>
+          <w:bCs/>
+        </w:rPr>
+      </w:pPr>
+      <w:r>
+        <w:rPr>
+          <w:b/>
+          <w:bCs/>
+        </w:rPr>
+        <w:t>Lenguajes de marcas</w:t>
+      </w:r>
+      <w:r>
+        <w:rPr>
+          <w:b/>
+          <w:bCs/>
+        </w:rPr>
+        <w:t xml:space="preserve">: </w:t>
+      </w:r>
+      <w:r>
+        <w:t>Creación de página web interactiva con HTML, CSS y JavaScript.</w:t>
+      </w:r>
+    </w:p>
+    <w:p>
+      <w:pPr>
+        <w:pStyle w:val="Prrafodelista"/>
+        <w:numPr>
+          <w:ilvl w:val="0"/>
+          <w:numId w:val="22"/>
+        </w:numPr>
+        <w:jc w:val="both"/>
+        <w:rPr>
+          <w:b/>
+          <w:bCs/>
+        </w:rPr>
+      </w:pPr>
+      <w:r>
+        <w:rPr>
+          <w:b/>
+          <w:bCs/>
+        </w:rPr>
+        <w:t xml:space="preserve">Programación: </w:t>
+      </w:r>
+      <w:r>
+        <w:t xml:space="preserve">Desarrollo de aplicación </w:t>
+      </w:r>
+      <w:proofErr w:type="spellStart"/>
+      <w:r>
+        <w:t>JavaFX</w:t>
+      </w:r>
+      <w:proofErr w:type="spellEnd"/>
+      <w:r>
+        <w:t xml:space="preserve"> para la administración de base de datos. Integración de función para usar reconocimiento facial. </w:t>
+      </w:r>
+    </w:p>
+    <w:p>
+      <w:pPr>
+        <w:pStyle w:val="Prrafodelista"/>
+        <w:numPr>
+          <w:ilvl w:val="0"/>
+          <w:numId w:val="22"/>
+        </w:numPr>
+        <w:jc w:val="both"/>
+        <w:rPr>
+          <w:b/>
+          <w:bCs/>
+        </w:rPr>
+      </w:pPr>
+      <w:r>
+        <w:rPr>
+          <w:b/>
+          <w:bCs/>
+        </w:rPr>
+        <w:t xml:space="preserve">Bases de datos: </w:t>
+      </w:r>
+      <w:r>
+        <w:t xml:space="preserve">Diseño y creación de base de datos, así como la inserción de todos los datos e inclusión de disparadores. </w:t>
+      </w:r>
+    </w:p>
+    <w:p>
+      <w:pPr>
+        <w:pStyle w:val="Prrafodelista"/>
+        <w:numPr>
+          <w:ilvl w:val="0"/>
+          <w:numId w:val="22"/>
+        </w:numPr>
+        <w:jc w:val="both"/>
+        <w:rPr>
+          <w:b/>
+          <w:bCs/>
+        </w:rPr>
+      </w:pPr>
+      <w:r>
+        <w:rPr>
+          <w:b/>
+          <w:bCs/>
+        </w:rPr>
+        <w:t xml:space="preserve">Entornos de desarrollo: </w:t>
+      </w:r>
+      <w:r>
+        <w:t xml:space="preserve">Creación de </w:t>
+      </w:r>
+      <w:r>
+        <w:t>diagramas,</w:t>
+      </w:r>
+      <w:r>
+        <w:t xml:space="preserve"> así como de la documentación previa al desarrollo del proyecto. Definir objetivos, elegir sistema de organización y metodología de desarrollo.</w:t>
+      </w:r>
+    </w:p>
+    <w:p>
+      <w:pPr>
+        <w:pStyle w:val="Prrafodelista"/>
+        <w:numPr>
+          <w:ilvl w:val="0"/>
+          <w:numId w:val="22"/>
+        </w:numPr>
+        <w:jc w:val="both"/>
+        <w:rPr>
+          <w:b/>
+          <w:bCs/>
+        </w:rPr>
+      </w:pPr>
+      <w:r>
+        <w:rPr>
+          <w:b/>
+          <w:bCs/>
+        </w:rPr>
+        <w:t xml:space="preserve">Sistemas Informáticos: </w:t>
+      </w:r>
+      <w:r>
+        <w:t xml:space="preserve">Mayor conocimiento real del hardware </w:t>
+      </w:r>
+      <w:r>
+        <w:t>usado,</w:t>
+      </w:r>
+      <w:r>
+        <w:t xml:space="preserve"> así como uso de comandos en consola en situaciones puntuales. </w:t>
+      </w:r>
+    </w:p>
+    <w:p>
+      <w:pPr>
+        <w:pStyle w:val="Prrafodelista"/>
+        <w:numPr>
+          <w:ilvl w:val="0"/>
+          <w:numId w:val="22"/>
+        </w:numPr>
+        <w:jc w:val="both"/>
+        <w:rPr>
+          <w:b/>
+          <w:bCs/>
+        </w:rPr>
+      </w:pPr>
+      <w:r>
+        <w:rPr>
+          <w:b/>
+          <w:bCs/>
+        </w:rPr>
+        <w:lastRenderedPageBreak/>
+        <w:t xml:space="preserve">Inglés: </w:t>
+      </w:r>
+      <w:r>
+        <w:t xml:space="preserve">Redacción del </w:t>
+      </w:r>
+      <w:proofErr w:type="spellStart"/>
+      <w:proofErr w:type="gramStart"/>
+      <w:r>
+        <w:t>abstract</w:t>
+      </w:r>
+      <w:proofErr w:type="spellEnd"/>
+      <w:proofErr w:type="gramEnd"/>
+      <w:r>
+        <w:t xml:space="preserve"> del proyecto y comentario de los videos de demostración. </w:t>
+      </w:r>
+    </w:p>
+    <w:p>
+      <w:pPr>
+        <w:pStyle w:val="Prrafodelista"/>
+        <w:numPr>
+          <w:ilvl w:val="0"/>
+          <w:numId w:val="22"/>
+        </w:numPr>
+        <w:jc w:val="both"/>
+        <w:rPr>
+          <w:b/>
+          <w:bCs/>
+        </w:rPr>
+      </w:pPr>
+      <w:r>
+        <w:rPr>
+          <w:b/>
+          <w:bCs/>
+        </w:rPr>
+        <w:t xml:space="preserve">IPE: </w:t>
+      </w:r>
+      <w:r>
+        <w:t xml:space="preserve">Elaboración de las secciones Prevención de Riesgos Laborales y Plan de Negocio. </w:t>
+      </w:r>
+    </w:p>
+    <w:p>
+      <w:pPr>
+        <w:rPr>
+          <w:b/>
+          <w:bCs/>
+        </w:rPr>
+      </w:pPr>
+    </w:p>
+    <w:p>
+      <w:pPr>
+        <w:pStyle w:val="Ttulo1"/>
+      </w:pPr>
+      <w:bookmarkStart w:id="65" w:name="_Toc229854742"/>
       <w:r>
         <w:t>Conclusiones</w:t>
       </w:r>
-      <w:bookmarkEnd w:id="64"/>
+      <w:bookmarkEnd w:id="65"/>
     </w:p>
     <w:p>
       <w:pPr>
         <w:pStyle w:val="Ttulo2"/>
       </w:pPr>
-      <w:bookmarkStart w:id="65" w:name="_Toc229852090"/>
+      <w:bookmarkStart w:id="66" w:name="_Toc229854743"/>
       <w:r>
         <w:t>Conclusiones sobre el trabajo realizado</w:t>
       </w:r>
-      <w:bookmarkEnd w:id="65"/>
+      <w:bookmarkEnd w:id="66"/>
     </w:p>
     <w:p>
       <w:pPr>
@@ -15087,74 +15422,71 @@
         <w:jc w:val="both"/>
       </w:pPr>
       <w:r>
-        <w:t xml:space="preserve">Las mayores dificultades que se han encontrado han sido, la coordinación de todas las partes del equipo, en especial la sincronización de flujos de trabajo y la unión de criterios </w:t>
-      </w:r>
+        <w:t xml:space="preserve">Las mayores dificultades que se han encontrado han sido, la coordinación de todas las partes del equipo, en especial la sincronización de flujos de trabajo y la unión de criterios para cumplir los plazos establecidos. También, se han encontrado dificultades al intentar coordinar la realización del proyecto a la vez que la formación en centros de trabajo. </w:t>
+      </w:r>
+    </w:p>
+    <w:p>
+      <w:pPr>
+        <w:jc w:val="both"/>
+      </w:pPr>
+      <w:r>
+        <w:t xml:space="preserve">Gran parte del aprendizaje adquirido al realizar este proyecto viene de la investigación y búsqueda de información y de la necesidad de encontrar soluciones creativas por cuenta propia para superar los distintos obstáculos encontrados durante los diferentes hitos. </w:t>
+      </w:r>
+    </w:p>
+    <w:p>
+      <w:pPr>
+        <w:pStyle w:val="Ttulo2"/>
+      </w:pPr>
+      <w:bookmarkStart w:id="67" w:name="_Toc229854744"/>
+      <w:r>
+        <w:t>Posibles ampliaciones y mejoras</w:t>
+      </w:r>
+      <w:bookmarkEnd w:id="67"/>
+    </w:p>
+    <w:p>
+      <w:pPr>
+        <w:jc w:val="both"/>
+      </w:pPr>
+      <w:r>
+        <w:t xml:space="preserve"> En las posibles mejoras de este proyecto, la primera sería la conexión real entre el </w:t>
+      </w:r>
+      <w:proofErr w:type="spellStart"/>
+      <w:r>
+        <w:t>frontend</w:t>
+      </w:r>
+      <w:proofErr w:type="spellEnd"/>
+      <w:r>
+        <w:t xml:space="preserve"> y </w:t>
+      </w:r>
+      <w:proofErr w:type="spellStart"/>
+      <w:r>
+        <w:t>backend</w:t>
+      </w:r>
+      <w:proofErr w:type="spellEnd"/>
+      <w:r>
+        <w:t xml:space="preserve"> para que el proyecto fuera realmente funcional. Ya que ahora los datos recogidos desde la página web no se guardan en la base de datos y los datos que usa la página web no provienen de la base de datos. </w:t>
+      </w:r>
+    </w:p>
+    <w:p>
+      <w:pPr>
+        <w:jc w:val="both"/>
+      </w:pPr>
+      <w:r>
+        <w:t>Otra posible mejora sería, como se ha mencionado antes, la implementación de búsqueda a través de un mapa</w:t>
+      </w:r>
+      <w:r>
+        <w:t>,</w:t>
+      </w:r>
+      <w:r>
+        <w:t xml:space="preserve"> ya que haría la experiencia de búsqueda de habitaciones más visual y atractiva. </w:t>
+      </w:r>
+    </w:p>
+    <w:p>
+      <w:pPr>
+        <w:jc w:val="both"/>
+      </w:pPr>
       <w:r>
         <w:lastRenderedPageBreak/>
-        <w:t xml:space="preserve">para cumplir los plazos establecidos. También, se han encontrado dificultades al intentar coordinar la realización del proyecto a la vez que la formación en centros de trabajo. </w:t>
-      </w:r>
-    </w:p>
-    <w:p>
-      <w:pPr>
-        <w:jc w:val="both"/>
-      </w:pPr>
-      <w:r>
-        <w:t xml:space="preserve">Gran parte del aprendizaje adquirido al realizar este proyecto viene de la investigación y búsqueda de información y de la necesidad de encontrar soluciones creativas por cuenta propia para superar los distintos obstáculos encontrados durante los diferentes hitos. </w:t>
-      </w:r>
-    </w:p>
-    <w:p>
-      <w:pPr>
-        <w:pStyle w:val="Ttulo2"/>
-      </w:pPr>
-      <w:bookmarkStart w:id="66" w:name="_Toc229852091"/>
-      <w:r>
-        <w:t>Posibles ampliaciones y mejoras</w:t>
-      </w:r>
-      <w:bookmarkEnd w:id="66"/>
-    </w:p>
-    <w:p>
-      <w:pPr>
-        <w:jc w:val="both"/>
-      </w:pPr>
-      <w:r>
-        <w:t xml:space="preserve"> En las posibles mejoras de este proyecto, la primera sería la conexión real entre el </w:t>
-      </w:r>
-      <w:proofErr w:type="spellStart"/>
-      <w:r>
-        <w:t>frontend</w:t>
-      </w:r>
-      <w:proofErr w:type="spellEnd"/>
-      <w:r>
-        <w:t xml:space="preserve"> y </w:t>
-      </w:r>
-      <w:proofErr w:type="spellStart"/>
-      <w:r>
-        <w:t>backend</w:t>
-      </w:r>
-      <w:proofErr w:type="spellEnd"/>
-      <w:r>
-        <w:t xml:space="preserve"> para que el proyecto fuera realmente funcional. Ya que ahora los datos recogidos desde la página web no se guardan en la base de datos y los datos que usa la página web no provienen de la base de datos. </w:t>
-      </w:r>
-    </w:p>
-    <w:p>
-      <w:pPr>
-        <w:jc w:val="both"/>
-      </w:pPr>
-      <w:r>
-        <w:t>Otra posible mejora sería, como se ha mencionado antes, la implementación de búsqueda a través de un mapa</w:t>
-      </w:r>
-      <w:r>
-        <w:t>,</w:t>
-      </w:r>
-      <w:r>
-        <w:t xml:space="preserve"> ya que haría la experiencia de búsqueda de habitaciones más visual y atractiva. </w:t>
-      </w:r>
-    </w:p>
-    <w:p>
-      <w:pPr>
-        <w:jc w:val="both"/>
-      </w:pPr>
-      <w:r>
         <w:t xml:space="preserve">Finalmente, </w:t>
       </w:r>
       <w:proofErr w:type="spellStart"/>
@@ -15204,32 +15536,16 @@
         <w:t xml:space="preserve"> con la base de datos que compartiría con la página web original. </w:t>
       </w:r>
     </w:p>
-    <w:p>
-      <w:pPr>
-        <w:spacing w:before="240" w:after="240" w:line="276" w:lineRule="auto"/>
-        <w:jc w:val="both"/>
-        <w:rPr>
-          <w:rFonts w:ascii="Aptos" w:eastAsia="Aptos" w:hAnsi="Aptos" w:cs="Aptos"/>
-          <w:color w:val="000000" w:themeColor="text1"/>
-        </w:rPr>
-      </w:pPr>
-    </w:p>
     <w:p/>
     <w:p>
-      <w:r>
-        <w:br w:type="page"/>
-      </w:r>
-    </w:p>
-    <w:p>
       <w:pPr>
         <w:pStyle w:val="Ttulo1"/>
       </w:pPr>
-      <w:bookmarkStart w:id="67" w:name="_Toc229852092"/>
-      <w:r>
-        <w:lastRenderedPageBreak/>
+      <w:bookmarkStart w:id="68" w:name="_Toc229854745"/>
+      <w:r>
         <w:t>Bibliografía</w:t>
       </w:r>
-      <w:bookmarkEnd w:id="67"/>
+      <w:bookmarkEnd w:id="68"/>
     </w:p>
     <w:p>
       <w:pPr>
@@ -17148,6 +17464,95 @@
     </w:lvl>
   </w:abstractNum>
   <w:abstractNum w:abstractNumId="12" w15:restartNumberingAfterBreak="0">
+    <w:nsid w:val="540048E0"/>
+    <w:multiLevelType w:val="hybridMultilevel"/>
+    <w:tmpl w:val="7F682B12"/>
+    <w:lvl w:ilvl="0" w:tplc="0C0A000F">
+      <w:start w:val="1"/>
+      <w:numFmt w:val="decimal"/>
+      <w:lvlText w:val="%1."/>
+      <w:lvlJc w:val="left"/>
+      <w:pPr>
+        <w:ind w:left="720" w:hanging="360"/>
+      </w:pPr>
+      <w:rPr>
+        <w:rFonts w:hint="default"/>
+      </w:rPr>
+    </w:lvl>
+    <w:lvl w:ilvl="1" w:tplc="0C0A0019" w:tentative="1">
+      <w:start w:val="1"/>
+      <w:numFmt w:val="lowerLetter"/>
+      <w:lvlText w:val="%2."/>
+      <w:lvlJc w:val="left"/>
+      <w:pPr>
+        <w:ind w:left="1440" w:hanging="360"/>
+      </w:pPr>
+    </w:lvl>
+    <w:lvl w:ilvl="2" w:tplc="0C0A001B" w:tentative="1">
+      <w:start w:val="1"/>
+      <w:numFmt w:val="lowerRoman"/>
+      <w:lvlText w:val="%3."/>
+      <w:lvlJc w:val="right"/>
+      <w:pPr>
+        <w:ind w:left="2160" w:hanging="180"/>
+      </w:pPr>
+    </w:lvl>
+    <w:lvl w:ilvl="3" w:tplc="0C0A000F" w:tentative="1">
+      <w:start w:val="1"/>
+      <w:numFmt w:val="decimal"/>
+      <w:lvlText w:val="%4."/>
+      <w:lvlJc w:val="left"/>
+      <w:pPr>
+        <w:ind w:left="2880" w:hanging="360"/>
+      </w:pPr>
+    </w:lvl>
+    <w:lvl w:ilvl="4" w:tplc="0C0A0019" w:tentative="1">
+      <w:start w:val="1"/>
+      <w:numFmt w:val="lowerLetter"/>
+      <w:lvlText w:val="%5."/>
+      <w:lvlJc w:val="left"/>
+      <w:pPr>
+        <w:ind w:left="3600" w:hanging="360"/>
+      </w:pPr>
+    </w:lvl>
+    <w:lvl w:ilvl="5" w:tplc="0C0A001B" w:tentative="1">
+      <w:start w:val="1"/>
+      <w:numFmt w:val="lowerRoman"/>
+      <w:lvlText w:val="%6."/>
+      <w:lvlJc w:val="right"/>
+      <w:pPr>
+        <w:ind w:left="4320" w:hanging="180"/>
+      </w:pPr>
+    </w:lvl>
+    <w:lvl w:ilvl="6" w:tplc="0C0A000F" w:tentative="1">
+      <w:start w:val="1"/>
+      <w:numFmt w:val="decimal"/>
+      <w:lvlText w:val="%7."/>
+      <w:lvlJc w:val="left"/>
+      <w:pPr>
+        <w:ind w:left="5040" w:hanging="360"/>
+      </w:pPr>
+    </w:lvl>
+    <w:lvl w:ilvl="7" w:tplc="0C0A0019" w:tentative="1">
+      <w:start w:val="1"/>
+      <w:numFmt w:val="lowerLetter"/>
+      <w:lvlText w:val="%8."/>
+      <w:lvlJc w:val="left"/>
+      <w:pPr>
+        <w:ind w:left="5760" w:hanging="360"/>
+      </w:pPr>
+    </w:lvl>
+    <w:lvl w:ilvl="8" w:tplc="0C0A001B" w:tentative="1">
+      <w:start w:val="1"/>
+      <w:numFmt w:val="lowerRoman"/>
+      <w:lvlText w:val="%9."/>
+      <w:lvlJc w:val="right"/>
+      <w:pPr>
+        <w:ind w:left="6480" w:hanging="180"/>
+      </w:pPr>
+    </w:lvl>
+  </w:abstractNum>
+  <w:abstractNum w:abstractNumId="13" w15:restartNumberingAfterBreak="0">
     <w:nsid w:val="573BA664"/>
     <w:multiLevelType w:val="multilevel"/>
     <w:tmpl w:val="1BFE550E"/>
@@ -17233,7 +17638,7 @@
       </w:pPr>
     </w:lvl>
   </w:abstractNum>
-  <w:abstractNum w:abstractNumId="13" w15:restartNumberingAfterBreak="0">
+  <w:abstractNum w:abstractNumId="14" w15:restartNumberingAfterBreak="0">
     <w:nsid w:val="5A6F4870"/>
     <w:multiLevelType w:val="hybridMultilevel"/>
     <w:tmpl w:val="94AE46AA"/>
@@ -17346,7 +17751,7 @@
       </w:rPr>
     </w:lvl>
   </w:abstractNum>
-  <w:abstractNum w:abstractNumId="14" w15:restartNumberingAfterBreak="0">
+  <w:abstractNum w:abstractNumId="15" w15:restartNumberingAfterBreak="0">
     <w:nsid w:val="5A8863B8"/>
     <w:multiLevelType w:val="hybridMultilevel"/>
     <w:tmpl w:val="EC9EFB48"/>
@@ -17459,7 +17864,7 @@
       </w:rPr>
     </w:lvl>
   </w:abstractNum>
-  <w:abstractNum w:abstractNumId="15" w15:restartNumberingAfterBreak="0">
+  <w:abstractNum w:abstractNumId="16" w15:restartNumberingAfterBreak="0">
     <w:nsid w:val="5E20A2D6"/>
     <w:multiLevelType w:val="hybridMultilevel"/>
     <w:tmpl w:val="5956AD64"/>
@@ -17572,7 +17977,7 @@
       </w:rPr>
     </w:lvl>
   </w:abstractNum>
-  <w:abstractNum w:abstractNumId="16" w15:restartNumberingAfterBreak="0">
+  <w:abstractNum w:abstractNumId="17" w15:restartNumberingAfterBreak="0">
     <w:nsid w:val="61EE0F9E"/>
     <w:multiLevelType w:val="multilevel"/>
     <w:tmpl w:val="9A568394"/>
@@ -17659,7 +18064,7 @@
       </w:pPr>
     </w:lvl>
   </w:abstractNum>
-  <w:abstractNum w:abstractNumId="17" w15:restartNumberingAfterBreak="0">
+  <w:abstractNum w:abstractNumId="18" w15:restartNumberingAfterBreak="0">
     <w:nsid w:val="6E6F6B00"/>
     <w:multiLevelType w:val="hybridMultilevel"/>
     <w:tmpl w:val="65D885F8"/>
@@ -17772,7 +18177,7 @@
       </w:rPr>
     </w:lvl>
   </w:abstractNum>
-  <w:abstractNum w:abstractNumId="18" w15:restartNumberingAfterBreak="0">
+  <w:abstractNum w:abstractNumId="19" w15:restartNumberingAfterBreak="0">
     <w:nsid w:val="72D77F95"/>
     <w:multiLevelType w:val="hybridMultilevel"/>
     <w:tmpl w:val="03E6E4BA"/>
@@ -17885,7 +18290,7 @@
       </w:rPr>
     </w:lvl>
   </w:abstractNum>
-  <w:abstractNum w:abstractNumId="19" w15:restartNumberingAfterBreak="0">
+  <w:abstractNum w:abstractNumId="20" w15:restartNumberingAfterBreak="0">
     <w:nsid w:val="7B622CB4"/>
     <w:multiLevelType w:val="hybridMultilevel"/>
     <w:tmpl w:val="86B0A450"/>
@@ -17998,7 +18403,7 @@
       </w:rPr>
     </w:lvl>
   </w:abstractNum>
-  <w:abstractNum w:abstractNumId="20" w15:restartNumberingAfterBreak="0">
+  <w:abstractNum w:abstractNumId="21" w15:restartNumberingAfterBreak="0">
     <w:nsid w:val="7E154811"/>
     <w:multiLevelType w:val="hybridMultilevel"/>
     <w:tmpl w:val="CC00BB8C"/>
@@ -18130,13 +18535,13 @@
     <w:abstractNumId w:val="0"/>
   </w:num>
   <w:num w:numId="7" w16cid:durableId="361321672">
-    <w:abstractNumId w:val="17"/>
+    <w:abstractNumId w:val="18"/>
   </w:num>
   <w:num w:numId="8" w16cid:durableId="2057123933">
     <w:abstractNumId w:val="9"/>
   </w:num>
   <w:num w:numId="9" w16cid:durableId="1011220778">
-    <w:abstractNumId w:val="13"/>
+    <w:abstractNumId w:val="14"/>
   </w:num>
   <w:num w:numId="10" w16cid:durableId="740562609">
     <w:abstractNumId w:val="3"/>
@@ -18148,31 +18553,34 @@
     <w:abstractNumId w:val="5"/>
   </w:num>
   <w:num w:numId="13" w16cid:durableId="516777353">
-    <w:abstractNumId w:val="12"/>
+    <w:abstractNumId w:val="13"/>
   </w:num>
   <w:num w:numId="14" w16cid:durableId="921599014">
-    <w:abstractNumId w:val="15"/>
+    <w:abstractNumId w:val="16"/>
   </w:num>
   <w:num w:numId="15" w16cid:durableId="1471242181">
-    <w:abstractNumId w:val="16"/>
+    <w:abstractNumId w:val="17"/>
   </w:num>
   <w:num w:numId="16" w16cid:durableId="1280255786">
     <w:abstractNumId w:val="2"/>
   </w:num>
   <w:num w:numId="17" w16cid:durableId="1111163449">
-    <w:abstractNumId w:val="19"/>
+    <w:abstractNumId w:val="20"/>
   </w:num>
   <w:num w:numId="18" w16cid:durableId="1473985840">
     <w:abstractNumId w:val="8"/>
   </w:num>
   <w:num w:numId="19" w16cid:durableId="1342390438">
-    <w:abstractNumId w:val="14"/>
+    <w:abstractNumId w:val="15"/>
   </w:num>
   <w:num w:numId="20" w16cid:durableId="1656689130">
-    <w:abstractNumId w:val="20"/>
+    <w:abstractNumId w:val="21"/>
   </w:num>
   <w:num w:numId="21" w16cid:durableId="785151921">
-    <w:abstractNumId w:val="18"/>
+    <w:abstractNumId w:val="19"/>
+  </w:num>
+  <w:num w:numId="22" w16cid:durableId="506554086">
+    <w:abstractNumId w:val="12"/>
   </w:num>
 </w:numbering>
 </file>
@@ -19194,7 +19602,12 @@
 </file>
 
 <file path=customXml/item3.xml><?xml version="1.0" encoding="utf-8"?>
-<b:Sources xmlns:b="http://schemas.openxmlformats.org/officeDocument/2006/bibliography" xmlns="http://schemas.openxmlformats.org/officeDocument/2006/bibliography" SelectedStyle="\APASixthEditionOfficeOnline.xsl" StyleName="APA" Version="6"/>
+<?mso-contentType ?>
+<FormTemplates xmlns="http://schemas.microsoft.com/sharepoint/v3/contenttype/forms">
+  <Display>DocumentLibraryForm</Display>
+  <Edit>DocumentLibraryForm</Edit>
+  <New>DocumentLibraryForm</New>
+</FormTemplates>
 </file>
 
 <file path=customXml/item4.xml><?xml version="1.0" encoding="utf-8"?>
@@ -19348,12 +19761,7 @@
 </file>
 
 <file path=customXml/item5.xml><?xml version="1.0" encoding="utf-8"?>
-<?mso-contentType ?>
-<FormTemplates xmlns="http://schemas.microsoft.com/sharepoint/v3/contenttype/forms">
-  <Display>DocumentLibraryForm</Display>
-  <Edit>DocumentLibraryForm</Edit>
-  <New>DocumentLibraryForm</New>
-</FormTemplates>
+<b:Sources xmlns:b="http://schemas.openxmlformats.org/officeDocument/2006/bibliography" xmlns="http://schemas.openxmlformats.org/officeDocument/2006/bibliography" SelectedStyle="\APASixthEditionOfficeOnline.xsl" StyleName="APA" Version="6"/>
 </file>
 
 <file path=customXml/itemProps1.xml><?xml version="1.0" encoding="utf-8"?>
@@ -19375,9 +19783,9 @@
 </file>
 
 <file path=customXml/itemProps3.xml><?xml version="1.0" encoding="utf-8"?>
-<ds:datastoreItem xmlns:ds="http://schemas.openxmlformats.org/officeDocument/2006/customXml" ds:itemID="{84CA4A16-CE6B-4C64-8CA7-CF5CBE9EE313}">
+<ds:datastoreItem xmlns:ds="http://schemas.openxmlformats.org/officeDocument/2006/customXml" ds:itemID="{9C62D19F-2C4B-4163-B98D-18BF5B309744}">
   <ds:schemaRefs>
-    <ds:schemaRef ds:uri="http://schemas.openxmlformats.org/officeDocument/2006/bibliography"/>
+    <ds:schemaRef ds:uri="http://schemas.microsoft.com/sharepoint/v3/contenttype/forms"/>
   </ds:schemaRefs>
 </ds:datastoreItem>
 </file>
@@ -19401,9 +19809,9 @@
 </file>
 
 <file path=customXml/itemProps5.xml><?xml version="1.0" encoding="utf-8"?>
-<ds:datastoreItem xmlns:ds="http://schemas.openxmlformats.org/officeDocument/2006/customXml" ds:itemID="{9C62D19F-2C4B-4163-B98D-18BF5B309744}">
+<ds:datastoreItem xmlns:ds="http://schemas.openxmlformats.org/officeDocument/2006/customXml" ds:itemID="{84CA4A16-CE6B-4C64-8CA7-CF5CBE9EE313}">
   <ds:schemaRefs>
-    <ds:schemaRef ds:uri="http://schemas.microsoft.com/sharepoint/v3/contenttype/forms"/>
+    <ds:schemaRef ds:uri="http://schemas.openxmlformats.org/officeDocument/2006/bibliography"/>
   </ds:schemaRefs>
 </ds:datastoreItem>
 </file>
</xml_diff>